<commit_message>
LISA: cálculo explicado passo a passo com exemplo, dica com z e I local, permutação condicional sem reposição
Co-Authored-By: Claude Opus 5.5 <noreply@anthropic.com>
Claude-Session: https://claude.ai/code/session_01VemTUauk2kCmRrtg5b6HFR
</commit_message>
<xml_diff>
--- a/PROCESSO.docx
+++ b/PROCESSO.docx
@@ -2,7 +2,7 @@
 <file path=word/document.xml><?xml version="1.0" encoding="utf-8"?>
 <w:document xmlns:w="http://schemas.openxmlformats.org/wordprocessingml/2006/main" xmlns:m="http://schemas.openxmlformats.org/officeDocument/2006/math" xmlns:r="http://schemas.openxmlformats.org/officeDocument/2006/relationships" xmlns:o="urn:schemas-microsoft-com:office:office" xmlns:v="urn:schemas-microsoft-com:vml" xmlns:w10="urn:schemas-microsoft-com:office:word" xmlns:a="http://schemas.openxmlformats.org/drawingml/2006/main" xmlns:pic="http://schemas.openxmlformats.org/drawingml/2006/picture" xmlns:wp="http://schemas.openxmlformats.org/drawingml/2006/wordprocessingDrawing">
   <w:body>
-    <w:bookmarkStart w:id="43" w:name="Xa2da3811f05494e056d19a3aa3e79062f38da32"/>
+    <w:bookmarkStart w:id="44" w:name="Xa2da3811f05494e056d19a3aa3e79062f38da32"/>
     <w:p>
       <w:pPr>
         <w:pStyle w:val="Heading1"/>
@@ -259,7 +259,7 @@
               <w:rPr>
                 <w:sz w:val="18"/>
               </w:rPr>
-              <w:t xml:space="preserve">1.2 · 19/10/2026</w:t>
+              <w:t xml:space="preserve">1.3 · 19/10/2026</w:t>
             </w:r>
           </w:p>
         </w:tc>
@@ -3878,7 +3878,7 @@
     </w:p>
     <w:bookmarkEnd w:id="35"/>
     <w:bookmarkEnd w:id="36"/>
-    <w:bookmarkStart w:id="37" w:name="X6d348273175772d54216bfc7432a22c556cacdc"/>
+    <w:bookmarkStart w:id="38" w:name="X6d348273175772d54216bfc7432a22c556cacdc"/>
     <w:p>
       <w:pPr>
         <w:pStyle w:val="Heading2"/>
@@ -4510,7 +4510,7 @@
               <w:rPr>
                 <w:sz w:val="18"/>
               </w:rPr>
-              <w:t xml:space="preserve">sobre taxas bayesianas empíricas (Marshall), 499 permutações, p &lt; 0,05; animação mensal com escala comum</w:t>
+              <w:t xml:space="preserve">(ver 7.1); animação mensal com escala comum</w:t>
             </w:r>
           </w:p>
         </w:tc>
@@ -4781,6 +4781,218 @@
         </w:tc>
       </w:tr>
     </w:tbl>
+    <w:bookmarkStart w:id="37" w:name="Xea11f6940d713a04dff187ed0f1eb6d9257881f"/>
+    <w:p>
+      <w:pPr>
+        <w:pStyle w:val="Heading3"/>
+      </w:pPr>
+      <w:r>
+        <w:t xml:space="preserve">7.1 Pontos quentes e frios (LISA)</w:t>
+      </w:r>
+    </w:p>
+    <w:p>
+      <w:pPr>
+        <w:pStyle w:val="FirstParagraph"/>
+      </w:pPr>
+      <w:r>
+        <w:t xml:space="preserve">I de Moran local (Anselin, 1995), por departamento, calculado no navegador (</w:t>
+      </w:r>
+      <w:r>
+        <w:rPr>
+          <w:rStyle w:val="VerbatimChar"/>
+        </w:rPr>
+        <w:t xml:space="preserve">lisaCalc</w:t>
+      </w:r>
+      <w:r>
+        <w:t xml:space="preserve"> </w:t>
+      </w:r>
+      <w:r>
+        <w:t xml:space="preserve">em</w:t>
+      </w:r>
+      <w:r>
+        <w:t xml:space="preserve"> </w:t>
+      </w:r>
+      <w:r>
+        <w:rPr>
+          <w:rStyle w:val="VerbatimChar"/>
+        </w:rPr>
+        <w:t xml:space="preserve">assets/js/app/mapas.js</w:t>
+      </w:r>
+      <w:r>
+        <w:t xml:space="preserve">):</w:t>
+      </w:r>
+    </w:p>
+    <w:p>
+      <w:pPr>
+        <w:numPr>
+          <w:ilvl w:val="0"/>
+          <w:numId w:val="1004"/>
+        </w:numPr>
+        <w:pStyle w:val="Compact"/>
+      </w:pPr>
+      <w:r>
+        <w:rPr>
+          <w:bCs/>
+          <w:b/>
+        </w:rPr>
+        <w:t xml:space="preserve">Taxa bruta</w:t>
+      </w:r>
+      <w:r>
+        <w:t xml:space="preserve"> </w:t>
+      </w:r>
+      <w:r>
+        <w:t xml:space="preserve">de cada um dos 511 departamentos com população: notícias que citam o departamento ÷ população do Censo 2022 × 100.000 (departamentos sem notícias entram com zero).</w:t>
+      </w:r>
+    </w:p>
+    <w:p>
+      <w:pPr>
+        <w:numPr>
+          <w:ilvl w:val="0"/>
+          <w:numId w:val="1004"/>
+        </w:numPr>
+        <w:pStyle w:val="Compact"/>
+      </w:pPr>
+      <w:r>
+        <w:rPr>
+          <w:bCs/>
+          <w:b/>
+        </w:rPr>
+        <w:t xml:space="preserve">Taxa bayesiana empírica global</w:t>
+      </w:r>
+      <w:r>
+        <w:t xml:space="preserve"> </w:t>
+      </w:r>
+      <w:r>
+        <w:t xml:space="preserve">(Marshall, 1991): taxa suavizada = m + w × (taxa bruta − m), com m = taxa nacional e w = A ÷ (A + m ÷ população), em que A é a variância entre departamentos descontado o ruído de Poisson. Aproxima da média os departamentos pequenos.</w:t>
+      </w:r>
+    </w:p>
+    <w:p>
+      <w:pPr>
+        <w:numPr>
+          <w:ilvl w:val="0"/>
+          <w:numId w:val="1004"/>
+        </w:numPr>
+        <w:pStyle w:val="Compact"/>
+      </w:pPr>
+      <w:r>
+        <w:rPr>
+          <w:bCs/>
+          <w:b/>
+        </w:rPr>
+        <w:t xml:space="preserve">Escore z</w:t>
+      </w:r>
+      <w:r>
+        <w:t xml:space="preserve"> </w:t>
+      </w:r>
+      <w:r>
+        <w:t xml:space="preserve">das taxas suavizadas (média e desvio-padrão dos departamentos).</w:t>
+      </w:r>
+    </w:p>
+    <w:p>
+      <w:pPr>
+        <w:numPr>
+          <w:ilvl w:val="0"/>
+          <w:numId w:val="1004"/>
+        </w:numPr>
+        <w:pStyle w:val="Compact"/>
+      </w:pPr>
+      <w:r>
+        <w:rPr>
+          <w:bCs/>
+          <w:b/>
+        </w:rPr>
+        <w:t xml:space="preserve">Vizinhança por contiguidade “rainha”</w:t>
+      </w:r>
+      <w:r>
+        <w:t xml:space="preserve"> </w:t>
+      </w:r>
+      <w:r>
+        <w:t xml:space="preserve">(fronteira ou vértice em comum,</w:t>
+      </w:r>
+      <w:r>
+        <w:t xml:space="preserve"> </w:t>
+      </w:r>
+      <w:r>
+        <w:rPr>
+          <w:rStyle w:val="VerbatimChar"/>
+        </w:rPr>
+        <w:t xml:space="preserve">topojson.neighbors</w:t>
+      </w:r>
+      <w:r>
+        <w:t xml:space="preserve">), pesos padronizados por linha; defasagem espacial = média dos z dos vizinhos. Departamentos sem vizinhos ficam fora.</w:t>
+      </w:r>
+    </w:p>
+    <w:p>
+      <w:pPr>
+        <w:numPr>
+          <w:ilvl w:val="0"/>
+          <w:numId w:val="1004"/>
+        </w:numPr>
+        <w:pStyle w:val="Compact"/>
+      </w:pPr>
+      <w:r>
+        <w:rPr>
+          <w:bCs/>
+          <w:b/>
+        </w:rPr>
+        <w:t xml:space="preserve">I local</w:t>
+      </w:r>
+      <w:r>
+        <w:t xml:space="preserve"> </w:t>
+      </w:r>
+      <w:r>
+        <w:t xml:space="preserve">= zᵢ × média dos z vizinhos. Classes pelos sinais: alto-alto (ponto quente), baixo-baixo (ponto frio), alto-baixo, baixo-alto.</w:t>
+      </w:r>
+    </w:p>
+    <w:p>
+      <w:pPr>
+        <w:numPr>
+          <w:ilvl w:val="0"/>
+          <w:numId w:val="1004"/>
+        </w:numPr>
+        <w:pStyle w:val="Compact"/>
+      </w:pPr>
+      <w:r>
+        <w:rPr>
+          <w:bCs/>
+          <w:b/>
+        </w:rPr>
+        <w:t xml:space="preserve">Permutação condicional</w:t>
+      </w:r>
+      <w:r>
+        <w:t xml:space="preserve">: zᵢ fixo e k vizinhos sorteados sem reposição entre os demais departamentos, 499 vezes; p = (nº de sorteios tão extremos + 1) ÷ 500; classe pintada só com p &lt; 0,05. Semente fixa (resultado reprodutível).</w:t>
+      </w:r>
+    </w:p>
+    <w:p>
+      <w:pPr>
+        <w:numPr>
+          <w:ilvl w:val="0"/>
+          <w:numId w:val="1004"/>
+        </w:numPr>
+        <w:pStyle w:val="Compact"/>
+      </w:pPr>
+      <w:r>
+        <w:rPr>
+          <w:bCs/>
+          <w:b/>
+        </w:rPr>
+        <w:t xml:space="preserve">I de Moran global</w:t>
+      </w:r>
+      <w:r>
+        <w:t xml:space="preserve"> </w:t>
+      </w:r>
+      <w:r>
+        <w:t xml:space="preserve">= Σ zᵢ × defasagemᵢ ÷ Σ zᵢ², com p por 199 permutações das taxas.</w:t>
+      </w:r>
+    </w:p>
+    <w:p>
+      <w:pPr>
+        <w:pStyle w:val="FirstParagraph"/>
+      </w:pPr>
+      <w:r>
+        <w:t xml:space="preserve">Cuidados registrados no site: cerca de 511 testes simultâneos (uns 26 falsos positivos esperados a 5%, sem correção de múltiplos testes); dependência da vizinhança e dos limites; a taxa mede cobertura da imprensa. No recorte completo (19/10/2026): 14 pontos quentes (sobretudo Patagônia andina e Tierra del Fuego), 55 pontos frios (sobretudo partidos do Gran Buenos Aires sem notícias), I global = 0,183 (p ≈ 0,005).</w:t>
+      </w:r>
+    </w:p>
     <w:p>
       <w:pPr>
         <w:pStyle w:val="BodyText"/>
@@ -4843,7 +5055,8 @@
       </w:r>
     </w:p>
     <w:bookmarkEnd w:id="37"/>
-    <w:bookmarkStart w:id="38" w:name="X9a8a5c3f4675aaafcd01bef6e7fb33b3e7de441"/>
+    <w:bookmarkEnd w:id="38"/>
+    <w:bookmarkStart w:id="39" w:name="X9a8a5c3f4675aaafcd01bef6e7fb33b3e7de441"/>
     <w:p>
       <w:pPr>
         <w:pStyle w:val="Heading2"/>
@@ -5241,8 +5454,8 @@
         </w:pict>
       </w:r>
     </w:p>
-    <w:bookmarkEnd w:id="38"/>
-    <w:bookmarkStart w:id="41" w:name="X37a24ddc49ec6a08847d5e7c09b751dfa640a32"/>
+    <w:bookmarkEnd w:id="39"/>
+    <w:bookmarkStart w:id="42" w:name="X37a24ddc49ec6a08847d5e7c09b751dfa640a32"/>
     <w:p>
       <w:pPr>
         <w:pStyle w:val="Heading2"/>
@@ -5259,251 +5472,13 @@
         <w:t xml:space="preserve">Datas no fuso de São Paulo. Os códigos entre colchetes são os commits do repositório.</w:t>
       </w:r>
     </w:p>
-    <w:bookmarkStart w:id="39" w:name="Xb374f4671a78533177f9e41d94caa4dc6b2e1e1"/>
+    <w:bookmarkStart w:id="40" w:name="Xb374f4671a78533177f9e41d94caa4dc6b2e1e1"/>
     <w:p>
       <w:pPr>
         <w:pStyle w:val="Heading3"/>
       </w:pPr>
       <w:r>
         <w:t xml:space="preserve">18/10/2026</w:t>
-      </w:r>
-    </w:p>
-    <w:p>
-      <w:pPr>
-        <w:numPr>
-          <w:ilvl w:val="0"/>
-          <w:numId w:val="1004"/>
-        </w:numPr>
-        <w:pStyle w:val="Compact"/>
-      </w:pPr>
-      <w:r>
-        <w:rPr>
-          <w:bCs/>
-          <w:b/>
-        </w:rPr>
-        <w:t xml:space="preserve">Primeira versão do site</w:t>
-      </w:r>
-      <w:r>
-        <w:t xml:space="preserve"> </w:t>
-      </w:r>
-      <w:r>
-        <w:t xml:space="preserve">e base interativa 2024 publicadas no GitHub Pages [bf1632d, 5c440c7].</w:t>
-      </w:r>
-    </w:p>
-    <w:p>
-      <w:pPr>
-        <w:numPr>
-          <w:ilvl w:val="0"/>
-          <w:numId w:val="1004"/>
-        </w:numPr>
-        <w:pStyle w:val="Compact"/>
-      </w:pPr>
-      <w:r>
-        <w:t xml:space="preserve">Navegação por endereço (</w:t>
-      </w:r>
-      <w:r>
-        <w:rPr>
-          <w:rStyle w:val="VerbatimChar"/>
-        </w:rPr>
-        <w:t xml:space="preserve">#mapa</w:t>
-      </w:r>
-      <w:r>
-        <w:t xml:space="preserve">,</w:t>
-      </w:r>
-      <w:r>
-        <w:t xml:space="preserve"> </w:t>
-      </w:r>
-      <w:r>
-        <w:rPr>
-          <w:rStyle w:val="VerbatimChar"/>
-        </w:rPr>
-        <w:t xml:space="preserve">#tempo</w:t>
-      </w:r>
-      <w:r>
-        <w:t xml:space="preserve">), zoom e arraste nos mapas; README com metodologia e fontes [c1a0ced, 3f2981b].</w:t>
-      </w:r>
-    </w:p>
-    <w:p>
-      <w:pPr>
-        <w:numPr>
-          <w:ilvl w:val="0"/>
-          <w:numId w:val="1004"/>
-        </w:numPr>
-        <w:pStyle w:val="Compact"/>
-      </w:pPr>
-      <w:r>
-        <w:rPr>
-          <w:bCs/>
-          <w:b/>
-        </w:rPr>
-        <w:t xml:space="preserve">Pipeline em Python</w:t>
-      </w:r>
-      <w:r>
-        <w:t xml:space="preserve">, código modular, dados abertos e GeoPackage para QGIS; publicação automática pelo GitHub Actions com verificação de privacidade [a33414f, cc7cd3c].</w:t>
-      </w:r>
-    </w:p>
-    <w:p>
-      <w:pPr>
-        <w:numPr>
-          <w:ilvl w:val="0"/>
-          <w:numId w:val="1004"/>
-        </w:numPr>
-        <w:pStyle w:val="Compact"/>
-      </w:pPr>
-      <w:r>
-        <w:t xml:space="preserve">Identidade argentina, gráficos especializados e primeiros indicadores oficiais (população, EPH, homicídios) [968ee5c].</w:t>
-      </w:r>
-    </w:p>
-    <w:p>
-      <w:pPr>
-        <w:numPr>
-          <w:ilvl w:val="0"/>
-          <w:numId w:val="1004"/>
-        </w:numPr>
-        <w:pStyle w:val="Compact"/>
-      </w:pPr>
-      <w:r>
-        <w:rPr>
-          <w:bCs/>
-          <w:b/>
-        </w:rPr>
-        <w:t xml:space="preserve">28 indicadores do Censo 2022 por departamento</w:t>
-      </w:r>
-      <w:r>
-        <w:t xml:space="preserve"> </w:t>
-      </w:r>
-      <w:r>
-        <w:t xml:space="preserve">(Geoportal do INDEC) e taxas por departamento [9c2705c].</w:t>
-      </w:r>
-    </w:p>
-    <w:p>
-      <w:pPr>
-        <w:numPr>
-          <w:ilvl w:val="0"/>
-          <w:numId w:val="1004"/>
-        </w:numPr>
-        <w:pStyle w:val="Compact"/>
-      </w:pPr>
-      <w:r>
-        <w:t xml:space="preserve">Nova identidade visual com fundo branco e marcha desenhada; tipografia Urbanist [ee5db14, 504893c].</w:t>
-      </w:r>
-    </w:p>
-    <w:p>
-      <w:pPr>
-        <w:numPr>
-          <w:ilvl w:val="0"/>
-          <w:numId w:val="1004"/>
-        </w:numPr>
-        <w:pStyle w:val="Compact"/>
-      </w:pPr>
-      <w:r>
-        <w:t xml:space="preserve">Novas análises: associação (resíduos), Comparar, ACM, mapa bivariado, LISA, série semanal com acontecimentos, comunidades, Imprensa, Fichas e links do recorte [3e910b0].</w:t>
-      </w:r>
-    </w:p>
-    <w:p>
-      <w:pPr>
-        <w:numPr>
-          <w:ilvl w:val="0"/>
-          <w:numId w:val="1004"/>
-        </w:numPr>
-        <w:pStyle w:val="Compact"/>
-      </w:pPr>
-      <w:r>
-        <w:t xml:space="preserve">Guias “Como ler”, exemplos, leituras automáticas, topônimos que mudam com o zoom e ficha em formato de prancha [88a2c6e, c896e9e].</w:t>
-      </w:r>
-    </w:p>
-    <w:p>
-      <w:pPr>
-        <w:numPr>
-          <w:ilvl w:val="0"/>
-          <w:numId w:val="1004"/>
-        </w:numPr>
-        <w:pStyle w:val="Compact"/>
-      </w:pPr>
-      <w:r>
-        <w:t xml:space="preserve">Mapa navegável mundial, destaques por população (Poisson), combinações prontas em todas as abas, glossário [f80c8bd].</w:t>
-      </w:r>
-    </w:p>
-    <w:p>
-      <w:pPr>
-        <w:numPr>
-          <w:ilvl w:val="0"/>
-          <w:numId w:val="1004"/>
-        </w:numPr>
-        <w:pStyle w:val="Compact"/>
-      </w:pPr>
-      <w:r>
-        <w:rPr>
-          <w:bCs/>
-          <w:b/>
-        </w:rPr>
-        <w:t xml:space="preserve">Título DATALUTA</w:t>
-      </w:r>
-      <w:r>
-        <w:t xml:space="preserve">, revisão dos textos e troca do mapa base (CARTO exigia chave; passou a Esri/OSM) [81c0a67].</w:t>
-      </w:r>
-    </w:p>
-    <w:p>
-      <w:pPr>
-        <w:numPr>
-          <w:ilvl w:val="0"/>
-          <w:numId w:val="1004"/>
-        </w:numPr>
-        <w:pStyle w:val="Compact"/>
-      </w:pPr>
-      <w:r>
-        <w:t xml:space="preserve">Título com</w:t>
-      </w:r>
-      <w:r>
-        <w:t xml:space="preserve"> </w:t>
-      </w:r>
-      <w:r>
-        <w:rPr>
-          <w:bCs/>
-          <w:b/>
-        </w:rPr>
-        <w:t xml:space="preserve">Argentina 2024</w:t>
-      </w:r>
-      <w:r>
-        <w:t xml:space="preserve">,</w:t>
-      </w:r>
-      <w:r>
-        <w:t xml:space="preserve"> </w:t>
-      </w:r>
-      <w:r>
-        <w:rPr>
-          <w:bCs/>
-          <w:b/>
-        </w:rPr>
-        <w:t xml:space="preserve">aba Síntese</w:t>
-      </w:r>
-      <w:r>
-        <w:t xml:space="preserve"> </w:t>
-      </w:r>
-      <w:r>
-        <w:t xml:space="preserve">e novas combinações prontas [ec307a2].</w:t>
-      </w:r>
-    </w:p>
-    <w:p>
-      <w:pPr>
-        <w:numPr>
-          <w:ilvl w:val="0"/>
-          <w:numId w:val="1004"/>
-        </w:numPr>
-        <w:pStyle w:val="Compact"/>
-      </w:pPr>
-      <w:r>
-        <w:t xml:space="preserve">Síntese: explicação passo a passo do resíduo ajustado, régua de leitura e combinações raras [2ee97ab].</w:t>
-      </w:r>
-    </w:p>
-    <w:bookmarkEnd w:id="39"/>
-    <w:bookmarkStart w:id="40" w:name="Xfda8f6a74ee01990937dc6b5f77dee589813531"/>
-    <w:p>
-      <w:pPr>
-        <w:pStyle w:val="Heading3"/>
-      </w:pPr>
-      <w:r>
-        <w:t xml:space="preserve">19/10/2026</w:t>
       </w:r>
     </w:p>
     <w:p>
@@ -5519,13 +5494,13 @@
           <w:bCs/>
           <w:b/>
         </w:rPr>
-        <w:t xml:space="preserve">Contexto ligado às lutas:</w:t>
-      </w:r>
-      <w:r>
-        <w:t xml:space="preserve"> </w:t>
-      </w:r>
-      <w:r>
-        <w:t xml:space="preserve">entram RENABAP, ReNaTEP, voto presidencial de 2023 e femicídios; indicadores separados em “ligados às lutas” e “controles” [6f0fe22].</w:t>
+        <w:t xml:space="preserve">Primeira versão do site</w:t>
+      </w:r>
+      <w:r>
+        <w:t xml:space="preserve"> </w:t>
+      </w:r>
+      <w:r>
+        <w:t xml:space="preserve">e base interativa 2024 publicadas no GitHub Pages [bf1632d, 5c440c7].</w:t>
       </w:r>
     </w:p>
     <w:p>
@@ -5537,30 +5512,28 @@
         <w:pStyle w:val="Compact"/>
       </w:pPr>
       <w:r>
-        <w:rPr>
-          <w:bCs/>
-          <w:b/>
-        </w:rPr>
-        <w:t xml:space="preserve">Indicadores sem ligação com as lutas retirados do site</w:t>
-      </w:r>
-      <w:r>
-        <w:t xml:space="preserve">; El Cuy deixado vazio no RENABAP; painel do mapa reorganizado em três blocos; quadro “Como foi calculado este mapa”; cálculo da tendência explicado no Contexto;</w:t>
-      </w:r>
-      <w:r>
-        <w:t xml:space="preserve"> </w:t>
-      </w:r>
-      <w:r>
-        <w:rPr>
-          <w:bCs/>
-          <w:b/>
-        </w:rPr>
-        <w:t xml:space="preserve">leitura em três partes para as 139 combinações prontas</w:t>
-      </w:r>
-      <w:r>
-        <w:t xml:space="preserve"> </w:t>
-      </w:r>
-      <w:r>
-        <w:t xml:space="preserve">[5839d6f].</w:t>
+        <w:t xml:space="preserve">Navegação por endereço (</w:t>
+      </w:r>
+      <w:r>
+        <w:rPr>
+          <w:rStyle w:val="VerbatimChar"/>
+        </w:rPr>
+        <w:t xml:space="preserve">#mapa</w:t>
+      </w:r>
+      <w:r>
+        <w:t xml:space="preserve">,</w:t>
+      </w:r>
+      <w:r>
+        <w:t xml:space="preserve"> </w:t>
+      </w:r>
+      <w:r>
+        <w:rPr>
+          <w:rStyle w:val="VerbatimChar"/>
+        </w:rPr>
+        <w:t xml:space="preserve">#tempo</w:t>
+      </w:r>
+      <w:r>
+        <w:t xml:space="preserve">), zoom e arraste nos mapas; README com metodologia e fontes [c1a0ced, 3f2981b].</w:t>
       </w:r>
     </w:p>
     <w:p>
@@ -5572,19 +5545,14 @@
         <w:pStyle w:val="Compact"/>
       </w:pPr>
       <w:r>
-        <w:t xml:space="preserve">Criado este documento de processo e o roteiro</w:t>
-      </w:r>
-      <w:r>
-        <w:t xml:space="preserve"> </w:t>
-      </w:r>
-      <w:r>
-        <w:rPr>
-          <w:rStyle w:val="VerbatimChar"/>
-        </w:rPr>
-        <w:t xml:space="preserve">pipeline/reconstruir.sh</w:t>
-      </w:r>
-      <w:r>
-        <w:t xml:space="preserve">.</w:t>
+        <w:rPr>
+          <w:bCs/>
+          <w:b/>
+        </w:rPr>
+        <w:t xml:space="preserve">Pipeline em Python</w:t>
+      </w:r>
+      <w:r>
+        <w:t xml:space="preserve">, código modular, dados abertos e GeoPackage para QGIS; publicação automática pelo GitHub Actions com verificação de privacidade [a33414f, cc7cd3c].</w:t>
       </w:r>
     </w:p>
     <w:p>
@@ -5596,53 +5564,7 @@
         <w:pStyle w:val="Compact"/>
       </w:pPr>
       <w:r>
-        <w:rPr>
-          <w:bCs/>
-          <w:b/>
-        </w:rPr>
-        <w:t xml:space="preserve">Licenças definidas:</w:t>
-      </w:r>
-      <w:r>
-        <w:t xml:space="preserve"> </w:t>
-      </w:r>
-      <w:r>
-        <w:t xml:space="preserve">base de dados sob CC BY 4.0 (arquivo</w:t>
-      </w:r>
-      <w:r>
-        <w:t xml:space="preserve"> </w:t>
-      </w:r>
-      <w:r>
-        <w:rPr>
-          <w:rStyle w:val="VerbatimChar"/>
-        </w:rPr>
-        <w:t xml:space="preserve">LICENSE</w:t>
-      </w:r>
-      <w:r>
-        <w:t xml:space="preserve">, que o GitHub reconhece) e código sob MIT (</w:t>
-      </w:r>
-      <w:r>
-        <w:rPr>
-          <w:rStyle w:val="VerbatimChar"/>
-        </w:rPr>
-        <w:t xml:space="preserve">LICENCA-CODIGO</w:t>
-      </w:r>
-      <w:r>
-        <w:t xml:space="preserve">);</w:t>
-      </w:r>
-      <w:r>
-        <w:t xml:space="preserve"> </w:t>
-      </w:r>
-      <w:r>
-        <w:rPr>
-          <w:rStyle w:val="VerbatimChar"/>
-        </w:rPr>
-        <w:t xml:space="preserve">LICENCAS.md</w:t>
-      </w:r>
-      <w:r>
-        <w:t xml:space="preserve"> </w:t>
-      </w:r>
-      <w:r>
-        <w:t xml:space="preserve">explica o que cada uma cobre, lista as condições dos dados de terceiros e traz a forma de citar; rodapés do site e README atualizados. Motivo: sem licença, ninguém tinha permissão formal de reutilizar a base; a CC BY 4.0 é o padrão em dados científicos abertos, garante o crédito e é compatível com o GeoNames e o datos.gob.ar.</w:t>
+        <w:t xml:space="preserve">Identidade argentina, gráficos especializados e primeiros indicadores oficiais (população, EPH, homicídios) [968ee5c].</w:t>
       </w:r>
     </w:p>
     <w:p>
@@ -5658,55 +5580,143 @@
           <w:bCs/>
           <w:b/>
         </w:rPr>
-        <w:t xml:space="preserve">Versão em Word do documento de processo</w:t>
-      </w:r>
-      <w:r>
-        <w:t xml:space="preserve"> </w:t>
-      </w:r>
-      <w:r>
-        <w:t xml:space="preserve">(</w:t>
-      </w:r>
-      <w:r>
-        <w:rPr>
-          <w:rStyle w:val="VerbatimChar"/>
-        </w:rPr>
-        <w:t xml:space="preserve">PROCESSO.docx</w:t>
-      </w:r>
-      <w:r>
-        <w:t xml:space="preserve">), gerada a partir deste arquivo por</w:t>
-      </w:r>
-      <w:r>
-        <w:t xml:space="preserve"> </w:t>
-      </w:r>
-      <w:r>
-        <w:rPr>
-          <w:rStyle w:val="VerbatimChar"/>
-        </w:rPr>
-        <w:t xml:space="preserve">pipeline/gerar_processo_docx.py</w:t>
-      </w:r>
-      <w:r>
-        <w:t xml:space="preserve"> </w:t>
-      </w:r>
-      <w:r>
-        <w:t xml:space="preserve">(pandoc + python-docx), para circular no grupo.</w:t>
-      </w:r>
-    </w:p>
-    <w:p>
-      <w:r>
-        <w:pict>
-          <v:rect style="width:0;height:1.5pt" o:hralign="center" o:hrstd="t" o:hr="t"/>
-        </w:pict>
+        <w:t xml:space="preserve">28 indicadores do Censo 2022 por departamento</w:t>
+      </w:r>
+      <w:r>
+        <w:t xml:space="preserve"> </w:t>
+      </w:r>
+      <w:r>
+        <w:t xml:space="preserve">(Geoportal do INDEC) e taxas por departamento [9c2705c].</w:t>
+      </w:r>
+    </w:p>
+    <w:p>
+      <w:pPr>
+        <w:numPr>
+          <w:ilvl w:val="0"/>
+          <w:numId w:val="1005"/>
+        </w:numPr>
+        <w:pStyle w:val="Compact"/>
+      </w:pPr>
+      <w:r>
+        <w:t xml:space="preserve">Nova identidade visual com fundo branco e marcha desenhada; tipografia Urbanist [ee5db14, 504893c].</w:t>
+      </w:r>
+    </w:p>
+    <w:p>
+      <w:pPr>
+        <w:numPr>
+          <w:ilvl w:val="0"/>
+          <w:numId w:val="1005"/>
+        </w:numPr>
+        <w:pStyle w:val="Compact"/>
+      </w:pPr>
+      <w:r>
+        <w:t xml:space="preserve">Novas análises: associação (resíduos), Comparar, ACM, mapa bivariado, LISA, série semanal com acontecimentos, comunidades, Imprensa, Fichas e links do recorte [3e910b0].</w:t>
+      </w:r>
+    </w:p>
+    <w:p>
+      <w:pPr>
+        <w:numPr>
+          <w:ilvl w:val="0"/>
+          <w:numId w:val="1005"/>
+        </w:numPr>
+        <w:pStyle w:val="Compact"/>
+      </w:pPr>
+      <w:r>
+        <w:t xml:space="preserve">Guias “Como ler”, exemplos, leituras automáticas, topônimos que mudam com o zoom e ficha em formato de prancha [88a2c6e, c896e9e].</w:t>
+      </w:r>
+    </w:p>
+    <w:p>
+      <w:pPr>
+        <w:numPr>
+          <w:ilvl w:val="0"/>
+          <w:numId w:val="1005"/>
+        </w:numPr>
+        <w:pStyle w:val="Compact"/>
+      </w:pPr>
+      <w:r>
+        <w:t xml:space="preserve">Mapa navegável mundial, destaques por população (Poisson), combinações prontas em todas as abas, glossário [f80c8bd].</w:t>
+      </w:r>
+    </w:p>
+    <w:p>
+      <w:pPr>
+        <w:numPr>
+          <w:ilvl w:val="0"/>
+          <w:numId w:val="1005"/>
+        </w:numPr>
+        <w:pStyle w:val="Compact"/>
+      </w:pPr>
+      <w:r>
+        <w:rPr>
+          <w:bCs/>
+          <w:b/>
+        </w:rPr>
+        <w:t xml:space="preserve">Título DATALUTA</w:t>
+      </w:r>
+      <w:r>
+        <w:t xml:space="preserve">, revisão dos textos e troca do mapa base (CARTO exigia chave; passou a Esri/OSM) [81c0a67].</w:t>
+      </w:r>
+    </w:p>
+    <w:p>
+      <w:pPr>
+        <w:numPr>
+          <w:ilvl w:val="0"/>
+          <w:numId w:val="1005"/>
+        </w:numPr>
+        <w:pStyle w:val="Compact"/>
+      </w:pPr>
+      <w:r>
+        <w:t xml:space="preserve">Título com</w:t>
+      </w:r>
+      <w:r>
+        <w:t xml:space="preserve"> </w:t>
+      </w:r>
+      <w:r>
+        <w:rPr>
+          <w:bCs/>
+          <w:b/>
+        </w:rPr>
+        <w:t xml:space="preserve">Argentina 2024</w:t>
+      </w:r>
+      <w:r>
+        <w:t xml:space="preserve">,</w:t>
+      </w:r>
+      <w:r>
+        <w:t xml:space="preserve"> </w:t>
+      </w:r>
+      <w:r>
+        <w:rPr>
+          <w:bCs/>
+          <w:b/>
+        </w:rPr>
+        <w:t xml:space="preserve">aba Síntese</w:t>
+      </w:r>
+      <w:r>
+        <w:t xml:space="preserve"> </w:t>
+      </w:r>
+      <w:r>
+        <w:t xml:space="preserve">e novas combinações prontas [ec307a2].</w:t>
+      </w:r>
+    </w:p>
+    <w:p>
+      <w:pPr>
+        <w:numPr>
+          <w:ilvl w:val="0"/>
+          <w:numId w:val="1005"/>
+        </w:numPr>
+        <w:pStyle w:val="Compact"/>
+      </w:pPr>
+      <w:r>
+        <w:t xml:space="preserve">Síntese: explicação passo a passo do resíduo ajustado, régua de leitura e combinações raras [2ee97ab].</w:t>
       </w:r>
     </w:p>
     <w:bookmarkEnd w:id="40"/>
-    <w:bookmarkEnd w:id="41"/>
-    <w:bookmarkStart w:id="42" w:name="X3d9f82193e44c2a113d49ff9b97f8db3ae86c66"/>
-    <w:p>
-      <w:pPr>
-        <w:pStyle w:val="Heading2"/>
-      </w:pPr>
-      <w:r>
-        <w:t xml:space="preserve">10. Pendências</w:t>
+    <w:bookmarkStart w:id="41" w:name="Xfda8f6a74ee01990937dc6b5f77dee589813531"/>
+    <w:p>
+      <w:pPr>
+        <w:pStyle w:val="Heading3"/>
+      </w:pPr>
+      <w:r>
+        <w:t xml:space="preserve">19/10/2026</w:t>
       </w:r>
     </w:p>
     <w:p>
@@ -5718,7 +5728,17 @@
         <w:pStyle w:val="Compact"/>
       </w:pPr>
       <w:r>
-        <w:t xml:space="preserve">☐ Confirmar a escolha das licenças com o grupo/centro de pesquisa e, se houver, com a política de dados da instituição.</w:t>
+        <w:rPr>
+          <w:bCs/>
+          <w:b/>
+        </w:rPr>
+        <w:t xml:space="preserve">Contexto ligado às lutas:</w:t>
+      </w:r>
+      <w:r>
+        <w:t xml:space="preserve"> </w:t>
+      </w:r>
+      <w:r>
+        <w:t xml:space="preserve">entram RENABAP, ReNaTEP, voto presidencial de 2023 e femicídios; indicadores separados em “ligados às lutas” e “controles” [6f0fe22].</w:t>
       </w:r>
     </w:p>
     <w:p>
@@ -5730,19 +5750,30 @@
         <w:pStyle w:val="Compact"/>
       </w:pPr>
       <w:r>
-        <w:t xml:space="preserve">☐ Depositar a base no Zenodo (ou repositório institucional) para obter um DOI e atualizar a citação em</w:t>
-      </w:r>
-      <w:r>
-        <w:t xml:space="preserve"> </w:t>
-      </w:r>
-      <w:r>
-        <w:rPr>
-          <w:rStyle w:val="VerbatimChar"/>
-        </w:rPr>
-        <w:t xml:space="preserve">LICENCAS.md</w:t>
-      </w:r>
-      <w:r>
-        <w:t xml:space="preserve">.</w:t>
+        <w:rPr>
+          <w:bCs/>
+          <w:b/>
+        </w:rPr>
+        <w:t xml:space="preserve">Indicadores sem ligação com as lutas retirados do site</w:t>
+      </w:r>
+      <w:r>
+        <w:t xml:space="preserve">; El Cuy deixado vazio no RENABAP; painel do mapa reorganizado em três blocos; quadro “Como foi calculado este mapa”; cálculo da tendência explicado no Contexto;</w:t>
+      </w:r>
+      <w:r>
+        <w:t xml:space="preserve"> </w:t>
+      </w:r>
+      <w:r>
+        <w:rPr>
+          <w:bCs/>
+          <w:b/>
+        </w:rPr>
+        <w:t xml:space="preserve">leitura em três partes para as 139 combinações prontas</w:t>
+      </w:r>
+      <w:r>
+        <w:t xml:space="preserve"> </w:t>
+      </w:r>
+      <w:r>
+        <w:t xml:space="preserve">[5839d6f].</w:t>
       </w:r>
     </w:p>
     <w:p>
@@ -5754,23 +5785,19 @@
         <w:pStyle w:val="Compact"/>
       </w:pPr>
       <w:r>
-        <w:t xml:space="preserve">☐</w:t>
-      </w:r>
-      <w:r>
-        <w:t xml:space="preserve"> </w:t>
-      </w:r>
-      <w:r>
-        <w:rPr>
-          <w:bCs/>
-          <w:b/>
-        </w:rPr>
-        <w:t xml:space="preserve">Unificar nomes de organizações duplicados</w:t>
-      </w:r>
-      <w:r>
-        <w:t xml:space="preserve"> </w:t>
-      </w:r>
-      <w:r>
-        <w:t xml:space="preserve">(ex.: grafias diferentes de CTA e CGT). Afeta contagens, fichas e redes.</w:t>
+        <w:t xml:space="preserve">Criado este documento de processo e o roteiro</w:t>
+      </w:r>
+      <w:r>
+        <w:t xml:space="preserve"> </w:t>
+      </w:r>
+      <w:r>
+        <w:rPr>
+          <w:rStyle w:val="VerbatimChar"/>
+        </w:rPr>
+        <w:t xml:space="preserve">pipeline/reconstruir.sh</w:t>
+      </w:r>
+      <w:r>
+        <w:t xml:space="preserve">.</w:t>
       </w:r>
     </w:p>
     <w:p>
@@ -5782,23 +5809,53 @@
         <w:pStyle w:val="Compact"/>
       </w:pPr>
       <w:r>
-        <w:t xml:space="preserve">☐ Resultado do</w:t>
-      </w:r>
-      <w:r>
-        <w:t xml:space="preserve"> </w:t>
-      </w:r>
-      <w:r>
         <w:rPr>
           <w:bCs/>
           <w:b/>
         </w:rPr>
-        <w:t xml:space="preserve">2º turno de 2023</w:t>
-      </w:r>
-      <w:r>
-        <w:t xml:space="preserve"> </w:t>
-      </w:r>
-      <w:r>
-        <w:t xml:space="preserve">por departamento, se a DINE publicar no formato mesa a mesa.</w:t>
+        <w:t xml:space="preserve">Licenças definidas:</w:t>
+      </w:r>
+      <w:r>
+        <w:t xml:space="preserve"> </w:t>
+      </w:r>
+      <w:r>
+        <w:t xml:space="preserve">base de dados sob CC BY 4.0 (arquivo</w:t>
+      </w:r>
+      <w:r>
+        <w:t xml:space="preserve"> </w:t>
+      </w:r>
+      <w:r>
+        <w:rPr>
+          <w:rStyle w:val="VerbatimChar"/>
+        </w:rPr>
+        <w:t xml:space="preserve">LICENSE</w:t>
+      </w:r>
+      <w:r>
+        <w:t xml:space="preserve">, que o GitHub reconhece) e código sob MIT (</w:t>
+      </w:r>
+      <w:r>
+        <w:rPr>
+          <w:rStyle w:val="VerbatimChar"/>
+        </w:rPr>
+        <w:t xml:space="preserve">LICENCA-CODIGO</w:t>
+      </w:r>
+      <w:r>
+        <w:t xml:space="preserve">);</w:t>
+      </w:r>
+      <w:r>
+        <w:t xml:space="preserve"> </w:t>
+      </w:r>
+      <w:r>
+        <w:rPr>
+          <w:rStyle w:val="VerbatimChar"/>
+        </w:rPr>
+        <w:t xml:space="preserve">LICENCAS.md</w:t>
+      </w:r>
+      <w:r>
+        <w:t xml:space="preserve"> </w:t>
+      </w:r>
+      <w:r>
+        <w:t xml:space="preserve">explica o que cada uma cobre, lista as condições dos dados de terceiros e traz a forma de citar; rodapés do site e README atualizados. Motivo: sem licença, ninguém tinha permissão formal de reutilizar a base; a CC BY 4.0 é o padrão em dados científicos abertos, garante o crédito e é compatível com o GeoNames e o datos.gob.ar.</w:t>
       </w:r>
     </w:p>
     <w:p>
@@ -5810,7 +5867,41 @@
         <w:pStyle w:val="Compact"/>
       </w:pPr>
       <w:r>
-        <w:t xml:space="preserve">☐ Outras fontes sugeridas e ainda não coletadas: estudantes de universidades nacionais por província, emprego público por província, titulares do Potenciar Trabajo, projetos de mineração e comunidades indígenas registradas.</w:t>
+        <w:rPr>
+          <w:bCs/>
+          <w:b/>
+        </w:rPr>
+        <w:t xml:space="preserve">Versão em Word do documento de processo</w:t>
+      </w:r>
+      <w:r>
+        <w:t xml:space="preserve"> </w:t>
+      </w:r>
+      <w:r>
+        <w:t xml:space="preserve">(</w:t>
+      </w:r>
+      <w:r>
+        <w:rPr>
+          <w:rStyle w:val="VerbatimChar"/>
+        </w:rPr>
+        <w:t xml:space="preserve">PROCESSO.docx</w:t>
+      </w:r>
+      <w:r>
+        <w:t xml:space="preserve">), gerada a partir deste arquivo por</w:t>
+      </w:r>
+      <w:r>
+        <w:t xml:space="preserve"> </w:t>
+      </w:r>
+      <w:r>
+        <w:rPr>
+          <w:rStyle w:val="VerbatimChar"/>
+        </w:rPr>
+        <w:t xml:space="preserve">pipeline/gerar_processo_docx.py</w:t>
+      </w:r>
+      <w:r>
+        <w:t xml:space="preserve"> </w:t>
+      </w:r>
+      <w:r>
+        <w:t xml:space="preserve">(pandoc + python-docx), para circular no grupo.</w:t>
       </w:r>
     </w:p>
     <w:p>
@@ -5822,23 +5913,183 @@
         <w:pStyle w:val="Compact"/>
       </w:pPr>
       <w:r>
-        <w:t xml:space="preserve">☐ Atualizar o ReNaTEP e o RENABAP quando houver versões oficiais mais recentes.</w:t>
+        <w:rPr>
+          <w:bCs/>
+          <w:b/>
+        </w:rPr>
+        <w:t xml:space="preserve">LISA explicado passo a passo</w:t>
+      </w:r>
+      <w:r>
+        <w:t xml:space="preserve"> </w:t>
+      </w:r>
+      <w:r>
+        <w:t xml:space="preserve">no quadro “Como foi calculado este mapa” (abre sozinho na primeira vez), com exemplo numérico de um ponto quente e de um ponto frio, lista dos departamentos, I global e cuidados; dica do mapa mostra z, média dos vizinhos e I local; glossário e guia ampliados. O teste de permutação passou a sortear os vizinhos</w:t>
+      </w:r>
+      <w:r>
+        <w:t xml:space="preserve"> </w:t>
+      </w:r>
+      <w:r>
+        <w:rPr>
+          <w:bCs/>
+          <w:b/>
+        </w:rPr>
+        <w:t xml:space="preserve">sem reposição</w:t>
+      </w:r>
+      <w:r>
+        <w:t xml:space="preserve"> </w:t>
+      </w:r>
+      <w:r>
+        <w:t xml:space="preserve">(permutação condicional, como no GeoDa); antes sorteava com reposição. Motivo: pedido de deixar claro como o LISA é calculado.</w:t>
+      </w:r>
+    </w:p>
+    <w:p>
+      <w:r>
+        <w:pict>
+          <v:rect style="width:0;height:1.5pt" o:hralign="center" o:hrstd="t" o:hr="t"/>
+        </w:pict>
+      </w:r>
+    </w:p>
+    <w:bookmarkEnd w:id="41"/>
+    <w:bookmarkEnd w:id="42"/>
+    <w:bookmarkStart w:id="43" w:name="X3d9f82193e44c2a113d49ff9b97f8db3ae86c66"/>
+    <w:p>
+      <w:pPr>
+        <w:pStyle w:val="Heading2"/>
+      </w:pPr>
+      <w:r>
+        <w:t xml:space="preserve">10. Pendências</w:t>
       </w:r>
     </w:p>
     <w:p>
       <w:pPr>
         <w:numPr>
           <w:ilvl w:val="0"/>
-          <w:numId w:val="1006"/>
+          <w:numId w:val="1007"/>
         </w:numPr>
         <w:pStyle w:val="Compact"/>
       </w:pPr>
       <w:r>
+        <w:t xml:space="preserve">☐ Confirmar a escolha das licenças com o grupo/centro de pesquisa e, se houver, com a política de dados da instituição.</w:t>
+      </w:r>
+    </w:p>
+    <w:p>
+      <w:pPr>
+        <w:numPr>
+          <w:ilvl w:val="0"/>
+          <w:numId w:val="1007"/>
+        </w:numPr>
+        <w:pStyle w:val="Compact"/>
+      </w:pPr>
+      <w:r>
+        <w:t xml:space="preserve">☐ Depositar a base no Zenodo (ou repositório institucional) para obter um DOI e atualizar a citação em</w:t>
+      </w:r>
+      <w:r>
+        <w:t xml:space="preserve"> </w:t>
+      </w:r>
+      <w:r>
+        <w:rPr>
+          <w:rStyle w:val="VerbatimChar"/>
+        </w:rPr>
+        <w:t xml:space="preserve">LICENCAS.md</w:t>
+      </w:r>
+      <w:r>
+        <w:t xml:space="preserve">.</w:t>
+      </w:r>
+    </w:p>
+    <w:p>
+      <w:pPr>
+        <w:numPr>
+          <w:ilvl w:val="0"/>
+          <w:numId w:val="1007"/>
+        </w:numPr>
+        <w:pStyle w:val="Compact"/>
+      </w:pPr>
+      <w:r>
+        <w:t xml:space="preserve">☐</w:t>
+      </w:r>
+      <w:r>
+        <w:t xml:space="preserve"> </w:t>
+      </w:r>
+      <w:r>
+        <w:rPr>
+          <w:bCs/>
+          <w:b/>
+        </w:rPr>
+        <w:t xml:space="preserve">Unificar nomes de organizações duplicados</w:t>
+      </w:r>
+      <w:r>
+        <w:t xml:space="preserve"> </w:t>
+      </w:r>
+      <w:r>
+        <w:t xml:space="preserve">(ex.: grafias diferentes de CTA e CGT). Afeta contagens, fichas e redes.</w:t>
+      </w:r>
+    </w:p>
+    <w:p>
+      <w:pPr>
+        <w:numPr>
+          <w:ilvl w:val="0"/>
+          <w:numId w:val="1007"/>
+        </w:numPr>
+        <w:pStyle w:val="Compact"/>
+      </w:pPr>
+      <w:r>
+        <w:t xml:space="preserve">☐ Resultado do</w:t>
+      </w:r>
+      <w:r>
+        <w:t xml:space="preserve"> </w:t>
+      </w:r>
+      <w:r>
+        <w:rPr>
+          <w:bCs/>
+          <w:b/>
+        </w:rPr>
+        <w:t xml:space="preserve">2º turno de 2023</w:t>
+      </w:r>
+      <w:r>
+        <w:t xml:space="preserve"> </w:t>
+      </w:r>
+      <w:r>
+        <w:t xml:space="preserve">por departamento, se a DINE publicar no formato mesa a mesa.</w:t>
+      </w:r>
+    </w:p>
+    <w:p>
+      <w:pPr>
+        <w:numPr>
+          <w:ilvl w:val="0"/>
+          <w:numId w:val="1007"/>
+        </w:numPr>
+        <w:pStyle w:val="Compact"/>
+      </w:pPr>
+      <w:r>
+        <w:t xml:space="preserve">☐ Outras fontes sugeridas e ainda não coletadas: estudantes de universidades nacionais por província, emprego público por província, titulares do Potenciar Trabajo, projetos de mineração e comunidades indígenas registradas.</w:t>
+      </w:r>
+    </w:p>
+    <w:p>
+      <w:pPr>
+        <w:numPr>
+          <w:ilvl w:val="0"/>
+          <w:numId w:val="1007"/>
+        </w:numPr>
+        <w:pStyle w:val="Compact"/>
+      </w:pPr>
+      <w:r>
+        <w:t xml:space="preserve">☐ Atualizar o ReNaTEP e o RENABAP quando houver versões oficiais mais recentes.</w:t>
+      </w:r>
+    </w:p>
+    <w:p>
+      <w:pPr>
+        <w:numPr>
+          <w:ilvl w:val="0"/>
+          <w:numId w:val="1007"/>
+        </w:numPr>
+        <w:pStyle w:val="Compact"/>
+      </w:pPr>
+      <w:r>
         <w:t xml:space="preserve">☐ Revisar a codificação de casos em que organizações da economia popular aparecem também como “movimientos sindicales”.</w:t>
       </w:r>
     </w:p>
-    <w:bookmarkEnd w:id="42"/>
     <w:bookmarkEnd w:id="43"/>
+    <w:bookmarkEnd w:id="44"/>
     <w:sectPr>
       <w:footerReference w:type="default" r:id="rId9"/>
       <w:pgSz w:h="16838" w:w="11906"/>
@@ -6194,12 +6445,42 @@
     </w:lvlOverride>
   </w:num>
   <w:num w:numId="1004">
-    <w:abstractNumId w:val="991"/>
+    <w:abstractNumId w:val="99411"/>
+    <w:lvlOverride w:ilvl="0">
+      <w:startOverride w:val="1"/>
+    </w:lvlOverride>
+    <w:lvlOverride w:ilvl="1">
+      <w:startOverride w:val="1"/>
+    </w:lvlOverride>
+    <w:lvlOverride w:ilvl="2">
+      <w:startOverride w:val="1"/>
+    </w:lvlOverride>
+    <w:lvlOverride w:ilvl="3">
+      <w:startOverride w:val="1"/>
+    </w:lvlOverride>
+    <w:lvlOverride w:ilvl="4">
+      <w:startOverride w:val="1"/>
+    </w:lvlOverride>
+    <w:lvlOverride w:ilvl="5">
+      <w:startOverride w:val="1"/>
+    </w:lvlOverride>
+    <w:lvlOverride w:ilvl="6">
+      <w:startOverride w:val="1"/>
+    </w:lvlOverride>
+    <w:lvlOverride w:ilvl="7">
+      <w:startOverride w:val="1"/>
+    </w:lvlOverride>
+    <w:lvlOverride w:ilvl="8">
+      <w:startOverride w:val="1"/>
+    </w:lvlOverride>
   </w:num>
   <w:num w:numId="1005">
     <w:abstractNumId w:val="991"/>
   </w:num>
   <w:num w:numId="1006">
+    <w:abstractNumId w:val="991"/>
+  </w:num>
+  <w:num w:numId="1007">
     <w:abstractNumId w:val="991"/>
   </w:num>
 </w:numbering>

</xml_diff>

<commit_message>
Fichas: lista de escolha só com as categorias do tipo escolhido, com filtro
Co-Authored-By: Claude Opus 5.5 <noreply@anthropic.com>
Claude-Session: https://claude.ai/code/session_01VemTUauk2kCmRrtg5b6HFR
</commit_message>
<xml_diff>
--- a/PROCESSO.docx
+++ b/PROCESSO.docx
@@ -2,7 +2,7 @@
 <file path=word/document.xml><?xml version="1.0" encoding="utf-8"?>
 <w:document xmlns:w="http://schemas.openxmlformats.org/wordprocessingml/2006/main" xmlns:m="http://schemas.openxmlformats.org/officeDocument/2006/math" xmlns:r="http://schemas.openxmlformats.org/officeDocument/2006/relationships" xmlns:o="urn:schemas-microsoft-com:office:office" xmlns:v="urn:schemas-microsoft-com:vml" xmlns:w10="urn:schemas-microsoft-com:office:word" xmlns:a="http://schemas.openxmlformats.org/drawingml/2006/main" xmlns:pic="http://schemas.openxmlformats.org/drawingml/2006/picture" xmlns:wp="http://schemas.openxmlformats.org/drawingml/2006/wordprocessingDrawing">
   <w:body>
-    <w:bookmarkStart w:id="44" w:name="Xa2da3811f05494e056d19a3aa3e79062f38da32"/>
+    <w:bookmarkStart w:id="45" w:name="Xa2da3811f05494e056d19a3aa3e79062f38da32"/>
     <w:p>
       <w:pPr>
         <w:pStyle w:val="Heading1"/>
@@ -259,7 +259,7 @@
               <w:rPr>
                 <w:sz w:val="18"/>
               </w:rPr>
-              <w:t xml:space="preserve">1.3 · 19/10/2026</w:t>
+              <w:t xml:space="preserve">1.4 · 28/10/2026</w:t>
             </w:r>
           </w:p>
         </w:tc>
@@ -5455,7 +5455,7 @@
       </w:r>
     </w:p>
     <w:bookmarkEnd w:id="39"/>
-    <w:bookmarkStart w:id="42" w:name="X37a24ddc49ec6a08847d5e7c09b751dfa640a32"/>
+    <w:bookmarkStart w:id="43" w:name="X37a24ddc49ec6a08847d5e7c09b751dfa640a32"/>
     <w:p>
       <w:pPr>
         <w:pStyle w:val="Heading2"/>
@@ -5942,22 +5942,14 @@
         <w:t xml:space="preserve">(permutação condicional, como no GeoDa); antes sorteava com reposição. Motivo: pedido de deixar claro como o LISA é calculado.</w:t>
       </w:r>
     </w:p>
-    <w:p>
-      <w:r>
-        <w:pict>
-          <v:rect style="width:0;height:1.5pt" o:hralign="center" o:hrstd="t" o:hr="t"/>
-        </w:pict>
-      </w:r>
-    </w:p>
     <w:bookmarkEnd w:id="41"/>
-    <w:bookmarkEnd w:id="42"/>
-    <w:bookmarkStart w:id="43" w:name="X3d9f82193e44c2a113d49ff9b97f8db3ae86c66"/>
-    <w:p>
-      <w:pPr>
-        <w:pStyle w:val="Heading2"/>
-      </w:pPr>
-      <w:r>
-        <w:t xml:space="preserve">10. Pendências</w:t>
+    <w:bookmarkStart w:id="42" w:name="X0243e2acffdb3298bb3301518b805b778538cf8"/>
+    <w:p>
+      <w:pPr>
+        <w:pStyle w:val="Heading3"/>
+      </w:pPr>
+      <w:r>
+        <w:t xml:space="preserve">28/10/2026</w:t>
       </w:r>
     </w:p>
     <w:p>
@@ -5969,42 +5961,82 @@
         <w:pStyle w:val="Compact"/>
       </w:pPr>
       <w:r>
-        <w:t xml:space="preserve">☐ Confirmar a escolha das licenças com o grupo/centro de pesquisa e, se houver, com a política de dados da instituição.</w:t>
+        <w:rPr>
+          <w:bCs/>
+          <w:b/>
+        </w:rPr>
+        <w:t xml:space="preserve">Fichas:</w:t>
+      </w:r>
+      <w:r>
+        <w:t xml:space="preserve"> </w:t>
+      </w:r>
+      <w:r>
+        <w:t xml:space="preserve">a escolha passou a ser uma lista fechada só com as categorias do tipo de ficha escolhido (por exemplo, só objetivos), com o número de notícias, e um campo para filtrar a lista. Motivo: o campo de texto anterior, com sugestões, deixava o navegador misturar valores digitados antes em outros tipos de ficha (nomes de movimentos, províncias).</w:t>
+      </w:r>
+    </w:p>
+    <w:p>
+      <w:r>
+        <w:pict>
+          <v:rect style="width:0;height:1.5pt" o:hralign="center" o:hrstd="t" o:hr="t"/>
+        </w:pict>
+      </w:r>
+    </w:p>
+    <w:bookmarkEnd w:id="42"/>
+    <w:bookmarkEnd w:id="43"/>
+    <w:bookmarkStart w:id="44" w:name="X3d9f82193e44c2a113d49ff9b97f8db3ae86c66"/>
+    <w:p>
+      <w:pPr>
+        <w:pStyle w:val="Heading2"/>
+      </w:pPr>
+      <w:r>
+        <w:t xml:space="preserve">10. Pendências</w:t>
       </w:r>
     </w:p>
     <w:p>
       <w:pPr>
         <w:numPr>
           <w:ilvl w:val="0"/>
-          <w:numId w:val="1007"/>
+          <w:numId w:val="1008"/>
         </w:numPr>
         <w:pStyle w:val="Compact"/>
       </w:pPr>
       <w:r>
-        <w:t xml:space="preserve">☐ Depositar a base no Zenodo (ou repositório institucional) para obter um DOI e atualizar a citação em</w:t>
-      </w:r>
-      <w:r>
-        <w:t xml:space="preserve"> </w:t>
-      </w:r>
-      <w:r>
-        <w:rPr>
-          <w:rStyle w:val="VerbatimChar"/>
-        </w:rPr>
-        <w:t xml:space="preserve">LICENCAS.md</w:t>
-      </w:r>
-      <w:r>
-        <w:t xml:space="preserve">.</w:t>
+        <w:t xml:space="preserve">☐ Confirmar a escolha das licenças com o grupo/centro de pesquisa e, se houver, com a política de dados da instituição.</w:t>
       </w:r>
     </w:p>
     <w:p>
       <w:pPr>
         <w:numPr>
           <w:ilvl w:val="0"/>
-          <w:numId w:val="1007"/>
+          <w:numId w:val="1008"/>
         </w:numPr>
         <w:pStyle w:val="Compact"/>
       </w:pPr>
       <w:r>
+        <w:t xml:space="preserve">☐ Depositar a base no Zenodo (ou repositório institucional) para obter um DOI e atualizar a citação em</w:t>
+      </w:r>
+      <w:r>
+        <w:t xml:space="preserve"> </w:t>
+      </w:r>
+      <w:r>
+        <w:rPr>
+          <w:rStyle w:val="VerbatimChar"/>
+        </w:rPr>
+        <w:t xml:space="preserve">LICENCAS.md</w:t>
+      </w:r>
+      <w:r>
+        <w:t xml:space="preserve">.</w:t>
+      </w:r>
+    </w:p>
+    <w:p>
+      <w:pPr>
+        <w:numPr>
+          <w:ilvl w:val="0"/>
+          <w:numId w:val="1008"/>
+        </w:numPr>
+        <w:pStyle w:val="Compact"/>
+      </w:pPr>
+      <w:r>
         <w:t xml:space="preserve">☐</w:t>
       </w:r>
       <w:r>
@@ -6028,7 +6060,7 @@
       <w:pPr>
         <w:numPr>
           <w:ilvl w:val="0"/>
-          <w:numId w:val="1007"/>
+          <w:numId w:val="1008"/>
         </w:numPr>
         <w:pStyle w:val="Compact"/>
       </w:pPr>
@@ -6056,7 +6088,7 @@
       <w:pPr>
         <w:numPr>
           <w:ilvl w:val="0"/>
-          <w:numId w:val="1007"/>
+          <w:numId w:val="1008"/>
         </w:numPr>
         <w:pStyle w:val="Compact"/>
       </w:pPr>
@@ -6068,7 +6100,7 @@
       <w:pPr>
         <w:numPr>
           <w:ilvl w:val="0"/>
-          <w:numId w:val="1007"/>
+          <w:numId w:val="1008"/>
         </w:numPr>
         <w:pStyle w:val="Compact"/>
       </w:pPr>
@@ -6080,7 +6112,7 @@
       <w:pPr>
         <w:numPr>
           <w:ilvl w:val="0"/>
-          <w:numId w:val="1007"/>
+          <w:numId w:val="1008"/>
         </w:numPr>
         <w:pStyle w:val="Compact"/>
       </w:pPr>
@@ -6088,8 +6120,8 @@
         <w:t xml:space="preserve">☐ Revisar a codificação de casos em que organizações da economia popular aparecem também como “movimientos sindicales”.</w:t>
       </w:r>
     </w:p>
-    <w:bookmarkEnd w:id="43"/>
     <w:bookmarkEnd w:id="44"/>
+    <w:bookmarkEnd w:id="45"/>
     <w:sectPr>
       <w:footerReference w:type="default" r:id="rId9"/>
       <w:pgSz w:h="16838" w:w="11906"/>
@@ -6481,6 +6513,9 @@
     <w:abstractNumId w:val="991"/>
   </w:num>
   <w:num w:numId="1007">
+    <w:abstractNumId w:val="991"/>
+  </w:num>
+  <w:num w:numId="1008">
     <w:abstractNumId w:val="991"/>
   </w:num>
 </w:numbering>

</xml_diff>

<commit_message>
Versão em espanhol, seletores de ano e país, busca no topo e página Sobre
- Ano e país como variáveis (colunas opcionais Año/País) e seletores no topo da base
- Busca por palavra fixa no topo, filtrando todas as abas e guardada no link
- Página "Sobre e metodologia" (/sobre/)
- Versão em espanhol (/es/) gerada por i18n/ferramenta.js a partir do catálogo i18n/es.json;
  o GitHub Actions passa a gerá-la e a publicar sobre/ e es/
- Troca de idioma mantendo aba e filtros; ?v= atualizado
- PROCESSO.md 1.5 (+ Word), README e reconstruir.sh atualizados

Co-Authored-By: Claude Opus 5.5 <noreply@anthropic.com>
Claude-Session: https://claude.ai/code/session_01VemTUauk2kCmRrtg5b6HFR
</commit_message>
<xml_diff>
--- a/PROCESSO.docx
+++ b/PROCESSO.docx
@@ -2,7 +2,7 @@
 <file path=word/document.xml><?xml version="1.0" encoding="utf-8"?>
 <w:document xmlns:w="http://schemas.openxmlformats.org/wordprocessingml/2006/main" xmlns:m="http://schemas.openxmlformats.org/officeDocument/2006/math" xmlns:r="http://schemas.openxmlformats.org/officeDocument/2006/relationships" xmlns:o="urn:schemas-microsoft-com:office:office" xmlns:v="urn:schemas-microsoft-com:vml" xmlns:w10="urn:schemas-microsoft-com:office:word" xmlns:a="http://schemas.openxmlformats.org/drawingml/2006/main" xmlns:pic="http://schemas.openxmlformats.org/drawingml/2006/picture" xmlns:wp="http://schemas.openxmlformats.org/drawingml/2006/wordprocessingDrawing">
   <w:body>
-    <w:bookmarkStart w:id="45" w:name="Xa2da3811f05494e056d19a3aa3e79062f38da32"/>
+    <w:bookmarkStart w:id="49" w:name="Xa2da3811f05494e056d19a3aa3e79062f38da32"/>
     <w:p>
       <w:pPr>
         <w:pStyle w:val="Heading1"/>
@@ -189,6 +189,44 @@
               <w:rPr>
                 <w:sz w:val="18"/>
               </w:rPr>
+              <w:t xml:space="preserve">, página de metodologia em</w:t>
+            </w:r>
+            <w:r>
+              <w:rPr>
+                <w:sz w:val="18"/>
+              </w:rPr>
+              <w:t xml:space="preserve"> </w:t>
+            </w:r>
+            <w:r>
+              <w:rPr>
+                <w:rStyle w:val="VerbatimChar"/>
+                <w:sz w:val="18"/>
+              </w:rPr>
+              <w:t xml:space="preserve">/sobre/</w:t>
+            </w:r>
+            <w:r>
+              <w:rPr>
+                <w:sz w:val="18"/>
+              </w:rPr>
+              <w:t xml:space="preserve">, versão em espanhol em</w:t>
+            </w:r>
+            <w:r>
+              <w:rPr>
+                <w:sz w:val="18"/>
+              </w:rPr>
+              <w:t xml:space="preserve"> </w:t>
+            </w:r>
+            <w:r>
+              <w:rPr>
+                <w:rStyle w:val="VerbatimChar"/>
+                <w:sz w:val="18"/>
+              </w:rPr>
+              <w:t xml:space="preserve">/es/</w:t>
+            </w:r>
+            <w:r>
+              <w:rPr>
+                <w:sz w:val="18"/>
+              </w:rPr>
               <w:t xml:space="preserve">)</w:t>
             </w:r>
           </w:p>
@@ -259,7 +297,7 @@
               <w:rPr>
                 <w:sz w:val="18"/>
               </w:rPr>
-              <w:t xml:space="preserve">1.4 · 28/10/2026</w:t>
+              <w:t xml:space="preserve">1.5 · 30/10/2026</w:t>
             </w:r>
           </w:p>
         </w:tc>
@@ -1409,7 +1447,7 @@
         <w:rPr>
           <w:rStyle w:val="CommentTok"/>
         </w:rPr>
-        <w:t xml:space="preserve"># 5. Ver localmente</w:t>
+        <w:t xml:space="preserve"># 5. Versão em espanhol (requer Node; o pacote typescript só é usado para ler o JavaScript)</w:t>
       </w:r>
       <w:r>
         <w:br/>
@@ -1418,6 +1456,90 @@
         <w:rPr>
           <w:rStyle w:val="ExtensionTok"/>
         </w:rPr>
+        <w:t xml:space="preserve">npm</w:t>
+      </w:r>
+      <w:r>
+        <w:rPr>
+          <w:rStyle w:val="NormalTok"/>
+        </w:rPr>
+        <w:t xml:space="preserve"> install </w:t>
+      </w:r>
+      <w:r>
+        <w:rPr>
+          <w:rStyle w:val="AttributeTok"/>
+        </w:rPr>
+        <w:t xml:space="preserve">--prefix</w:t>
+      </w:r>
+      <w:r>
+        <w:rPr>
+          <w:rStyle w:val="NormalTok"/>
+        </w:rPr>
+        <w:t xml:space="preserve"> i18n </w:t>
+      </w:r>
+      <w:r>
+        <w:rPr>
+          <w:rStyle w:val="AttributeTok"/>
+        </w:rPr>
+        <w:t xml:space="preserve">--no-save</w:t>
+      </w:r>
+      <w:r>
+        <w:rPr>
+          <w:rStyle w:val="NormalTok"/>
+        </w:rPr>
+        <w:t xml:space="preserve"> </w:t>
+      </w:r>
+      <w:r>
+        <w:rPr>
+          <w:rStyle w:val="AttributeTok"/>
+        </w:rPr>
+        <w:t xml:space="preserve">--no-package-lock</w:t>
+      </w:r>
+      <w:r>
+        <w:rPr>
+          <w:rStyle w:val="NormalTok"/>
+        </w:rPr>
+        <w:t xml:space="preserve"> typescript@5.6.3</w:t>
+      </w:r>
+      <w:r>
+        <w:br/>
+      </w:r>
+      <w:r>
+        <w:rPr>
+          <w:rStyle w:val="ExtensionTok"/>
+        </w:rPr>
+        <w:t xml:space="preserve">node</w:t>
+      </w:r>
+      <w:r>
+        <w:rPr>
+          <w:rStyle w:val="NormalTok"/>
+        </w:rPr>
+        <w:t xml:space="preserve"> i18n/ferramenta.js gerar                           </w:t>
+      </w:r>
+      <w:r>
+        <w:rPr>
+          <w:rStyle w:val="CommentTok"/>
+        </w:rPr>
+        <w:t xml:space="preserve"># → es/, assets/js/app-es/, i18n/pendentes.json</w:t>
+      </w:r>
+      <w:r>
+        <w:br/>
+      </w:r>
+      <w:r>
+        <w:br/>
+      </w:r>
+      <w:r>
+        <w:rPr>
+          <w:rStyle w:val="CommentTok"/>
+        </w:rPr>
+        <w:t xml:space="preserve"># 6. Ver localmente</w:t>
+      </w:r>
+      <w:r>
+        <w:br/>
+      </w:r>
+      <w:r>
+        <w:rPr>
+          <w:rStyle w:val="ExtensionTok"/>
+        </w:rPr>
         <w:t xml:space="preserve">python</w:t>
       </w:r>
       <w:r>
@@ -1442,7 +1564,7 @@
         <w:rPr>
           <w:rStyle w:val="CommentTok"/>
         </w:rPr>
-        <w:t xml:space="preserve"># abrir http://localhost:8000/base/</w:t>
+        <w:t xml:space="preserve"># abrir http://localhost:8000/base/ e /es/base/</w:t>
       </w:r>
       <w:r>
         <w:br/>
@@ -1454,7 +1576,7 @@
         <w:rPr>
           <w:rStyle w:val="CommentTok"/>
         </w:rPr>
-        <w:t xml:space="preserve"># 6. Publicar: enviar ao ramo main; o GitHub Actions (.github/workflows/publicar.yml) repete 2–4 e publica</w:t>
+        <w:t xml:space="preserve"># 7. Publicar: enviar ao ramo main; o GitHub Actions (.github/workflows/publicar.yml) repete 2–5 e publica</w:t>
       </w:r>
       <w:r>
         <w:br/>
@@ -1571,7 +1693,7 @@
         <w:t xml:space="preserve"> </w:t>
       </w:r>
       <w:r>
-        <w:t xml:space="preserve">repetir os passos 1 a 6. Os arquivos de referência (</w:t>
+        <w:t xml:space="preserve">repetir os passos 1 a 7. Os arquivos de referência (</w:t>
       </w:r>
       <w:r>
         <w:rPr>
@@ -2211,6 +2333,212 @@
                 <w:sz w:val="18"/>
               </w:rPr>
               <w:t xml:space="preserve">Data de início da ação; na falta dela, data de publicação. Usada na série semanal e no calendário.</w:t>
+            </w:r>
+          </w:p>
+        </w:tc>
+      </w:tr>
+      <w:tr>
+        <w:tc>
+          <w:tcPr/>
+          <w:p>
+            <w:pPr>
+              <w:pStyle w:val="Compact"/>
+              <w:spacing w:after="20"/>
+              <w:jc w:val="left"/>
+            </w:pPr>
+            <w:r>
+              <w:rPr>
+                <w:sz w:val="18"/>
+              </w:rPr>
+              <w:t xml:space="preserve">Ano e país</w:t>
+            </w:r>
+          </w:p>
+        </w:tc>
+        <w:tc>
+          <w:tcPr/>
+          <w:p>
+            <w:pPr>
+              <w:pStyle w:val="Compact"/>
+              <w:spacing w:after="20"/>
+              <w:jc w:val="left"/>
+            </w:pPr>
+            <w:r>
+              <w:rPr>
+                <w:sz w:val="18"/>
+              </w:rPr>
+              <w:t xml:space="preserve">Duas variáveis novas no início da base (30/10/2026).</w:t>
+            </w:r>
+            <w:r>
+              <w:rPr>
+                <w:sz w:val="18"/>
+              </w:rPr>
+              <w:t xml:space="preserve"> </w:t>
+            </w:r>
+            <w:r>
+              <w:rPr>
+                <w:bCs/>
+                <w:b/>
+                <w:sz w:val="18"/>
+              </w:rPr>
+              <w:t xml:space="preserve">Ano</w:t>
+            </w:r>
+            <w:r>
+              <w:rPr>
+                <w:sz w:val="18"/>
+              </w:rPr>
+              <w:t xml:space="preserve">: coluna</w:t>
+            </w:r>
+            <w:r>
+              <w:rPr>
+                <w:sz w:val="18"/>
+              </w:rPr>
+              <w:t xml:space="preserve"> </w:t>
+            </w:r>
+            <w:r>
+              <w:rPr>
+                <w:rStyle w:val="VerbatimChar"/>
+                <w:sz w:val="18"/>
+              </w:rPr>
+              <w:t xml:space="preserve">Año</w:t>
+            </w:r>
+            <w:r>
+              <w:rPr>
+                <w:sz w:val="18"/>
+              </w:rPr>
+              <w:t xml:space="preserve"> </w:t>
+            </w:r>
+            <w:r>
+              <w:rPr>
+                <w:sz w:val="18"/>
+              </w:rPr>
+              <w:t xml:space="preserve">(ou</w:t>
+            </w:r>
+            <w:r>
+              <w:rPr>
+                <w:sz w:val="18"/>
+              </w:rPr>
+              <w:t xml:space="preserve"> </w:t>
+            </w:r>
+            <w:r>
+              <w:rPr>
+                <w:rStyle w:val="VerbatimChar"/>
+                <w:sz w:val="18"/>
+              </w:rPr>
+              <w:t xml:space="preserve">Ano</w:t>
+            </w:r>
+            <w:r>
+              <w:rPr>
+                <w:sz w:val="18"/>
+              </w:rPr>
+              <w:t xml:space="preserve">) da planilha, se existir; senão, o ano da data da notícia.</w:t>
+            </w:r>
+            <w:r>
+              <w:rPr>
+                <w:sz w:val="18"/>
+              </w:rPr>
+              <w:t xml:space="preserve"> </w:t>
+            </w:r>
+            <w:r>
+              <w:rPr>
+                <w:bCs/>
+                <w:b/>
+                <w:sz w:val="18"/>
+              </w:rPr>
+              <w:t xml:space="preserve">País</w:t>
+            </w:r>
+            <w:r>
+              <w:rPr>
+                <w:sz w:val="18"/>
+              </w:rPr>
+              <w:t xml:space="preserve">: coluna</w:t>
+            </w:r>
+            <w:r>
+              <w:rPr>
+                <w:sz w:val="18"/>
+              </w:rPr>
+              <w:t xml:space="preserve"> </w:t>
+            </w:r>
+            <w:r>
+              <w:rPr>
+                <w:rStyle w:val="VerbatimChar"/>
+                <w:sz w:val="18"/>
+              </w:rPr>
+              <w:t xml:space="preserve">País</w:t>
+            </w:r>
+            <w:r>
+              <w:rPr>
+                <w:sz w:val="18"/>
+              </w:rPr>
+              <w:t xml:space="preserve"> </w:t>
+            </w:r>
+            <w:r>
+              <w:rPr>
+                <w:sz w:val="18"/>
+              </w:rPr>
+              <w:t xml:space="preserve">(ou</w:t>
+            </w:r>
+            <w:r>
+              <w:rPr>
+                <w:sz w:val="18"/>
+              </w:rPr>
+              <w:t xml:space="preserve"> </w:t>
+            </w:r>
+            <w:r>
+              <w:rPr>
+                <w:rStyle w:val="VerbatimChar"/>
+                <w:sz w:val="18"/>
+              </w:rPr>
+              <w:t xml:space="preserve">Pais</w:t>
+            </w:r>
+            <w:r>
+              <w:rPr>
+                <w:sz w:val="18"/>
+              </w:rPr>
+              <w:t xml:space="preserve">), se existir; senão, “Argentina”. As duas colunas são opcionais em</w:t>
+            </w:r>
+            <w:r>
+              <w:rPr>
+                <w:sz w:val="18"/>
+              </w:rPr>
+              <w:t xml:space="preserve"> </w:t>
+            </w:r>
+            <w:r>
+              <w:rPr>
+                <w:rStyle w:val="VerbatimChar"/>
+                <w:sz w:val="18"/>
+              </w:rPr>
+              <w:t xml:space="preserve">anonimizar.py</w:t>
+            </w:r>
+            <w:r>
+              <w:rPr>
+                <w:sz w:val="18"/>
+              </w:rPr>
+              <w:t xml:space="preserve"> </w:t>
+            </w:r>
+            <w:r>
+              <w:rPr>
+                <w:sz w:val="18"/>
+              </w:rPr>
+              <w:t xml:space="preserve">e</w:t>
+            </w:r>
+            <w:r>
+              <w:rPr>
+                <w:sz w:val="18"/>
+              </w:rPr>
+              <w:t xml:space="preserve"> </w:t>
+            </w:r>
+            <w:r>
+              <w:rPr>
+                <w:rStyle w:val="VerbatimChar"/>
+                <w:sz w:val="18"/>
+              </w:rPr>
+              <w:t xml:space="preserve">verificar_privacidade.py</w:t>
+            </w:r>
+            <w:r>
+              <w:rPr>
+                <w:sz w:val="18"/>
+              </w:rPr>
+              <w:t xml:space="preserve">. Servem para juntar, numa mesma planilha padronizada, vários anos (2020–2024) e outros países (Brasil), e já aparecem como seletores no topo da base. Hoje a base tem um só ano e um só país, então os seletores mostram apenas 2024 e Argentina.</w:t>
             </w:r>
           </w:p>
         </w:tc>
@@ -3878,7 +4206,7 @@
     </w:p>
     <w:bookmarkEnd w:id="35"/>
     <w:bookmarkEnd w:id="36"/>
-    <w:bookmarkStart w:id="38" w:name="X6d348273175772d54216bfc7432a22c556cacdc"/>
+    <w:bookmarkStart w:id="41" w:name="X6d348273175772d54216bfc7432a22c556cacdc"/>
     <w:p>
       <w:pPr>
         <w:pStyle w:val="Heading2"/>
@@ -5047,6 +5375,466 @@
         <w:t xml:space="preserve">fundo branco, tipografia Urbanist (hospedada no próprio site, licença OFL), ilustração de marcha gerada a partir dos objetivos mais frequentes da base; mapas em Arial para exportação estável.</w:t>
       </w:r>
     </w:p>
+    <w:bookmarkEnd w:id="37"/>
+    <w:bookmarkStart w:id="38" w:name="X6462eb4f94f59a5ac833c9718ffe94916519a9f"/>
+    <w:p>
+      <w:pPr>
+        <w:pStyle w:val="Heading3"/>
+      </w:pPr>
+      <w:r>
+        <w:t xml:space="preserve">7.2 Seletores de ano e país e busca nas notícias</w:t>
+      </w:r>
+    </w:p>
+    <w:p>
+      <w:pPr>
+        <w:numPr>
+          <w:ilvl w:val="0"/>
+          <w:numId w:val="1005"/>
+        </w:numPr>
+        <w:pStyle w:val="Compact"/>
+      </w:pPr>
+      <w:r>
+        <w:t xml:space="preserve">No topo da base, ao lado da variável e do cruzamento, há</w:t>
+      </w:r>
+      <w:r>
+        <w:t xml:space="preserve"> </w:t>
+      </w:r>
+      <w:r>
+        <w:rPr>
+          <w:bCs/>
+          <w:b/>
+        </w:rPr>
+        <w:t xml:space="preserve">seletores de ano e de país</w:t>
+      </w:r>
+      <w:r>
+        <w:t xml:space="preserve"> </w:t>
+      </w:r>
+      <w:r>
+        <w:t xml:space="preserve">(</w:t>
+      </w:r>
+      <w:r>
+        <w:rPr>
+          <w:rStyle w:val="VerbatimChar"/>
+        </w:rPr>
+        <w:t xml:space="preserve">fAno</w:t>
+      </w:r>
+      <w:r>
+        <w:t xml:space="preserve">,</w:t>
+      </w:r>
+      <w:r>
+        <w:t xml:space="preserve"> </w:t>
+      </w:r>
+      <w:r>
+        <w:rPr>
+          <w:rStyle w:val="VerbatimChar"/>
+        </w:rPr>
+        <w:t xml:space="preserve">fPais</w:t>
+      </w:r>
+      <w:r>
+        <w:t xml:space="preserve">), que filtram todas as abas, e um</w:t>
+      </w:r>
+      <w:r>
+        <w:t xml:space="preserve"> </w:t>
+      </w:r>
+      <w:r>
+        <w:rPr>
+          <w:bCs/>
+          <w:b/>
+        </w:rPr>
+        <w:t xml:space="preserve">campo de busca</w:t>
+      </w:r>
+      <w:r>
+        <w:t xml:space="preserve"> </w:t>
+      </w:r>
+      <w:r>
+        <w:t xml:space="preserve">(</w:t>
+      </w:r>
+      <w:r>
+        <w:rPr>
+          <w:rStyle w:val="VerbatimChar"/>
+        </w:rPr>
+        <w:t xml:space="preserve">qTop</w:t>
+      </w:r>
+      <w:r>
+        <w:t xml:space="preserve">) sempre visível.</w:t>
+      </w:r>
+    </w:p>
+    <w:p>
+      <w:pPr>
+        <w:numPr>
+          <w:ilvl w:val="0"/>
+          <w:numId w:val="1005"/>
+        </w:numPr>
+        <w:pStyle w:val="Compact"/>
+      </w:pPr>
+      <w:r>
+        <w:t xml:space="preserve">A busca procura a palavra no título, na fonte e no código da notícia, sem diferenciar maiúsculas nem acentos. Ela</w:t>
+      </w:r>
+      <w:r>
+        <w:t xml:space="preserve"> </w:t>
+      </w:r>
+      <w:r>
+        <w:rPr>
+          <w:bCs/>
+          <w:b/>
+        </w:rPr>
+        <w:t xml:space="preserve">filtra todas as abas</w:t>
+      </w:r>
+      <w:r>
+        <w:t xml:space="preserve"> </w:t>
+      </w:r>
+      <w:r>
+        <w:t xml:space="preserve">(antes valia só para a lista de notícias), aparece como etiqueta “Palavra: …” nos filtros, entra no texto do recorte das pranchas e fica guardada no link (</w:t>
+      </w:r>
+      <w:r>
+        <w:rPr>
+          <w:rStyle w:val="VerbatimChar"/>
+        </w:rPr>
+        <w:t xml:space="preserve">q=</w:t>
+      </w:r>
+      <w:r>
+        <w:t xml:space="preserve">). O botão “Ver notícias” leva à lista do recorte.</w:t>
+      </w:r>
+    </w:p>
+    <w:bookmarkEnd w:id="38"/>
+    <w:bookmarkStart w:id="39" w:name="X4031718f82c58153f462ccdd941a59e04038a6e"/>
+    <w:p>
+      <w:pPr>
+        <w:pStyle w:val="Heading3"/>
+      </w:pPr>
+      <w:r>
+        <w:t xml:space="preserve">7.3 Página “Sobre e metodologia”</w:t>
+      </w:r>
+    </w:p>
+    <w:p>
+      <w:pPr>
+        <w:pStyle w:val="FirstParagraph"/>
+      </w:pPr>
+      <w:r>
+        <w:rPr>
+          <w:rStyle w:val="VerbatimChar"/>
+        </w:rPr>
+        <w:t xml:space="preserve">sobre/index.html</w:t>
+      </w:r>
+      <w:r>
+        <w:t xml:space="preserve"> </w:t>
+      </w:r>
+      <w:r>
+        <w:t xml:space="preserve">(estilo em</w:t>
+      </w:r>
+      <w:r>
+        <w:t xml:space="preserve"> </w:t>
+      </w:r>
+      <w:r>
+        <w:rPr>
+          <w:rStyle w:val="VerbatimChar"/>
+        </w:rPr>
+        <w:t xml:space="preserve">assets/css/sobre.css</w:t>
+      </w:r>
+      <w:r>
+        <w:t xml:space="preserve">): o que é a base, como foi construída (codificação, anonimização, padronização, georreferenciação, indicadores, publicação), variáveis por dimensão, fontes oficiais, como os números são calculados, ferramentas, limites, licença e citação. Ligada no menu da página inicial e da base.</w:t>
+      </w:r>
+    </w:p>
+    <w:bookmarkEnd w:id="39"/>
+    <w:bookmarkStart w:id="40" w:name="Xe2536c815164416847d5f5b617d6e05abe31b59"/>
+    <w:p>
+      <w:pPr>
+        <w:pStyle w:val="Heading3"/>
+      </w:pPr>
+      <w:r>
+        <w:t xml:space="preserve">7.4 Versão em espanhol</w:t>
+      </w:r>
+    </w:p>
+    <w:p>
+      <w:pPr>
+        <w:numPr>
+          <w:ilvl w:val="0"/>
+          <w:numId w:val="1006"/>
+        </w:numPr>
+        <w:pStyle w:val="Compact"/>
+      </w:pPr>
+      <w:r>
+        <w:t xml:space="preserve">Endereços:</w:t>
+      </w:r>
+      <w:r>
+        <w:t xml:space="preserve"> </w:t>
+      </w:r>
+      <w:r>
+        <w:rPr>
+          <w:rStyle w:val="VerbatimChar"/>
+        </w:rPr>
+        <w:t xml:space="preserve">/es/</w:t>
+      </w:r>
+      <w:r>
+        <w:t xml:space="preserve">,</w:t>
+      </w:r>
+      <w:r>
+        <w:t xml:space="preserve"> </w:t>
+      </w:r>
+      <w:r>
+        <w:rPr>
+          <w:rStyle w:val="VerbatimChar"/>
+        </w:rPr>
+        <w:t xml:space="preserve">/es/base/</w:t>
+      </w:r>
+      <w:r>
+        <w:t xml:space="preserve"> </w:t>
+      </w:r>
+      <w:r>
+        <w:t xml:space="preserve">e</w:t>
+      </w:r>
+      <w:r>
+        <w:t xml:space="preserve"> </w:t>
+      </w:r>
+      <w:r>
+        <w:rPr>
+          <w:rStyle w:val="VerbatimChar"/>
+        </w:rPr>
+        <w:t xml:space="preserve">/es/sobre/</w:t>
+      </w:r>
+      <w:r>
+        <w:t xml:space="preserve">; o link “Español”/“Português” no menu troca de idioma (na base, mantendo aba e filtros).</w:t>
+      </w:r>
+    </w:p>
+    <w:p>
+      <w:pPr>
+        <w:numPr>
+          <w:ilvl w:val="0"/>
+          <w:numId w:val="1006"/>
+        </w:numPr>
+        <w:pStyle w:val="Compact"/>
+      </w:pPr>
+      <w:r>
+        <w:rPr>
+          <w:bCs/>
+          <w:b/>
+        </w:rPr>
+        <w:t xml:space="preserve">Como é gerada.</w:t>
+      </w:r>
+      <w:r>
+        <w:t xml:space="preserve"> </w:t>
+      </w:r>
+      <w:r>
+        <w:t xml:space="preserve">O português continua sendo o original.</w:t>
+      </w:r>
+      <w:r>
+        <w:t xml:space="preserve"> </w:t>
+      </w:r>
+      <w:r>
+        <w:rPr>
+          <w:rStyle w:val="VerbatimChar"/>
+        </w:rPr>
+        <w:t xml:space="preserve">i18n/ferramenta.js</w:t>
+      </w:r>
+      <w:r>
+        <w:t xml:space="preserve"> </w:t>
+      </w:r>
+      <w:r>
+        <w:t xml:space="preserve">(Node) lê o JavaScript com o analisador do TypeScript e as páginas HTML, encontra cada trecho de texto e o troca pela tradução do catálogo</w:t>
+      </w:r>
+      <w:r>
+        <w:t xml:space="preserve"> </w:t>
+      </w:r>
+      <w:r>
+        <w:rPr>
+          <w:rStyle w:val="VerbatimChar"/>
+        </w:rPr>
+        <w:t xml:space="preserve">i18n/es.json</w:t>
+      </w:r>
+      <w:r>
+        <w:t xml:space="preserve"> </w:t>
+      </w:r>
+      <w:r>
+        <w:t xml:space="preserve">(pares “texto em português” → “texto em espanhol”, cerca de 1.800). Palavras curtas que em outros arquivos são chaves internas (meses abreviados, “forte”, “baixo”…) são traduzidas só no arquivo certo, por</w:t>
+      </w:r>
+      <w:r>
+        <w:t xml:space="preserve"> </w:t>
+      </w:r>
+      <w:r>
+        <w:rPr>
+          <w:rStyle w:val="VerbatimChar"/>
+        </w:rPr>
+        <w:t xml:space="preserve">i18n/es-contexto.json</w:t>
+      </w:r>
+      <w:r>
+        <w:t xml:space="preserve">. Textos que são iguais nas duas línguas ou não devem ser traduzidos (nomes de organizações, seletores CSS, definições do INDEC já em espanhol) ficam em</w:t>
+      </w:r>
+      <w:r>
+        <w:t xml:space="preserve"> </w:t>
+      </w:r>
+      <w:r>
+        <w:rPr>
+          <w:rStyle w:val="VerbatimChar"/>
+        </w:rPr>
+        <w:t xml:space="preserve">i18n/ignorar.json</w:t>
+      </w:r>
+      <w:r>
+        <w:t xml:space="preserve">.</w:t>
+      </w:r>
+    </w:p>
+    <w:p>
+      <w:pPr>
+        <w:numPr>
+          <w:ilvl w:val="0"/>
+          <w:numId w:val="1006"/>
+        </w:numPr>
+        <w:pStyle w:val="Compact"/>
+      </w:pPr>
+      <w:r>
+        <w:t xml:space="preserve">Saídas geradas (não editar à mão):</w:t>
+      </w:r>
+      <w:r>
+        <w:t xml:space="preserve"> </w:t>
+      </w:r>
+      <w:r>
+        <w:rPr>
+          <w:rStyle w:val="VerbatimChar"/>
+        </w:rPr>
+        <w:t xml:space="preserve">es/index.html</w:t>
+      </w:r>
+      <w:r>
+        <w:t xml:space="preserve">,</w:t>
+      </w:r>
+      <w:r>
+        <w:t xml:space="preserve"> </w:t>
+      </w:r>
+      <w:r>
+        <w:rPr>
+          <w:rStyle w:val="VerbatimChar"/>
+        </w:rPr>
+        <w:t xml:space="preserve">es/base/index.html</w:t>
+      </w:r>
+      <w:r>
+        <w:t xml:space="preserve">,</w:t>
+      </w:r>
+      <w:r>
+        <w:t xml:space="preserve"> </w:t>
+      </w:r>
+      <w:r>
+        <w:rPr>
+          <w:rStyle w:val="VerbatimChar"/>
+        </w:rPr>
+        <w:t xml:space="preserve">es/sobre/index.html</w:t>
+      </w:r>
+      <w:r>
+        <w:t xml:space="preserve"> </w:t>
+      </w:r>
+      <w:r>
+        <w:t xml:space="preserve">e</w:t>
+      </w:r>
+      <w:r>
+        <w:t xml:space="preserve"> </w:t>
+      </w:r>
+      <w:r>
+        <w:rPr>
+          <w:rStyle w:val="VerbatimChar"/>
+        </w:rPr>
+        <w:t xml:space="preserve">assets/js/app-es/*.js</w:t>
+      </w:r>
+      <w:r>
+        <w:t xml:space="preserve">. Rótulos que vêm dos dados (nomes das variáveis, meses, indicadores, acontecimentos) são traduzidos no navegador, logo depois de carregar os JSON (</w:t>
+      </w:r>
+      <w:r>
+        <w:rPr>
+          <w:rStyle w:val="VerbatimChar"/>
+        </w:rPr>
+        <w:t xml:space="preserve">TR_DADOS</w:t>
+      </w:r>
+      <w:r>
+        <w:t xml:space="preserve"> </w:t>
+      </w:r>
+      <w:r>
+        <w:t xml:space="preserve">em</w:t>
+      </w:r>
+      <w:r>
+        <w:t xml:space="preserve"> </w:t>
+      </w:r>
+      <w:r>
+        <w:rPr>
+          <w:rStyle w:val="VerbatimChar"/>
+        </w:rPr>
+        <w:t xml:space="preserve">assets/js/app-es/carregar.js</w:t>
+      </w:r>
+      <w:r>
+        <w:t xml:space="preserve">). Datas e números usam o formato</w:t>
+      </w:r>
+      <w:r>
+        <w:t xml:space="preserve"> </w:t>
+      </w:r>
+      <w:r>
+        <w:rPr>
+          <w:rStyle w:val="VerbatimChar"/>
+        </w:rPr>
+        <w:t xml:space="preserve">es-AR</w:t>
+      </w:r>
+      <w:r>
+        <w:t xml:space="preserve">.</w:t>
+      </w:r>
+    </w:p>
+    <w:p>
+      <w:pPr>
+        <w:numPr>
+          <w:ilvl w:val="0"/>
+          <w:numId w:val="1006"/>
+        </w:numPr>
+        <w:pStyle w:val="Compact"/>
+      </w:pPr>
+      <w:r>
+        <w:t xml:space="preserve">O GitHub Actions gera a versão em espanhol a cada publicação.</w:t>
+      </w:r>
+      <w:r>
+        <w:t xml:space="preserve"> </w:t>
+      </w:r>
+      <w:r>
+        <w:rPr>
+          <w:bCs/>
+          <w:b/>
+        </w:rPr>
+        <w:t xml:space="preserve">Ao mudar um texto em português</w:t>
+      </w:r>
+      <w:r>
+        <w:t xml:space="preserve">, rode</w:t>
+      </w:r>
+      <w:r>
+        <w:t xml:space="preserve"> </w:t>
+      </w:r>
+      <w:r>
+        <w:rPr>
+          <w:rStyle w:val="VerbatimChar"/>
+        </w:rPr>
+        <w:t xml:space="preserve">node i18n/ferramenta.js gerar</w:t>
+      </w:r>
+      <w:r>
+        <w:t xml:space="preserve">: o que ficar sem tradução aparece em</w:t>
+      </w:r>
+      <w:r>
+        <w:t xml:space="preserve"> </w:t>
+      </w:r>
+      <w:r>
+        <w:rPr>
+          <w:rStyle w:val="VerbatimChar"/>
+        </w:rPr>
+        <w:t xml:space="preserve">i18n/pendentes.json</w:t>
+      </w:r>
+      <w:r>
+        <w:t xml:space="preserve"> </w:t>
+      </w:r>
+      <w:r>
+        <w:t xml:space="preserve">(e no site, em português) até ser acrescentado ao catálogo.</w:t>
+      </w:r>
+    </w:p>
+    <w:p>
+      <w:pPr>
+        <w:numPr>
+          <w:ilvl w:val="0"/>
+          <w:numId w:val="1006"/>
+        </w:numPr>
+        <w:pStyle w:val="Compact"/>
+      </w:pPr>
+      <w:r>
+        <w:t xml:space="preserve">As categorias da base (tipos de movimento, objetivos etc.) já estão em espanhol na planilha e não mudam.</w:t>
+      </w:r>
+    </w:p>
     <w:p>
       <w:r>
         <w:pict>
@@ -5054,9 +5842,9 @@
         </w:pict>
       </w:r>
     </w:p>
-    <w:bookmarkEnd w:id="37"/>
-    <w:bookmarkEnd w:id="38"/>
-    <w:bookmarkStart w:id="39" w:name="X9a8a5c3f4675aaafcd01bef6e7fb33b3e7de441"/>
+    <w:bookmarkEnd w:id="40"/>
+    <w:bookmarkEnd w:id="41"/>
+    <w:bookmarkStart w:id="42" w:name="X9a8a5c3f4675aaafcd01bef6e7fb33b3e7de441"/>
     <w:p>
       <w:pPr>
         <w:pStyle w:val="Heading2"/>
@@ -5360,7 +6148,60 @@
               <w:rPr>
                 <w:sz w:val="18"/>
               </w:rPr>
-              <w:t xml:space="preserve">Script automático abre as 11 abas e clica nas 139 combinações prontas: sem erros (19/10/2026)</w:t>
+              <w:t xml:space="preserve">Script automático abre as 12 abas e clica nas 139 combinações prontas, em português e em espanhol: sem erros (30/10/2026)</w:t>
+            </w:r>
+          </w:p>
+        </w:tc>
+      </w:tr>
+      <w:tr>
+        <w:tc>
+          <w:tcPr/>
+          <w:p>
+            <w:pPr>
+              <w:pStyle w:val="Compact"/>
+              <w:spacing w:after="20"/>
+              <w:jc w:val="left"/>
+            </w:pPr>
+            <w:r>
+              <w:rPr>
+                <w:sz w:val="18"/>
+              </w:rPr>
+              <w:t xml:space="preserve">Versão em espanhol</w:t>
+            </w:r>
+          </w:p>
+        </w:tc>
+        <w:tc>
+          <w:tcPr/>
+          <w:p>
+            <w:pPr>
+              <w:pStyle w:val="Compact"/>
+              <w:spacing w:after="20"/>
+              <w:jc w:val="left"/>
+            </w:pPr>
+            <w:r>
+              <w:rPr>
+                <w:sz w:val="18"/>
+              </w:rPr>
+              <w:t xml:space="preserve">Catálogo sem pendências (</w:t>
+            </w:r>
+            <w:r>
+              <w:rPr>
+                <w:rStyle w:val="VerbatimChar"/>
+                <w:sz w:val="18"/>
+              </w:rPr>
+              <w:t xml:space="preserve">i18n/pendentes.json</w:t>
+            </w:r>
+            <w:r>
+              <w:rPr>
+                <w:sz w:val="18"/>
+              </w:rPr>
+              <w:t xml:space="preserve"> </w:t>
+            </w:r>
+            <w:r>
+              <w:rPr>
+                <w:sz w:val="18"/>
+              </w:rPr>
+              <w:t xml:space="preserve">vazio); varredura das páginas em espanhol, depois de clicar nas combinações prontas, sem palavras em português</w:t>
             </w:r>
           </w:p>
         </w:tc>
@@ -5454,8 +6295,8 @@
         </w:pict>
       </w:r>
     </w:p>
-    <w:bookmarkEnd w:id="39"/>
-    <w:bookmarkStart w:id="43" w:name="X37a24ddc49ec6a08847d5e7c09b751dfa640a32"/>
+    <w:bookmarkEnd w:id="42"/>
+    <w:bookmarkStart w:id="47" w:name="X37a24ddc49ec6a08847d5e7c09b751dfa640a32"/>
     <w:p>
       <w:pPr>
         <w:pStyle w:val="Heading2"/>
@@ -5472,484 +6313,13 @@
         <w:t xml:space="preserve">Datas no fuso de São Paulo. Os códigos entre colchetes são os commits do repositório.</w:t>
       </w:r>
     </w:p>
-    <w:bookmarkStart w:id="40" w:name="Xb374f4671a78533177f9e41d94caa4dc6b2e1e1"/>
+    <w:bookmarkStart w:id="43" w:name="Xb374f4671a78533177f9e41d94caa4dc6b2e1e1"/>
     <w:p>
       <w:pPr>
         <w:pStyle w:val="Heading3"/>
       </w:pPr>
       <w:r>
         <w:t xml:space="preserve">18/10/2026</w:t>
-      </w:r>
-    </w:p>
-    <w:p>
-      <w:pPr>
-        <w:numPr>
-          <w:ilvl w:val="0"/>
-          <w:numId w:val="1005"/>
-        </w:numPr>
-        <w:pStyle w:val="Compact"/>
-      </w:pPr>
-      <w:r>
-        <w:rPr>
-          <w:bCs/>
-          <w:b/>
-        </w:rPr>
-        <w:t xml:space="preserve">Primeira versão do site</w:t>
-      </w:r>
-      <w:r>
-        <w:t xml:space="preserve"> </w:t>
-      </w:r>
-      <w:r>
-        <w:t xml:space="preserve">e base interativa 2024 publicadas no GitHub Pages [bf1632d, 5c440c7].</w:t>
-      </w:r>
-    </w:p>
-    <w:p>
-      <w:pPr>
-        <w:numPr>
-          <w:ilvl w:val="0"/>
-          <w:numId w:val="1005"/>
-        </w:numPr>
-        <w:pStyle w:val="Compact"/>
-      </w:pPr>
-      <w:r>
-        <w:t xml:space="preserve">Navegação por endereço (</w:t>
-      </w:r>
-      <w:r>
-        <w:rPr>
-          <w:rStyle w:val="VerbatimChar"/>
-        </w:rPr>
-        <w:t xml:space="preserve">#mapa</w:t>
-      </w:r>
-      <w:r>
-        <w:t xml:space="preserve">,</w:t>
-      </w:r>
-      <w:r>
-        <w:t xml:space="preserve"> </w:t>
-      </w:r>
-      <w:r>
-        <w:rPr>
-          <w:rStyle w:val="VerbatimChar"/>
-        </w:rPr>
-        <w:t xml:space="preserve">#tempo</w:t>
-      </w:r>
-      <w:r>
-        <w:t xml:space="preserve">), zoom e arraste nos mapas; README com metodologia e fontes [c1a0ced, 3f2981b].</w:t>
-      </w:r>
-    </w:p>
-    <w:p>
-      <w:pPr>
-        <w:numPr>
-          <w:ilvl w:val="0"/>
-          <w:numId w:val="1005"/>
-        </w:numPr>
-        <w:pStyle w:val="Compact"/>
-      </w:pPr>
-      <w:r>
-        <w:rPr>
-          <w:bCs/>
-          <w:b/>
-        </w:rPr>
-        <w:t xml:space="preserve">Pipeline em Python</w:t>
-      </w:r>
-      <w:r>
-        <w:t xml:space="preserve">, código modular, dados abertos e GeoPackage para QGIS; publicação automática pelo GitHub Actions com verificação de privacidade [a33414f, cc7cd3c].</w:t>
-      </w:r>
-    </w:p>
-    <w:p>
-      <w:pPr>
-        <w:numPr>
-          <w:ilvl w:val="0"/>
-          <w:numId w:val="1005"/>
-        </w:numPr>
-        <w:pStyle w:val="Compact"/>
-      </w:pPr>
-      <w:r>
-        <w:t xml:space="preserve">Identidade argentina, gráficos especializados e primeiros indicadores oficiais (população, EPH, homicídios) [968ee5c].</w:t>
-      </w:r>
-    </w:p>
-    <w:p>
-      <w:pPr>
-        <w:numPr>
-          <w:ilvl w:val="0"/>
-          <w:numId w:val="1005"/>
-        </w:numPr>
-        <w:pStyle w:val="Compact"/>
-      </w:pPr>
-      <w:r>
-        <w:rPr>
-          <w:bCs/>
-          <w:b/>
-        </w:rPr>
-        <w:t xml:space="preserve">28 indicadores do Censo 2022 por departamento</w:t>
-      </w:r>
-      <w:r>
-        <w:t xml:space="preserve"> </w:t>
-      </w:r>
-      <w:r>
-        <w:t xml:space="preserve">(Geoportal do INDEC) e taxas por departamento [9c2705c].</w:t>
-      </w:r>
-    </w:p>
-    <w:p>
-      <w:pPr>
-        <w:numPr>
-          <w:ilvl w:val="0"/>
-          <w:numId w:val="1005"/>
-        </w:numPr>
-        <w:pStyle w:val="Compact"/>
-      </w:pPr>
-      <w:r>
-        <w:t xml:space="preserve">Nova identidade visual com fundo branco e marcha desenhada; tipografia Urbanist [ee5db14, 504893c].</w:t>
-      </w:r>
-    </w:p>
-    <w:p>
-      <w:pPr>
-        <w:numPr>
-          <w:ilvl w:val="0"/>
-          <w:numId w:val="1005"/>
-        </w:numPr>
-        <w:pStyle w:val="Compact"/>
-      </w:pPr>
-      <w:r>
-        <w:t xml:space="preserve">Novas análises: associação (resíduos), Comparar, ACM, mapa bivariado, LISA, série semanal com acontecimentos, comunidades, Imprensa, Fichas e links do recorte [3e910b0].</w:t>
-      </w:r>
-    </w:p>
-    <w:p>
-      <w:pPr>
-        <w:numPr>
-          <w:ilvl w:val="0"/>
-          <w:numId w:val="1005"/>
-        </w:numPr>
-        <w:pStyle w:val="Compact"/>
-      </w:pPr>
-      <w:r>
-        <w:t xml:space="preserve">Guias “Como ler”, exemplos, leituras automáticas, topônimos que mudam com o zoom e ficha em formato de prancha [88a2c6e, c896e9e].</w:t>
-      </w:r>
-    </w:p>
-    <w:p>
-      <w:pPr>
-        <w:numPr>
-          <w:ilvl w:val="0"/>
-          <w:numId w:val="1005"/>
-        </w:numPr>
-        <w:pStyle w:val="Compact"/>
-      </w:pPr>
-      <w:r>
-        <w:t xml:space="preserve">Mapa navegável mundial, destaques por população (Poisson), combinações prontas em todas as abas, glossário [f80c8bd].</w:t>
-      </w:r>
-    </w:p>
-    <w:p>
-      <w:pPr>
-        <w:numPr>
-          <w:ilvl w:val="0"/>
-          <w:numId w:val="1005"/>
-        </w:numPr>
-        <w:pStyle w:val="Compact"/>
-      </w:pPr>
-      <w:r>
-        <w:rPr>
-          <w:bCs/>
-          <w:b/>
-        </w:rPr>
-        <w:t xml:space="preserve">Título DATALUTA</w:t>
-      </w:r>
-      <w:r>
-        <w:t xml:space="preserve">, revisão dos textos e troca do mapa base (CARTO exigia chave; passou a Esri/OSM) [81c0a67].</w:t>
-      </w:r>
-    </w:p>
-    <w:p>
-      <w:pPr>
-        <w:numPr>
-          <w:ilvl w:val="0"/>
-          <w:numId w:val="1005"/>
-        </w:numPr>
-        <w:pStyle w:val="Compact"/>
-      </w:pPr>
-      <w:r>
-        <w:t xml:space="preserve">Título com</w:t>
-      </w:r>
-      <w:r>
-        <w:t xml:space="preserve"> </w:t>
-      </w:r>
-      <w:r>
-        <w:rPr>
-          <w:bCs/>
-          <w:b/>
-        </w:rPr>
-        <w:t xml:space="preserve">Argentina 2024</w:t>
-      </w:r>
-      <w:r>
-        <w:t xml:space="preserve">,</w:t>
-      </w:r>
-      <w:r>
-        <w:t xml:space="preserve"> </w:t>
-      </w:r>
-      <w:r>
-        <w:rPr>
-          <w:bCs/>
-          <w:b/>
-        </w:rPr>
-        <w:t xml:space="preserve">aba Síntese</w:t>
-      </w:r>
-      <w:r>
-        <w:t xml:space="preserve"> </w:t>
-      </w:r>
-      <w:r>
-        <w:t xml:space="preserve">e novas combinações prontas [ec307a2].</w:t>
-      </w:r>
-    </w:p>
-    <w:p>
-      <w:pPr>
-        <w:numPr>
-          <w:ilvl w:val="0"/>
-          <w:numId w:val="1005"/>
-        </w:numPr>
-        <w:pStyle w:val="Compact"/>
-      </w:pPr>
-      <w:r>
-        <w:t xml:space="preserve">Síntese: explicação passo a passo do resíduo ajustado, régua de leitura e combinações raras [2ee97ab].</w:t>
-      </w:r>
-    </w:p>
-    <w:bookmarkEnd w:id="40"/>
-    <w:bookmarkStart w:id="41" w:name="Xfda8f6a74ee01990937dc6b5f77dee589813531"/>
-    <w:p>
-      <w:pPr>
-        <w:pStyle w:val="Heading3"/>
-      </w:pPr>
-      <w:r>
-        <w:t xml:space="preserve">19/10/2026</w:t>
-      </w:r>
-    </w:p>
-    <w:p>
-      <w:pPr>
-        <w:numPr>
-          <w:ilvl w:val="0"/>
-          <w:numId w:val="1006"/>
-        </w:numPr>
-        <w:pStyle w:val="Compact"/>
-      </w:pPr>
-      <w:r>
-        <w:rPr>
-          <w:bCs/>
-          <w:b/>
-        </w:rPr>
-        <w:t xml:space="preserve">Contexto ligado às lutas:</w:t>
-      </w:r>
-      <w:r>
-        <w:t xml:space="preserve"> </w:t>
-      </w:r>
-      <w:r>
-        <w:t xml:space="preserve">entram RENABAP, ReNaTEP, voto presidencial de 2023 e femicídios; indicadores separados em “ligados às lutas” e “controles” [6f0fe22].</w:t>
-      </w:r>
-    </w:p>
-    <w:p>
-      <w:pPr>
-        <w:numPr>
-          <w:ilvl w:val="0"/>
-          <w:numId w:val="1006"/>
-        </w:numPr>
-        <w:pStyle w:val="Compact"/>
-      </w:pPr>
-      <w:r>
-        <w:rPr>
-          <w:bCs/>
-          <w:b/>
-        </w:rPr>
-        <w:t xml:space="preserve">Indicadores sem ligação com as lutas retirados do site</w:t>
-      </w:r>
-      <w:r>
-        <w:t xml:space="preserve">; El Cuy deixado vazio no RENABAP; painel do mapa reorganizado em três blocos; quadro “Como foi calculado este mapa”; cálculo da tendência explicado no Contexto;</w:t>
-      </w:r>
-      <w:r>
-        <w:t xml:space="preserve"> </w:t>
-      </w:r>
-      <w:r>
-        <w:rPr>
-          <w:bCs/>
-          <w:b/>
-        </w:rPr>
-        <w:t xml:space="preserve">leitura em três partes para as 139 combinações prontas</w:t>
-      </w:r>
-      <w:r>
-        <w:t xml:space="preserve"> </w:t>
-      </w:r>
-      <w:r>
-        <w:t xml:space="preserve">[5839d6f].</w:t>
-      </w:r>
-    </w:p>
-    <w:p>
-      <w:pPr>
-        <w:numPr>
-          <w:ilvl w:val="0"/>
-          <w:numId w:val="1006"/>
-        </w:numPr>
-        <w:pStyle w:val="Compact"/>
-      </w:pPr>
-      <w:r>
-        <w:t xml:space="preserve">Criado este documento de processo e o roteiro</w:t>
-      </w:r>
-      <w:r>
-        <w:t xml:space="preserve"> </w:t>
-      </w:r>
-      <w:r>
-        <w:rPr>
-          <w:rStyle w:val="VerbatimChar"/>
-        </w:rPr>
-        <w:t xml:space="preserve">pipeline/reconstruir.sh</w:t>
-      </w:r>
-      <w:r>
-        <w:t xml:space="preserve">.</w:t>
-      </w:r>
-    </w:p>
-    <w:p>
-      <w:pPr>
-        <w:numPr>
-          <w:ilvl w:val="0"/>
-          <w:numId w:val="1006"/>
-        </w:numPr>
-        <w:pStyle w:val="Compact"/>
-      </w:pPr>
-      <w:r>
-        <w:rPr>
-          <w:bCs/>
-          <w:b/>
-        </w:rPr>
-        <w:t xml:space="preserve">Licenças definidas:</w:t>
-      </w:r>
-      <w:r>
-        <w:t xml:space="preserve"> </w:t>
-      </w:r>
-      <w:r>
-        <w:t xml:space="preserve">base de dados sob CC BY 4.0 (arquivo</w:t>
-      </w:r>
-      <w:r>
-        <w:t xml:space="preserve"> </w:t>
-      </w:r>
-      <w:r>
-        <w:rPr>
-          <w:rStyle w:val="VerbatimChar"/>
-        </w:rPr>
-        <w:t xml:space="preserve">LICENSE</w:t>
-      </w:r>
-      <w:r>
-        <w:t xml:space="preserve">, que o GitHub reconhece) e código sob MIT (</w:t>
-      </w:r>
-      <w:r>
-        <w:rPr>
-          <w:rStyle w:val="VerbatimChar"/>
-        </w:rPr>
-        <w:t xml:space="preserve">LICENCA-CODIGO</w:t>
-      </w:r>
-      <w:r>
-        <w:t xml:space="preserve">);</w:t>
-      </w:r>
-      <w:r>
-        <w:t xml:space="preserve"> </w:t>
-      </w:r>
-      <w:r>
-        <w:rPr>
-          <w:rStyle w:val="VerbatimChar"/>
-        </w:rPr>
-        <w:t xml:space="preserve">LICENCAS.md</w:t>
-      </w:r>
-      <w:r>
-        <w:t xml:space="preserve"> </w:t>
-      </w:r>
-      <w:r>
-        <w:t xml:space="preserve">explica o que cada uma cobre, lista as condições dos dados de terceiros e traz a forma de citar; rodapés do site e README atualizados. Motivo: sem licença, ninguém tinha permissão formal de reutilizar a base; a CC BY 4.0 é o padrão em dados científicos abertos, garante o crédito e é compatível com o GeoNames e o datos.gob.ar.</w:t>
-      </w:r>
-    </w:p>
-    <w:p>
-      <w:pPr>
-        <w:numPr>
-          <w:ilvl w:val="0"/>
-          <w:numId w:val="1006"/>
-        </w:numPr>
-        <w:pStyle w:val="Compact"/>
-      </w:pPr>
-      <w:r>
-        <w:rPr>
-          <w:bCs/>
-          <w:b/>
-        </w:rPr>
-        <w:t xml:space="preserve">Versão em Word do documento de processo</w:t>
-      </w:r>
-      <w:r>
-        <w:t xml:space="preserve"> </w:t>
-      </w:r>
-      <w:r>
-        <w:t xml:space="preserve">(</w:t>
-      </w:r>
-      <w:r>
-        <w:rPr>
-          <w:rStyle w:val="VerbatimChar"/>
-        </w:rPr>
-        <w:t xml:space="preserve">PROCESSO.docx</w:t>
-      </w:r>
-      <w:r>
-        <w:t xml:space="preserve">), gerada a partir deste arquivo por</w:t>
-      </w:r>
-      <w:r>
-        <w:t xml:space="preserve"> </w:t>
-      </w:r>
-      <w:r>
-        <w:rPr>
-          <w:rStyle w:val="VerbatimChar"/>
-        </w:rPr>
-        <w:t xml:space="preserve">pipeline/gerar_processo_docx.py</w:t>
-      </w:r>
-      <w:r>
-        <w:t xml:space="preserve"> </w:t>
-      </w:r>
-      <w:r>
-        <w:t xml:space="preserve">(pandoc + python-docx), para circular no grupo.</w:t>
-      </w:r>
-    </w:p>
-    <w:p>
-      <w:pPr>
-        <w:numPr>
-          <w:ilvl w:val="0"/>
-          <w:numId w:val="1006"/>
-        </w:numPr>
-        <w:pStyle w:val="Compact"/>
-      </w:pPr>
-      <w:r>
-        <w:rPr>
-          <w:bCs/>
-          <w:b/>
-        </w:rPr>
-        <w:t xml:space="preserve">LISA explicado passo a passo</w:t>
-      </w:r>
-      <w:r>
-        <w:t xml:space="preserve"> </w:t>
-      </w:r>
-      <w:r>
-        <w:t xml:space="preserve">no quadro “Como foi calculado este mapa” (abre sozinho na primeira vez), com exemplo numérico de um ponto quente e de um ponto frio, lista dos departamentos, I global e cuidados; dica do mapa mostra z, média dos vizinhos e I local; glossário e guia ampliados. O teste de permutação passou a sortear os vizinhos</w:t>
-      </w:r>
-      <w:r>
-        <w:t xml:space="preserve"> </w:t>
-      </w:r>
-      <w:r>
-        <w:rPr>
-          <w:bCs/>
-          <w:b/>
-        </w:rPr>
-        <w:t xml:space="preserve">sem reposição</w:t>
-      </w:r>
-      <w:r>
-        <w:t xml:space="preserve"> </w:t>
-      </w:r>
-      <w:r>
-        <w:t xml:space="preserve">(permutação condicional, como no GeoDa); antes sorteava com reposição. Motivo: pedido de deixar claro como o LISA é calculado.</w:t>
-      </w:r>
-    </w:p>
-    <w:bookmarkEnd w:id="41"/>
-    <w:bookmarkStart w:id="42" w:name="X0243e2acffdb3298bb3301518b805b778538cf8"/>
-    <w:p>
-      <w:pPr>
-        <w:pStyle w:val="Heading3"/>
-      </w:pPr>
-      <w:r>
-        <w:t xml:space="preserve">28/10/2026</w:t>
       </w:r>
     </w:p>
     <w:p>
@@ -5965,31 +6335,229 @@
           <w:bCs/>
           <w:b/>
         </w:rPr>
-        <w:t xml:space="preserve">Fichas:</w:t>
-      </w:r>
-      <w:r>
-        <w:t xml:space="preserve"> </w:t>
-      </w:r>
-      <w:r>
-        <w:t xml:space="preserve">a escolha passou a ser uma lista fechada só com as categorias do tipo de ficha escolhido (por exemplo, só objetivos), com o número de notícias, e um campo para filtrar a lista. Motivo: o campo de texto anterior, com sugestões, deixava o navegador misturar valores digitados antes em outros tipos de ficha (nomes de movimentos, províncias).</w:t>
-      </w:r>
-    </w:p>
-    <w:p>
-      <w:r>
-        <w:pict>
-          <v:rect style="width:0;height:1.5pt" o:hralign="center" o:hrstd="t" o:hr="t"/>
-        </w:pict>
-      </w:r>
-    </w:p>
-    <w:bookmarkEnd w:id="42"/>
+        <w:t xml:space="preserve">Primeira versão do site</w:t>
+      </w:r>
+      <w:r>
+        <w:t xml:space="preserve"> </w:t>
+      </w:r>
+      <w:r>
+        <w:t xml:space="preserve">e base interativa 2024 publicadas no GitHub Pages [bf1632d, 5c440c7].</w:t>
+      </w:r>
+    </w:p>
+    <w:p>
+      <w:pPr>
+        <w:numPr>
+          <w:ilvl w:val="0"/>
+          <w:numId w:val="1007"/>
+        </w:numPr>
+        <w:pStyle w:val="Compact"/>
+      </w:pPr>
+      <w:r>
+        <w:t xml:space="preserve">Navegação por endereço (</w:t>
+      </w:r>
+      <w:r>
+        <w:rPr>
+          <w:rStyle w:val="VerbatimChar"/>
+        </w:rPr>
+        <w:t xml:space="preserve">#mapa</w:t>
+      </w:r>
+      <w:r>
+        <w:t xml:space="preserve">,</w:t>
+      </w:r>
+      <w:r>
+        <w:t xml:space="preserve"> </w:t>
+      </w:r>
+      <w:r>
+        <w:rPr>
+          <w:rStyle w:val="VerbatimChar"/>
+        </w:rPr>
+        <w:t xml:space="preserve">#tempo</w:t>
+      </w:r>
+      <w:r>
+        <w:t xml:space="preserve">), zoom e arraste nos mapas; README com metodologia e fontes [c1a0ced, 3f2981b].</w:t>
+      </w:r>
+    </w:p>
+    <w:p>
+      <w:pPr>
+        <w:numPr>
+          <w:ilvl w:val="0"/>
+          <w:numId w:val="1007"/>
+        </w:numPr>
+        <w:pStyle w:val="Compact"/>
+      </w:pPr>
+      <w:r>
+        <w:rPr>
+          <w:bCs/>
+          <w:b/>
+        </w:rPr>
+        <w:t xml:space="preserve">Pipeline em Python</w:t>
+      </w:r>
+      <w:r>
+        <w:t xml:space="preserve">, código modular, dados abertos e GeoPackage para QGIS; publicação automática pelo GitHub Actions com verificação de privacidade [a33414f, cc7cd3c].</w:t>
+      </w:r>
+    </w:p>
+    <w:p>
+      <w:pPr>
+        <w:numPr>
+          <w:ilvl w:val="0"/>
+          <w:numId w:val="1007"/>
+        </w:numPr>
+        <w:pStyle w:val="Compact"/>
+      </w:pPr>
+      <w:r>
+        <w:t xml:space="preserve">Identidade argentina, gráficos especializados e primeiros indicadores oficiais (população, EPH, homicídios) [968ee5c].</w:t>
+      </w:r>
+    </w:p>
+    <w:p>
+      <w:pPr>
+        <w:numPr>
+          <w:ilvl w:val="0"/>
+          <w:numId w:val="1007"/>
+        </w:numPr>
+        <w:pStyle w:val="Compact"/>
+      </w:pPr>
+      <w:r>
+        <w:rPr>
+          <w:bCs/>
+          <w:b/>
+        </w:rPr>
+        <w:t xml:space="preserve">28 indicadores do Censo 2022 por departamento</w:t>
+      </w:r>
+      <w:r>
+        <w:t xml:space="preserve"> </w:t>
+      </w:r>
+      <w:r>
+        <w:t xml:space="preserve">(Geoportal do INDEC) e taxas por departamento [9c2705c].</w:t>
+      </w:r>
+    </w:p>
+    <w:p>
+      <w:pPr>
+        <w:numPr>
+          <w:ilvl w:val="0"/>
+          <w:numId w:val="1007"/>
+        </w:numPr>
+        <w:pStyle w:val="Compact"/>
+      </w:pPr>
+      <w:r>
+        <w:t xml:space="preserve">Nova identidade visual com fundo branco e marcha desenhada; tipografia Urbanist [ee5db14, 504893c].</w:t>
+      </w:r>
+    </w:p>
+    <w:p>
+      <w:pPr>
+        <w:numPr>
+          <w:ilvl w:val="0"/>
+          <w:numId w:val="1007"/>
+        </w:numPr>
+        <w:pStyle w:val="Compact"/>
+      </w:pPr>
+      <w:r>
+        <w:t xml:space="preserve">Novas análises: associação (resíduos), Comparar, ACM, mapa bivariado, LISA, série semanal com acontecimentos, comunidades, Imprensa, Fichas e links do recorte [3e910b0].</w:t>
+      </w:r>
+    </w:p>
+    <w:p>
+      <w:pPr>
+        <w:numPr>
+          <w:ilvl w:val="0"/>
+          <w:numId w:val="1007"/>
+        </w:numPr>
+        <w:pStyle w:val="Compact"/>
+      </w:pPr>
+      <w:r>
+        <w:t xml:space="preserve">Guias “Como ler”, exemplos, leituras automáticas, topônimos que mudam com o zoom e ficha em formato de prancha [88a2c6e, c896e9e].</w:t>
+      </w:r>
+    </w:p>
+    <w:p>
+      <w:pPr>
+        <w:numPr>
+          <w:ilvl w:val="0"/>
+          <w:numId w:val="1007"/>
+        </w:numPr>
+        <w:pStyle w:val="Compact"/>
+      </w:pPr>
+      <w:r>
+        <w:t xml:space="preserve">Mapa navegável mundial, destaques por população (Poisson), combinações prontas em todas as abas, glossário [f80c8bd].</w:t>
+      </w:r>
+    </w:p>
+    <w:p>
+      <w:pPr>
+        <w:numPr>
+          <w:ilvl w:val="0"/>
+          <w:numId w:val="1007"/>
+        </w:numPr>
+        <w:pStyle w:val="Compact"/>
+      </w:pPr>
+      <w:r>
+        <w:rPr>
+          <w:bCs/>
+          <w:b/>
+        </w:rPr>
+        <w:t xml:space="preserve">Título DATALUTA</w:t>
+      </w:r>
+      <w:r>
+        <w:t xml:space="preserve">, revisão dos textos e troca do mapa base (CARTO exigia chave; passou a Esri/OSM) [81c0a67].</w:t>
+      </w:r>
+    </w:p>
+    <w:p>
+      <w:pPr>
+        <w:numPr>
+          <w:ilvl w:val="0"/>
+          <w:numId w:val="1007"/>
+        </w:numPr>
+        <w:pStyle w:val="Compact"/>
+      </w:pPr>
+      <w:r>
+        <w:t xml:space="preserve">Título com</w:t>
+      </w:r>
+      <w:r>
+        <w:t xml:space="preserve"> </w:t>
+      </w:r>
+      <w:r>
+        <w:rPr>
+          <w:bCs/>
+          <w:b/>
+        </w:rPr>
+        <w:t xml:space="preserve">Argentina 2024</w:t>
+      </w:r>
+      <w:r>
+        <w:t xml:space="preserve">,</w:t>
+      </w:r>
+      <w:r>
+        <w:t xml:space="preserve"> </w:t>
+      </w:r>
+      <w:r>
+        <w:rPr>
+          <w:bCs/>
+          <w:b/>
+        </w:rPr>
+        <w:t xml:space="preserve">aba Síntese</w:t>
+      </w:r>
+      <w:r>
+        <w:t xml:space="preserve"> </w:t>
+      </w:r>
+      <w:r>
+        <w:t xml:space="preserve">e novas combinações prontas [ec307a2].</w:t>
+      </w:r>
+    </w:p>
+    <w:p>
+      <w:pPr>
+        <w:numPr>
+          <w:ilvl w:val="0"/>
+          <w:numId w:val="1007"/>
+        </w:numPr>
+        <w:pStyle w:val="Compact"/>
+      </w:pPr>
+      <w:r>
+        <w:t xml:space="preserve">Síntese: explicação passo a passo do resíduo ajustado, régua de leitura e combinações raras [2ee97ab].</w:t>
+      </w:r>
+    </w:p>
     <w:bookmarkEnd w:id="43"/>
-    <w:bookmarkStart w:id="44" w:name="X3d9f82193e44c2a113d49ff9b97f8db3ae86c66"/>
-    <w:p>
-      <w:pPr>
-        <w:pStyle w:val="Heading2"/>
-      </w:pPr>
-      <w:r>
-        <w:t xml:space="preserve">10. Pendências</w:t>
+    <w:bookmarkStart w:id="44" w:name="Xfda8f6a74ee01990937dc6b5f77dee589813531"/>
+    <w:p>
+      <w:pPr>
+        <w:pStyle w:val="Heading3"/>
+      </w:pPr>
+      <w:r>
+        <w:t xml:space="preserve">19/10/2026</w:t>
       </w:r>
     </w:p>
     <w:p>
@@ -6001,7 +6569,17 @@
         <w:pStyle w:val="Compact"/>
       </w:pPr>
       <w:r>
-        <w:t xml:space="preserve">☐ Confirmar a escolha das licenças com o grupo/centro de pesquisa e, se houver, com a política de dados da instituição.</w:t>
+        <w:rPr>
+          <w:bCs/>
+          <w:b/>
+        </w:rPr>
+        <w:t xml:space="preserve">Contexto ligado às lutas:</w:t>
+      </w:r>
+      <w:r>
+        <w:t xml:space="preserve"> </w:t>
+      </w:r>
+      <w:r>
+        <w:t xml:space="preserve">entram RENABAP, ReNaTEP, voto presidencial de 2023 e femicídios; indicadores separados em “ligados às lutas” e “controles” [6f0fe22].</w:t>
       </w:r>
     </w:p>
     <w:p>
@@ -6013,19 +6591,30 @@
         <w:pStyle w:val="Compact"/>
       </w:pPr>
       <w:r>
-        <w:t xml:space="preserve">☐ Depositar a base no Zenodo (ou repositório institucional) para obter um DOI e atualizar a citação em</w:t>
-      </w:r>
-      <w:r>
-        <w:t xml:space="preserve"> </w:t>
-      </w:r>
-      <w:r>
-        <w:rPr>
-          <w:rStyle w:val="VerbatimChar"/>
-        </w:rPr>
-        <w:t xml:space="preserve">LICENCAS.md</w:t>
-      </w:r>
-      <w:r>
-        <w:t xml:space="preserve">.</w:t>
+        <w:rPr>
+          <w:bCs/>
+          <w:b/>
+        </w:rPr>
+        <w:t xml:space="preserve">Indicadores sem ligação com as lutas retirados do site</w:t>
+      </w:r>
+      <w:r>
+        <w:t xml:space="preserve">; El Cuy deixado vazio no RENABAP; painel do mapa reorganizado em três blocos; quadro “Como foi calculado este mapa”; cálculo da tendência explicado no Contexto;</w:t>
+      </w:r>
+      <w:r>
+        <w:t xml:space="preserve"> </w:t>
+      </w:r>
+      <w:r>
+        <w:rPr>
+          <w:bCs/>
+          <w:b/>
+        </w:rPr>
+        <w:t xml:space="preserve">leitura em três partes para as 139 combinações prontas</w:t>
+      </w:r>
+      <w:r>
+        <w:t xml:space="preserve"> </w:t>
+      </w:r>
+      <w:r>
+        <w:t xml:space="preserve">[5839d6f].</w:t>
       </w:r>
     </w:p>
     <w:p>
@@ -6037,23 +6626,19 @@
         <w:pStyle w:val="Compact"/>
       </w:pPr>
       <w:r>
-        <w:t xml:space="preserve">☐</w:t>
-      </w:r>
-      <w:r>
-        <w:t xml:space="preserve"> </w:t>
-      </w:r>
-      <w:r>
-        <w:rPr>
-          <w:bCs/>
-          <w:b/>
-        </w:rPr>
-        <w:t xml:space="preserve">Unificar nomes de organizações duplicados</w:t>
-      </w:r>
-      <w:r>
-        <w:t xml:space="preserve"> </w:t>
-      </w:r>
-      <w:r>
-        <w:t xml:space="preserve">(ex.: grafias diferentes de CTA e CGT). Afeta contagens, fichas e redes.</w:t>
+        <w:t xml:space="preserve">Criado este documento de processo e o roteiro</w:t>
+      </w:r>
+      <w:r>
+        <w:t xml:space="preserve"> </w:t>
+      </w:r>
+      <w:r>
+        <w:rPr>
+          <w:rStyle w:val="VerbatimChar"/>
+        </w:rPr>
+        <w:t xml:space="preserve">pipeline/reconstruir.sh</w:t>
+      </w:r>
+      <w:r>
+        <w:t xml:space="preserve">.</w:t>
       </w:r>
     </w:p>
     <w:p>
@@ -6065,23 +6650,53 @@
         <w:pStyle w:val="Compact"/>
       </w:pPr>
       <w:r>
-        <w:t xml:space="preserve">☐ Resultado do</w:t>
-      </w:r>
-      <w:r>
-        <w:t xml:space="preserve"> </w:t>
-      </w:r>
-      <w:r>
         <w:rPr>
           <w:bCs/>
           <w:b/>
         </w:rPr>
-        <w:t xml:space="preserve">2º turno de 2023</w:t>
-      </w:r>
-      <w:r>
-        <w:t xml:space="preserve"> </w:t>
-      </w:r>
-      <w:r>
-        <w:t xml:space="preserve">por departamento, se a DINE publicar no formato mesa a mesa.</w:t>
+        <w:t xml:space="preserve">Licenças definidas:</w:t>
+      </w:r>
+      <w:r>
+        <w:t xml:space="preserve"> </w:t>
+      </w:r>
+      <w:r>
+        <w:t xml:space="preserve">base de dados sob CC BY 4.0 (arquivo</w:t>
+      </w:r>
+      <w:r>
+        <w:t xml:space="preserve"> </w:t>
+      </w:r>
+      <w:r>
+        <w:rPr>
+          <w:rStyle w:val="VerbatimChar"/>
+        </w:rPr>
+        <w:t xml:space="preserve">LICENSE</w:t>
+      </w:r>
+      <w:r>
+        <w:t xml:space="preserve">, que o GitHub reconhece) e código sob MIT (</w:t>
+      </w:r>
+      <w:r>
+        <w:rPr>
+          <w:rStyle w:val="VerbatimChar"/>
+        </w:rPr>
+        <w:t xml:space="preserve">LICENCA-CODIGO</w:t>
+      </w:r>
+      <w:r>
+        <w:t xml:space="preserve">);</w:t>
+      </w:r>
+      <w:r>
+        <w:t xml:space="preserve"> </w:t>
+      </w:r>
+      <w:r>
+        <w:rPr>
+          <w:rStyle w:val="VerbatimChar"/>
+        </w:rPr>
+        <w:t xml:space="preserve">LICENCAS.md</w:t>
+      </w:r>
+      <w:r>
+        <w:t xml:space="preserve"> </w:t>
+      </w:r>
+      <w:r>
+        <w:t xml:space="preserve">explica o que cada uma cobre, lista as condições dos dados de terceiros e traz a forma de citar; rodapés do site e README atualizados. Motivo: sem licença, ninguém tinha permissão formal de reutilizar a base; a CC BY 4.0 é o padrão em dados científicos abertos, garante o crédito e é compatível com o GeoNames e o datos.gob.ar.</w:t>
       </w:r>
     </w:p>
     <w:p>
@@ -6093,7 +6708,41 @@
         <w:pStyle w:val="Compact"/>
       </w:pPr>
       <w:r>
-        <w:t xml:space="preserve">☐ Outras fontes sugeridas e ainda não coletadas: estudantes de universidades nacionais por província, emprego público por província, titulares do Potenciar Trabajo, projetos de mineração e comunidades indígenas registradas.</w:t>
+        <w:rPr>
+          <w:bCs/>
+          <w:b/>
+        </w:rPr>
+        <w:t xml:space="preserve">Versão em Word do documento de processo</w:t>
+      </w:r>
+      <w:r>
+        <w:t xml:space="preserve"> </w:t>
+      </w:r>
+      <w:r>
+        <w:t xml:space="preserve">(</w:t>
+      </w:r>
+      <w:r>
+        <w:rPr>
+          <w:rStyle w:val="VerbatimChar"/>
+        </w:rPr>
+        <w:t xml:space="preserve">PROCESSO.docx</w:t>
+      </w:r>
+      <w:r>
+        <w:t xml:space="preserve">), gerada a partir deste arquivo por</w:t>
+      </w:r>
+      <w:r>
+        <w:t xml:space="preserve"> </w:t>
+      </w:r>
+      <w:r>
+        <w:rPr>
+          <w:rStyle w:val="VerbatimChar"/>
+        </w:rPr>
+        <w:t xml:space="preserve">pipeline/gerar_processo_docx.py</w:t>
+      </w:r>
+      <w:r>
+        <w:t xml:space="preserve"> </w:t>
+      </w:r>
+      <w:r>
+        <w:t xml:space="preserve">(pandoc + python-docx), para circular no grupo.</w:t>
       </w:r>
     </w:p>
     <w:p>
@@ -6105,23 +6754,510 @@
         <w:pStyle w:val="Compact"/>
       </w:pPr>
       <w:r>
-        <w:t xml:space="preserve">☐ Atualizar o ReNaTEP e o RENABAP quando houver versões oficiais mais recentes.</w:t>
+        <w:rPr>
+          <w:bCs/>
+          <w:b/>
+        </w:rPr>
+        <w:t xml:space="preserve">LISA explicado passo a passo</w:t>
+      </w:r>
+      <w:r>
+        <w:t xml:space="preserve"> </w:t>
+      </w:r>
+      <w:r>
+        <w:t xml:space="preserve">no quadro “Como foi calculado este mapa” (abre sozinho na primeira vez), com exemplo numérico de um ponto quente e de um ponto frio, lista dos departamentos, I global e cuidados; dica do mapa mostra z, média dos vizinhos e I local; glossário e guia ampliados. O teste de permutação passou a sortear os vizinhos</w:t>
+      </w:r>
+      <w:r>
+        <w:t xml:space="preserve"> </w:t>
+      </w:r>
+      <w:r>
+        <w:rPr>
+          <w:bCs/>
+          <w:b/>
+        </w:rPr>
+        <w:t xml:space="preserve">sem reposição</w:t>
+      </w:r>
+      <w:r>
+        <w:t xml:space="preserve"> </w:t>
+      </w:r>
+      <w:r>
+        <w:t xml:space="preserve">(permutação condicional, como no GeoDa); antes sorteava com reposição. Motivo: pedido de deixar claro como o LISA é calculado.</w:t>
+      </w:r>
+    </w:p>
+    <w:bookmarkEnd w:id="44"/>
+    <w:bookmarkStart w:id="45" w:name="X0243e2acffdb3298bb3301518b805b778538cf8"/>
+    <w:p>
+      <w:pPr>
+        <w:pStyle w:val="Heading3"/>
+      </w:pPr>
+      <w:r>
+        <w:t xml:space="preserve">28/10/2026</w:t>
       </w:r>
     </w:p>
     <w:p>
       <w:pPr>
         <w:numPr>
           <w:ilvl w:val="0"/>
-          <w:numId w:val="1008"/>
+          <w:numId w:val="1009"/>
         </w:numPr>
         <w:pStyle w:val="Compact"/>
       </w:pPr>
       <w:r>
+        <w:rPr>
+          <w:bCs/>
+          <w:b/>
+        </w:rPr>
+        <w:t xml:space="preserve">Fichas:</w:t>
+      </w:r>
+      <w:r>
+        <w:t xml:space="preserve"> </w:t>
+      </w:r>
+      <w:r>
+        <w:t xml:space="preserve">a escolha passou a ser uma lista fechada só com as categorias do tipo de ficha escolhido (por exemplo, só objetivos), com o número de notícias, e um campo para filtrar a lista. Motivo: o campo de texto anterior, com sugestões, deixava o navegador misturar valores digitados antes em outros tipos de ficha (nomes de movimentos, províncias).</w:t>
+      </w:r>
+    </w:p>
+    <w:bookmarkEnd w:id="45"/>
+    <w:bookmarkStart w:id="46" w:name="X6d16d1d1dfee84c5325917dbbdeb1135ee226ab"/>
+    <w:p>
+      <w:pPr>
+        <w:pStyle w:val="Heading3"/>
+      </w:pPr>
+      <w:r>
+        <w:t xml:space="preserve">30/10/2026</w:t>
+      </w:r>
+    </w:p>
+    <w:p>
+      <w:pPr>
+        <w:numPr>
+          <w:ilvl w:val="0"/>
+          <w:numId w:val="1010"/>
+        </w:numPr>
+        <w:pStyle w:val="Compact"/>
+      </w:pPr>
+      <w:r>
+        <w:rPr>
+          <w:bCs/>
+          <w:b/>
+        </w:rPr>
+        <w:t xml:space="preserve">Ano e país</w:t>
+      </w:r>
+      <w:r>
+        <w:t xml:space="preserve"> </w:t>
+      </w:r>
+      <w:r>
+        <w:t xml:space="preserve">entram como variáveis (colunas opcionais</w:t>
+      </w:r>
+      <w:r>
+        <w:t xml:space="preserve"> </w:t>
+      </w:r>
+      <w:r>
+        <w:rPr>
+          <w:rStyle w:val="VerbatimChar"/>
+        </w:rPr>
+        <w:t xml:space="preserve">Año</w:t>
+      </w:r>
+      <w:r>
+        <w:t xml:space="preserve"> </w:t>
+      </w:r>
+      <w:r>
+        <w:t xml:space="preserve">e</w:t>
+      </w:r>
+      <w:r>
+        <w:t xml:space="preserve"> </w:t>
+      </w:r>
+      <w:r>
+        <w:rPr>
+          <w:rStyle w:val="VerbatimChar"/>
+        </w:rPr>
+        <w:t xml:space="preserve">País</w:t>
+      </w:r>
+      <w:r>
+        <w:t xml:space="preserve"> </w:t>
+      </w:r>
+      <w:r>
+        <w:t xml:space="preserve">da planilha) e como</w:t>
+      </w:r>
+      <w:r>
+        <w:t xml:space="preserve"> </w:t>
+      </w:r>
+      <w:r>
+        <w:rPr>
+          <w:bCs/>
+          <w:b/>
+        </w:rPr>
+        <w:t xml:space="preserve">seletores no topo da base</w:t>
+      </w:r>
+      <w:r>
+        <w:t xml:space="preserve">. Motivo: preparar a base para juntar os cinco anos da Argentina e os dados do Brasil numa só planilha padronizada.</w:t>
+      </w:r>
+    </w:p>
+    <w:p>
+      <w:pPr>
+        <w:numPr>
+          <w:ilvl w:val="0"/>
+          <w:numId w:val="1010"/>
+        </w:numPr>
+        <w:pStyle w:val="Compact"/>
+      </w:pPr>
+      <w:r>
+        <w:rPr>
+          <w:bCs/>
+          <w:b/>
+        </w:rPr>
+        <w:t xml:space="preserve">Busca mais visível:</w:t>
+      </w:r>
+      <w:r>
+        <w:t xml:space="preserve"> </w:t>
+      </w:r>
+      <w:r>
+        <w:t xml:space="preserve">campo fixo no topo da base que filtra todas as abas, com etiqueta nos filtros e guardado no link. Motivo: a busca ficava escondida no fim da página e só valia para a lista de notícias.</w:t>
+      </w:r>
+    </w:p>
+    <w:p>
+      <w:pPr>
+        <w:numPr>
+          <w:ilvl w:val="0"/>
+          <w:numId w:val="1010"/>
+        </w:numPr>
+        <w:pStyle w:val="Compact"/>
+      </w:pPr>
+      <w:r>
+        <w:rPr>
+          <w:bCs/>
+          <w:b/>
+        </w:rPr>
+        <w:t xml:space="preserve">Página “Sobre e metodologia”</w:t>
+      </w:r>
+      <w:r>
+        <w:t xml:space="preserve"> </w:t>
+      </w:r>
+      <w:r>
+        <w:t xml:space="preserve">(</w:t>
+      </w:r>
+      <w:r>
+        <w:rPr>
+          <w:rStyle w:val="VerbatimChar"/>
+        </w:rPr>
+        <w:t xml:space="preserve">/sobre/</w:t>
+      </w:r>
+      <w:r>
+        <w:t xml:space="preserve">). Motivo: reunir num só lugar como a base foi feita, com fontes, cálculos, limites e citação.</w:t>
+      </w:r>
+    </w:p>
+    <w:p>
+      <w:pPr>
+        <w:numPr>
+          <w:ilvl w:val="0"/>
+          <w:numId w:val="1010"/>
+        </w:numPr>
+        <w:pStyle w:val="Compact"/>
+      </w:pPr>
+      <w:r>
+        <w:rPr>
+          <w:bCs/>
+          <w:b/>
+        </w:rPr>
+        <w:t xml:space="preserve">Versão em espanhol</w:t>
+      </w:r>
+      <w:r>
+        <w:t xml:space="preserve"> </w:t>
+      </w:r>
+      <w:r>
+        <w:t xml:space="preserve">(</w:t>
+      </w:r>
+      <w:r>
+        <w:rPr>
+          <w:rStyle w:val="VerbatimChar"/>
+        </w:rPr>
+        <w:t xml:space="preserve">/es/</w:t>
+      </w:r>
+      <w:r>
+        <w:t xml:space="preserve">), gerada a partir do português por</w:t>
+      </w:r>
+      <w:r>
+        <w:t xml:space="preserve"> </w:t>
+      </w:r>
+      <w:r>
+        <w:rPr>
+          <w:rStyle w:val="VerbatimChar"/>
+        </w:rPr>
+        <w:t xml:space="preserve">i18n/ferramenta.js</w:t>
+      </w:r>
+      <w:r>
+        <w:t xml:space="preserve"> </w:t>
+      </w:r>
+      <w:r>
+        <w:t xml:space="preserve">com o catálogo</w:t>
+      </w:r>
+      <w:r>
+        <w:t xml:space="preserve"> </w:t>
+      </w:r>
+      <w:r>
+        <w:rPr>
+          <w:rStyle w:val="VerbatimChar"/>
+        </w:rPr>
+        <w:t xml:space="preserve">i18n/es.json</w:t>
+      </w:r>
+      <w:r>
+        <w:t xml:space="preserve">; o GitHub Actions passou a gerá-la e a publicar também</w:t>
+      </w:r>
+      <w:r>
+        <w:t xml:space="preserve"> </w:t>
+      </w:r>
+      <w:r>
+        <w:rPr>
+          <w:rStyle w:val="VerbatimChar"/>
+        </w:rPr>
+        <w:t xml:space="preserve">sobre/</w:t>
+      </w:r>
+      <w:r>
+        <w:t xml:space="preserve"> </w:t>
+      </w:r>
+      <w:r>
+        <w:t xml:space="preserve">e</w:t>
+      </w:r>
+      <w:r>
+        <w:t xml:space="preserve"> </w:t>
+      </w:r>
+      <w:r>
+        <w:rPr>
+          <w:rStyle w:val="VerbatimChar"/>
+        </w:rPr>
+        <w:t xml:space="preserve">es/</w:t>
+      </w:r>
+      <w:r>
+        <w:t xml:space="preserve">. Motivo: o público da base é sobretudo argentino e latino-americano (CLACSO).</w:t>
+      </w:r>
+    </w:p>
+    <w:p>
+      <w:pPr>
+        <w:numPr>
+          <w:ilvl w:val="0"/>
+          <w:numId w:val="1010"/>
+        </w:numPr>
+        <w:pStyle w:val="Compact"/>
+      </w:pPr>
+      <w:r>
+        <w:t xml:space="preserve">Seção 2, 4, 7 e 8 atualizadas;</w:t>
+      </w:r>
+      <w:r>
+        <w:t xml:space="preserve"> </w:t>
+      </w:r>
+      <w:r>
+        <w:rPr>
+          <w:rStyle w:val="VerbatimChar"/>
+        </w:rPr>
+        <w:t xml:space="preserve">pipeline/reconstruir.sh</w:t>
+      </w:r>
+      <w:r>
+        <w:t xml:space="preserve"> </w:t>
+      </w:r>
+      <w:r>
+        <w:t xml:space="preserve">ganhou o passo da versão em espanhol.</w:t>
+      </w:r>
+    </w:p>
+    <w:p>
+      <w:r>
+        <w:pict>
+          <v:rect style="width:0;height:1.5pt" o:hralign="center" o:hrstd="t" o:hr="t"/>
+        </w:pict>
+      </w:r>
+    </w:p>
+    <w:bookmarkEnd w:id="46"/>
+    <w:bookmarkEnd w:id="47"/>
+    <w:bookmarkStart w:id="48" w:name="X3d9f82193e44c2a113d49ff9b97f8db3ae86c66"/>
+    <w:p>
+      <w:pPr>
+        <w:pStyle w:val="Heading2"/>
+      </w:pPr>
+      <w:r>
+        <w:t xml:space="preserve">10. Pendências</w:t>
+      </w:r>
+    </w:p>
+    <w:p>
+      <w:pPr>
+        <w:numPr>
+          <w:ilvl w:val="0"/>
+          <w:numId w:val="1011"/>
+        </w:numPr>
+        <w:pStyle w:val="Compact"/>
+      </w:pPr>
+      <w:r>
+        <w:t xml:space="preserve">☐</w:t>
+      </w:r>
+      <w:r>
+        <w:t xml:space="preserve"> </w:t>
+      </w:r>
+      <w:r>
+        <w:rPr>
+          <w:bCs/>
+          <w:b/>
+        </w:rPr>
+        <w:t xml:space="preserve">Licenças:</w:t>
+      </w:r>
+      <w:r>
+        <w:t xml:space="preserve"> </w:t>
+      </w:r>
+      <w:r>
+        <w:t xml:space="preserve">o arquivo</w:t>
+      </w:r>
+      <w:r>
+        <w:t xml:space="preserve"> </w:t>
+      </w:r>
+      <w:r>
+        <w:rPr>
+          <w:rStyle w:val="VerbatimChar"/>
+        </w:rPr>
+        <w:t xml:space="preserve">LICENSE</w:t>
+      </w:r>
+      <w:r>
+        <w:t xml:space="preserve"> </w:t>
+      </w:r>
+      <w:r>
+        <w:t xml:space="preserve">foi trocado no GitHub para MIT (commit 6f63b69), mas</w:t>
+      </w:r>
+      <w:r>
+        <w:t xml:space="preserve"> </w:t>
+      </w:r>
+      <w:r>
+        <w:rPr>
+          <w:rStyle w:val="VerbatimChar"/>
+        </w:rPr>
+        <w:t xml:space="preserve">LICENCAS.md</w:t>
+      </w:r>
+      <w:r>
+        <w:t xml:space="preserve">, README, página Sobre e rodapés ainda dizem base de dados sob CC BY 4.0 e código sob MIT. Decidir entre manter CC BY 4.0 para os dados (recomendado) ou adotar MIT para tudo, e alinhar os arquivos. Confirmar também com o grupo/centro de pesquisa.</w:t>
+      </w:r>
+    </w:p>
+    <w:p>
+      <w:pPr>
+        <w:numPr>
+          <w:ilvl w:val="0"/>
+          <w:numId w:val="1011"/>
+        </w:numPr>
+        <w:pStyle w:val="Compact"/>
+      </w:pPr>
+      <w:r>
+        <w:t xml:space="preserve">☐ Revisão da versão em espanhol por falante nativo (termos como “recorte”, “ficha”, “plancha”).</w:t>
+      </w:r>
+    </w:p>
+    <w:p>
+      <w:pPr>
+        <w:numPr>
+          <w:ilvl w:val="0"/>
+          <w:numId w:val="1011"/>
+        </w:numPr>
+        <w:pStyle w:val="Compact"/>
+      </w:pPr>
+      <w:r>
+        <w:t xml:space="preserve">☐ Depositar a base no Zenodo (ou repositório institucional) para obter um DOI e atualizar a citação em</w:t>
+      </w:r>
+      <w:r>
+        <w:t xml:space="preserve"> </w:t>
+      </w:r>
+      <w:r>
+        <w:rPr>
+          <w:rStyle w:val="VerbatimChar"/>
+        </w:rPr>
+        <w:t xml:space="preserve">LICENCAS.md</w:t>
+      </w:r>
+      <w:r>
+        <w:t xml:space="preserve">.</w:t>
+      </w:r>
+    </w:p>
+    <w:p>
+      <w:pPr>
+        <w:numPr>
+          <w:ilvl w:val="0"/>
+          <w:numId w:val="1011"/>
+        </w:numPr>
+        <w:pStyle w:val="Compact"/>
+      </w:pPr>
+      <w:r>
+        <w:t xml:space="preserve">☐</w:t>
+      </w:r>
+      <w:r>
+        <w:t xml:space="preserve"> </w:t>
+      </w:r>
+      <w:r>
+        <w:rPr>
+          <w:bCs/>
+          <w:b/>
+        </w:rPr>
+        <w:t xml:space="preserve">Unificar nomes de organizações duplicados</w:t>
+      </w:r>
+      <w:r>
+        <w:t xml:space="preserve"> </w:t>
+      </w:r>
+      <w:r>
+        <w:t xml:space="preserve">(ex.: grafias diferentes de CTA e CGT). Afeta contagens, fichas e redes.</w:t>
+      </w:r>
+    </w:p>
+    <w:p>
+      <w:pPr>
+        <w:numPr>
+          <w:ilvl w:val="0"/>
+          <w:numId w:val="1011"/>
+        </w:numPr>
+        <w:pStyle w:val="Compact"/>
+      </w:pPr>
+      <w:r>
+        <w:t xml:space="preserve">☐ Resultado do</w:t>
+      </w:r>
+      <w:r>
+        <w:t xml:space="preserve"> </w:t>
+      </w:r>
+      <w:r>
+        <w:rPr>
+          <w:bCs/>
+          <w:b/>
+        </w:rPr>
+        <w:t xml:space="preserve">2º turno de 2023</w:t>
+      </w:r>
+      <w:r>
+        <w:t xml:space="preserve"> </w:t>
+      </w:r>
+      <w:r>
+        <w:t xml:space="preserve">por departamento, se a DINE publicar no formato mesa a mesa.</w:t>
+      </w:r>
+    </w:p>
+    <w:p>
+      <w:pPr>
+        <w:numPr>
+          <w:ilvl w:val="0"/>
+          <w:numId w:val="1011"/>
+        </w:numPr>
+        <w:pStyle w:val="Compact"/>
+      </w:pPr>
+      <w:r>
+        <w:t xml:space="preserve">☐ Outras fontes sugeridas e ainda não coletadas: estudantes de universidades nacionais por província, emprego público por província, titulares do Potenciar Trabajo, projetos de mineração e comunidades indígenas registradas.</w:t>
+      </w:r>
+    </w:p>
+    <w:p>
+      <w:pPr>
+        <w:numPr>
+          <w:ilvl w:val="0"/>
+          <w:numId w:val="1011"/>
+        </w:numPr>
+        <w:pStyle w:val="Compact"/>
+      </w:pPr>
+      <w:r>
+        <w:t xml:space="preserve">☐ Atualizar o ReNaTEP e o RENABAP quando houver versões oficiais mais recentes.</w:t>
+      </w:r>
+    </w:p>
+    <w:p>
+      <w:pPr>
+        <w:numPr>
+          <w:ilvl w:val="0"/>
+          <w:numId w:val="1011"/>
+        </w:numPr>
+        <w:pStyle w:val="Compact"/>
+      </w:pPr>
+      <w:r>
         <w:t xml:space="preserve">☐ Revisar a codificação de casos em que organizações da economia popular aparecem também como “movimientos sindicales”.</w:t>
       </w:r>
     </w:p>
-    <w:bookmarkEnd w:id="44"/>
-    <w:bookmarkEnd w:id="45"/>
+    <w:bookmarkEnd w:id="48"/>
+    <w:bookmarkEnd w:id="49"/>
     <w:sectPr>
       <w:footerReference w:type="default" r:id="rId9"/>
       <w:pgSz w:h="16838" w:w="11906"/>
@@ -6516,6 +7652,15 @@
     <w:abstractNumId w:val="991"/>
   </w:num>
   <w:num w:numId="1008">
+    <w:abstractNumId w:val="991"/>
+  </w:num>
+  <w:num w:numId="1009">
+    <w:abstractNumId w:val="991"/>
+  </w:num>
+  <w:num w:numId="1010">
+    <w:abstractNumId w:val="991"/>
+  </w:num>
+  <w:num w:numId="1011">
     <w:abstractNumId w:val="991"/>
   </w:num>
 </w:numbering>

</xml_diff>

<commit_message>
Abertura com mapa animado das ações de 2024 no lugar da marcha
- dados/entrada.json gerado pelo pipeline (contorno projetado e um ponto por ação, por data)
- assets/js/mapa-entrada.js: pontos surgem dia a dia, barra de semanas e contador; depois fica estático
- página inicial e base (português e espanhol); menu quebra linha no celular
- PROCESSO.md 1.6 (+ Word)

Co-Authored-By: Claude Opus 5.5 <noreply@anthropic.com>
Claude-Session: https://claude.ai/code/session_01VemTUauk2kCmRrtg5b6HFR
</commit_message>
<xml_diff>
--- a/PROCESSO.docx
+++ b/PROCESSO.docx
@@ -297,7 +297,7 @@
               <w:rPr>
                 <w:sz w:val="18"/>
               </w:rPr>
-              <w:t xml:space="preserve">1.5 · 30/10/2026</w:t>
+              <w:t xml:space="preserve">1.6 · 30/10/2026</w:t>
             </w:r>
           </w:p>
         </w:tc>
@@ -2694,6 +2694,21 @@
       </w:r>
       <w:r>
         <w:t xml:space="preserve">(formato compacto do site),</w:t>
+      </w:r>
+      <w:r>
+        <w:t xml:space="preserve"> </w:t>
+      </w:r>
+      <w:r>
+        <w:rPr>
+          <w:rStyle w:val="VerbatimChar"/>
+        </w:rPr>
+        <w:t xml:space="preserve">dados/entrada.json</w:t>
+      </w:r>
+      <w:r>
+        <w:t xml:space="preserve"> </w:t>
+      </w:r>
+      <w:r>
+        <w:t xml:space="preserve">(mapa animado da abertura),</w:t>
       </w:r>
       <w:r>
         <w:t xml:space="preserve"> </w:t>
@@ -5372,7 +5387,98 @@
         <w:t xml:space="preserve"> </w:t>
       </w:r>
       <w:r>
-        <w:t xml:space="preserve">fundo branco, tipografia Urbanist (hospedada no próprio site, licença OFL), ilustração de marcha gerada a partir dos objetivos mais frequentes da base; mapas em Arial para exportação estável.</w:t>
+        <w:t xml:space="preserve">fundo branco, tipografia Urbanist (hospedada no próprio site, licença OFL); mapas em Arial para exportação estável.</w:t>
+      </w:r>
+      <w:r>
+        <w:t xml:space="preserve"> </w:t>
+      </w:r>
+      <w:r>
+        <w:rPr>
+          <w:bCs/>
+          <w:b/>
+        </w:rPr>
+        <w:t xml:space="preserve">Mapa animado da abertura</w:t>
+      </w:r>
+      <w:r>
+        <w:t xml:space="preserve"> </w:t>
+      </w:r>
+      <w:r>
+        <w:t xml:space="preserve">(página inicial e base, desde 30/10/2026; substituiu a ilustração da marcha): a Argentina é preenchida, dia a dia, por um ponto para cada ação noticiada (notícias únicas, na localidade citada, na data de início da ação ou, na falta dela, na de publicação), em cerca de 8 segundos, e depois fica parada; uma barra de semanas embaixo acompanha o ano e o contador mostra o mês e o número de ações. Pontos do mesmo lugar se espalham em espiral, e por isso as cidades com muitas ações viram manchas. Começa quando o mapa aparece na tela, tem o botão “Ver de novo” e, com “reduzir movimento” ativado no sistema, aparece direto no estado final. Dados em</w:t>
+      </w:r>
+      <w:r>
+        <w:t xml:space="preserve"> </w:t>
+      </w:r>
+      <w:r>
+        <w:rPr>
+          <w:rStyle w:val="VerbatimChar"/>
+        </w:rPr>
+        <w:t xml:space="preserve">dados/entrada.json</w:t>
+      </w:r>
+      <w:r>
+        <w:t xml:space="preserve"> </w:t>
+      </w:r>
+      <w:r>
+        <w:t xml:space="preserve">(gerado por</w:t>
+      </w:r>
+      <w:r>
+        <w:t xml:space="preserve"> </w:t>
+      </w:r>
+      <w:r>
+        <w:rPr>
+          <w:rStyle w:val="VerbatimChar"/>
+        </w:rPr>
+        <w:t xml:space="preserve">escrever_entrada</w:t>
+      </w:r>
+      <w:r>
+        <w:t xml:space="preserve"> </w:t>
+      </w:r>
+      <w:r>
+        <w:t xml:space="preserve">em</w:t>
+      </w:r>
+      <w:r>
+        <w:t xml:space="preserve"> </w:t>
+      </w:r>
+      <w:r>
+        <w:rPr>
+          <w:rStyle w:val="VerbatimChar"/>
+        </w:rPr>
+        <w:t xml:space="preserve">pipeline/construir_site.py</w:t>
+      </w:r>
+      <w:r>
+        <w:t xml:space="preserve">: contorno das províncias na projeção cônica conforme de Lambert do site, simplificado, e os pontos já projetados, 835 pontos em 122 localidades, 35 KB); desenho em</w:t>
+      </w:r>
+      <w:r>
+        <w:t xml:space="preserve"> </w:t>
+      </w:r>
+      <w:r>
+        <w:rPr>
+          <w:rStyle w:val="VerbatimChar"/>
+        </w:rPr>
+        <w:t xml:space="preserve">assets/js/mapa-entrada.js</w:t>
+      </w:r>
+      <w:r>
+        <w:t xml:space="preserve">, sem bibliotecas, e estilo em</w:t>
+      </w:r>
+      <w:r>
+        <w:t xml:space="preserve"> </w:t>
+      </w:r>
+      <w:r>
+        <w:rPr>
+          <w:rStyle w:val="VerbatimChar"/>
+        </w:rPr>
+        <w:t xml:space="preserve">assets/css/mapa-entrada.css</w:t>
+      </w:r>
+      <w:r>
+        <w:t xml:space="preserve">. O código da marcha (</w:t>
+      </w:r>
+      <w:r>
+        <w:rPr>
+          <w:rStyle w:val="VerbatimChar"/>
+        </w:rPr>
+        <w:t xml:space="preserve">assets/js/marcha.js</w:t>
+      </w:r>
+      <w:r>
+        <w:t xml:space="preserve">) continua no repositório, sem uso.</w:t>
       </w:r>
     </w:p>
     <w:bookmarkEnd w:id="37"/>
@@ -7053,6 +7159,28 @@
       </w:r>
       <w:r>
         <w:t xml:space="preserve">ganhou o passo da versão em espanhol.</w:t>
+      </w:r>
+    </w:p>
+    <w:p>
+      <w:pPr>
+        <w:numPr>
+          <w:ilvl w:val="0"/>
+          <w:numId w:val="1010"/>
+        </w:numPr>
+        <w:pStyle w:val="Compact"/>
+      </w:pPr>
+      <w:r>
+        <w:rPr>
+          <w:bCs/>
+          <w:b/>
+        </w:rPr>
+        <w:t xml:space="preserve">Mapa animado na abertura</w:t>
+      </w:r>
+      <w:r>
+        <w:t xml:space="preserve"> </w:t>
+      </w:r>
+      <w:r>
+        <w:t xml:space="preserve">da página inicial e da base, no lugar da ilustração da marcha: os pontos das ações vão preenchendo a Argentina ao longo de 2024 e depois o mapa fica parado (ver seção 7, Identidade visual). Motivo: pedido de uma entrada mais dinâmica, que mostre já na abertura onde e quando as ações aconteceram. Também: links do menu passam a quebrar linha em telas estreitas (antes vazavam para a direita no celular).</w:t>
       </w:r>
     </w:p>
     <w:p>

</xml_diff>

<commit_message>
Mapa da abertura: países vizinhos e oceanos, cores mais vivas, divisas mais fortes e bandeira
Co-Authored-By: Claude Opus 5.5 <noreply@anthropic.com>
Claude-Session: https://claude.ai/code/session_01VemTUauk2kCmRrtg5b6HFR
</commit_message>
<xml_diff>
--- a/PROCESSO.docx
+++ b/PROCESSO.docx
@@ -297,7 +297,7 @@
               <w:rPr>
                 <w:sz w:val="18"/>
               </w:rPr>
-              <w:t xml:space="preserve">1.6 · 30/10/2026</w:t>
+              <w:t xml:space="preserve">1.7 · 30/10/2026</w:t>
             </w:r>
           </w:p>
         </w:tc>
@@ -5478,7 +5478,19 @@
         <w:t xml:space="preserve">assets/js/marcha.js</w:t>
       </w:r>
       <w:r>
-        <w:t xml:space="preserve">) continua no repositório, sem uso.</w:t>
+        <w:t xml:space="preserve">) continua no repositório, sem uso. Visual do mapa (ajuste de 30/10/2026): a Argentina aparece entre os países vizinhos (Chile, Bolívia, Paraguai, Uruguai e Brasil, de</w:t>
+      </w:r>
+      <w:r>
+        <w:t xml:space="preserve"> </w:t>
+      </w:r>
+      <w:r>
+        <w:rPr>
+          <w:rStyle w:val="VerbatimChar"/>
+        </w:rPr>
+        <w:t xml:space="preserve">paises_vizinhos.topo.json</w:t>
+      </w:r>
+      <w:r>
+        <w:t xml:space="preserve">, recortados numa moldura) e os oceanos, com nomes; fundo do país em branco quente, mar em celeste, vizinhos em bege, divisas provinciais mais fortes e contorno do país em azul; bandeira argentina com o Sol de Maio no Atlântico Sul.</w:t>
       </w:r>
     </w:p>
     <w:bookmarkEnd w:id="37"/>
@@ -7181,6 +7193,28 @@
       </w:r>
       <w:r>
         <w:t xml:space="preserve">da página inicial e da base, no lugar da ilustração da marcha: os pontos das ações vão preenchendo a Argentina ao longo de 2024 e depois o mapa fica parado (ver seção 7, Identidade visual). Motivo: pedido de uma entrada mais dinâmica, que mostre já na abertura onde e quando as ações aconteceram. Também: links do menu passam a quebrar linha em telas estreitas (antes vazavam para a direita no celular).</w:t>
+      </w:r>
+    </w:p>
+    <w:p>
+      <w:pPr>
+        <w:numPr>
+          <w:ilvl w:val="0"/>
+          <w:numId w:val="1010"/>
+        </w:numPr>
+        <w:pStyle w:val="Compact"/>
+      </w:pPr>
+      <w:r>
+        <w:rPr>
+          <w:bCs/>
+          <w:b/>
+        </w:rPr>
+        <w:t xml:space="preserve">Ajustes no mapa da abertura:</w:t>
+      </w:r>
+      <w:r>
+        <w:t xml:space="preserve"> </w:t>
+      </w:r>
+      <w:r>
+        <w:t xml:space="preserve">países vizinhos e oceanos com nomes, como no mapa navegável; cores mais vivas (mar celeste, país em branco quente, vizinhos em bege); divisas das províncias mais fortes; bandeira argentina. Motivo: pedido do responsável (o fundo estava muito apagado e faltava situar a Argentina no continente).</w:t>
       </w:r>
     </w:p>
     <w:p>

</xml_diff>

<commit_message>
Mapa da abertura ocupa todo o cabeçalho da página inicial e perde o gráfico de semanas
Co-Authored-By: Claude Opus 5.5 <noreply@anthropic.com>
Claude-Session: https://claude.ai/code/session_01VemTUauk2kCmRrtg5b6HFR
</commit_message>
<xml_diff>
--- a/PROCESSO.docx
+++ b/PROCESSO.docx
@@ -297,7 +297,7 @@
               <w:rPr>
                 <w:sz w:val="18"/>
               </w:rPr>
-              <w:t xml:space="preserve">1.7 · 30/10/2026</w:t>
+              <w:t xml:space="preserve">1.8 · 30/10/2026</w:t>
             </w:r>
           </w:p>
         </w:tc>
@@ -5403,7 +5403,7 @@
         <w:t xml:space="preserve"> </w:t>
       </w:r>
       <w:r>
-        <w:t xml:space="preserve">(página inicial e base, desde 30/10/2026; substituiu a ilustração da marcha): a Argentina é preenchida, dia a dia, por um ponto para cada ação noticiada (notícias únicas, na localidade citada, na data de início da ação ou, na falta dela, na de publicação), em cerca de 8 segundos, e depois fica parada; uma barra de semanas embaixo acompanha o ano e o contador mostra o mês e o número de ações. Pontos do mesmo lugar se espalham em espiral, e por isso as cidades com muitas ações viram manchas. Começa quando o mapa aparece na tela, tem o botão “Ver de novo” e, com “reduzir movimento” ativado no sistema, aparece direto no estado final. Dados em</w:t>
+        <w:t xml:space="preserve">(página inicial e base, desde 30/10/2026; substituiu a ilustração da marcha): a Argentina é preenchida, dia a dia, por um ponto para cada ação noticiada (notícias únicas, na localidade citada, na data de início da ação ou, na falta dela, na de publicação), em cerca de 8 segundos, e depois fica parada; o contador mostra o mês e o número de ações. Na página inicial, em telas a partir de 1200 px, o mapa ocupa todo o cabeçalho, atrás do título (quadro largo com o Pacífico à esquerda e a Argentina ancorada à direita); em telas menores e na base interativa aparece só o recorte da Argentina, numa moldura. Pontos do mesmo lugar se espalham em espiral, e por isso as cidades com muitas ações viram manchas. Começa quando o mapa aparece na tela, tem o botão “Ver de novo” e, com “reduzir movimento” ativado no sistema, aparece direto no estado final. Dados em</w:t>
       </w:r>
       <w:r>
         <w:t xml:space="preserve"> </w:t>
@@ -7215,6 +7215,44 @@
       </w:r>
       <w:r>
         <w:t xml:space="preserve">países vizinhos e oceanos com nomes, como no mapa navegável; cores mais vivas (mar celeste, país em branco quente, vizinhos em bege); divisas das províncias mais fortes; bandeira argentina. Motivo: pedido do responsável (o fundo estava muito apagado e faltava situar a Argentina no continente).</w:t>
+      </w:r>
+    </w:p>
+    <w:p>
+      <w:pPr>
+        <w:numPr>
+          <w:ilvl w:val="0"/>
+          <w:numId w:val="1010"/>
+        </w:numPr>
+        <w:pStyle w:val="Compact"/>
+      </w:pPr>
+      <w:r>
+        <w:rPr>
+          <w:bCs/>
+          <w:b/>
+        </w:rPr>
+        <w:t xml:space="preserve">Mapa no cabeçalho inteiro</w:t>
+      </w:r>
+      <w:r>
+        <w:t xml:space="preserve"> </w:t>
+      </w:r>
+      <w:r>
+        <w:t xml:space="preserve">da página inicial (telas a partir de 1200 px), com grade de meridianos e paralelos no mar, e</w:t>
+      </w:r>
+      <w:r>
+        <w:t xml:space="preserve"> </w:t>
+      </w:r>
+      <w:r>
+        <w:rPr>
+          <w:bCs/>
+          <w:b/>
+        </w:rPr>
+        <w:t xml:space="preserve">sem o gráfico de semanas</w:t>
+      </w:r>
+      <w:r>
+        <w:t xml:space="preserve"> </w:t>
+      </w:r>
+      <w:r>
+        <w:t xml:space="preserve">embaixo do mapa (na página inicial e na base). Contagem de localidades do mapa passou a usar os nomes das localidades (123), e não as coordenadas arredondadas. Motivo: pedido do responsável.</w:t>
       </w:r>
     </w:p>
     <w:p>

</xml_diff>

<commit_message>
Mapa da abertura cobre todo o cabeçalho (menu incluído) em qualquer largura de tela
Co-Authored-By: Claude Opus 5.5 <noreply@anthropic.com>
Claude-Session: https://claude.ai/code/session_01VemTUauk2kCmRrtg5b6HFR
</commit_message>
<xml_diff>
--- a/PROCESSO.docx
+++ b/PROCESSO.docx
@@ -297,7 +297,7 @@
               <w:rPr>
                 <w:sz w:val="18"/>
               </w:rPr>
-              <w:t xml:space="preserve">1.8 · 30/10/2026</w:t>
+              <w:t xml:space="preserve">1.9 · 30/10/2026</w:t>
             </w:r>
           </w:p>
         </w:tc>
@@ -5403,7 +5403,7 @@
         <w:t xml:space="preserve"> </w:t>
       </w:r>
       <w:r>
-        <w:t xml:space="preserve">(página inicial e base, desde 30/10/2026; substituiu a ilustração da marcha): a Argentina é preenchida, dia a dia, por um ponto para cada ação noticiada (notícias únicas, na localidade citada, na data de início da ação ou, na falta dela, na de publicação), em cerca de 8 segundos, e depois fica parada; o contador mostra o mês e o número de ações. Na página inicial, em telas a partir de 1200 px, o mapa ocupa todo o cabeçalho, atrás do título (quadro largo com o Pacífico à esquerda e a Argentina ancorada à direita); em telas menores e na base interativa aparece só o recorte da Argentina, numa moldura. Pontos do mesmo lugar se espalham em espiral, e por isso as cidades com muitas ações viram manchas. Começa quando o mapa aparece na tela, tem o botão “Ver de novo” e, com “reduzir movimento” ativado no sistema, aparece direto no estado final. Dados em</w:t>
+        <w:t xml:space="preserve">(página inicial e base, desde 30/10/2026; substituiu a ilustração da marcha): a Argentina é preenchida, dia a dia, por um ponto para cada ação noticiada (notícias únicas, na localidade citada, na data de início da ação ou, na falta dela, na de publicação), em cerca de 8 segundos, e depois fica parada; o contador mostra o mês e o número de ações. Na página inicial, a partir de 760 px de largura, o mapa ocupa todo o cabeçalho, inclusive atrás da navegação: a altura do mapa acompanha a do cabeçalho (a Argentina vai de logo abaixo do menu até o pé) e o quadro é deslocado para a Argentina começar logo depois do texto, com o Pacífico atrás do título e o Atlântico à direita. No celular, o recorte da Argentina vai de uma borda à outra, abaixo do texto, sobre o mesmo fundo celeste. Na base interativa, o mapa fica numa moldura ao lado do título. Pontos do mesmo lugar se espalham em espiral, e por isso as cidades com muitas ações viram manchas. Começa quando o mapa aparece na tela, tem o botão “Ver de novo” e, com “reduzir movimento” ativado no sistema, aparece direto no estado final. Dados em</w:t>
       </w:r>
       <w:r>
         <w:t xml:space="preserve"> </w:t>
@@ -7253,6 +7253,28 @@
       </w:r>
       <w:r>
         <w:t xml:space="preserve">embaixo do mapa (na página inicial e na base). Contagem de localidades do mapa passou a usar os nomes das localidades (123), e não as coordenadas arredondadas. Motivo: pedido do responsável.</w:t>
+      </w:r>
+    </w:p>
+    <w:p>
+      <w:pPr>
+        <w:numPr>
+          <w:ilvl w:val="0"/>
+          <w:numId w:val="1010"/>
+        </w:numPr>
+        <w:pStyle w:val="Compact"/>
+      </w:pPr>
+      <w:r>
+        <w:rPr>
+          <w:bCs/>
+          <w:b/>
+        </w:rPr>
+        <w:t xml:space="preserve">Mapa cobrindo o cabeçalho inteiro em qualquer tela</w:t>
+      </w:r>
+      <w:r>
+        <w:t xml:space="preserve"> </w:t>
+      </w:r>
+      <w:r>
+        <w:t xml:space="preserve">(a versão anterior só fazia isso a partir de 1200 px e deixava o menu sobre fundo branco): menu dentro do cabeçalho, sobre o mapa, com fundo branco translúcido; enquadramento calculado no navegador a partir do tamanho do cabeçalho e do texto. Motivo: o responsável avaliou que o mapa não ocupava todo o cabeçalho.</w:t>
       </w:r>
     </w:p>
     <w:p>

</xml_diff>

<commit_message>
Novo nome oficial da base, título da página inicial e bandeira reposicionada no mapa
Co-Authored-By: Claude Opus 5.5 <noreply@anthropic.com>
Claude-Session: https://claude.ai/code/session_01VemTUauk2kCmRrtg5b6HFR
</commit_message>
<xml_diff>
--- a/PROCESSO.docx
+++ b/PROCESSO.docx
@@ -20,7 +20,7 @@
           <w:bCs/>
           <w:b/>
         </w:rPr>
-        <w:t xml:space="preserve">Banco de Dados das Lutas por Espaços e Territórios (DATALUTA) Argentina 2024 · Movimentos Socioespaciais e Socioterritoriais Urbanos</w:t>
+        <w:t xml:space="preserve">Banco de Dados das Lutas por Espaços e Territórios (DATALUTA) - Movimentos Socioespaciais e Socioterritoriais Urbanos Argentinos (2024)</w:t>
       </w:r>
     </w:p>
     <w:p>
@@ -297,7 +297,7 @@
               <w:rPr>
                 <w:sz w:val="18"/>
               </w:rPr>
-              <w:t xml:space="preserve">1.9 · 30/10/2026</w:t>
+              <w:t xml:space="preserve">2.0 · 30/10/2026</w:t>
             </w:r>
           </w:p>
         </w:tc>
@@ -7275,6 +7275,40 @@
       </w:r>
       <w:r>
         <w:t xml:space="preserve">(a versão anterior só fazia isso a partir de 1200 px e deixava o menu sobre fundo branco): menu dentro do cabeçalho, sobre o mapa, com fundo branco translúcido; enquadramento calculado no navegador a partir do tamanho do cabeçalho e do texto. Motivo: o responsável avaliou que o mapa não ocupava todo o cabeçalho.</w:t>
+      </w:r>
+    </w:p>
+    <w:p>
+      <w:pPr>
+        <w:numPr>
+          <w:ilvl w:val="0"/>
+          <w:numId w:val="1010"/>
+        </w:numPr>
+        <w:pStyle w:val="Compact"/>
+      </w:pPr>
+      <w:r>
+        <w:rPr>
+          <w:bCs/>
+          <w:b/>
+        </w:rPr>
+        <w:t xml:space="preserve">Nome oficial da base</w:t>
+      </w:r>
+      <w:r>
+        <w:t xml:space="preserve"> </w:t>
+      </w:r>
+      <w:r>
+        <w:t xml:space="preserve">passa a ser “Banco de Dados das Lutas por Espaços e Territórios (DATALUTA) - Movimentos Socioespaciais e Socioterritoriais Urbanos Argentinos (2024)” (em espanhol, “Banco de Datos de las Luchas por Espacios y Territorios (DATALUTA) - Movimientos Socioespaciales y Socioterritoriales Urbanos Argentinos (2024)”), na página inicial, na base, na página Sobre, nas citações (README,</w:t>
+      </w:r>
+      <w:r>
+        <w:t xml:space="preserve"> </w:t>
+      </w:r>
+      <w:r>
+        <w:rPr>
+          <w:rStyle w:val="VerbatimChar"/>
+        </w:rPr>
+        <w:t xml:space="preserve">LICENCAS.md</w:t>
+      </w:r>
+      <w:r>
+        <w:t xml:space="preserve">, Sobre), neste documento e no rodapé da versão em Word. Título da página inicial: “Ações no espaço urbano argentino em 2024”. Bandeira do mapa da abertura reposicionada para o Atlântico aberto, a leste da Patagônia. Motivo: pedido do responsável.</w:t>
       </w:r>
     </w:p>
     <w:p>
@@ -7504,7 +7538,7 @@
         <w:color w:val="7C8AA0"/>
         <w:sz w:val="16"/>
       </w:rPr>
-      <w:t>DATALUTA Argentina 2024 · Processo de construção da base</w:t>
+      <w:t>DATALUTA · Movimentos Socioespaciais e Socioterritoriais Urbanos Argentinos (2024) · Processo de construção da base</w:t>
     </w:r>
   </w:p>
 </w:ftr>

</xml_diff>

<commit_message>
Linha do nome da base e rótulos em azul da paleta, no lugar do laranja
Co-Authored-By: Claude Opus 5.5 <noreply@anthropic.com>
Claude-Session: https://claude.ai/code/session_01VemTUauk2kCmRrtg5b6HFR
</commit_message>
<xml_diff>
--- a/PROCESSO.docx
+++ b/PROCESSO.docx
@@ -297,7 +297,7 @@
               <w:rPr>
                 <w:sz w:val="18"/>
               </w:rPr>
-              <w:t xml:space="preserve">2.0 · 30/10/2026</w:t>
+              <w:t xml:space="preserve">2.1 · 30/10/2026</w:t>
             </w:r>
           </w:p>
         </w:tc>
@@ -7309,6 +7309,28 @@
       </w:r>
       <w:r>
         <w:t xml:space="preserve">, Sobre), neste documento e no rodapé da versão em Word. Título da página inicial: “Ações no espaço urbano argentino em 2024”. Bandeira do mapa da abertura reposicionada para o Atlântico aberto, a leste da Patagônia. Motivo: pedido do responsável.</w:t>
+      </w:r>
+    </w:p>
+    <w:p>
+      <w:pPr>
+        <w:numPr>
+          <w:ilvl w:val="0"/>
+          <w:numId w:val="1010"/>
+        </w:numPr>
+        <w:pStyle w:val="Compact"/>
+      </w:pPr>
+      <w:r>
+        <w:rPr>
+          <w:bCs/>
+          <w:b/>
+        </w:rPr>
+        <w:t xml:space="preserve">Linha com o nome da base</w:t>
+      </w:r>
+      <w:r>
+        <w:t xml:space="preserve"> </w:t>
+      </w:r>
+      <w:r>
+        <w:t xml:space="preserve">(acima do título, na página inicial e na Sobre) e rótulos da Síntese e das leituras passam do laranja-amarronzado para o azul da paleta (#1d5994 e #2569ad). O laranja segue só nos gráficos e mapas, onde indica “acima do esperado”. Motivo: pedido do responsável, para combinar com a paleta.</w:t>
       </w:r>
     </w:p>
     <w:p>

</xml_diff>

<commit_message>
Ficha de cada notícia, correção colaborativa, data de atualização, galeria de perguntas e página de produções
Tudo acrescentado sem mudar a estrutura da base:
- ficha-noticia.js: ficha com link próprio (#…&noticia=), mini mapa, notícias parecidas, sugerir correção
- formulários do GitHub para correção e para produções (.github/ISSUE_TEMPLATE)
- data de atualização dos dados (resumo.json "atualizado", atualizado.js); checkout com histórico completo
- galeria "Perguntas para começar" na página inicial, com o parâmetro novo pronto=ABA:N (abrir-pronto.js)
- página /producoes/ lida de dados/producoes.csv
- versão em espanhol: links entre páginas ficam em es/; es/producoes/
- PROCESSO.md 2.2 (+ Word) e README

Co-Authored-By: Claude Opus 5.5 <noreply@anthropic.com>
Claude-Session: https://claude.ai/code/session_01VemTUauk2kCmRrtg5b6HFR
</commit_message>
<xml_diff>
--- a/PROCESSO.docx
+++ b/PROCESSO.docx
@@ -2,7 +2,7 @@
 <file path=word/document.xml><?xml version="1.0" encoding="utf-8"?>
 <w:document xmlns:w="http://schemas.openxmlformats.org/wordprocessingml/2006/main" xmlns:m="http://schemas.openxmlformats.org/officeDocument/2006/math" xmlns:r="http://schemas.openxmlformats.org/officeDocument/2006/relationships" xmlns:o="urn:schemas-microsoft-com:office:office" xmlns:v="urn:schemas-microsoft-com:vml" xmlns:w10="urn:schemas-microsoft-com:office:word" xmlns:a="http://schemas.openxmlformats.org/drawingml/2006/main" xmlns:pic="http://schemas.openxmlformats.org/drawingml/2006/picture" xmlns:wp="http://schemas.openxmlformats.org/drawingml/2006/wordprocessingDrawing">
   <w:body>
-    <w:bookmarkStart w:id="49" w:name="Xa2da3811f05494e056d19a3aa3e79062f38da32"/>
+    <w:bookmarkStart w:id="50" w:name="Xa2da3811f05494e056d19a3aa3e79062f38da32"/>
     <w:p>
       <w:pPr>
         <w:pStyle w:val="Heading1"/>
@@ -189,7 +189,7 @@
               <w:rPr>
                 <w:sz w:val="18"/>
               </w:rPr>
-              <w:t xml:space="preserve">, página de metodologia em</w:t>
+              <w:t xml:space="preserve">, metodologia em</w:t>
             </w:r>
             <w:r>
               <w:rPr>
@@ -203,6 +203,25 @@
                 <w:sz w:val="18"/>
               </w:rPr>
               <w:t xml:space="preserve">/sobre/</w:t>
+            </w:r>
+            <w:r>
+              <w:rPr>
+                <w:sz w:val="18"/>
+              </w:rPr>
+              <w:t xml:space="preserve">, produções em</w:t>
+            </w:r>
+            <w:r>
+              <w:rPr>
+                <w:sz w:val="18"/>
+              </w:rPr>
+              <w:t xml:space="preserve"> </w:t>
+            </w:r>
+            <w:r>
+              <w:rPr>
+                <w:rStyle w:val="VerbatimChar"/>
+                <w:sz w:val="18"/>
+              </w:rPr>
+              <w:t xml:space="preserve">/producoes/</w:t>
             </w:r>
             <w:r>
               <w:rPr>
@@ -297,7 +316,7 @@
               <w:rPr>
                 <w:sz w:val="18"/>
               </w:rPr>
-              <w:t xml:space="preserve">2.1 · 30/10/2026</w:t>
+              <w:t xml:space="preserve">2.2 · 30/10/2026</w:t>
             </w:r>
           </w:p>
         </w:tc>
@@ -4221,7 +4240,7 @@
     </w:p>
     <w:bookmarkEnd w:id="35"/>
     <w:bookmarkEnd w:id="36"/>
-    <w:bookmarkStart w:id="41" w:name="X6d348273175772d54216bfc7432a22c556cacdc"/>
+    <w:bookmarkStart w:id="42" w:name="X6d348273175772d54216bfc7432a22c556cacdc"/>
     <w:p>
       <w:pPr>
         <w:pStyle w:val="Heading2"/>
@@ -5654,13 +5673,21 @@
       </w:r>
     </w:p>
     <w:bookmarkEnd w:id="39"/>
-    <w:bookmarkStart w:id="40" w:name="Xe2536c815164416847d5f5b617d6e05abe31b59"/>
+    <w:bookmarkStart w:id="40" w:name="X2610cc037de1195ebb8ec8ba0118b692a0f7803"/>
     <w:p>
       <w:pPr>
         <w:pStyle w:val="Heading3"/>
       </w:pPr>
       <w:r>
-        <w:t xml:space="preserve">7.4 Versão em espanhol</w:t>
+        <w:t xml:space="preserve">7.5 Recursos acrescentados em 30/10/2026 (sem mudar a estrutura da base)</w:t>
+      </w:r>
+    </w:p>
+    <w:p>
+      <w:pPr>
+        <w:pStyle w:val="FirstParagraph"/>
+      </w:pPr>
+      <w:r>
+        <w:t xml:space="preserve">Todos entram como módulos ou páginas novas; abas, cálculos, combinações prontas e endereços antigos continuam iguais.</w:t>
       </w:r>
     </w:p>
     <w:p>
@@ -5672,46 +5699,64 @@
         <w:pStyle w:val="Compact"/>
       </w:pPr>
       <w:r>
-        <w:t xml:space="preserve">Endereços:</w:t>
-      </w:r>
-      <w:r>
-        <w:t xml:space="preserve"> </w:t>
-      </w:r>
-      <w:r>
-        <w:rPr>
-          <w:rStyle w:val="VerbatimChar"/>
-        </w:rPr>
-        <w:t xml:space="preserve">/es/</w:t>
-      </w:r>
-      <w:r>
-        <w:t xml:space="preserve">,</w:t>
-      </w:r>
-      <w:r>
-        <w:t xml:space="preserve"> </w:t>
-      </w:r>
-      <w:r>
-        <w:rPr>
-          <w:rStyle w:val="VerbatimChar"/>
-        </w:rPr>
-        <w:t xml:space="preserve">/es/base/</w:t>
-      </w:r>
-      <w:r>
-        <w:t xml:space="preserve"> </w:t>
-      </w:r>
-      <w:r>
-        <w:t xml:space="preserve">e</w:t>
-      </w:r>
-      <w:r>
-        <w:t xml:space="preserve"> </w:t>
-      </w:r>
-      <w:r>
-        <w:rPr>
-          <w:rStyle w:val="VerbatimChar"/>
-        </w:rPr>
-        <w:t xml:space="preserve">/es/sobre/</w:t>
-      </w:r>
-      <w:r>
-        <w:t xml:space="preserve">; o link “Español”/“Português” no menu troca de idioma (na base, mantendo aba e filtros).</w:t>
+        <w:rPr>
+          <w:bCs/>
+          <w:b/>
+        </w:rPr>
+        <w:t xml:space="preserve">Ficha de cada notícia</w:t>
+      </w:r>
+      <w:r>
+        <w:t xml:space="preserve"> </w:t>
+      </w:r>
+      <w:r>
+        <w:t xml:space="preserve">(</w:t>
+      </w:r>
+      <w:r>
+        <w:rPr>
+          <w:rStyle w:val="VerbatimChar"/>
+        </w:rPr>
+        <w:t xml:space="preserve">assets/js/app/ficha-noticia.js</w:t>
+      </w:r>
+      <w:r>
+        <w:t xml:space="preserve">). Cada linha da lista de notícias ganha um botão “Ficha”, que abre um painel com tudo o que foi codificado (agrupado como na planilha), datas, veículo, link da notícia original, um mapa pequeno com as localidades citadas e até 5</w:t>
+      </w:r>
+      <w:r>
+        <w:t xml:space="preserve"> </w:t>
+      </w:r>
+      <w:r>
+        <w:rPr>
+          <w:bCs/>
+          <w:b/>
+        </w:rPr>
+        <w:t xml:space="preserve">notícias parecidas</w:t>
+      </w:r>
+      <w:r>
+        <w:t xml:space="preserve">. Parecidas = soma de categorias em comum, com pesos: organização 3, tipo de movimento 2, objetivos 2, localidade 2, ação matriz 1, ação derivada 1, província 1; entram as que somam 3 ou mais; empate desfeito pela data mais próxima. A ficha tem</w:t>
+      </w:r>
+      <w:r>
+        <w:t xml:space="preserve"> </w:t>
+      </w:r>
+      <w:r>
+        <w:rPr>
+          <w:bCs/>
+          <w:b/>
+        </w:rPr>
+        <w:t xml:space="preserve">link próprio</w:t>
+      </w:r>
+      <w:r>
+        <w:t xml:space="preserve"> </w:t>
+      </w:r>
+      <w:r>
+        <w:t xml:space="preserve">(</w:t>
+      </w:r>
+      <w:r>
+        <w:rPr>
+          <w:rStyle w:val="VerbatimChar"/>
+        </w:rPr>
+        <w:t xml:space="preserve">base/#…&amp;noticia=CÓDIGO</w:t>
+      </w:r>
+      <w:r>
+        <w:t xml:space="preserve">), que abre a base já com ela.</w:t>
       </w:r>
     </w:p>
     <w:p>
@@ -5727,67 +5772,22 @@
           <w:bCs/>
           <w:b/>
         </w:rPr>
-        <w:t xml:space="preserve">Como é gerada.</w:t>
-      </w:r>
-      <w:r>
-        <w:t xml:space="preserve"> </w:t>
-      </w:r>
-      <w:r>
-        <w:t xml:space="preserve">O português continua sendo o original.</w:t>
-      </w:r>
-      <w:r>
-        <w:t xml:space="preserve"> </w:t>
-      </w:r>
-      <w:r>
-        <w:rPr>
-          <w:rStyle w:val="VerbatimChar"/>
-        </w:rPr>
-        <w:t xml:space="preserve">i18n/ferramenta.js</w:t>
-      </w:r>
-      <w:r>
-        <w:t xml:space="preserve"> </w:t>
-      </w:r>
-      <w:r>
-        <w:t xml:space="preserve">(Node) lê o JavaScript com o analisador do TypeScript e as páginas HTML, encontra cada trecho de texto e o troca pela tradução do catálogo</w:t>
-      </w:r>
-      <w:r>
-        <w:t xml:space="preserve"> </w:t>
-      </w:r>
-      <w:r>
-        <w:rPr>
-          <w:rStyle w:val="VerbatimChar"/>
-        </w:rPr>
-        <w:t xml:space="preserve">i18n/es.json</w:t>
-      </w:r>
-      <w:r>
-        <w:t xml:space="preserve"> </w:t>
-      </w:r>
-      <w:r>
-        <w:t xml:space="preserve">(pares “texto em português” → “texto em espanhol”, cerca de 1.800). Palavras curtas que em outros arquivos são chaves internas (meses abreviados, “forte”, “baixo”…) são traduzidas só no arquivo certo, por</w:t>
-      </w:r>
-      <w:r>
-        <w:t xml:space="preserve"> </w:t>
-      </w:r>
-      <w:r>
-        <w:rPr>
-          <w:rStyle w:val="VerbatimChar"/>
-        </w:rPr>
-        <w:t xml:space="preserve">i18n/es-contexto.json</w:t>
-      </w:r>
-      <w:r>
-        <w:t xml:space="preserve">. Textos que são iguais nas duas línguas ou não devem ser traduzidos (nomes de organizações, seletores CSS, definições do INDEC já em espanhol) ficam em</w:t>
-      </w:r>
-      <w:r>
-        <w:t xml:space="preserve"> </w:t>
-      </w:r>
-      <w:r>
-        <w:rPr>
-          <w:rStyle w:val="VerbatimChar"/>
-        </w:rPr>
-        <w:t xml:space="preserve">i18n/ignorar.json</w:t>
-      </w:r>
-      <w:r>
-        <w:t xml:space="preserve">.</w:t>
+        <w:t xml:space="preserve">Correção colaborativa.</w:t>
+      </w:r>
+      <w:r>
+        <w:t xml:space="preserve"> </w:t>
+      </w:r>
+      <w:r>
+        <w:t xml:space="preserve">Botão “Sugerir uma correção” em cada ficha e link “Sugerir uma notícia que faltou” ao pé da lista. Ambos abrem um formulário do GitHub (</w:t>
+      </w:r>
+      <w:r>
+        <w:rPr>
+          <w:rStyle w:val="VerbatimChar"/>
+        </w:rPr>
+        <w:t xml:space="preserve">.github/ISSUE_TEMPLATE/correcao.yml</w:t>
+      </w:r>
+      <w:r>
+        <w:t xml:space="preserve">) com o código e o título da notícia já preenchidos; é preciso ter conta no GitHub. A equipe revisa antes de mudar a planilha.</w:t>
       </w:r>
     </w:p>
     <w:p>
@@ -5799,94 +5799,71 @@
         <w:pStyle w:val="Compact"/>
       </w:pPr>
       <w:r>
-        <w:t xml:space="preserve">Saídas geradas (não editar à mão):</w:t>
-      </w:r>
-      <w:r>
-        <w:t xml:space="preserve"> </w:t>
-      </w:r>
-      <w:r>
-        <w:rPr>
-          <w:rStyle w:val="VerbatimChar"/>
-        </w:rPr>
-        <w:t xml:space="preserve">es/index.html</w:t>
-      </w:r>
-      <w:r>
-        <w:t xml:space="preserve">,</w:t>
-      </w:r>
-      <w:r>
-        <w:t xml:space="preserve"> </w:t>
-      </w:r>
-      <w:r>
-        <w:rPr>
-          <w:rStyle w:val="VerbatimChar"/>
-        </w:rPr>
-        <w:t xml:space="preserve">es/base/index.html</w:t>
-      </w:r>
-      <w:r>
-        <w:t xml:space="preserve">,</w:t>
-      </w:r>
-      <w:r>
-        <w:t xml:space="preserve"> </w:t>
-      </w:r>
-      <w:r>
-        <w:rPr>
-          <w:rStyle w:val="VerbatimChar"/>
-        </w:rPr>
-        <w:t xml:space="preserve">es/sobre/index.html</w:t>
-      </w:r>
-      <w:r>
-        <w:t xml:space="preserve"> </w:t>
-      </w:r>
-      <w:r>
-        <w:t xml:space="preserve">e</w:t>
-      </w:r>
-      <w:r>
-        <w:t xml:space="preserve"> </w:t>
-      </w:r>
-      <w:r>
-        <w:rPr>
-          <w:rStyle w:val="VerbatimChar"/>
-        </w:rPr>
-        <w:t xml:space="preserve">assets/js/app-es/*.js</w:t>
-      </w:r>
-      <w:r>
-        <w:t xml:space="preserve">. Rótulos que vêm dos dados (nomes das variáveis, meses, indicadores, acontecimentos) são traduzidos no navegador, logo depois de carregar os JSON (</w:t>
-      </w:r>
-      <w:r>
-        <w:rPr>
-          <w:rStyle w:val="VerbatimChar"/>
-        </w:rPr>
-        <w:t xml:space="preserve">TR_DADOS</w:t>
-      </w:r>
-      <w:r>
-        <w:t xml:space="preserve"> </w:t>
-      </w:r>
-      <w:r>
-        <w:t xml:space="preserve">em</w:t>
-      </w:r>
-      <w:r>
-        <w:t xml:space="preserve"> </w:t>
-      </w:r>
-      <w:r>
-        <w:rPr>
-          <w:rStyle w:val="VerbatimChar"/>
-        </w:rPr>
-        <w:t xml:space="preserve">assets/js/app-es/carregar.js</w:t>
-      </w:r>
-      <w:r>
-        <w:t xml:space="preserve">). Datas e números usam o formato</w:t>
-      </w:r>
-      <w:r>
-        <w:t xml:space="preserve"> </w:t>
-      </w:r>
-      <w:r>
-        <w:rPr>
-          <w:rStyle w:val="VerbatimChar"/>
-        </w:rPr>
-        <w:t xml:space="preserve">es-AR</w:t>
-      </w:r>
-      <w:r>
-        <w:t xml:space="preserve">.</w:t>
+        <w:rPr>
+          <w:bCs/>
+          <w:b/>
+        </w:rPr>
+        <w:t xml:space="preserve">Data de atualização dos dados</w:t>
+      </w:r>
+      <w:r>
+        <w:t xml:space="preserve"> </w:t>
+      </w:r>
+      <w:r>
+        <w:t xml:space="preserve">na página inicial, na base e na página Sobre (</w:t>
+      </w:r>
+      <w:r>
+        <w:rPr>
+          <w:rStyle w:val="VerbatimChar"/>
+        </w:rPr>
+        <w:t xml:space="preserve">assets/js/atualizado.js</w:t>
+      </w:r>
+      <w:r>
+        <w:t xml:space="preserve">). Vem do campo</w:t>
+      </w:r>
+      <w:r>
+        <w:t xml:space="preserve"> </w:t>
+      </w:r>
+      <w:r>
+        <w:rPr>
+          <w:rStyle w:val="VerbatimChar"/>
+        </w:rPr>
+        <w:t xml:space="preserve">atualizado</w:t>
+      </w:r>
+      <w:r>
+        <w:t xml:space="preserve"> </w:t>
+      </w:r>
+      <w:r>
+        <w:t xml:space="preserve">de</w:t>
+      </w:r>
+      <w:r>
+        <w:t xml:space="preserve"> </w:t>
+      </w:r>
+      <w:r>
+        <w:rPr>
+          <w:rStyle w:val="VerbatimChar"/>
+        </w:rPr>
+        <w:t xml:space="preserve">dados/resumo.json</w:t>
+      </w:r>
+      <w:r>
+        <w:t xml:space="preserve">, que o pipeline preenche com a data do último commit que alterou a planilha publicável (</w:t>
+      </w:r>
+      <w:r>
+        <w:rPr>
+          <w:rStyle w:val="VerbatimChar"/>
+        </w:rPr>
+        <w:t xml:space="preserve">dados/fonte/acoes_2024_fonte.csv</w:t>
+      </w:r>
+      <w:r>
+        <w:t xml:space="preserve">); o GitHub Actions passou a baixar o histórico completo (</w:t>
+      </w:r>
+      <w:r>
+        <w:rPr>
+          <w:rStyle w:val="VerbatimChar"/>
+        </w:rPr>
+        <w:t xml:space="preserve">fetch-depth: 0</w:t>
+      </w:r>
+      <w:r>
+        <w:t xml:space="preserve">) para isso.</w:t>
       </w:r>
     </w:p>
     <w:p>
@@ -5898,47 +5875,66 @@
         <w:pStyle w:val="Compact"/>
       </w:pPr>
       <w:r>
-        <w:t xml:space="preserve">O GitHub Actions gera a versão em espanhol a cada publicação.</w:t>
-      </w:r>
-      <w:r>
-        <w:t xml:space="preserve"> </w:t>
-      </w:r>
-      <w:r>
         <w:rPr>
           <w:bCs/>
           <w:b/>
         </w:rPr>
-        <w:t xml:space="preserve">Ao mudar um texto em português</w:t>
-      </w:r>
-      <w:r>
-        <w:t xml:space="preserve">, rode</w:t>
-      </w:r>
-      <w:r>
-        <w:t xml:space="preserve"> </w:t>
-      </w:r>
-      <w:r>
-        <w:rPr>
-          <w:rStyle w:val="VerbatimChar"/>
-        </w:rPr>
-        <w:t xml:space="preserve">node i18n/ferramenta.js gerar</w:t>
-      </w:r>
-      <w:r>
-        <w:t xml:space="preserve">: o que ficar sem tradução aparece em</w:t>
-      </w:r>
-      <w:r>
-        <w:t xml:space="preserve"> </w:t>
-      </w:r>
-      <w:r>
-        <w:rPr>
-          <w:rStyle w:val="VerbatimChar"/>
-        </w:rPr>
-        <w:t xml:space="preserve">i18n/pendentes.json</w:t>
-      </w:r>
-      <w:r>
-        <w:t xml:space="preserve"> </w:t>
-      </w:r>
-      <w:r>
-        <w:t xml:space="preserve">(e no site, em português) até ser acrescentado ao catálogo.</w:t>
+        <w:t xml:space="preserve">Galeria “Perguntas para começar”</w:t>
+      </w:r>
+      <w:r>
+        <w:t xml:space="preserve"> </w:t>
+      </w:r>
+      <w:r>
+        <w:t xml:space="preserve">na página inicial: 9 cartões com pergunta, texto curto e miniatura (</w:t>
+      </w:r>
+      <w:r>
+        <w:rPr>
+          <w:rStyle w:val="VerbatimChar"/>
+        </w:rPr>
+        <w:t xml:space="preserve">assets/img/galeria/</w:t>
+      </w:r>
+      <w:r>
+        <w:t xml:space="preserve">, geradas por captura da própria base). Cada cartão abre a base numa combinação pronta pelo parâmetro novo</w:t>
+      </w:r>
+      <w:r>
+        <w:t xml:space="preserve"> </w:t>
+      </w:r>
+      <w:r>
+        <w:rPr>
+          <w:rStyle w:val="VerbatimChar"/>
+        </w:rPr>
+        <w:t xml:space="preserve">pronto=ABA:N</w:t>
+      </w:r>
+      <w:r>
+        <w:t xml:space="preserve"> </w:t>
+      </w:r>
+      <w:r>
+        <w:t xml:space="preserve">(</w:t>
+      </w:r>
+      <w:r>
+        <w:rPr>
+          <w:rStyle w:val="VerbatimChar"/>
+        </w:rPr>
+        <w:t xml:space="preserve">assets/js/app/abrir-pronto.js</w:t>
+      </w:r>
+      <w:r>
+        <w:t xml:space="preserve">; N = posição do botão na aba, contando de 0).</w:t>
+      </w:r>
+      <w:r>
+        <w:t xml:space="preserve"> </w:t>
+      </w:r>
+      <w:r>
+        <w:rPr>
+          <w:bCs/>
+          <w:b/>
+        </w:rPr>
+        <w:t xml:space="preserve">Atenção:</w:t>
+      </w:r>
+      <w:r>
+        <w:t xml:space="preserve"> </w:t>
+      </w:r>
+      <w:r>
+        <w:t xml:space="preserve">se a ordem das combinações prontas de uma aba mudar, os links da galeria precisam ser revistos.</w:t>
       </w:r>
     </w:p>
     <w:p>
@@ -5950,6 +5946,391 @@
         <w:pStyle w:val="Compact"/>
       </w:pPr>
       <w:r>
+        <w:rPr>
+          <w:bCs/>
+          <w:b/>
+        </w:rPr>
+        <w:t xml:space="preserve">Página “Produções”</w:t>
+      </w:r>
+      <w:r>
+        <w:t xml:space="preserve"> </w:t>
+      </w:r>
+      <w:r>
+        <w:t xml:space="preserve">(</w:t>
+      </w:r>
+      <w:r>
+        <w:rPr>
+          <w:rStyle w:val="VerbatimChar"/>
+        </w:rPr>
+        <w:t xml:space="preserve">/producoes/</w:t>
+      </w:r>
+      <w:r>
+        <w:t xml:space="preserve">): artigos, apresentações e outros produtos feitos com a base, agrupados por ano, com busca e filtro por tipo. A lista vem de</w:t>
+      </w:r>
+      <w:r>
+        <w:t xml:space="preserve"> </w:t>
+      </w:r>
+      <w:r>
+        <w:rPr>
+          <w:rStyle w:val="VerbatimChar"/>
+        </w:rPr>
+        <w:t xml:space="preserve">dados/producoes.csv</w:t>
+      </w:r>
+      <w:r>
+        <w:t xml:space="preserve"> </w:t>
+      </w:r>
+      <w:r>
+        <w:t xml:space="preserve">(colunas ano, tipo, titulo, autores, onde, link, resumo, resumo_es), editável no GitHub ou no Excel; sugestões pelo formulário</w:t>
+      </w:r>
+      <w:r>
+        <w:t xml:space="preserve"> </w:t>
+      </w:r>
+      <w:r>
+        <w:rPr>
+          <w:rStyle w:val="VerbatimChar"/>
+        </w:rPr>
+        <w:t xml:space="preserve">.github/ISSUE_TEMPLATE/producao.yml</w:t>
+      </w:r>
+      <w:r>
+        <w:t xml:space="preserve">. Ligada no menu de todas as páginas.</w:t>
+      </w:r>
+    </w:p>
+    <w:p>
+      <w:pPr>
+        <w:numPr>
+          <w:ilvl w:val="0"/>
+          <w:numId w:val="1006"/>
+        </w:numPr>
+        <w:pStyle w:val="Compact"/>
+      </w:pPr>
+      <w:r>
+        <w:t xml:space="preserve">A ferramenta da versão em espanhol passou a manter os links entre páginas dentro de</w:t>
+      </w:r>
+      <w:r>
+        <w:t xml:space="preserve"> </w:t>
+      </w:r>
+      <w:r>
+        <w:rPr>
+          <w:rStyle w:val="VerbatimChar"/>
+        </w:rPr>
+        <w:t xml:space="preserve">es/</w:t>
+      </w:r>
+      <w:r>
+        <w:t xml:space="preserve"> </w:t>
+      </w:r>
+      <w:r>
+        <w:t xml:space="preserve">(antes, links da página inicial em espanhol levavam à base em português) e a gerar também</w:t>
+      </w:r>
+      <w:r>
+        <w:t xml:space="preserve"> </w:t>
+      </w:r>
+      <w:r>
+        <w:rPr>
+          <w:rStyle w:val="VerbatimChar"/>
+        </w:rPr>
+        <w:t xml:space="preserve">es/producoes/</w:t>
+      </w:r>
+      <w:r>
+        <w:t xml:space="preserve">.</w:t>
+      </w:r>
+    </w:p>
+    <w:bookmarkEnd w:id="40"/>
+    <w:bookmarkStart w:id="41" w:name="Xe2536c815164416847d5f5b617d6e05abe31b59"/>
+    <w:p>
+      <w:pPr>
+        <w:pStyle w:val="Heading3"/>
+      </w:pPr>
+      <w:r>
+        <w:t xml:space="preserve">7.4 Versão em espanhol</w:t>
+      </w:r>
+    </w:p>
+    <w:p>
+      <w:pPr>
+        <w:numPr>
+          <w:ilvl w:val="0"/>
+          <w:numId w:val="1007"/>
+        </w:numPr>
+        <w:pStyle w:val="Compact"/>
+      </w:pPr>
+      <w:r>
+        <w:t xml:space="preserve">Endereços:</w:t>
+      </w:r>
+      <w:r>
+        <w:t xml:space="preserve"> </w:t>
+      </w:r>
+      <w:r>
+        <w:rPr>
+          <w:rStyle w:val="VerbatimChar"/>
+        </w:rPr>
+        <w:t xml:space="preserve">/es/</w:t>
+      </w:r>
+      <w:r>
+        <w:t xml:space="preserve">,</w:t>
+      </w:r>
+      <w:r>
+        <w:t xml:space="preserve"> </w:t>
+      </w:r>
+      <w:r>
+        <w:rPr>
+          <w:rStyle w:val="VerbatimChar"/>
+        </w:rPr>
+        <w:t xml:space="preserve">/es/base/</w:t>
+      </w:r>
+      <w:r>
+        <w:t xml:space="preserve"> </w:t>
+      </w:r>
+      <w:r>
+        <w:t xml:space="preserve">e</w:t>
+      </w:r>
+      <w:r>
+        <w:t xml:space="preserve"> </w:t>
+      </w:r>
+      <w:r>
+        <w:rPr>
+          <w:rStyle w:val="VerbatimChar"/>
+        </w:rPr>
+        <w:t xml:space="preserve">/es/sobre/</w:t>
+      </w:r>
+      <w:r>
+        <w:t xml:space="preserve">; o link “Español”/“Português” no menu troca de idioma (na base, mantendo aba e filtros).</w:t>
+      </w:r>
+    </w:p>
+    <w:p>
+      <w:pPr>
+        <w:numPr>
+          <w:ilvl w:val="0"/>
+          <w:numId w:val="1007"/>
+        </w:numPr>
+        <w:pStyle w:val="Compact"/>
+      </w:pPr>
+      <w:r>
+        <w:rPr>
+          <w:bCs/>
+          <w:b/>
+        </w:rPr>
+        <w:t xml:space="preserve">Como é gerada.</w:t>
+      </w:r>
+      <w:r>
+        <w:t xml:space="preserve"> </w:t>
+      </w:r>
+      <w:r>
+        <w:t xml:space="preserve">O português continua sendo o original.</w:t>
+      </w:r>
+      <w:r>
+        <w:t xml:space="preserve"> </w:t>
+      </w:r>
+      <w:r>
+        <w:rPr>
+          <w:rStyle w:val="VerbatimChar"/>
+        </w:rPr>
+        <w:t xml:space="preserve">i18n/ferramenta.js</w:t>
+      </w:r>
+      <w:r>
+        <w:t xml:space="preserve"> </w:t>
+      </w:r>
+      <w:r>
+        <w:t xml:space="preserve">(Node) lê o JavaScript com o analisador do TypeScript e as páginas HTML, encontra cada trecho de texto e o troca pela tradução do catálogo</w:t>
+      </w:r>
+      <w:r>
+        <w:t xml:space="preserve"> </w:t>
+      </w:r>
+      <w:r>
+        <w:rPr>
+          <w:rStyle w:val="VerbatimChar"/>
+        </w:rPr>
+        <w:t xml:space="preserve">i18n/es.json</w:t>
+      </w:r>
+      <w:r>
+        <w:t xml:space="preserve"> </w:t>
+      </w:r>
+      <w:r>
+        <w:t xml:space="preserve">(pares “texto em português” → “texto em espanhol”, cerca de 1.800). Palavras curtas que em outros arquivos são chaves internas (meses abreviados, “forte”, “baixo”…) são traduzidas só no arquivo certo, por</w:t>
+      </w:r>
+      <w:r>
+        <w:t xml:space="preserve"> </w:t>
+      </w:r>
+      <w:r>
+        <w:rPr>
+          <w:rStyle w:val="VerbatimChar"/>
+        </w:rPr>
+        <w:t xml:space="preserve">i18n/es-contexto.json</w:t>
+      </w:r>
+      <w:r>
+        <w:t xml:space="preserve">. Textos que são iguais nas duas línguas ou não devem ser traduzidos (nomes de organizações, seletores CSS, definições do INDEC já em espanhol) ficam em</w:t>
+      </w:r>
+      <w:r>
+        <w:t xml:space="preserve"> </w:t>
+      </w:r>
+      <w:r>
+        <w:rPr>
+          <w:rStyle w:val="VerbatimChar"/>
+        </w:rPr>
+        <w:t xml:space="preserve">i18n/ignorar.json</w:t>
+      </w:r>
+      <w:r>
+        <w:t xml:space="preserve">.</w:t>
+      </w:r>
+    </w:p>
+    <w:p>
+      <w:pPr>
+        <w:numPr>
+          <w:ilvl w:val="0"/>
+          <w:numId w:val="1007"/>
+        </w:numPr>
+        <w:pStyle w:val="Compact"/>
+      </w:pPr>
+      <w:r>
+        <w:t xml:space="preserve">Saídas geradas (não editar à mão):</w:t>
+      </w:r>
+      <w:r>
+        <w:t xml:space="preserve"> </w:t>
+      </w:r>
+      <w:r>
+        <w:rPr>
+          <w:rStyle w:val="VerbatimChar"/>
+        </w:rPr>
+        <w:t xml:space="preserve">es/index.html</w:t>
+      </w:r>
+      <w:r>
+        <w:t xml:space="preserve">,</w:t>
+      </w:r>
+      <w:r>
+        <w:t xml:space="preserve"> </w:t>
+      </w:r>
+      <w:r>
+        <w:rPr>
+          <w:rStyle w:val="VerbatimChar"/>
+        </w:rPr>
+        <w:t xml:space="preserve">es/base/index.html</w:t>
+      </w:r>
+      <w:r>
+        <w:t xml:space="preserve">,</w:t>
+      </w:r>
+      <w:r>
+        <w:t xml:space="preserve"> </w:t>
+      </w:r>
+      <w:r>
+        <w:rPr>
+          <w:rStyle w:val="VerbatimChar"/>
+        </w:rPr>
+        <w:t xml:space="preserve">es/sobre/index.html</w:t>
+      </w:r>
+      <w:r>
+        <w:t xml:space="preserve"> </w:t>
+      </w:r>
+      <w:r>
+        <w:t xml:space="preserve">e</w:t>
+      </w:r>
+      <w:r>
+        <w:t xml:space="preserve"> </w:t>
+      </w:r>
+      <w:r>
+        <w:rPr>
+          <w:rStyle w:val="VerbatimChar"/>
+        </w:rPr>
+        <w:t xml:space="preserve">assets/js/app-es/*.js</w:t>
+      </w:r>
+      <w:r>
+        <w:t xml:space="preserve">. Rótulos que vêm dos dados (nomes das variáveis, meses, indicadores, acontecimentos) são traduzidos no navegador, logo depois de carregar os JSON (</w:t>
+      </w:r>
+      <w:r>
+        <w:rPr>
+          <w:rStyle w:val="VerbatimChar"/>
+        </w:rPr>
+        <w:t xml:space="preserve">TR_DADOS</w:t>
+      </w:r>
+      <w:r>
+        <w:t xml:space="preserve"> </w:t>
+      </w:r>
+      <w:r>
+        <w:t xml:space="preserve">em</w:t>
+      </w:r>
+      <w:r>
+        <w:t xml:space="preserve"> </w:t>
+      </w:r>
+      <w:r>
+        <w:rPr>
+          <w:rStyle w:val="VerbatimChar"/>
+        </w:rPr>
+        <w:t xml:space="preserve">assets/js/app-es/carregar.js</w:t>
+      </w:r>
+      <w:r>
+        <w:t xml:space="preserve">). Datas e números usam o formato</w:t>
+      </w:r>
+      <w:r>
+        <w:t xml:space="preserve"> </w:t>
+      </w:r>
+      <w:r>
+        <w:rPr>
+          <w:rStyle w:val="VerbatimChar"/>
+        </w:rPr>
+        <w:t xml:space="preserve">es-AR</w:t>
+      </w:r>
+      <w:r>
+        <w:t xml:space="preserve">.</w:t>
+      </w:r>
+    </w:p>
+    <w:p>
+      <w:pPr>
+        <w:numPr>
+          <w:ilvl w:val="0"/>
+          <w:numId w:val="1007"/>
+        </w:numPr>
+        <w:pStyle w:val="Compact"/>
+      </w:pPr>
+      <w:r>
+        <w:t xml:space="preserve">O GitHub Actions gera a versão em espanhol a cada publicação.</w:t>
+      </w:r>
+      <w:r>
+        <w:t xml:space="preserve"> </w:t>
+      </w:r>
+      <w:r>
+        <w:rPr>
+          <w:bCs/>
+          <w:b/>
+        </w:rPr>
+        <w:t xml:space="preserve">Ao mudar um texto em português</w:t>
+      </w:r>
+      <w:r>
+        <w:t xml:space="preserve">, rode</w:t>
+      </w:r>
+      <w:r>
+        <w:t xml:space="preserve"> </w:t>
+      </w:r>
+      <w:r>
+        <w:rPr>
+          <w:rStyle w:val="VerbatimChar"/>
+        </w:rPr>
+        <w:t xml:space="preserve">node i18n/ferramenta.js gerar</w:t>
+      </w:r>
+      <w:r>
+        <w:t xml:space="preserve">: o que ficar sem tradução aparece em</w:t>
+      </w:r>
+      <w:r>
+        <w:t xml:space="preserve"> </w:t>
+      </w:r>
+      <w:r>
+        <w:rPr>
+          <w:rStyle w:val="VerbatimChar"/>
+        </w:rPr>
+        <w:t xml:space="preserve">i18n/pendentes.json</w:t>
+      </w:r>
+      <w:r>
+        <w:t xml:space="preserve"> </w:t>
+      </w:r>
+      <w:r>
+        <w:t xml:space="preserve">(e no site, em português) até ser acrescentado ao catálogo.</w:t>
+      </w:r>
+    </w:p>
+    <w:p>
+      <w:pPr>
+        <w:numPr>
+          <w:ilvl w:val="0"/>
+          <w:numId w:val="1007"/>
+        </w:numPr>
+        <w:pStyle w:val="Compact"/>
+      </w:pPr>
+      <w:r>
         <w:t xml:space="preserve">As categorias da base (tipos de movimento, objetivos etc.) já estão em espanhol na planilha e não mudam.</w:t>
       </w:r>
     </w:p>
@@ -5960,9 +6341,9 @@
         </w:pict>
       </w:r>
     </w:p>
-    <w:bookmarkEnd w:id="40"/>
     <w:bookmarkEnd w:id="41"/>
-    <w:bookmarkStart w:id="42" w:name="X9a8a5c3f4675aaafcd01bef6e7fb33b3e7de441"/>
+    <w:bookmarkEnd w:id="42"/>
+    <w:bookmarkStart w:id="43" w:name="X9a8a5c3f4675aaafcd01bef6e7fb33b3e7de441"/>
     <w:p>
       <w:pPr>
         <w:pStyle w:val="Heading2"/>
@@ -6413,8 +6794,8 @@
         </w:pict>
       </w:r>
     </w:p>
-    <w:bookmarkEnd w:id="42"/>
-    <w:bookmarkStart w:id="47" w:name="X37a24ddc49ec6a08847d5e7c09b751dfa640a32"/>
+    <w:bookmarkEnd w:id="43"/>
+    <w:bookmarkStart w:id="48" w:name="X37a24ddc49ec6a08847d5e7c09b751dfa640a32"/>
     <w:p>
       <w:pPr>
         <w:pStyle w:val="Heading2"/>
@@ -6431,251 +6812,13 @@
         <w:t xml:space="preserve">Datas no fuso de São Paulo. Os códigos entre colchetes são os commits do repositório.</w:t>
       </w:r>
     </w:p>
-    <w:bookmarkStart w:id="43" w:name="Xb374f4671a78533177f9e41d94caa4dc6b2e1e1"/>
+    <w:bookmarkStart w:id="44" w:name="Xb374f4671a78533177f9e41d94caa4dc6b2e1e1"/>
     <w:p>
       <w:pPr>
         <w:pStyle w:val="Heading3"/>
       </w:pPr>
       <w:r>
         <w:t xml:space="preserve">18/10/2026</w:t>
-      </w:r>
-    </w:p>
-    <w:p>
-      <w:pPr>
-        <w:numPr>
-          <w:ilvl w:val="0"/>
-          <w:numId w:val="1007"/>
-        </w:numPr>
-        <w:pStyle w:val="Compact"/>
-      </w:pPr>
-      <w:r>
-        <w:rPr>
-          <w:bCs/>
-          <w:b/>
-        </w:rPr>
-        <w:t xml:space="preserve">Primeira versão do site</w:t>
-      </w:r>
-      <w:r>
-        <w:t xml:space="preserve"> </w:t>
-      </w:r>
-      <w:r>
-        <w:t xml:space="preserve">e base interativa 2024 publicadas no GitHub Pages [bf1632d, 5c440c7].</w:t>
-      </w:r>
-    </w:p>
-    <w:p>
-      <w:pPr>
-        <w:numPr>
-          <w:ilvl w:val="0"/>
-          <w:numId w:val="1007"/>
-        </w:numPr>
-        <w:pStyle w:val="Compact"/>
-      </w:pPr>
-      <w:r>
-        <w:t xml:space="preserve">Navegação por endereço (</w:t>
-      </w:r>
-      <w:r>
-        <w:rPr>
-          <w:rStyle w:val="VerbatimChar"/>
-        </w:rPr>
-        <w:t xml:space="preserve">#mapa</w:t>
-      </w:r>
-      <w:r>
-        <w:t xml:space="preserve">,</w:t>
-      </w:r>
-      <w:r>
-        <w:t xml:space="preserve"> </w:t>
-      </w:r>
-      <w:r>
-        <w:rPr>
-          <w:rStyle w:val="VerbatimChar"/>
-        </w:rPr>
-        <w:t xml:space="preserve">#tempo</w:t>
-      </w:r>
-      <w:r>
-        <w:t xml:space="preserve">), zoom e arraste nos mapas; README com metodologia e fontes [c1a0ced, 3f2981b].</w:t>
-      </w:r>
-    </w:p>
-    <w:p>
-      <w:pPr>
-        <w:numPr>
-          <w:ilvl w:val="0"/>
-          <w:numId w:val="1007"/>
-        </w:numPr>
-        <w:pStyle w:val="Compact"/>
-      </w:pPr>
-      <w:r>
-        <w:rPr>
-          <w:bCs/>
-          <w:b/>
-        </w:rPr>
-        <w:t xml:space="preserve">Pipeline em Python</w:t>
-      </w:r>
-      <w:r>
-        <w:t xml:space="preserve">, código modular, dados abertos e GeoPackage para QGIS; publicação automática pelo GitHub Actions com verificação de privacidade [a33414f, cc7cd3c].</w:t>
-      </w:r>
-    </w:p>
-    <w:p>
-      <w:pPr>
-        <w:numPr>
-          <w:ilvl w:val="0"/>
-          <w:numId w:val="1007"/>
-        </w:numPr>
-        <w:pStyle w:val="Compact"/>
-      </w:pPr>
-      <w:r>
-        <w:t xml:space="preserve">Identidade argentina, gráficos especializados e primeiros indicadores oficiais (população, EPH, homicídios) [968ee5c].</w:t>
-      </w:r>
-    </w:p>
-    <w:p>
-      <w:pPr>
-        <w:numPr>
-          <w:ilvl w:val="0"/>
-          <w:numId w:val="1007"/>
-        </w:numPr>
-        <w:pStyle w:val="Compact"/>
-      </w:pPr>
-      <w:r>
-        <w:rPr>
-          <w:bCs/>
-          <w:b/>
-        </w:rPr>
-        <w:t xml:space="preserve">28 indicadores do Censo 2022 por departamento</w:t>
-      </w:r>
-      <w:r>
-        <w:t xml:space="preserve"> </w:t>
-      </w:r>
-      <w:r>
-        <w:t xml:space="preserve">(Geoportal do INDEC) e taxas por departamento [9c2705c].</w:t>
-      </w:r>
-    </w:p>
-    <w:p>
-      <w:pPr>
-        <w:numPr>
-          <w:ilvl w:val="0"/>
-          <w:numId w:val="1007"/>
-        </w:numPr>
-        <w:pStyle w:val="Compact"/>
-      </w:pPr>
-      <w:r>
-        <w:t xml:space="preserve">Nova identidade visual com fundo branco e marcha desenhada; tipografia Urbanist [ee5db14, 504893c].</w:t>
-      </w:r>
-    </w:p>
-    <w:p>
-      <w:pPr>
-        <w:numPr>
-          <w:ilvl w:val="0"/>
-          <w:numId w:val="1007"/>
-        </w:numPr>
-        <w:pStyle w:val="Compact"/>
-      </w:pPr>
-      <w:r>
-        <w:t xml:space="preserve">Novas análises: associação (resíduos), Comparar, ACM, mapa bivariado, LISA, série semanal com acontecimentos, comunidades, Imprensa, Fichas e links do recorte [3e910b0].</w:t>
-      </w:r>
-    </w:p>
-    <w:p>
-      <w:pPr>
-        <w:numPr>
-          <w:ilvl w:val="0"/>
-          <w:numId w:val="1007"/>
-        </w:numPr>
-        <w:pStyle w:val="Compact"/>
-      </w:pPr>
-      <w:r>
-        <w:t xml:space="preserve">Guias “Como ler”, exemplos, leituras automáticas, topônimos que mudam com o zoom e ficha em formato de prancha [88a2c6e, c896e9e].</w:t>
-      </w:r>
-    </w:p>
-    <w:p>
-      <w:pPr>
-        <w:numPr>
-          <w:ilvl w:val="0"/>
-          <w:numId w:val="1007"/>
-        </w:numPr>
-        <w:pStyle w:val="Compact"/>
-      </w:pPr>
-      <w:r>
-        <w:t xml:space="preserve">Mapa navegável mundial, destaques por população (Poisson), combinações prontas em todas as abas, glossário [f80c8bd].</w:t>
-      </w:r>
-    </w:p>
-    <w:p>
-      <w:pPr>
-        <w:numPr>
-          <w:ilvl w:val="0"/>
-          <w:numId w:val="1007"/>
-        </w:numPr>
-        <w:pStyle w:val="Compact"/>
-      </w:pPr>
-      <w:r>
-        <w:rPr>
-          <w:bCs/>
-          <w:b/>
-        </w:rPr>
-        <w:t xml:space="preserve">Título DATALUTA</w:t>
-      </w:r>
-      <w:r>
-        <w:t xml:space="preserve">, revisão dos textos e troca do mapa base (CARTO exigia chave; passou a Esri/OSM) [81c0a67].</w:t>
-      </w:r>
-    </w:p>
-    <w:p>
-      <w:pPr>
-        <w:numPr>
-          <w:ilvl w:val="0"/>
-          <w:numId w:val="1007"/>
-        </w:numPr>
-        <w:pStyle w:val="Compact"/>
-      </w:pPr>
-      <w:r>
-        <w:t xml:space="preserve">Título com</w:t>
-      </w:r>
-      <w:r>
-        <w:t xml:space="preserve"> </w:t>
-      </w:r>
-      <w:r>
-        <w:rPr>
-          <w:bCs/>
-          <w:b/>
-        </w:rPr>
-        <w:t xml:space="preserve">Argentina 2024</w:t>
-      </w:r>
-      <w:r>
-        <w:t xml:space="preserve">,</w:t>
-      </w:r>
-      <w:r>
-        <w:t xml:space="preserve"> </w:t>
-      </w:r>
-      <w:r>
-        <w:rPr>
-          <w:bCs/>
-          <w:b/>
-        </w:rPr>
-        <w:t xml:space="preserve">aba Síntese</w:t>
-      </w:r>
-      <w:r>
-        <w:t xml:space="preserve"> </w:t>
-      </w:r>
-      <w:r>
-        <w:t xml:space="preserve">e novas combinações prontas [ec307a2].</w:t>
-      </w:r>
-    </w:p>
-    <w:p>
-      <w:pPr>
-        <w:numPr>
-          <w:ilvl w:val="0"/>
-          <w:numId w:val="1007"/>
-        </w:numPr>
-        <w:pStyle w:val="Compact"/>
-      </w:pPr>
-      <w:r>
-        <w:t xml:space="preserve">Síntese: explicação passo a passo do resíduo ajustado, régua de leitura e combinações raras [2ee97ab].</w:t>
-      </w:r>
-    </w:p>
-    <w:bookmarkEnd w:id="43"/>
-    <w:bookmarkStart w:id="44" w:name="Xfda8f6a74ee01990937dc6b5f77dee589813531"/>
-    <w:p>
-      <w:pPr>
-        <w:pStyle w:val="Heading3"/>
-      </w:pPr>
-      <w:r>
-        <w:t xml:space="preserve">19/10/2026</w:t>
       </w:r>
     </w:p>
     <w:p>
@@ -6691,13 +6834,13 @@
           <w:bCs/>
           <w:b/>
         </w:rPr>
-        <w:t xml:space="preserve">Contexto ligado às lutas:</w:t>
-      </w:r>
-      <w:r>
-        <w:t xml:space="preserve"> </w:t>
-      </w:r>
-      <w:r>
-        <w:t xml:space="preserve">entram RENABAP, ReNaTEP, voto presidencial de 2023 e femicídios; indicadores separados em “ligados às lutas” e “controles” [6f0fe22].</w:t>
+        <w:t xml:space="preserve">Primeira versão do site</w:t>
+      </w:r>
+      <w:r>
+        <w:t xml:space="preserve"> </w:t>
+      </w:r>
+      <w:r>
+        <w:t xml:space="preserve">e base interativa 2024 publicadas no GitHub Pages [bf1632d, 5c440c7].</w:t>
       </w:r>
     </w:p>
     <w:p>
@@ -6709,30 +6852,28 @@
         <w:pStyle w:val="Compact"/>
       </w:pPr>
       <w:r>
-        <w:rPr>
-          <w:bCs/>
-          <w:b/>
-        </w:rPr>
-        <w:t xml:space="preserve">Indicadores sem ligação com as lutas retirados do site</w:t>
-      </w:r>
-      <w:r>
-        <w:t xml:space="preserve">; El Cuy deixado vazio no RENABAP; painel do mapa reorganizado em três blocos; quadro “Como foi calculado este mapa”; cálculo da tendência explicado no Contexto;</w:t>
-      </w:r>
-      <w:r>
-        <w:t xml:space="preserve"> </w:t>
-      </w:r>
-      <w:r>
-        <w:rPr>
-          <w:bCs/>
-          <w:b/>
-        </w:rPr>
-        <w:t xml:space="preserve">leitura em três partes para as 139 combinações prontas</w:t>
-      </w:r>
-      <w:r>
-        <w:t xml:space="preserve"> </w:t>
-      </w:r>
-      <w:r>
-        <w:t xml:space="preserve">[5839d6f].</w:t>
+        <w:t xml:space="preserve">Navegação por endereço (</w:t>
+      </w:r>
+      <w:r>
+        <w:rPr>
+          <w:rStyle w:val="VerbatimChar"/>
+        </w:rPr>
+        <w:t xml:space="preserve">#mapa</w:t>
+      </w:r>
+      <w:r>
+        <w:t xml:space="preserve">,</w:t>
+      </w:r>
+      <w:r>
+        <w:t xml:space="preserve"> </w:t>
+      </w:r>
+      <w:r>
+        <w:rPr>
+          <w:rStyle w:val="VerbatimChar"/>
+        </w:rPr>
+        <w:t xml:space="preserve">#tempo</w:t>
+      </w:r>
+      <w:r>
+        <w:t xml:space="preserve">), zoom e arraste nos mapas; README com metodologia e fontes [c1a0ced, 3f2981b].</w:t>
       </w:r>
     </w:p>
     <w:p>
@@ -6744,19 +6885,14 @@
         <w:pStyle w:val="Compact"/>
       </w:pPr>
       <w:r>
-        <w:t xml:space="preserve">Criado este documento de processo e o roteiro</w:t>
-      </w:r>
-      <w:r>
-        <w:t xml:space="preserve"> </w:t>
-      </w:r>
-      <w:r>
-        <w:rPr>
-          <w:rStyle w:val="VerbatimChar"/>
-        </w:rPr>
-        <w:t xml:space="preserve">pipeline/reconstruir.sh</w:t>
-      </w:r>
-      <w:r>
-        <w:t xml:space="preserve">.</w:t>
+        <w:rPr>
+          <w:bCs/>
+          <w:b/>
+        </w:rPr>
+        <w:t xml:space="preserve">Pipeline em Python</w:t>
+      </w:r>
+      <w:r>
+        <w:t xml:space="preserve">, código modular, dados abertos e GeoPackage para QGIS; publicação automática pelo GitHub Actions com verificação de privacidade [a33414f, cc7cd3c].</w:t>
       </w:r>
     </w:p>
     <w:p>
@@ -6768,53 +6904,7 @@
         <w:pStyle w:val="Compact"/>
       </w:pPr>
       <w:r>
-        <w:rPr>
-          <w:bCs/>
-          <w:b/>
-        </w:rPr>
-        <w:t xml:space="preserve">Licenças definidas:</w:t>
-      </w:r>
-      <w:r>
-        <w:t xml:space="preserve"> </w:t>
-      </w:r>
-      <w:r>
-        <w:t xml:space="preserve">base de dados sob CC BY 4.0 (arquivo</w:t>
-      </w:r>
-      <w:r>
-        <w:t xml:space="preserve"> </w:t>
-      </w:r>
-      <w:r>
-        <w:rPr>
-          <w:rStyle w:val="VerbatimChar"/>
-        </w:rPr>
-        <w:t xml:space="preserve">LICENSE</w:t>
-      </w:r>
-      <w:r>
-        <w:t xml:space="preserve">, que o GitHub reconhece) e código sob MIT (</w:t>
-      </w:r>
-      <w:r>
-        <w:rPr>
-          <w:rStyle w:val="VerbatimChar"/>
-        </w:rPr>
-        <w:t xml:space="preserve">LICENCA-CODIGO</w:t>
-      </w:r>
-      <w:r>
-        <w:t xml:space="preserve">);</w:t>
-      </w:r>
-      <w:r>
-        <w:t xml:space="preserve"> </w:t>
-      </w:r>
-      <w:r>
-        <w:rPr>
-          <w:rStyle w:val="VerbatimChar"/>
-        </w:rPr>
-        <w:t xml:space="preserve">LICENCAS.md</w:t>
-      </w:r>
-      <w:r>
-        <w:t xml:space="preserve"> </w:t>
-      </w:r>
-      <w:r>
-        <w:t xml:space="preserve">explica o que cada uma cobre, lista as condições dos dados de terceiros e traz a forma de citar; rodapés do site e README atualizados. Motivo: sem licença, ninguém tinha permissão formal de reutilizar a base; a CC BY 4.0 é o padrão em dados científicos abertos, garante o crédito e é compatível com o GeoNames e o datos.gob.ar.</w:t>
+        <w:t xml:space="preserve">Identidade argentina, gráficos especializados e primeiros indicadores oficiais (população, EPH, homicídios) [968ee5c].</w:t>
       </w:r>
     </w:p>
     <w:p>
@@ -6830,37 +6920,13 @@
           <w:bCs/>
           <w:b/>
         </w:rPr>
-        <w:t xml:space="preserve">Versão em Word do documento de processo</w:t>
-      </w:r>
-      <w:r>
-        <w:t xml:space="preserve"> </w:t>
-      </w:r>
-      <w:r>
-        <w:t xml:space="preserve">(</w:t>
-      </w:r>
-      <w:r>
-        <w:rPr>
-          <w:rStyle w:val="VerbatimChar"/>
-        </w:rPr>
-        <w:t xml:space="preserve">PROCESSO.docx</w:t>
-      </w:r>
-      <w:r>
-        <w:t xml:space="preserve">), gerada a partir deste arquivo por</w:t>
-      </w:r>
-      <w:r>
-        <w:t xml:space="preserve"> </w:t>
-      </w:r>
-      <w:r>
-        <w:rPr>
-          <w:rStyle w:val="VerbatimChar"/>
-        </w:rPr>
-        <w:t xml:space="preserve">pipeline/gerar_processo_docx.py</w:t>
-      </w:r>
-      <w:r>
-        <w:t xml:space="preserve"> </w:t>
-      </w:r>
-      <w:r>
-        <w:t xml:space="preserve">(pandoc + python-docx), para circular no grupo.</w:t>
+        <w:t xml:space="preserve">28 indicadores do Censo 2022 por departamento</w:t>
+      </w:r>
+      <w:r>
+        <w:t xml:space="preserve"> </w:t>
+      </w:r>
+      <w:r>
+        <w:t xml:space="preserve">(Geoportal do INDEC) e taxas por departamento [9c2705c].</w:t>
       </w:r>
     </w:p>
     <w:p>
@@ -6872,17 +6938,74 @@
         <w:pStyle w:val="Compact"/>
       </w:pPr>
       <w:r>
+        <w:t xml:space="preserve">Nova identidade visual com fundo branco e marcha desenhada; tipografia Urbanist [ee5db14, 504893c].</w:t>
+      </w:r>
+    </w:p>
+    <w:p>
+      <w:pPr>
+        <w:numPr>
+          <w:ilvl w:val="0"/>
+          <w:numId w:val="1008"/>
+        </w:numPr>
+        <w:pStyle w:val="Compact"/>
+      </w:pPr>
+      <w:r>
+        <w:t xml:space="preserve">Novas análises: associação (resíduos), Comparar, ACM, mapa bivariado, LISA, série semanal com acontecimentos, comunidades, Imprensa, Fichas e links do recorte [3e910b0].</w:t>
+      </w:r>
+    </w:p>
+    <w:p>
+      <w:pPr>
+        <w:numPr>
+          <w:ilvl w:val="0"/>
+          <w:numId w:val="1008"/>
+        </w:numPr>
+        <w:pStyle w:val="Compact"/>
+      </w:pPr>
+      <w:r>
+        <w:t xml:space="preserve">Guias “Como ler”, exemplos, leituras automáticas, topônimos que mudam com o zoom e ficha em formato de prancha [88a2c6e, c896e9e].</w:t>
+      </w:r>
+    </w:p>
+    <w:p>
+      <w:pPr>
+        <w:numPr>
+          <w:ilvl w:val="0"/>
+          <w:numId w:val="1008"/>
+        </w:numPr>
+        <w:pStyle w:val="Compact"/>
+      </w:pPr>
+      <w:r>
+        <w:t xml:space="preserve">Mapa navegável mundial, destaques por população (Poisson), combinações prontas em todas as abas, glossário [f80c8bd].</w:t>
+      </w:r>
+    </w:p>
+    <w:p>
+      <w:pPr>
+        <w:numPr>
+          <w:ilvl w:val="0"/>
+          <w:numId w:val="1008"/>
+        </w:numPr>
+        <w:pStyle w:val="Compact"/>
+      </w:pPr>
+      <w:r>
         <w:rPr>
           <w:bCs/>
           <w:b/>
         </w:rPr>
-        <w:t xml:space="preserve">LISA explicado passo a passo</w:t>
-      </w:r>
-      <w:r>
-        <w:t xml:space="preserve"> </w:t>
-      </w:r>
-      <w:r>
-        <w:t xml:space="preserve">no quadro “Como foi calculado este mapa” (abre sozinho na primeira vez), com exemplo numérico de um ponto quente e de um ponto frio, lista dos departamentos, I global e cuidados; dica do mapa mostra z, média dos vizinhos e I local; glossário e guia ampliados. O teste de permutação passou a sortear os vizinhos</w:t>
+        <w:t xml:space="preserve">Título DATALUTA</w:t>
+      </w:r>
+      <w:r>
+        <w:t xml:space="preserve">, revisão dos textos e troca do mapa base (CARTO exigia chave; passou a Esri/OSM) [81c0a67].</w:t>
+      </w:r>
+    </w:p>
+    <w:p>
+      <w:pPr>
+        <w:numPr>
+          <w:ilvl w:val="0"/>
+          <w:numId w:val="1008"/>
+        </w:numPr>
+        <w:pStyle w:val="Compact"/>
+      </w:pPr>
+      <w:r>
+        <w:t xml:space="preserve">Título com</w:t>
       </w:r>
       <w:r>
         <w:t xml:space="preserve"> </w:t>
@@ -6892,23 +7015,48 @@
           <w:bCs/>
           <w:b/>
         </w:rPr>
-        <w:t xml:space="preserve">sem reposição</w:t>
-      </w:r>
-      <w:r>
-        <w:t xml:space="preserve"> </w:t>
-      </w:r>
-      <w:r>
-        <w:t xml:space="preserve">(permutação condicional, como no GeoDa); antes sorteava com reposição. Motivo: pedido de deixar claro como o LISA é calculado.</w:t>
+        <w:t xml:space="preserve">Argentina 2024</w:t>
+      </w:r>
+      <w:r>
+        <w:t xml:space="preserve">,</w:t>
+      </w:r>
+      <w:r>
+        <w:t xml:space="preserve"> </w:t>
+      </w:r>
+      <w:r>
+        <w:rPr>
+          <w:bCs/>
+          <w:b/>
+        </w:rPr>
+        <w:t xml:space="preserve">aba Síntese</w:t>
+      </w:r>
+      <w:r>
+        <w:t xml:space="preserve"> </w:t>
+      </w:r>
+      <w:r>
+        <w:t xml:space="preserve">e novas combinações prontas [ec307a2].</w:t>
+      </w:r>
+    </w:p>
+    <w:p>
+      <w:pPr>
+        <w:numPr>
+          <w:ilvl w:val="0"/>
+          <w:numId w:val="1008"/>
+        </w:numPr>
+        <w:pStyle w:val="Compact"/>
+      </w:pPr>
+      <w:r>
+        <w:t xml:space="preserve">Síntese: explicação passo a passo do resíduo ajustado, régua de leitura e combinações raras [2ee97ab].</w:t>
       </w:r>
     </w:p>
     <w:bookmarkEnd w:id="44"/>
-    <w:bookmarkStart w:id="45" w:name="X0243e2acffdb3298bb3301518b805b778538cf8"/>
+    <w:bookmarkStart w:id="45" w:name="Xfda8f6a74ee01990937dc6b5f77dee589813531"/>
     <w:p>
       <w:pPr>
         <w:pStyle w:val="Heading3"/>
       </w:pPr>
       <w:r>
-        <w:t xml:space="preserve">28/10/2026</w:t>
+        <w:t xml:space="preserve">19/10/2026</w:t>
       </w:r>
     </w:p>
     <w:p>
@@ -6924,23 +7072,224 @@
           <w:bCs/>
           <w:b/>
         </w:rPr>
-        <w:t xml:space="preserve">Fichas:</w:t>
-      </w:r>
-      <w:r>
-        <w:t xml:space="preserve"> </w:t>
-      </w:r>
-      <w:r>
-        <w:t xml:space="preserve">a escolha passou a ser uma lista fechada só com as categorias do tipo de ficha escolhido (por exemplo, só objetivos), com o número de notícias, e um campo para filtrar a lista. Motivo: o campo de texto anterior, com sugestões, deixava o navegador misturar valores digitados antes em outros tipos de ficha (nomes de movimentos, províncias).</w:t>
+        <w:t xml:space="preserve">Contexto ligado às lutas:</w:t>
+      </w:r>
+      <w:r>
+        <w:t xml:space="preserve"> </w:t>
+      </w:r>
+      <w:r>
+        <w:t xml:space="preserve">entram RENABAP, ReNaTEP, voto presidencial de 2023 e femicídios; indicadores separados em “ligados às lutas” e “controles” [6f0fe22].</w:t>
+      </w:r>
+    </w:p>
+    <w:p>
+      <w:pPr>
+        <w:numPr>
+          <w:ilvl w:val="0"/>
+          <w:numId w:val="1009"/>
+        </w:numPr>
+        <w:pStyle w:val="Compact"/>
+      </w:pPr>
+      <w:r>
+        <w:rPr>
+          <w:bCs/>
+          <w:b/>
+        </w:rPr>
+        <w:t xml:space="preserve">Indicadores sem ligação com as lutas retirados do site</w:t>
+      </w:r>
+      <w:r>
+        <w:t xml:space="preserve">; El Cuy deixado vazio no RENABAP; painel do mapa reorganizado em três blocos; quadro “Como foi calculado este mapa”; cálculo da tendência explicado no Contexto;</w:t>
+      </w:r>
+      <w:r>
+        <w:t xml:space="preserve"> </w:t>
+      </w:r>
+      <w:r>
+        <w:rPr>
+          <w:bCs/>
+          <w:b/>
+        </w:rPr>
+        <w:t xml:space="preserve">leitura em três partes para as 139 combinações prontas</w:t>
+      </w:r>
+      <w:r>
+        <w:t xml:space="preserve"> </w:t>
+      </w:r>
+      <w:r>
+        <w:t xml:space="preserve">[5839d6f].</w:t>
+      </w:r>
+    </w:p>
+    <w:p>
+      <w:pPr>
+        <w:numPr>
+          <w:ilvl w:val="0"/>
+          <w:numId w:val="1009"/>
+        </w:numPr>
+        <w:pStyle w:val="Compact"/>
+      </w:pPr>
+      <w:r>
+        <w:t xml:space="preserve">Criado este documento de processo e o roteiro</w:t>
+      </w:r>
+      <w:r>
+        <w:t xml:space="preserve"> </w:t>
+      </w:r>
+      <w:r>
+        <w:rPr>
+          <w:rStyle w:val="VerbatimChar"/>
+        </w:rPr>
+        <w:t xml:space="preserve">pipeline/reconstruir.sh</w:t>
+      </w:r>
+      <w:r>
+        <w:t xml:space="preserve">.</w:t>
+      </w:r>
+    </w:p>
+    <w:p>
+      <w:pPr>
+        <w:numPr>
+          <w:ilvl w:val="0"/>
+          <w:numId w:val="1009"/>
+        </w:numPr>
+        <w:pStyle w:val="Compact"/>
+      </w:pPr>
+      <w:r>
+        <w:rPr>
+          <w:bCs/>
+          <w:b/>
+        </w:rPr>
+        <w:t xml:space="preserve">Licenças definidas:</w:t>
+      </w:r>
+      <w:r>
+        <w:t xml:space="preserve"> </w:t>
+      </w:r>
+      <w:r>
+        <w:t xml:space="preserve">base de dados sob CC BY 4.0 (arquivo</w:t>
+      </w:r>
+      <w:r>
+        <w:t xml:space="preserve"> </w:t>
+      </w:r>
+      <w:r>
+        <w:rPr>
+          <w:rStyle w:val="VerbatimChar"/>
+        </w:rPr>
+        <w:t xml:space="preserve">LICENSE</w:t>
+      </w:r>
+      <w:r>
+        <w:t xml:space="preserve">, que o GitHub reconhece) e código sob MIT (</w:t>
+      </w:r>
+      <w:r>
+        <w:rPr>
+          <w:rStyle w:val="VerbatimChar"/>
+        </w:rPr>
+        <w:t xml:space="preserve">LICENCA-CODIGO</w:t>
+      </w:r>
+      <w:r>
+        <w:t xml:space="preserve">);</w:t>
+      </w:r>
+      <w:r>
+        <w:t xml:space="preserve"> </w:t>
+      </w:r>
+      <w:r>
+        <w:rPr>
+          <w:rStyle w:val="VerbatimChar"/>
+        </w:rPr>
+        <w:t xml:space="preserve">LICENCAS.md</w:t>
+      </w:r>
+      <w:r>
+        <w:t xml:space="preserve"> </w:t>
+      </w:r>
+      <w:r>
+        <w:t xml:space="preserve">explica o que cada uma cobre, lista as condições dos dados de terceiros e traz a forma de citar; rodapés do site e README atualizados. Motivo: sem licença, ninguém tinha permissão formal de reutilizar a base; a CC BY 4.0 é o padrão em dados científicos abertos, garante o crédito e é compatível com o GeoNames e o datos.gob.ar.</w:t>
+      </w:r>
+    </w:p>
+    <w:p>
+      <w:pPr>
+        <w:numPr>
+          <w:ilvl w:val="0"/>
+          <w:numId w:val="1009"/>
+        </w:numPr>
+        <w:pStyle w:val="Compact"/>
+      </w:pPr>
+      <w:r>
+        <w:rPr>
+          <w:bCs/>
+          <w:b/>
+        </w:rPr>
+        <w:t xml:space="preserve">Versão em Word do documento de processo</w:t>
+      </w:r>
+      <w:r>
+        <w:t xml:space="preserve"> </w:t>
+      </w:r>
+      <w:r>
+        <w:t xml:space="preserve">(</w:t>
+      </w:r>
+      <w:r>
+        <w:rPr>
+          <w:rStyle w:val="VerbatimChar"/>
+        </w:rPr>
+        <w:t xml:space="preserve">PROCESSO.docx</w:t>
+      </w:r>
+      <w:r>
+        <w:t xml:space="preserve">), gerada a partir deste arquivo por</w:t>
+      </w:r>
+      <w:r>
+        <w:t xml:space="preserve"> </w:t>
+      </w:r>
+      <w:r>
+        <w:rPr>
+          <w:rStyle w:val="VerbatimChar"/>
+        </w:rPr>
+        <w:t xml:space="preserve">pipeline/gerar_processo_docx.py</w:t>
+      </w:r>
+      <w:r>
+        <w:t xml:space="preserve"> </w:t>
+      </w:r>
+      <w:r>
+        <w:t xml:space="preserve">(pandoc + python-docx), para circular no grupo.</w:t>
+      </w:r>
+    </w:p>
+    <w:p>
+      <w:pPr>
+        <w:numPr>
+          <w:ilvl w:val="0"/>
+          <w:numId w:val="1009"/>
+        </w:numPr>
+        <w:pStyle w:val="Compact"/>
+      </w:pPr>
+      <w:r>
+        <w:rPr>
+          <w:bCs/>
+          <w:b/>
+        </w:rPr>
+        <w:t xml:space="preserve">LISA explicado passo a passo</w:t>
+      </w:r>
+      <w:r>
+        <w:t xml:space="preserve"> </w:t>
+      </w:r>
+      <w:r>
+        <w:t xml:space="preserve">no quadro “Como foi calculado este mapa” (abre sozinho na primeira vez), com exemplo numérico de um ponto quente e de um ponto frio, lista dos departamentos, I global e cuidados; dica do mapa mostra z, média dos vizinhos e I local; glossário e guia ampliados. O teste de permutação passou a sortear os vizinhos</w:t>
+      </w:r>
+      <w:r>
+        <w:t xml:space="preserve"> </w:t>
+      </w:r>
+      <w:r>
+        <w:rPr>
+          <w:bCs/>
+          <w:b/>
+        </w:rPr>
+        <w:t xml:space="preserve">sem reposição</w:t>
+      </w:r>
+      <w:r>
+        <w:t xml:space="preserve"> </w:t>
+      </w:r>
+      <w:r>
+        <w:t xml:space="preserve">(permutação condicional, como no GeoDa); antes sorteava com reposição. Motivo: pedido de deixar claro como o LISA é calculado.</w:t>
       </w:r>
     </w:p>
     <w:bookmarkEnd w:id="45"/>
-    <w:bookmarkStart w:id="46" w:name="X6d16d1d1dfee84c5325917dbbdeb1135ee226ab"/>
+    <w:bookmarkStart w:id="46" w:name="X0243e2acffdb3298bb3301518b805b778538cf8"/>
     <w:p>
       <w:pPr>
         <w:pStyle w:val="Heading3"/>
       </w:pPr>
       <w:r>
-        <w:t xml:space="preserve">30/10/2026</w:t>
+        <w:t xml:space="preserve">28/10/2026</w:t>
       </w:r>
     </w:p>
     <w:p>
@@ -6956,399 +7305,23 @@
           <w:bCs/>
           <w:b/>
         </w:rPr>
-        <w:t xml:space="preserve">Ano e país</w:t>
-      </w:r>
-      <w:r>
-        <w:t xml:space="preserve"> </w:t>
-      </w:r>
-      <w:r>
-        <w:t xml:space="preserve">entram como variáveis (colunas opcionais</w:t>
-      </w:r>
-      <w:r>
-        <w:t xml:space="preserve"> </w:t>
-      </w:r>
-      <w:r>
-        <w:rPr>
-          <w:rStyle w:val="VerbatimChar"/>
-        </w:rPr>
-        <w:t xml:space="preserve">Año</w:t>
-      </w:r>
-      <w:r>
-        <w:t xml:space="preserve"> </w:t>
-      </w:r>
-      <w:r>
-        <w:t xml:space="preserve">e</w:t>
-      </w:r>
-      <w:r>
-        <w:t xml:space="preserve"> </w:t>
-      </w:r>
-      <w:r>
-        <w:rPr>
-          <w:rStyle w:val="VerbatimChar"/>
-        </w:rPr>
-        <w:t xml:space="preserve">País</w:t>
-      </w:r>
-      <w:r>
-        <w:t xml:space="preserve"> </w:t>
-      </w:r>
-      <w:r>
-        <w:t xml:space="preserve">da planilha) e como</w:t>
-      </w:r>
-      <w:r>
-        <w:t xml:space="preserve"> </w:t>
-      </w:r>
-      <w:r>
-        <w:rPr>
-          <w:bCs/>
-          <w:b/>
-        </w:rPr>
-        <w:t xml:space="preserve">seletores no topo da base</w:t>
-      </w:r>
-      <w:r>
-        <w:t xml:space="preserve">. Motivo: preparar a base para juntar os cinco anos da Argentina e os dados do Brasil numa só planilha padronizada.</w:t>
-      </w:r>
-    </w:p>
-    <w:p>
-      <w:pPr>
-        <w:numPr>
-          <w:ilvl w:val="0"/>
-          <w:numId w:val="1010"/>
-        </w:numPr>
-        <w:pStyle w:val="Compact"/>
-      </w:pPr>
-      <w:r>
-        <w:rPr>
-          <w:bCs/>
-          <w:b/>
-        </w:rPr>
-        <w:t xml:space="preserve">Busca mais visível:</w:t>
-      </w:r>
-      <w:r>
-        <w:t xml:space="preserve"> </w:t>
-      </w:r>
-      <w:r>
-        <w:t xml:space="preserve">campo fixo no topo da base que filtra todas as abas, com etiqueta nos filtros e guardado no link. Motivo: a busca ficava escondida no fim da página e só valia para a lista de notícias.</w:t>
-      </w:r>
-    </w:p>
-    <w:p>
-      <w:pPr>
-        <w:numPr>
-          <w:ilvl w:val="0"/>
-          <w:numId w:val="1010"/>
-        </w:numPr>
-        <w:pStyle w:val="Compact"/>
-      </w:pPr>
-      <w:r>
-        <w:rPr>
-          <w:bCs/>
-          <w:b/>
-        </w:rPr>
-        <w:t xml:space="preserve">Página “Sobre e metodologia”</w:t>
-      </w:r>
-      <w:r>
-        <w:t xml:space="preserve"> </w:t>
-      </w:r>
-      <w:r>
-        <w:t xml:space="preserve">(</w:t>
-      </w:r>
-      <w:r>
-        <w:rPr>
-          <w:rStyle w:val="VerbatimChar"/>
-        </w:rPr>
-        <w:t xml:space="preserve">/sobre/</w:t>
-      </w:r>
-      <w:r>
-        <w:t xml:space="preserve">). Motivo: reunir num só lugar como a base foi feita, com fontes, cálculos, limites e citação.</w:t>
-      </w:r>
-    </w:p>
-    <w:p>
-      <w:pPr>
-        <w:numPr>
-          <w:ilvl w:val="0"/>
-          <w:numId w:val="1010"/>
-        </w:numPr>
-        <w:pStyle w:val="Compact"/>
-      </w:pPr>
-      <w:r>
-        <w:rPr>
-          <w:bCs/>
-          <w:b/>
-        </w:rPr>
-        <w:t xml:space="preserve">Versão em espanhol</w:t>
-      </w:r>
-      <w:r>
-        <w:t xml:space="preserve"> </w:t>
-      </w:r>
-      <w:r>
-        <w:t xml:space="preserve">(</w:t>
-      </w:r>
-      <w:r>
-        <w:rPr>
-          <w:rStyle w:val="VerbatimChar"/>
-        </w:rPr>
-        <w:t xml:space="preserve">/es/</w:t>
-      </w:r>
-      <w:r>
-        <w:t xml:space="preserve">), gerada a partir do português por</w:t>
-      </w:r>
-      <w:r>
-        <w:t xml:space="preserve"> </w:t>
-      </w:r>
-      <w:r>
-        <w:rPr>
-          <w:rStyle w:val="VerbatimChar"/>
-        </w:rPr>
-        <w:t xml:space="preserve">i18n/ferramenta.js</w:t>
-      </w:r>
-      <w:r>
-        <w:t xml:space="preserve"> </w:t>
-      </w:r>
-      <w:r>
-        <w:t xml:space="preserve">com o catálogo</w:t>
-      </w:r>
-      <w:r>
-        <w:t xml:space="preserve"> </w:t>
-      </w:r>
-      <w:r>
-        <w:rPr>
-          <w:rStyle w:val="VerbatimChar"/>
-        </w:rPr>
-        <w:t xml:space="preserve">i18n/es.json</w:t>
-      </w:r>
-      <w:r>
-        <w:t xml:space="preserve">; o GitHub Actions passou a gerá-la e a publicar também</w:t>
-      </w:r>
-      <w:r>
-        <w:t xml:space="preserve"> </w:t>
-      </w:r>
-      <w:r>
-        <w:rPr>
-          <w:rStyle w:val="VerbatimChar"/>
-        </w:rPr>
-        <w:t xml:space="preserve">sobre/</w:t>
-      </w:r>
-      <w:r>
-        <w:t xml:space="preserve"> </w:t>
-      </w:r>
-      <w:r>
-        <w:t xml:space="preserve">e</w:t>
-      </w:r>
-      <w:r>
-        <w:t xml:space="preserve"> </w:t>
-      </w:r>
-      <w:r>
-        <w:rPr>
-          <w:rStyle w:val="VerbatimChar"/>
-        </w:rPr>
-        <w:t xml:space="preserve">es/</w:t>
-      </w:r>
-      <w:r>
-        <w:t xml:space="preserve">. Motivo: o público da base é sobretudo argentino e latino-americano (CLACSO). [66fd7e9]</w:t>
-      </w:r>
-    </w:p>
-    <w:p>
-      <w:pPr>
-        <w:numPr>
-          <w:ilvl w:val="0"/>
-          <w:numId w:val="1010"/>
-        </w:numPr>
-        <w:pStyle w:val="Compact"/>
-      </w:pPr>
-      <w:r>
-        <w:t xml:space="preserve">Seção 2, 4, 7 e 8 atualizadas;</w:t>
-      </w:r>
-      <w:r>
-        <w:t xml:space="preserve"> </w:t>
-      </w:r>
-      <w:r>
-        <w:rPr>
-          <w:rStyle w:val="VerbatimChar"/>
-        </w:rPr>
-        <w:t xml:space="preserve">pipeline/reconstruir.sh</w:t>
-      </w:r>
-      <w:r>
-        <w:t xml:space="preserve"> </w:t>
-      </w:r>
-      <w:r>
-        <w:t xml:space="preserve">ganhou o passo da versão em espanhol.</w:t>
-      </w:r>
-    </w:p>
-    <w:p>
-      <w:pPr>
-        <w:numPr>
-          <w:ilvl w:val="0"/>
-          <w:numId w:val="1010"/>
-        </w:numPr>
-        <w:pStyle w:val="Compact"/>
-      </w:pPr>
-      <w:r>
-        <w:rPr>
-          <w:bCs/>
-          <w:b/>
-        </w:rPr>
-        <w:t xml:space="preserve">Mapa animado na abertura</w:t>
-      </w:r>
-      <w:r>
-        <w:t xml:space="preserve"> </w:t>
-      </w:r>
-      <w:r>
-        <w:t xml:space="preserve">da página inicial e da base, no lugar da ilustração da marcha: os pontos das ações vão preenchendo a Argentina ao longo de 2024 e depois o mapa fica parado (ver seção 7, Identidade visual). Motivo: pedido de uma entrada mais dinâmica, que mostre já na abertura onde e quando as ações aconteceram. Também: links do menu passam a quebrar linha em telas estreitas (antes vazavam para a direita no celular).</w:t>
-      </w:r>
-    </w:p>
-    <w:p>
-      <w:pPr>
-        <w:numPr>
-          <w:ilvl w:val="0"/>
-          <w:numId w:val="1010"/>
-        </w:numPr>
-        <w:pStyle w:val="Compact"/>
-      </w:pPr>
-      <w:r>
-        <w:rPr>
-          <w:bCs/>
-          <w:b/>
-        </w:rPr>
-        <w:t xml:space="preserve">Ajustes no mapa da abertura:</w:t>
-      </w:r>
-      <w:r>
-        <w:t xml:space="preserve"> </w:t>
-      </w:r>
-      <w:r>
-        <w:t xml:space="preserve">países vizinhos e oceanos com nomes, como no mapa navegável; cores mais vivas (mar celeste, país em branco quente, vizinhos em bege); divisas das províncias mais fortes; bandeira argentina. Motivo: pedido do responsável (o fundo estava muito apagado e faltava situar a Argentina no continente).</w:t>
-      </w:r>
-    </w:p>
-    <w:p>
-      <w:pPr>
-        <w:numPr>
-          <w:ilvl w:val="0"/>
-          <w:numId w:val="1010"/>
-        </w:numPr>
-        <w:pStyle w:val="Compact"/>
-      </w:pPr>
-      <w:r>
-        <w:rPr>
-          <w:bCs/>
-          <w:b/>
-        </w:rPr>
-        <w:t xml:space="preserve">Mapa no cabeçalho inteiro</w:t>
-      </w:r>
-      <w:r>
-        <w:t xml:space="preserve"> </w:t>
-      </w:r>
-      <w:r>
-        <w:t xml:space="preserve">da página inicial (telas a partir de 1200 px), com grade de meridianos e paralelos no mar, e</w:t>
-      </w:r>
-      <w:r>
-        <w:t xml:space="preserve"> </w:t>
-      </w:r>
-      <w:r>
-        <w:rPr>
-          <w:bCs/>
-          <w:b/>
-        </w:rPr>
-        <w:t xml:space="preserve">sem o gráfico de semanas</w:t>
-      </w:r>
-      <w:r>
-        <w:t xml:space="preserve"> </w:t>
-      </w:r>
-      <w:r>
-        <w:t xml:space="preserve">embaixo do mapa (na página inicial e na base). Contagem de localidades do mapa passou a usar os nomes das localidades (123), e não as coordenadas arredondadas. Motivo: pedido do responsável.</w:t>
-      </w:r>
-    </w:p>
-    <w:p>
-      <w:pPr>
-        <w:numPr>
-          <w:ilvl w:val="0"/>
-          <w:numId w:val="1010"/>
-        </w:numPr>
-        <w:pStyle w:val="Compact"/>
-      </w:pPr>
-      <w:r>
-        <w:rPr>
-          <w:bCs/>
-          <w:b/>
-        </w:rPr>
-        <w:t xml:space="preserve">Mapa cobrindo o cabeçalho inteiro em qualquer tela</w:t>
-      </w:r>
-      <w:r>
-        <w:t xml:space="preserve"> </w:t>
-      </w:r>
-      <w:r>
-        <w:t xml:space="preserve">(a versão anterior só fazia isso a partir de 1200 px e deixava o menu sobre fundo branco): menu dentro do cabeçalho, sobre o mapa, com fundo branco translúcido; enquadramento calculado no navegador a partir do tamanho do cabeçalho e do texto. Motivo: o responsável avaliou que o mapa não ocupava todo o cabeçalho.</w:t>
-      </w:r>
-    </w:p>
-    <w:p>
-      <w:pPr>
-        <w:numPr>
-          <w:ilvl w:val="0"/>
-          <w:numId w:val="1010"/>
-        </w:numPr>
-        <w:pStyle w:val="Compact"/>
-      </w:pPr>
-      <w:r>
-        <w:rPr>
-          <w:bCs/>
-          <w:b/>
-        </w:rPr>
-        <w:t xml:space="preserve">Nome oficial da base</w:t>
-      </w:r>
-      <w:r>
-        <w:t xml:space="preserve"> </w:t>
-      </w:r>
-      <w:r>
-        <w:t xml:space="preserve">passa a ser “Banco de Dados das Lutas por Espaços e Territórios (DATALUTA) - Movimentos Socioespaciais e Socioterritoriais Urbanos Argentinos (2024)” (em espanhol, “Banco de Datos de las Luchas por Espacios y Territorios (DATALUTA) - Movimientos Socioespaciales y Socioterritoriales Urbanos Argentinos (2024)”), na página inicial, na base, na página Sobre, nas citações (README,</w:t>
-      </w:r>
-      <w:r>
-        <w:t xml:space="preserve"> </w:t>
-      </w:r>
-      <w:r>
-        <w:rPr>
-          <w:rStyle w:val="VerbatimChar"/>
-        </w:rPr>
-        <w:t xml:space="preserve">LICENCAS.md</w:t>
-      </w:r>
-      <w:r>
-        <w:t xml:space="preserve">, Sobre), neste documento e no rodapé da versão em Word. Título da página inicial: “Ações no espaço urbano argentino em 2024”. Bandeira do mapa da abertura reposicionada para o Atlântico aberto, a leste da Patagônia. Motivo: pedido do responsável.</w:t>
-      </w:r>
-    </w:p>
-    <w:p>
-      <w:pPr>
-        <w:numPr>
-          <w:ilvl w:val="0"/>
-          <w:numId w:val="1010"/>
-        </w:numPr>
-        <w:pStyle w:val="Compact"/>
-      </w:pPr>
-      <w:r>
-        <w:rPr>
-          <w:bCs/>
-          <w:b/>
-        </w:rPr>
-        <w:t xml:space="preserve">Linha com o nome da base</w:t>
-      </w:r>
-      <w:r>
-        <w:t xml:space="preserve"> </w:t>
-      </w:r>
-      <w:r>
-        <w:t xml:space="preserve">(acima do título, na página inicial e na Sobre) e rótulos da Síntese e das leituras passam do laranja-amarronzado para o azul da paleta (#1d5994 e #2569ad). O laranja segue só nos gráficos e mapas, onde indica “acima do esperado”. Motivo: pedido do responsável, para combinar com a paleta.</w:t>
-      </w:r>
-    </w:p>
-    <w:p>
-      <w:r>
-        <w:pict>
-          <v:rect style="width:0;height:1.5pt" o:hralign="center" o:hrstd="t" o:hr="t"/>
-        </w:pict>
+        <w:t xml:space="preserve">Fichas:</w:t>
+      </w:r>
+      <w:r>
+        <w:t xml:space="preserve"> </w:t>
+      </w:r>
+      <w:r>
+        <w:t xml:space="preserve">a escolha passou a ser uma lista fechada só com as categorias do tipo de ficha escolhido (por exemplo, só objetivos), com o número de notícias, e um campo para filtrar a lista. Motivo: o campo de texto anterior, com sugestões, deixava o navegador misturar valores digitados antes em outros tipos de ficha (nomes de movimentos, províncias).</w:t>
       </w:r>
     </w:p>
     <w:bookmarkEnd w:id="46"/>
-    <w:bookmarkEnd w:id="47"/>
-    <w:bookmarkStart w:id="48" w:name="X3d9f82193e44c2a113d49ff9b97f8db3ae86c66"/>
-    <w:p>
-      <w:pPr>
-        <w:pStyle w:val="Heading2"/>
-      </w:pPr>
-      <w:r>
-        <w:t xml:space="preserve">10. Pendências</w:t>
+    <w:bookmarkStart w:id="47" w:name="X6d16d1d1dfee84c5325917dbbdeb1135ee226ab"/>
+    <w:p>
+      <w:pPr>
+        <w:pStyle w:val="Heading3"/>
+      </w:pPr>
+      <w:r>
+        <w:t xml:space="preserve">30/10/2026</w:t>
       </w:r>
     </w:p>
     <w:p>
@@ -7360,50 +7333,60 @@
         <w:pStyle w:val="Compact"/>
       </w:pPr>
       <w:r>
-        <w:t xml:space="preserve">☐</w:t>
-      </w:r>
-      <w:r>
-        <w:t xml:space="preserve"> </w:t>
-      </w:r>
-      <w:r>
         <w:rPr>
           <w:bCs/>
           <w:b/>
         </w:rPr>
-        <w:t xml:space="preserve">Licenças:</w:t>
-      </w:r>
-      <w:r>
-        <w:t xml:space="preserve"> </w:t>
-      </w:r>
-      <w:r>
-        <w:t xml:space="preserve">o arquivo</w:t>
-      </w:r>
-      <w:r>
-        <w:t xml:space="preserve"> </w:t>
-      </w:r>
-      <w:r>
-        <w:rPr>
-          <w:rStyle w:val="VerbatimChar"/>
-        </w:rPr>
-        <w:t xml:space="preserve">LICENSE</w:t>
-      </w:r>
-      <w:r>
-        <w:t xml:space="preserve"> </w:t>
-      </w:r>
-      <w:r>
-        <w:t xml:space="preserve">foi trocado no GitHub para MIT (commit 6f63b69), mas</w:t>
-      </w:r>
-      <w:r>
-        <w:t xml:space="preserve"> </w:t>
-      </w:r>
-      <w:r>
-        <w:rPr>
-          <w:rStyle w:val="VerbatimChar"/>
-        </w:rPr>
-        <w:t xml:space="preserve">LICENCAS.md</w:t>
-      </w:r>
-      <w:r>
-        <w:t xml:space="preserve">, README, página Sobre e rodapés ainda dizem base de dados sob CC BY 4.0 e código sob MIT. Decidir entre manter CC BY 4.0 para os dados (recomendado) ou adotar MIT para tudo, e alinhar os arquivos. Confirmar também com o grupo/centro de pesquisa.</w:t>
+        <w:t xml:space="preserve">Ano e país</w:t>
+      </w:r>
+      <w:r>
+        <w:t xml:space="preserve"> </w:t>
+      </w:r>
+      <w:r>
+        <w:t xml:space="preserve">entram como variáveis (colunas opcionais</w:t>
+      </w:r>
+      <w:r>
+        <w:t xml:space="preserve"> </w:t>
+      </w:r>
+      <w:r>
+        <w:rPr>
+          <w:rStyle w:val="VerbatimChar"/>
+        </w:rPr>
+        <w:t xml:space="preserve">Año</w:t>
+      </w:r>
+      <w:r>
+        <w:t xml:space="preserve"> </w:t>
+      </w:r>
+      <w:r>
+        <w:t xml:space="preserve">e</w:t>
+      </w:r>
+      <w:r>
+        <w:t xml:space="preserve"> </w:t>
+      </w:r>
+      <w:r>
+        <w:rPr>
+          <w:rStyle w:val="VerbatimChar"/>
+        </w:rPr>
+        <w:t xml:space="preserve">País</w:t>
+      </w:r>
+      <w:r>
+        <w:t xml:space="preserve"> </w:t>
+      </w:r>
+      <w:r>
+        <w:t xml:space="preserve">da planilha) e como</w:t>
+      </w:r>
+      <w:r>
+        <w:t xml:space="preserve"> </w:t>
+      </w:r>
+      <w:r>
+        <w:rPr>
+          <w:bCs/>
+          <w:b/>
+        </w:rPr>
+        <w:t xml:space="preserve">seletores no topo da base</w:t>
+      </w:r>
+      <w:r>
+        <w:t xml:space="preserve">. Motivo: preparar a base para juntar os cinco anos da Argentina e os dados do Brasil numa só planilha padronizada.</w:t>
       </w:r>
     </w:p>
     <w:p>
@@ -7415,7 +7398,17 @@
         <w:pStyle w:val="Compact"/>
       </w:pPr>
       <w:r>
-        <w:t xml:space="preserve">☐ Revisão da versão em espanhol por falante nativo (termos como “recorte”, “ficha”, “plancha”).</w:t>
+        <w:rPr>
+          <w:bCs/>
+          <w:b/>
+        </w:rPr>
+        <w:t xml:space="preserve">Busca mais visível:</w:t>
+      </w:r>
+      <w:r>
+        <w:t xml:space="preserve"> </w:t>
+      </w:r>
+      <w:r>
+        <w:t xml:space="preserve">campo fixo no topo da base que filtra todas as abas, com etiqueta nos filtros e guardado no link. Motivo: a busca ficava escondida no fim da página e só valia para a lista de notícias.</w:t>
       </w:r>
     </w:p>
     <w:p>
@@ -7427,19 +7420,26 @@
         <w:pStyle w:val="Compact"/>
       </w:pPr>
       <w:r>
-        <w:t xml:space="preserve">☐ Depositar a base no Zenodo (ou repositório institucional) para obter um DOI e atualizar a citação em</w:t>
-      </w:r>
-      <w:r>
-        <w:t xml:space="preserve"> </w:t>
-      </w:r>
-      <w:r>
-        <w:rPr>
-          <w:rStyle w:val="VerbatimChar"/>
-        </w:rPr>
-        <w:t xml:space="preserve">LICENCAS.md</w:t>
-      </w:r>
-      <w:r>
-        <w:t xml:space="preserve">.</w:t>
+        <w:rPr>
+          <w:bCs/>
+          <w:b/>
+        </w:rPr>
+        <w:t xml:space="preserve">Página “Sobre e metodologia”</w:t>
+      </w:r>
+      <w:r>
+        <w:t xml:space="preserve"> </w:t>
+      </w:r>
+      <w:r>
+        <w:t xml:space="preserve">(</w:t>
+      </w:r>
+      <w:r>
+        <w:rPr>
+          <w:rStyle w:val="VerbatimChar"/>
+        </w:rPr>
+        <w:t xml:space="preserve">/sobre/</w:t>
+      </w:r>
+      <w:r>
+        <w:t xml:space="preserve">). Motivo: reunir num só lugar como a base foi feita, com fontes, cálculos, limites e citação.</w:t>
       </w:r>
     </w:p>
     <w:p>
@@ -7451,23 +7451,80 @@
         <w:pStyle w:val="Compact"/>
       </w:pPr>
       <w:r>
-        <w:t xml:space="preserve">☐</w:t>
-      </w:r>
-      <w:r>
-        <w:t xml:space="preserve"> </w:t>
-      </w:r>
-      <w:r>
         <w:rPr>
           <w:bCs/>
           <w:b/>
         </w:rPr>
-        <w:t xml:space="preserve">Unificar nomes de organizações duplicados</w:t>
-      </w:r>
-      <w:r>
-        <w:t xml:space="preserve"> </w:t>
-      </w:r>
-      <w:r>
-        <w:t xml:space="preserve">(ex.: grafias diferentes de CTA e CGT). Afeta contagens, fichas e redes.</w:t>
+        <w:t xml:space="preserve">Versão em espanhol</w:t>
+      </w:r>
+      <w:r>
+        <w:t xml:space="preserve"> </w:t>
+      </w:r>
+      <w:r>
+        <w:t xml:space="preserve">(</w:t>
+      </w:r>
+      <w:r>
+        <w:rPr>
+          <w:rStyle w:val="VerbatimChar"/>
+        </w:rPr>
+        <w:t xml:space="preserve">/es/</w:t>
+      </w:r>
+      <w:r>
+        <w:t xml:space="preserve">), gerada a partir do português por</w:t>
+      </w:r>
+      <w:r>
+        <w:t xml:space="preserve"> </w:t>
+      </w:r>
+      <w:r>
+        <w:rPr>
+          <w:rStyle w:val="VerbatimChar"/>
+        </w:rPr>
+        <w:t xml:space="preserve">i18n/ferramenta.js</w:t>
+      </w:r>
+      <w:r>
+        <w:t xml:space="preserve"> </w:t>
+      </w:r>
+      <w:r>
+        <w:t xml:space="preserve">com o catálogo</w:t>
+      </w:r>
+      <w:r>
+        <w:t xml:space="preserve"> </w:t>
+      </w:r>
+      <w:r>
+        <w:rPr>
+          <w:rStyle w:val="VerbatimChar"/>
+        </w:rPr>
+        <w:t xml:space="preserve">i18n/es.json</w:t>
+      </w:r>
+      <w:r>
+        <w:t xml:space="preserve">; o GitHub Actions passou a gerá-la e a publicar também</w:t>
+      </w:r>
+      <w:r>
+        <w:t xml:space="preserve"> </w:t>
+      </w:r>
+      <w:r>
+        <w:rPr>
+          <w:rStyle w:val="VerbatimChar"/>
+        </w:rPr>
+        <w:t xml:space="preserve">sobre/</w:t>
+      </w:r>
+      <w:r>
+        <w:t xml:space="preserve"> </w:t>
+      </w:r>
+      <w:r>
+        <w:t xml:space="preserve">e</w:t>
+      </w:r>
+      <w:r>
+        <w:t xml:space="preserve"> </w:t>
+      </w:r>
+      <w:r>
+        <w:rPr>
+          <w:rStyle w:val="VerbatimChar"/>
+        </w:rPr>
+        <w:t xml:space="preserve">es/</w:t>
+      </w:r>
+      <w:r>
+        <w:t xml:space="preserve">. Motivo: o público da base é sobretudo argentino e latino-americano (CLACSO). [66fd7e9]</w:t>
       </w:r>
     </w:p>
     <w:p>
@@ -7479,23 +7536,22 @@
         <w:pStyle w:val="Compact"/>
       </w:pPr>
       <w:r>
-        <w:t xml:space="preserve">☐ Resultado do</w:t>
-      </w:r>
-      <w:r>
-        <w:t xml:space="preserve"> </w:t>
-      </w:r>
-      <w:r>
-        <w:rPr>
-          <w:bCs/>
-          <w:b/>
-        </w:rPr>
-        <w:t xml:space="preserve">2º turno de 2023</w:t>
-      </w:r>
-      <w:r>
-        <w:t xml:space="preserve"> </w:t>
-      </w:r>
-      <w:r>
-        <w:t xml:space="preserve">por departamento, se a DINE publicar no formato mesa a mesa.</w:t>
+        <w:t xml:space="preserve">Seção 2, 4, 7 e 8 atualizadas;</w:t>
+      </w:r>
+      <w:r>
+        <w:t xml:space="preserve"> </w:t>
+      </w:r>
+      <w:r>
+        <w:rPr>
+          <w:rStyle w:val="VerbatimChar"/>
+        </w:rPr>
+        <w:t xml:space="preserve">pipeline/reconstruir.sh</w:t>
+      </w:r>
+      <w:r>
+        <w:t xml:space="preserve"> </w:t>
+      </w:r>
+      <w:r>
+        <w:t xml:space="preserve">ganhou o passo da versão em espanhol.</w:t>
       </w:r>
     </w:p>
     <w:p>
@@ -7507,7 +7563,17 @@
         <w:pStyle w:val="Compact"/>
       </w:pPr>
       <w:r>
-        <w:t xml:space="preserve">☐ Outras fontes sugeridas e ainda não coletadas: estudantes de universidades nacionais por província, emprego público por província, titulares do Potenciar Trabajo, projetos de mineração e comunidades indígenas registradas.</w:t>
+        <w:rPr>
+          <w:bCs/>
+          <w:b/>
+        </w:rPr>
+        <w:t xml:space="preserve">Mapa animado na abertura</w:t>
+      </w:r>
+      <w:r>
+        <w:t xml:space="preserve"> </w:t>
+      </w:r>
+      <w:r>
+        <w:t xml:space="preserve">da página inicial e da base, no lugar da ilustração da marcha: os pontos das ações vão preenchendo a Argentina ao longo de 2024 e depois o mapa fica parado (ver seção 7, Identidade visual). Motivo: pedido de uma entrada mais dinâmica, que mostre já na abertura onde e quando as ações aconteceram. Também: links do menu passam a quebrar linha em telas estreitas (antes vazavam para a direita no celular).</w:t>
       </w:r>
     </w:p>
     <w:p>
@@ -7519,7 +7585,17 @@
         <w:pStyle w:val="Compact"/>
       </w:pPr>
       <w:r>
-        <w:t xml:space="preserve">☐ Atualizar o ReNaTEP e o RENABAP quando houver versões oficiais mais recentes.</w:t>
+        <w:rPr>
+          <w:bCs/>
+          <w:b/>
+        </w:rPr>
+        <w:t xml:space="preserve">Ajustes no mapa da abertura:</w:t>
+      </w:r>
+      <w:r>
+        <w:t xml:space="preserve"> </w:t>
+      </w:r>
+      <w:r>
+        <w:t xml:space="preserve">países vizinhos e oceanos com nomes, como no mapa navegável; cores mais vivas (mar celeste, país em branco quente, vizinhos em bege); divisas das províncias mais fortes; bandeira argentina. Motivo: pedido do responsável (o fundo estava muito apagado e faltava situar a Argentina no continente).</w:t>
       </w:r>
     </w:p>
     <w:p>
@@ -7531,11 +7607,374 @@
         <w:pStyle w:val="Compact"/>
       </w:pPr>
       <w:r>
+        <w:rPr>
+          <w:bCs/>
+          <w:b/>
+        </w:rPr>
+        <w:t xml:space="preserve">Mapa no cabeçalho inteiro</w:t>
+      </w:r>
+      <w:r>
+        <w:t xml:space="preserve"> </w:t>
+      </w:r>
+      <w:r>
+        <w:t xml:space="preserve">da página inicial (telas a partir de 1200 px), com grade de meridianos e paralelos no mar, e</w:t>
+      </w:r>
+      <w:r>
+        <w:t xml:space="preserve"> </w:t>
+      </w:r>
+      <w:r>
+        <w:rPr>
+          <w:bCs/>
+          <w:b/>
+        </w:rPr>
+        <w:t xml:space="preserve">sem o gráfico de semanas</w:t>
+      </w:r>
+      <w:r>
+        <w:t xml:space="preserve"> </w:t>
+      </w:r>
+      <w:r>
+        <w:t xml:space="preserve">embaixo do mapa (na página inicial e na base). Contagem de localidades do mapa passou a usar os nomes das localidades (123), e não as coordenadas arredondadas. Motivo: pedido do responsável.</w:t>
+      </w:r>
+    </w:p>
+    <w:p>
+      <w:pPr>
+        <w:numPr>
+          <w:ilvl w:val="0"/>
+          <w:numId w:val="1011"/>
+        </w:numPr>
+        <w:pStyle w:val="Compact"/>
+      </w:pPr>
+      <w:r>
+        <w:rPr>
+          <w:bCs/>
+          <w:b/>
+        </w:rPr>
+        <w:t xml:space="preserve">Mapa cobrindo o cabeçalho inteiro em qualquer tela</w:t>
+      </w:r>
+      <w:r>
+        <w:t xml:space="preserve"> </w:t>
+      </w:r>
+      <w:r>
+        <w:t xml:space="preserve">(a versão anterior só fazia isso a partir de 1200 px e deixava o menu sobre fundo branco): menu dentro do cabeçalho, sobre o mapa, com fundo branco translúcido; enquadramento calculado no navegador a partir do tamanho do cabeçalho e do texto. Motivo: o responsável avaliou que o mapa não ocupava todo o cabeçalho.</w:t>
+      </w:r>
+    </w:p>
+    <w:p>
+      <w:pPr>
+        <w:numPr>
+          <w:ilvl w:val="0"/>
+          <w:numId w:val="1011"/>
+        </w:numPr>
+        <w:pStyle w:val="Compact"/>
+      </w:pPr>
+      <w:r>
+        <w:rPr>
+          <w:bCs/>
+          <w:b/>
+        </w:rPr>
+        <w:t xml:space="preserve">Nome oficial da base</w:t>
+      </w:r>
+      <w:r>
+        <w:t xml:space="preserve"> </w:t>
+      </w:r>
+      <w:r>
+        <w:t xml:space="preserve">passa a ser “Banco de Dados das Lutas por Espaços e Territórios (DATALUTA) - Movimentos Socioespaciais e Socioterritoriais Urbanos Argentinos (2024)” (em espanhol, “Banco de Datos de las Luchas por Espacios y Territorios (DATALUTA) - Movimientos Socioespaciales y Socioterritoriales Urbanos Argentinos (2024)”), na página inicial, na base, na página Sobre, nas citações (README,</w:t>
+      </w:r>
+      <w:r>
+        <w:t xml:space="preserve"> </w:t>
+      </w:r>
+      <w:r>
+        <w:rPr>
+          <w:rStyle w:val="VerbatimChar"/>
+        </w:rPr>
+        <w:t xml:space="preserve">LICENCAS.md</w:t>
+      </w:r>
+      <w:r>
+        <w:t xml:space="preserve">, Sobre), neste documento e no rodapé da versão em Word. Título da página inicial: “Ações no espaço urbano argentino em 2024”. Bandeira do mapa da abertura reposicionada para o Atlântico aberto, a leste da Patagônia. Motivo: pedido do responsável.</w:t>
+      </w:r>
+    </w:p>
+    <w:p>
+      <w:pPr>
+        <w:numPr>
+          <w:ilvl w:val="0"/>
+          <w:numId w:val="1011"/>
+        </w:numPr>
+        <w:pStyle w:val="Compact"/>
+      </w:pPr>
+      <w:r>
+        <w:rPr>
+          <w:bCs/>
+          <w:b/>
+        </w:rPr>
+        <w:t xml:space="preserve">Linha com o nome da base</w:t>
+      </w:r>
+      <w:r>
+        <w:t xml:space="preserve"> </w:t>
+      </w:r>
+      <w:r>
+        <w:t xml:space="preserve">(acima do título, na página inicial e na Sobre) e rótulos da Síntese e das leituras passam do laranja-amarronzado para o azul da paleta (#1d5994 e #2569ad). O laranja segue só nos gráficos e mapas, onde indica “acima do esperado”. Motivo: pedido do responsável, para combinar com a paleta.</w:t>
+      </w:r>
+    </w:p>
+    <w:p>
+      <w:pPr>
+        <w:numPr>
+          <w:ilvl w:val="0"/>
+          <w:numId w:val="1011"/>
+        </w:numPr>
+        <w:pStyle w:val="Compact"/>
+      </w:pPr>
+      <w:r>
+        <w:rPr>
+          <w:bCs/>
+          <w:b/>
+        </w:rPr>
+        <w:t xml:space="preserve">Quatro recursos novos e página de produções</w:t>
+      </w:r>
+      <w:r>
+        <w:t xml:space="preserve">, sem mudar a estrutura da base (seção 7.5): ficha de cada notícia com link próprio e notícias parecidas; correção colaborativa por formulário; data de atualização dos dados; galeria “Perguntas para começar” na página inicial; página “Produções”. Corrigido também o link da página inicial em espanhol, que levava à base em português. Motivo: levantamento de bases interativas de referência (IBGE, Crowd Counting, EJAtlas, Carnegie) e pedido do responsável.</w:t>
+      </w:r>
+    </w:p>
+    <w:p>
+      <w:r>
+        <w:pict>
+          <v:rect style="width:0;height:1.5pt" o:hralign="center" o:hrstd="t" o:hr="t"/>
+        </w:pict>
+      </w:r>
+    </w:p>
+    <w:bookmarkEnd w:id="47"/>
+    <w:bookmarkEnd w:id="48"/>
+    <w:bookmarkStart w:id="49" w:name="X3d9f82193e44c2a113d49ff9b97f8db3ae86c66"/>
+    <w:p>
+      <w:pPr>
+        <w:pStyle w:val="Heading2"/>
+      </w:pPr>
+      <w:r>
+        <w:t xml:space="preserve">10. Pendências</w:t>
+      </w:r>
+    </w:p>
+    <w:p>
+      <w:pPr>
+        <w:numPr>
+          <w:ilvl w:val="0"/>
+          <w:numId w:val="1012"/>
+        </w:numPr>
+        <w:pStyle w:val="Compact"/>
+      </w:pPr>
+      <w:r>
+        <w:t xml:space="preserve">☐</w:t>
+      </w:r>
+      <w:r>
+        <w:t xml:space="preserve"> </w:t>
+      </w:r>
+      <w:r>
+        <w:rPr>
+          <w:bCs/>
+          <w:b/>
+        </w:rPr>
+        <w:t xml:space="preserve">Licenças:</w:t>
+      </w:r>
+      <w:r>
+        <w:t xml:space="preserve"> </w:t>
+      </w:r>
+      <w:r>
+        <w:t xml:space="preserve">o arquivo</w:t>
+      </w:r>
+      <w:r>
+        <w:t xml:space="preserve"> </w:t>
+      </w:r>
+      <w:r>
+        <w:rPr>
+          <w:rStyle w:val="VerbatimChar"/>
+        </w:rPr>
+        <w:t xml:space="preserve">LICENSE</w:t>
+      </w:r>
+      <w:r>
+        <w:t xml:space="preserve"> </w:t>
+      </w:r>
+      <w:r>
+        <w:t xml:space="preserve">foi trocado no GitHub para MIT (commit 6f63b69), mas</w:t>
+      </w:r>
+      <w:r>
+        <w:t xml:space="preserve"> </w:t>
+      </w:r>
+      <w:r>
+        <w:rPr>
+          <w:rStyle w:val="VerbatimChar"/>
+        </w:rPr>
+        <w:t xml:space="preserve">LICENCAS.md</w:t>
+      </w:r>
+      <w:r>
+        <w:t xml:space="preserve">, README, página Sobre e rodapés ainda dizem base de dados sob CC BY 4.0 e código sob MIT. Decidir entre manter CC BY 4.0 para os dados (recomendado) ou adotar MIT para tudo, e alinhar os arquivos. Confirmar também com o grupo/centro de pesquisa.</w:t>
+      </w:r>
+    </w:p>
+    <w:p>
+      <w:pPr>
+        <w:numPr>
+          <w:ilvl w:val="0"/>
+          <w:numId w:val="1012"/>
+        </w:numPr>
+        <w:pStyle w:val="Compact"/>
+      </w:pPr>
+      <w:r>
+        <w:t xml:space="preserve">☐ Completar</w:t>
+      </w:r>
+      <w:r>
+        <w:t xml:space="preserve"> </w:t>
+      </w:r>
+      <w:r>
+        <w:rPr>
+          <w:rStyle w:val="VerbatimChar"/>
+        </w:rPr>
+        <w:t xml:space="preserve">dados/producoes.csv</w:t>
+      </w:r>
+      <w:r>
+        <w:t xml:space="preserve"> </w:t>
+      </w:r>
+      <w:r>
+        <w:t xml:space="preserve">com as produções do grupo (a apresentação no GT CLACSO entrou sem link e sem data exata).</w:t>
+      </w:r>
+    </w:p>
+    <w:p>
+      <w:pPr>
+        <w:numPr>
+          <w:ilvl w:val="0"/>
+          <w:numId w:val="1012"/>
+        </w:numPr>
+        <w:pStyle w:val="Compact"/>
+      </w:pPr>
+      <w:r>
+        <w:t xml:space="preserve">☐ Criar no GitHub os rótulos “correção” e “produção” e combinar quem revisa as sugestões que chegarem pelos formulários.</w:t>
+      </w:r>
+    </w:p>
+    <w:p>
+      <w:pPr>
+        <w:numPr>
+          <w:ilvl w:val="0"/>
+          <w:numId w:val="1012"/>
+        </w:numPr>
+        <w:pStyle w:val="Compact"/>
+      </w:pPr>
+      <w:r>
+        <w:t xml:space="preserve">☐ Revisão da versão em espanhol por falante nativo (termos como “recorte”, “ficha”, “plancha”).</w:t>
+      </w:r>
+    </w:p>
+    <w:p>
+      <w:pPr>
+        <w:numPr>
+          <w:ilvl w:val="0"/>
+          <w:numId w:val="1012"/>
+        </w:numPr>
+        <w:pStyle w:val="Compact"/>
+      </w:pPr>
+      <w:r>
+        <w:t xml:space="preserve">☐ Depositar a base no Zenodo (ou repositório institucional) para obter um DOI e atualizar a citação em</w:t>
+      </w:r>
+      <w:r>
+        <w:t xml:space="preserve"> </w:t>
+      </w:r>
+      <w:r>
+        <w:rPr>
+          <w:rStyle w:val="VerbatimChar"/>
+        </w:rPr>
+        <w:t xml:space="preserve">LICENCAS.md</w:t>
+      </w:r>
+      <w:r>
+        <w:t xml:space="preserve">.</w:t>
+      </w:r>
+    </w:p>
+    <w:p>
+      <w:pPr>
+        <w:numPr>
+          <w:ilvl w:val="0"/>
+          <w:numId w:val="1012"/>
+        </w:numPr>
+        <w:pStyle w:val="Compact"/>
+      </w:pPr>
+      <w:r>
+        <w:t xml:space="preserve">☐</w:t>
+      </w:r>
+      <w:r>
+        <w:t xml:space="preserve"> </w:t>
+      </w:r>
+      <w:r>
+        <w:rPr>
+          <w:bCs/>
+          <w:b/>
+        </w:rPr>
+        <w:t xml:space="preserve">Unificar nomes de organizações duplicados</w:t>
+      </w:r>
+      <w:r>
+        <w:t xml:space="preserve"> </w:t>
+      </w:r>
+      <w:r>
+        <w:t xml:space="preserve">(ex.: grafias diferentes de CTA e CGT). Afeta contagens, fichas e redes.</w:t>
+      </w:r>
+    </w:p>
+    <w:p>
+      <w:pPr>
+        <w:numPr>
+          <w:ilvl w:val="0"/>
+          <w:numId w:val="1012"/>
+        </w:numPr>
+        <w:pStyle w:val="Compact"/>
+      </w:pPr>
+      <w:r>
+        <w:t xml:space="preserve">☐ Resultado do</w:t>
+      </w:r>
+      <w:r>
+        <w:t xml:space="preserve"> </w:t>
+      </w:r>
+      <w:r>
+        <w:rPr>
+          <w:bCs/>
+          <w:b/>
+        </w:rPr>
+        <w:t xml:space="preserve">2º turno de 2023</w:t>
+      </w:r>
+      <w:r>
+        <w:t xml:space="preserve"> </w:t>
+      </w:r>
+      <w:r>
+        <w:t xml:space="preserve">por departamento, se a DINE publicar no formato mesa a mesa.</w:t>
+      </w:r>
+    </w:p>
+    <w:p>
+      <w:pPr>
+        <w:numPr>
+          <w:ilvl w:val="0"/>
+          <w:numId w:val="1012"/>
+        </w:numPr>
+        <w:pStyle w:val="Compact"/>
+      </w:pPr>
+      <w:r>
+        <w:t xml:space="preserve">☐ Outras fontes sugeridas e ainda não coletadas: estudantes de universidades nacionais por província, emprego público por província, titulares do Potenciar Trabajo, projetos de mineração e comunidades indígenas registradas.</w:t>
+      </w:r>
+    </w:p>
+    <w:p>
+      <w:pPr>
+        <w:numPr>
+          <w:ilvl w:val="0"/>
+          <w:numId w:val="1012"/>
+        </w:numPr>
+        <w:pStyle w:val="Compact"/>
+      </w:pPr>
+      <w:r>
+        <w:t xml:space="preserve">☐ Atualizar o ReNaTEP e o RENABAP quando houver versões oficiais mais recentes.</w:t>
+      </w:r>
+    </w:p>
+    <w:p>
+      <w:pPr>
+        <w:numPr>
+          <w:ilvl w:val="0"/>
+          <w:numId w:val="1012"/>
+        </w:numPr>
+        <w:pStyle w:val="Compact"/>
+      </w:pPr>
+      <w:r>
         <w:t xml:space="preserve">☐ Revisar a codificação de casos em que organizações da economia popular aparecem também como “movimientos sindicales”.</w:t>
       </w:r>
     </w:p>
-    <w:bookmarkEnd w:id="48"/>
     <w:bookmarkEnd w:id="49"/>
+    <w:bookmarkEnd w:id="50"/>
     <w:sectPr>
       <w:footerReference w:type="default" r:id="rId9"/>
       <w:pgSz w:h="16838" w:w="11906"/>
@@ -7939,6 +8378,9 @@
     <w:abstractNumId w:val="991"/>
   </w:num>
   <w:num w:numId="1011">
+    <w:abstractNumId w:val="991"/>
+  </w:num>
+  <w:num w:numId="1012">
     <w:abstractNumId w:val="991"/>
   </w:num>
 </w:numbering>

</xml_diff>

<commit_message>
Página inicial: galeria sem bairros populares, mapa sem bandeira, marca "Início" e contribuições mais visíveis
Co-Authored-By: Claude Opus 5.5 <noreply@anthropic.com>
Claude-Session: https://claude.ai/code/session_01VemTUauk2kCmRrtg5b6HFR
</commit_message>
<xml_diff>
--- a/PROCESSO.docx
+++ b/PROCESSO.docx
@@ -316,7 +316,7 @@
               <w:rPr>
                 <w:sz w:val="18"/>
               </w:rPr>
-              <w:t xml:space="preserve">2.2 · 30/10/2026</w:t>
+              <w:t xml:space="preserve">2.3 · 30/10/2026</w:t>
             </w:r>
           </w:p>
         </w:tc>
@@ -5778,7 +5778,7 @@
         <w:t xml:space="preserve"> </w:t>
       </w:r>
       <w:r>
-        <w:t xml:space="preserve">Botão “Sugerir uma correção” em cada ficha e link “Sugerir uma notícia que faltou” ao pé da lista. Ambos abrem um formulário do GitHub (</w:t>
+        <w:t xml:space="preserve">Seção “Contribua com a base” na página inicial (três opções: apontar um erro, sugerir notícia que faltou, incluir uma produção, com os passos), link “Contribuir” no menu de todas as páginas, quadro “Encontrou um erro ou falta alguma notícia?” acima da lista de notícias da base e botão “Sugerir uma correção” em destaque em cada ficha. Ambos abrem um formulário do GitHub (</w:t>
       </w:r>
       <w:r>
         <w:rPr>
@@ -5885,7 +5885,7 @@
         <w:t xml:space="preserve"> </w:t>
       </w:r>
       <w:r>
-        <w:t xml:space="preserve">na página inicial: 9 cartões com pergunta, texto curto e miniatura (</w:t>
+        <w:t xml:space="preserve">na página inicial: 8 cartões (o de bairros populares saiu em 30/10/2026) com pergunta, texto curto e miniatura (</w:t>
       </w:r>
       <w:r>
         <w:rPr>
@@ -7731,6 +7731,40 @@
       </w:r>
       <w:r>
         <w:t xml:space="preserve">, sem mudar a estrutura da base (seção 7.5): ficha de cada notícia com link próprio e notícias parecidas; correção colaborativa por formulário; data de atualização dos dados; galeria “Perguntas para começar” na página inicial; página “Produções”. Corrigido também o link da página inicial em espanhol, que levava à base em português. Motivo: levantamento de bases interativas de referência (IBGE, Crowd Counting, EJAtlas, Carnegie) e pedido do responsável.</w:t>
+      </w:r>
+    </w:p>
+    <w:p>
+      <w:pPr>
+        <w:numPr>
+          <w:ilvl w:val="0"/>
+          <w:numId w:val="1011"/>
+        </w:numPr>
+        <w:pStyle w:val="Compact"/>
+      </w:pPr>
+      <w:r>
+        <w:rPr>
+          <w:bCs/>
+          <w:b/>
+        </w:rPr>
+        <w:t xml:space="preserve">Ajustes na página inicial:</w:t>
+      </w:r>
+      <w:r>
+        <w:t xml:space="preserve"> </w:t>
+      </w:r>
+      <w:r>
+        <w:t xml:space="preserve">saiu o cartão “A mobilização aparece onde estão os bairros populares?” da galeria; saiu a bandeira do mapa da abertura (atributo</w:t>
+      </w:r>
+      <w:r>
+        <w:t xml:space="preserve"> </w:t>
+      </w:r>
+      <w:r>
+        <w:rPr>
+          <w:rStyle w:val="VerbatimChar"/>
+        </w:rPr>
+        <w:t xml:space="preserve">data-sem-bandeira</w:t>
+      </w:r>
+      <w:r>
+        <w:t xml:space="preserve">; no mapa menor da base ela continua); a marca no canto superior (sol + “Ações Socioespaciais”) passou a ser sol + “Início” em todas as páginas, e o link “Início” repetido no menu saiu; sugestões e correções ficaram mais visíveis (seção “Contribua com a base”, link “Contribuir” no menu e quadro acima da lista de notícias). Motivo: pedido do responsável.</w:t>
       </w:r>
     </w:p>
     <w:p>

</xml_diff>

<commit_message>
Novas leituras e história guiada de 2024, sem mudar o que já existia
- Contexto: gráfico de funil (Poisson, 95% e 99,8%) por província e departamento
- Mapa: mapa de pontos por categoria com detalhe da AMBA; cartograma de províncias (Dorling)
- Distribuição: mapa de calor reordenado pela análise de correspondências
- Fichas: perfil comparado às demais notícias
- No tempo: linha do tempo com cada notícia como ponto
- Comparar: diferença A − B com intervalo de 95%
- página /historia/ (2024 em ações), com rolagem, mapa e série semanal
- paleta Okabe-Ito e tabela de dados em cada painel novo; versão em espanhol
- PROCESSO.md 2.4 (+ Word), README

Co-Authored-By: Claude Opus 5.5 <noreply@anthropic.com>
Claude-Session: https://claude.ai/code/session_01VemTUauk2kCmRrtg5b6HFR
</commit_message>
<xml_diff>
--- a/PROCESSO.docx
+++ b/PROCESSO.docx
@@ -2,7 +2,7 @@
 <file path=word/document.xml><?xml version="1.0" encoding="utf-8"?>
 <w:document xmlns:w="http://schemas.openxmlformats.org/wordprocessingml/2006/main" xmlns:m="http://schemas.openxmlformats.org/officeDocument/2006/math" xmlns:r="http://schemas.openxmlformats.org/officeDocument/2006/relationships" xmlns:o="urn:schemas-microsoft-com:office:office" xmlns:v="urn:schemas-microsoft-com:vml" xmlns:w10="urn:schemas-microsoft-com:office:word" xmlns:a="http://schemas.openxmlformats.org/drawingml/2006/main" xmlns:pic="http://schemas.openxmlformats.org/drawingml/2006/picture" xmlns:wp="http://schemas.openxmlformats.org/drawingml/2006/wordprocessingDrawing">
   <w:body>
-    <w:bookmarkStart w:id="50" w:name="Xa2da3811f05494e056d19a3aa3e79062f38da32"/>
+    <w:bookmarkStart w:id="52" w:name="Xa2da3811f05494e056d19a3aa3e79062f38da32"/>
     <w:p>
       <w:pPr>
         <w:pStyle w:val="Heading1"/>
@@ -227,6 +227,25 @@
               <w:rPr>
                 <w:sz w:val="18"/>
               </w:rPr>
+              <w:t xml:space="preserve">, história guiada em</w:t>
+            </w:r>
+            <w:r>
+              <w:rPr>
+                <w:sz w:val="18"/>
+              </w:rPr>
+              <w:t xml:space="preserve"> </w:t>
+            </w:r>
+            <w:r>
+              <w:rPr>
+                <w:rStyle w:val="VerbatimChar"/>
+                <w:sz w:val="18"/>
+              </w:rPr>
+              <w:t xml:space="preserve">/historia/</w:t>
+            </w:r>
+            <w:r>
+              <w:rPr>
+                <w:sz w:val="18"/>
+              </w:rPr>
               <w:t xml:space="preserve">, versão em espanhol em</w:t>
             </w:r>
             <w:r>
@@ -316,7 +335,7 @@
               <w:rPr>
                 <w:sz w:val="18"/>
               </w:rPr>
-              <w:t xml:space="preserve">2.3 · 30/10/2026</w:t>
+              <w:t xml:space="preserve">2.4 · 30/10/2026</w:t>
             </w:r>
           </w:p>
         </w:tc>
@@ -4240,7 +4259,7 @@
     </w:p>
     <w:bookmarkEnd w:id="35"/>
     <w:bookmarkEnd w:id="36"/>
-    <w:bookmarkStart w:id="42" w:name="X6d348273175772d54216bfc7432a22c556cacdc"/>
+    <w:bookmarkStart w:id="44" w:name="X6d348273175772d54216bfc7432a22c556cacdc"/>
     <w:p>
       <w:pPr>
         <w:pStyle w:val="Heading2"/>
@@ -6035,7 +6054,559 @@
       </w:r>
     </w:p>
     <w:bookmarkEnd w:id="40"/>
-    <w:bookmarkStart w:id="41" w:name="Xe2536c815164416847d5f5b617d6e05abe31b59"/>
+    <w:bookmarkStart w:id="41" w:name="X87cbc21c56cd505f2e821bf26f426d977204cc4"/>
+    <w:p>
+      <w:pPr>
+        <w:pStyle w:val="Heading3"/>
+      </w:pPr>
+      <w:r>
+        <w:t xml:space="preserve">7.6 Novas leituras (30/10/2026, sem mudar o que já existia)</w:t>
+      </w:r>
+    </w:p>
+    <w:p>
+      <w:pPr>
+        <w:pStyle w:val="FirstParagraph"/>
+      </w:pPr>
+      <w:r>
+        <w:t xml:space="preserve">Painéis acrescentados ao fim de algumas abas, marcados com o selo “Nova leitura”, cada um com leitura automática, tabela de dados e “Como foi calculado”. Ficam em módulos próprios (</w:t>
+      </w:r>
+      <w:r>
+        <w:rPr>
+          <w:rStyle w:val="VerbatimChar"/>
+        </w:rPr>
+        <w:t xml:space="preserve">assets/js/app/nl-*.js</w:t>
+      </w:r>
+      <w:r>
+        <w:t xml:space="preserve">), desenhados depois do</w:t>
+      </w:r>
+      <w:r>
+        <w:t xml:space="preserve"> </w:t>
+      </w:r>
+      <w:r>
+        <w:rPr>
+          <w:rStyle w:val="VerbatimChar"/>
+        </w:rPr>
+        <w:t xml:space="preserve">render()</w:t>
+      </w:r>
+      <w:r>
+        <w:t xml:space="preserve"> </w:t>
+      </w:r>
+      <w:r>
+        <w:t xml:space="preserve">original e só quando a aba está aberta; um erro num painel novo não interrompe a base. Cores dos gráficos novos: paleta Okabe-Ito (segura para daltonismo) e escala divergente azul–laranja.</w:t>
+      </w:r>
+    </w:p>
+    <w:tbl>
+      <w:tblPr>
+        <w:tblStyle w:val="Table"/>
+        <w:tblW w:type="pct" w:w="5000"/>
+        <w:jc w:val="center"/>
+        <w:tblLook w:firstRow="1" w:lastRow="0" w:firstColumn="0" w:lastColumn="0" w:noHBand="0" w:noVBand="0" w:val="0020"/>
+        <w:tblBorders>
+          <w:top w:val="single" w:sz="4" w:color="C9D6E3"/>
+          <w:left w:val="single" w:sz="4" w:color="C9D6E3"/>
+          <w:bottom w:val="single" w:sz="4" w:color="C9D6E3"/>
+          <w:right w:val="single" w:sz="4" w:color="C9D6E3"/>
+          <w:insideH w:val="single" w:sz="4" w:color="C9D6E3"/>
+          <w:insideV w:val="single" w:sz="4" w:color="C9D6E3"/>
+        </w:tblBorders>
+      </w:tblPr>
+      <w:tblGrid>
+        <w:gridCol w:w="2640"/>
+        <w:gridCol w:w="2640"/>
+        <w:gridCol w:w="2640"/>
+      </w:tblGrid>
+      <w:tr>
+        <w:trPr>
+          <w:tblHeader w:val="true"/>
+        </w:trPr>
+        <w:tc>
+          <w:tcPr>
+            <w:shd w:val="clear" w:color="auto" w:fill="EAF3FB"/>
+          </w:tcPr>
+          <w:p>
+            <w:pPr>
+              <w:pStyle w:val="Compact"/>
+              <w:spacing w:after="20"/>
+              <w:jc w:val="left"/>
+            </w:pPr>
+            <w:r>
+              <w:rPr>
+                <w:b/>
+                <w:sz w:val="18"/>
+              </w:rPr>
+              <w:t xml:space="preserve">Aba</w:t>
+            </w:r>
+          </w:p>
+        </w:tc>
+        <w:tc>
+          <w:tcPr>
+            <w:shd w:val="clear" w:color="auto" w:fill="EAF3FB"/>
+          </w:tcPr>
+          <w:p>
+            <w:pPr>
+              <w:pStyle w:val="Compact"/>
+              <w:spacing w:after="20"/>
+              <w:jc w:val="left"/>
+            </w:pPr>
+            <w:r>
+              <w:rPr>
+                <w:b/>
+                <w:sz w:val="18"/>
+              </w:rPr>
+              <w:t xml:space="preserve">Painel</w:t>
+            </w:r>
+          </w:p>
+        </w:tc>
+        <w:tc>
+          <w:tcPr>
+            <w:shd w:val="clear" w:color="auto" w:fill="EAF3FB"/>
+          </w:tcPr>
+          <w:p>
+            <w:pPr>
+              <w:pStyle w:val="Compact"/>
+              <w:spacing w:after="20"/>
+              <w:jc w:val="left"/>
+            </w:pPr>
+            <w:r>
+              <w:rPr>
+                <w:b/>
+                <w:sz w:val="18"/>
+              </w:rPr>
+              <w:t xml:space="preserve">Método</w:t>
+            </w:r>
+          </w:p>
+        </w:tc>
+      </w:tr>
+      <w:tr>
+        <w:tc>
+          <w:tcPr/>
+          <w:p>
+            <w:pPr>
+              <w:pStyle w:val="Compact"/>
+              <w:spacing w:after="20"/>
+              <w:jc w:val="left"/>
+            </w:pPr>
+            <w:r>
+              <w:rPr>
+                <w:sz w:val="18"/>
+              </w:rPr>
+              <w:t xml:space="preserve">Contexto</w:t>
+            </w:r>
+          </w:p>
+        </w:tc>
+        <w:tc>
+          <w:tcPr/>
+          <w:p>
+            <w:pPr>
+              <w:pStyle w:val="Compact"/>
+              <w:spacing w:after="20"/>
+              <w:jc w:val="left"/>
+            </w:pPr>
+            <w:r>
+              <w:rPr>
+                <w:bCs/>
+                <w:b/>
+                <w:sz w:val="18"/>
+              </w:rPr>
+              <w:t xml:space="preserve">Funil</w:t>
+            </w:r>
+            <w:r>
+              <w:rPr>
+                <w:sz w:val="18"/>
+              </w:rPr>
+              <w:t xml:space="preserve"> </w:t>
+            </w:r>
+            <w:r>
+              <w:rPr>
+                <w:sz w:val="18"/>
+              </w:rPr>
+              <w:t xml:space="preserve">das taxas por província ou departamento</w:t>
+            </w:r>
+          </w:p>
+        </w:tc>
+        <w:tc>
+          <w:tcPr/>
+          <w:p>
+            <w:pPr>
+              <w:pStyle w:val="Compact"/>
+              <w:spacing w:after="20"/>
+              <w:jc w:val="left"/>
+            </w:pPr>
+            <w:r>
+              <w:rPr>
+                <w:sz w:val="18"/>
+              </w:rPr>
+              <w:t xml:space="preserve">Taxa = notícias ÷ população × 100.000; média do país = soma das notícias ÷ soma da população; limites de 95% e 99,8% pelos quantis de Poisson do esperado (média × população), interpolados (Spiegelhalter, 2005); em departamentos entram os 511, inclusive os sem notícias; eixo vertical em raiz quadrada.</w:t>
+            </w:r>
+          </w:p>
+        </w:tc>
+      </w:tr>
+      <w:tr>
+        <w:tc>
+          <w:tcPr/>
+          <w:p>
+            <w:pPr>
+              <w:pStyle w:val="Compact"/>
+              <w:spacing w:after="20"/>
+              <w:jc w:val="left"/>
+            </w:pPr>
+            <w:r>
+              <w:rPr>
+                <w:sz w:val="18"/>
+              </w:rPr>
+              <w:t xml:space="preserve">Mapa</w:t>
+            </w:r>
+          </w:p>
+        </w:tc>
+        <w:tc>
+          <w:tcPr/>
+          <w:p>
+            <w:pPr>
+              <w:pStyle w:val="Compact"/>
+              <w:spacing w:after="20"/>
+              <w:jc w:val="left"/>
+            </w:pPr>
+            <w:r>
+              <w:rPr>
+                <w:bCs/>
+                <w:b/>
+                <w:sz w:val="18"/>
+              </w:rPr>
+              <w:t xml:space="preserve">Mapa de pontos por categoria</w:t>
+            </w:r>
+          </w:p>
+        </w:tc>
+        <w:tc>
+          <w:tcPr/>
+          <w:p>
+            <w:pPr>
+              <w:pStyle w:val="Compact"/>
+              <w:spacing w:after="20"/>
+              <w:jc w:val="left"/>
+            </w:pPr>
+            <w:r>
+              <w:rPr>
+                <w:sz w:val="18"/>
+              </w:rPr>
+              <w:t xml:space="preserve">Um ponto por notícia × localidade, colorido pela categoria principal (entre as 7 mais frequentes) da variável escolhida; espiral de girassol por lugar; detalhe da AMBA; composição por região; clique abre a ficha da notícia.</w:t>
+            </w:r>
+          </w:p>
+        </w:tc>
+      </w:tr>
+      <w:tr>
+        <w:tc>
+          <w:tcPr/>
+          <w:p>
+            <w:pPr>
+              <w:pStyle w:val="Compact"/>
+              <w:spacing w:after="20"/>
+              <w:jc w:val="left"/>
+            </w:pPr>
+            <w:r>
+              <w:rPr>
+                <w:sz w:val="18"/>
+              </w:rPr>
+              <w:t xml:space="preserve">Mapa</w:t>
+            </w:r>
+          </w:p>
+        </w:tc>
+        <w:tc>
+          <w:tcPr/>
+          <w:p>
+            <w:pPr>
+              <w:pStyle w:val="Compact"/>
+              <w:spacing w:after="20"/>
+              <w:jc w:val="left"/>
+            </w:pPr>
+            <w:r>
+              <w:rPr>
+                <w:bCs/>
+                <w:b/>
+                <w:sz w:val="18"/>
+              </w:rPr>
+              <w:t xml:space="preserve">Cartograma de províncias</w:t>
+            </w:r>
+          </w:p>
+        </w:tc>
+        <w:tc>
+          <w:tcPr/>
+          <w:p>
+            <w:pPr>
+              <w:pStyle w:val="Compact"/>
+              <w:spacing w:after="20"/>
+              <w:jc w:val="left"/>
+            </w:pPr>
+            <w:r>
+              <w:rPr>
+                <w:sz w:val="18"/>
+              </w:rPr>
+              <w:t xml:space="preserve">Dorling: círculo com área ∝ população (Censo 2022), posição inicial no centro da província, afastamento por simulação de forças com colisão; cor = taxa em quintis.</w:t>
+            </w:r>
+          </w:p>
+        </w:tc>
+      </w:tr>
+      <w:tr>
+        <w:tc>
+          <w:tcPr/>
+          <w:p>
+            <w:pPr>
+              <w:pStyle w:val="Compact"/>
+              <w:spacing w:after="20"/>
+              <w:jc w:val="left"/>
+            </w:pPr>
+            <w:r>
+              <w:rPr>
+                <w:sz w:val="18"/>
+              </w:rPr>
+              <w:t xml:space="preserve">Distribuição</w:t>
+            </w:r>
+          </w:p>
+        </w:tc>
+        <w:tc>
+          <w:tcPr/>
+          <w:p>
+            <w:pPr>
+              <w:pStyle w:val="Compact"/>
+              <w:spacing w:after="20"/>
+              <w:jc w:val="left"/>
+            </w:pPr>
+            <w:r>
+              <w:rPr>
+                <w:bCs/>
+                <w:b/>
+                <w:sz w:val="18"/>
+              </w:rPr>
+              <w:t xml:space="preserve">Mapa de calor reordenado</w:t>
+            </w:r>
+          </w:p>
+        </w:tc>
+        <w:tc>
+          <w:tcPr/>
+          <w:p>
+            <w:pPr>
+              <w:pStyle w:val="Compact"/>
+              <w:spacing w:after="20"/>
+              <w:jc w:val="left"/>
+            </w:pPr>
+            <w:r>
+              <w:rPr>
+                <w:sz w:val="18"/>
+              </w:rPr>
+              <w:t xml:space="preserve">Resíduos ajustados de Haberman das 16 categorias mais frequentes de cada variável; linhas e colunas ordenadas pela coordenada no 1º eixo de uma análise de correspondências simples (iteração de potência). Aparece quando “Cruzar com” está escolhido.</w:t>
+            </w:r>
+          </w:p>
+        </w:tc>
+      </w:tr>
+      <w:tr>
+        <w:tc>
+          <w:tcPr/>
+          <w:p>
+            <w:pPr>
+              <w:pStyle w:val="Compact"/>
+              <w:spacing w:after="20"/>
+              <w:jc w:val="left"/>
+            </w:pPr>
+            <w:r>
+              <w:rPr>
+                <w:sz w:val="18"/>
+              </w:rPr>
+              <w:t xml:space="preserve">Fichas</w:t>
+            </w:r>
+          </w:p>
+        </w:tc>
+        <w:tc>
+          <w:tcPr/>
+          <w:p>
+            <w:pPr>
+              <w:pStyle w:val="Compact"/>
+              <w:spacing w:after="20"/>
+              <w:jc w:val="left"/>
+            </w:pPr>
+            <w:r>
+              <w:rPr>
+                <w:bCs/>
+                <w:b/>
+                <w:sz w:val="18"/>
+              </w:rPr>
+              <w:t xml:space="preserve">Perfil comparado</w:t>
+            </w:r>
+          </w:p>
+        </w:tc>
+        <w:tc>
+          <w:tcPr/>
+          <w:p>
+            <w:pPr>
+              <w:pStyle w:val="Compact"/>
+              <w:spacing w:after="20"/>
+              <w:jc w:val="left"/>
+            </w:pPr>
+            <w:r>
+              <w:rPr>
+                <w:sz w:val="18"/>
+              </w:rPr>
+              <w:t xml:space="preserve">Para 6 variáveis centrais, % na ficha × % nas demais notícias da base; diferença em p.p.; cor forte com teste z de duas proporções significativo a 5%.</w:t>
+            </w:r>
+          </w:p>
+        </w:tc>
+      </w:tr>
+      <w:tr>
+        <w:tc>
+          <w:tcPr/>
+          <w:p>
+            <w:pPr>
+              <w:pStyle w:val="Compact"/>
+              <w:spacing w:after="20"/>
+              <w:jc w:val="left"/>
+            </w:pPr>
+            <w:r>
+              <w:rPr>
+                <w:sz w:val="18"/>
+              </w:rPr>
+              <w:t xml:space="preserve">No tempo</w:t>
+            </w:r>
+          </w:p>
+        </w:tc>
+        <w:tc>
+          <w:tcPr/>
+          <w:p>
+            <w:pPr>
+              <w:pStyle w:val="Compact"/>
+              <w:spacing w:after="20"/>
+              <w:jc w:val="left"/>
+            </w:pPr>
+            <w:r>
+              <w:rPr>
+                <w:bCs/>
+                <w:b/>
+                <w:sz w:val="18"/>
+              </w:rPr>
+              <w:t xml:space="preserve">Linha do tempo de notícias</w:t>
+            </w:r>
+          </w:p>
+        </w:tc>
+        <w:tc>
+          <w:tcPr/>
+          <w:p>
+            <w:pPr>
+              <w:pStyle w:val="Compact"/>
+              <w:spacing w:after="20"/>
+              <w:jc w:val="left"/>
+            </w:pPr>
+            <w:r>
+              <w:rPr>
+                <w:sz w:val="18"/>
+              </w:rPr>
+              <w:t xml:space="preserve">Cada notícia é um ponto na semana de início (segunda a domingo), empilhado em colunas de três e colorido pela categoria; acontecimentos de 2024 marcados; clique abre a ficha.</w:t>
+            </w:r>
+          </w:p>
+        </w:tc>
+      </w:tr>
+      <w:tr>
+        <w:tc>
+          <w:tcPr/>
+          <w:p>
+            <w:pPr>
+              <w:pStyle w:val="Compact"/>
+              <w:spacing w:after="20"/>
+              <w:jc w:val="left"/>
+            </w:pPr>
+            <w:r>
+              <w:rPr>
+                <w:sz w:val="18"/>
+              </w:rPr>
+              <w:t xml:space="preserve">Comparar</w:t>
+            </w:r>
+          </w:p>
+        </w:tc>
+        <w:tc>
+          <w:tcPr/>
+          <w:p>
+            <w:pPr>
+              <w:pStyle w:val="Compact"/>
+              <w:spacing w:after="20"/>
+              <w:jc w:val="left"/>
+            </w:pPr>
+            <w:r>
+              <w:rPr>
+                <w:bCs/>
+                <w:b/>
+                <w:sz w:val="18"/>
+              </w:rPr>
+              <w:t xml:space="preserve">Margem de erro</w:t>
+            </w:r>
+          </w:p>
+        </w:tc>
+        <w:tc>
+          <w:tcPr/>
+          <w:p>
+            <w:pPr>
+              <w:pStyle w:val="Compact"/>
+              <w:spacing w:after="20"/>
+              <w:jc w:val="left"/>
+            </w:pPr>
+            <w:r>
+              <w:rPr>
+                <w:sz w:val="18"/>
+              </w:rPr>
+              <w:t xml:space="preserve">Diferença A − B por categoria com intervalo de 95% = d ± 1,96 × erro-padrão combinado (o mesmo do teste z do gráfico de halteres; o intervalo cruza o zero exatamente quando a diferença não é significativa).</w:t>
+            </w:r>
+          </w:p>
+        </w:tc>
+      </w:tr>
+    </w:tbl>
+    <w:bookmarkEnd w:id="41"/>
+    <w:bookmarkStart w:id="42" w:name="Xaba42bc22919c532accda37303b9a4f75cfa1fe"/>
+    <w:p>
+      <w:pPr>
+        <w:pStyle w:val="Heading3"/>
+      </w:pPr>
+      <w:r>
+        <w:t xml:space="preserve">7.7 História guiada de 2024 (</w:t>
+      </w:r>
+      <w:r>
+        <w:rPr>
+          <w:rStyle w:val="VerbatimChar"/>
+        </w:rPr>
+        <w:t xml:space="preserve">/historia/</w:t>
+      </w:r>
+      <w:r>
+        <w:t xml:space="preserve">)</w:t>
+      </w:r>
+    </w:p>
+    <w:p>
+      <w:pPr>
+        <w:pStyle w:val="FirstParagraph"/>
+      </w:pPr>
+      <w:r>
+        <w:t xml:space="preserve">Página com rolagem: à esquerda, oito passos de texto (abertura; janeiro; março; abril; maio–junho; setembro–outubro; novembro–dezembro; o ano inteiro); à direita, fixos, o mapa da Argentina (os mesmos dados de</w:t>
+      </w:r>
+      <w:r>
+        <w:t xml:space="preserve"> </w:t>
+      </w:r>
+      <w:r>
+        <w:rPr>
+          <w:rStyle w:val="VerbatimChar"/>
+        </w:rPr>
+        <w:t xml:space="preserve">dados/entrada.json</w:t>
+      </w:r>
+      <w:r>
+        <w:t xml:space="preserve">) e a série semanal. Ao chegar a cada passo, acendem as ações do período (laranja), as anteriores ficam em segundo plano e a série marca o período. A contagem de cada passo (ações no mapa = notícia × localidade) é calculada no navegador. As datas dos acontecimentos vêm de</w:t>
+      </w:r>
+      <w:r>
+        <w:t xml:space="preserve"> </w:t>
+      </w:r>
+      <w:r>
+        <w:rPr>
+          <w:rStyle w:val="VerbatimChar"/>
+        </w:rPr>
+        <w:t xml:space="preserve">pipeline/referencias/acontecimentos_2024.csv</w:t>
+      </w:r>
+      <w:r>
+        <w:t xml:space="preserve">. Ligada na página inicial (botão “A história de 2024”).</w:t>
+      </w:r>
+    </w:p>
+    <w:bookmarkEnd w:id="42"/>
+    <w:bookmarkStart w:id="43" w:name="Xe2536c815164416847d5f5b617d6e05abe31b59"/>
     <w:p>
       <w:pPr>
         <w:pStyle w:val="Heading3"/>
@@ -6341,9 +6912,9 @@
         </w:pict>
       </w:r>
     </w:p>
-    <w:bookmarkEnd w:id="41"/>
-    <w:bookmarkEnd w:id="42"/>
-    <w:bookmarkStart w:id="43" w:name="X9a8a5c3f4675aaafcd01bef6e7fb33b3e7de441"/>
+    <w:bookmarkEnd w:id="43"/>
+    <w:bookmarkEnd w:id="44"/>
+    <w:bookmarkStart w:id="45" w:name="X9a8a5c3f4675aaafcd01bef6e7fb33b3e7de441"/>
     <w:p>
       <w:pPr>
         <w:pStyle w:val="Heading2"/>
@@ -6794,8 +7365,8 @@
         </w:pict>
       </w:r>
     </w:p>
-    <w:bookmarkEnd w:id="43"/>
-    <w:bookmarkStart w:id="48" w:name="X37a24ddc49ec6a08847d5e7c09b751dfa640a32"/>
+    <w:bookmarkEnd w:id="45"/>
+    <w:bookmarkStart w:id="50" w:name="X37a24ddc49ec6a08847d5e7c09b751dfa640a32"/>
     <w:p>
       <w:pPr>
         <w:pStyle w:val="Heading2"/>
@@ -6812,7 +7383,7 @@
         <w:t xml:space="preserve">Datas no fuso de São Paulo. Os códigos entre colchetes são os commits do repositório.</w:t>
       </w:r>
     </w:p>
-    <w:bookmarkStart w:id="44" w:name="Xb374f4671a78533177f9e41d94caa4dc6b2e1e1"/>
+    <w:bookmarkStart w:id="46" w:name="Xb374f4671a78533177f9e41d94caa4dc6b2e1e1"/>
     <w:p>
       <w:pPr>
         <w:pStyle w:val="Heading3"/>
@@ -7049,8 +7620,8 @@
         <w:t xml:space="preserve">Síntese: explicação passo a passo do resíduo ajustado, régua de leitura e combinações raras [2ee97ab].</w:t>
       </w:r>
     </w:p>
-    <w:bookmarkEnd w:id="44"/>
-    <w:bookmarkStart w:id="45" w:name="Xfda8f6a74ee01990937dc6b5f77dee589813531"/>
+    <w:bookmarkEnd w:id="46"/>
+    <w:bookmarkStart w:id="47" w:name="Xfda8f6a74ee01990937dc6b5f77dee589813531"/>
     <w:p>
       <w:pPr>
         <w:pStyle w:val="Heading3"/>
@@ -7282,8 +7853,8 @@
         <w:t xml:space="preserve">(permutação condicional, como no GeoDa); antes sorteava com reposição. Motivo: pedido de deixar claro como o LISA é calculado.</w:t>
       </w:r>
     </w:p>
-    <w:bookmarkEnd w:id="45"/>
-    <w:bookmarkStart w:id="46" w:name="X0243e2acffdb3298bb3301518b805b778538cf8"/>
+    <w:bookmarkEnd w:id="47"/>
+    <w:bookmarkStart w:id="48" w:name="X0243e2acffdb3298bb3301518b805b778538cf8"/>
     <w:p>
       <w:pPr>
         <w:pStyle w:val="Heading3"/>
@@ -7314,8 +7885,8 @@
         <w:t xml:space="preserve">a escolha passou a ser uma lista fechada só com as categorias do tipo de ficha escolhido (por exemplo, só objetivos), com o número de notícias, e um campo para filtrar a lista. Motivo: o campo de texto anterior, com sugestões, deixava o navegador misturar valores digitados antes em outros tipos de ficha (nomes de movimentos, províncias).</w:t>
       </w:r>
     </w:p>
-    <w:bookmarkEnd w:id="46"/>
-    <w:bookmarkStart w:id="47" w:name="X6d16d1d1dfee84c5325917dbbdeb1135ee226ab"/>
+    <w:bookmarkEnd w:id="48"/>
+    <w:bookmarkStart w:id="49" w:name="X6d16d1d1dfee84c5325917dbbdeb1135ee226ab"/>
     <w:p>
       <w:pPr>
         <w:pStyle w:val="Heading3"/>
@@ -7768,15 +8339,37 @@
       </w:r>
     </w:p>
     <w:p>
+      <w:pPr>
+        <w:numPr>
+          <w:ilvl w:val="0"/>
+          <w:numId w:val="1011"/>
+        </w:numPr>
+        <w:pStyle w:val="Compact"/>
+      </w:pPr>
+      <w:r>
+        <w:rPr>
+          <w:bCs/>
+          <w:b/>
+        </w:rPr>
+        <w:t xml:space="preserve">Novas leituras e história guiada</w:t>
+      </w:r>
+      <w:r>
+        <w:t xml:space="preserve"> </w:t>
+      </w:r>
+      <w:r>
+        <w:t xml:space="preserve">(seções 7.6 e 7.7): funil, mapa de pontos por categoria, cartograma, mapa de calor reordenado, perfil comparado nas fichas, linha do tempo de notícias, margem de erro no Comparar e a página “2024 em ações”. Tudo acrescentado, sem mudar abas, cálculos ou endereços existentes. Motivo: pedido do responsável para melhorar a representação.</w:t>
+      </w:r>
+    </w:p>
+    <w:p>
       <w:r>
         <w:pict>
           <v:rect style="width:0;height:1.5pt" o:hralign="center" o:hrstd="t" o:hr="t"/>
         </w:pict>
       </w:r>
     </w:p>
-    <w:bookmarkEnd w:id="47"/>
-    <w:bookmarkEnd w:id="48"/>
-    <w:bookmarkStart w:id="49" w:name="X3d9f82193e44c2a113d49ff9b97f8db3ae86c66"/>
+    <w:bookmarkEnd w:id="49"/>
+    <w:bookmarkEnd w:id="50"/>
+    <w:bookmarkStart w:id="51" w:name="X3d9f82193e44c2a113d49ff9b97f8db3ae86c66"/>
     <w:p>
       <w:pPr>
         <w:pStyle w:val="Heading2"/>
@@ -8007,8 +8600,8 @@
         <w:t xml:space="preserve">☐ Revisar a codificação de casos em que organizações da economia popular aparecem também como “movimientos sindicales”.</w:t>
       </w:r>
     </w:p>
-    <w:bookmarkEnd w:id="49"/>
-    <w:bookmarkEnd w:id="50"/>
+    <w:bookmarkEnd w:id="51"/>
+    <w:bookmarkEnd w:id="52"/>
     <w:sectPr>
       <w:footerReference w:type="default" r:id="rId9"/>
       <w:pgSz w:h="16838" w:w="11906"/>

</xml_diff>

<commit_message>
Atalhos para as novas leituras, downloads de gráficos e tabelas, e como citar
Faixa no topo de cada aba com atalhos para as novas leituras, CSV do recorte e
Como citar; Baixar PNG/SVG embaixo dos gráficos (com título, recorte e fonte);
CSV das tabelas das novas leituras; citação ABNT/APA/BibTeX; CITATION.cff e
.zenodo.json. Nada do que já existia foi alterado.

Co-Authored-By: Claude Opus 5.5 <noreply@anthropic.com>
Claude-Session: https://claude.ai/code/session_01VemTUauk2kCmRrtg5b6HFR
</commit_message>
<xml_diff>
--- a/PROCESSO.docx
+++ b/PROCESSO.docx
@@ -2,7 +2,7 @@
 <file path=word/document.xml><?xml version="1.0" encoding="utf-8"?>
 <w:document xmlns:w="http://schemas.openxmlformats.org/wordprocessingml/2006/main" xmlns:m="http://schemas.openxmlformats.org/officeDocument/2006/math" xmlns:r="http://schemas.openxmlformats.org/officeDocument/2006/relationships" xmlns:o="urn:schemas-microsoft-com:office:office" xmlns:v="urn:schemas-microsoft-com:vml" xmlns:w10="urn:schemas-microsoft-com:office:word" xmlns:a="http://schemas.openxmlformats.org/drawingml/2006/main" xmlns:pic="http://schemas.openxmlformats.org/drawingml/2006/picture" xmlns:wp="http://schemas.openxmlformats.org/drawingml/2006/wordprocessingDrawing">
   <w:body>
-    <w:bookmarkStart w:id="52" w:name="Xa2da3811f05494e056d19a3aa3e79062f38da32"/>
+    <w:bookmarkStart w:id="53" w:name="Xa2da3811f05494e056d19a3aa3e79062f38da32"/>
     <w:p>
       <w:pPr>
         <w:pStyle w:val="Heading1"/>
@@ -335,7 +335,7 @@
               <w:rPr>
                 <w:sz w:val="18"/>
               </w:rPr>
-              <w:t xml:space="preserve">2.4 · 30/10/2026</w:t>
+              <w:t xml:space="preserve">2.5 · 30/10/2026</w:t>
             </w:r>
           </w:p>
         </w:tc>
@@ -4259,7 +4259,7 @@
     </w:p>
     <w:bookmarkEnd w:id="35"/>
     <w:bookmarkEnd w:id="36"/>
-    <w:bookmarkStart w:id="44" w:name="X6d348273175772d54216bfc7432a22c556cacdc"/>
+    <w:bookmarkStart w:id="45" w:name="X6d348273175772d54216bfc7432a22c556cacdc"/>
     <w:p>
       <w:pPr>
         <w:pStyle w:val="Heading2"/>
@@ -6606,13 +6606,45 @@
       </w:r>
     </w:p>
     <w:bookmarkEnd w:id="42"/>
-    <w:bookmarkStart w:id="43" w:name="Xe2536c815164416847d5f5b617d6e05abe31b59"/>
+    <w:bookmarkStart w:id="43" w:name="X61f474c0ce6c1ea8d466d064e3ea0c880d051ef"/>
     <w:p>
       <w:pPr>
         <w:pStyle w:val="Heading3"/>
       </w:pPr>
       <w:r>
-        <w:t xml:space="preserve">7.4 Versão em espanhol</w:t>
+        <w:t xml:space="preserve">7.8 Atalhos, downloads e citação (</w:t>
+      </w:r>
+      <w:r>
+        <w:rPr>
+          <w:rStyle w:val="VerbatimChar"/>
+        </w:rPr>
+        <w:t xml:space="preserve">assets/js/app/uso.js</w:t>
+      </w:r>
+      <w:r>
+        <w:t xml:space="preserve">)</w:t>
+      </w:r>
+    </w:p>
+    <w:p>
+      <w:pPr>
+        <w:pStyle w:val="FirstParagraph"/>
+      </w:pPr>
+      <w:r>
+        <w:t xml:space="preserve">Acrescentados depois do</w:t>
+      </w:r>
+      <w:r>
+        <w:t xml:space="preserve"> </w:t>
+      </w:r>
+      <w:r>
+        <w:rPr>
+          <w:rStyle w:val="VerbatimChar"/>
+        </w:rPr>
+        <w:t xml:space="preserve">render()</w:t>
+      </w:r>
+      <w:r>
+        <w:t xml:space="preserve"> </w:t>
+      </w:r>
+      <w:r>
+        <w:t xml:space="preserve">original, sem mudar abas, cálculos ou endereços:</w:t>
       </w:r>
     </w:p>
     <w:p>
@@ -6624,46 +6656,17 @@
         <w:pStyle w:val="Compact"/>
       </w:pPr>
       <w:r>
-        <w:t xml:space="preserve">Endereços:</w:t>
-      </w:r>
-      <w:r>
-        <w:t xml:space="preserve"> </w:t>
-      </w:r>
-      <w:r>
-        <w:rPr>
-          <w:rStyle w:val="VerbatimChar"/>
-        </w:rPr>
-        <w:t xml:space="preserve">/es/</w:t>
-      </w:r>
-      <w:r>
-        <w:t xml:space="preserve">,</w:t>
-      </w:r>
-      <w:r>
-        <w:t xml:space="preserve"> </w:t>
-      </w:r>
-      <w:r>
-        <w:rPr>
-          <w:rStyle w:val="VerbatimChar"/>
-        </w:rPr>
-        <w:t xml:space="preserve">/es/base/</w:t>
-      </w:r>
-      <w:r>
-        <w:t xml:space="preserve"> </w:t>
-      </w:r>
-      <w:r>
-        <w:t xml:space="preserve">e</w:t>
-      </w:r>
-      <w:r>
-        <w:t xml:space="preserve"> </w:t>
-      </w:r>
-      <w:r>
-        <w:rPr>
-          <w:rStyle w:val="VerbatimChar"/>
-        </w:rPr>
-        <w:t xml:space="preserve">/es/sobre/</w:t>
-      </w:r>
-      <w:r>
-        <w:t xml:space="preserve">; o link “Español”/“Português” no menu troca de idioma (na base, mantendo aba e filtros).</w:t>
+        <w:rPr>
+          <w:bCs/>
+          <w:b/>
+        </w:rPr>
+        <w:t xml:space="preserve">Atalhos no topo de cada aba:</w:t>
+      </w:r>
+      <w:r>
+        <w:t xml:space="preserve"> </w:t>
+      </w:r>
+      <w:r>
+        <w:t xml:space="preserve">uma faixa logo abaixo do título da aba com links para as novas leituras que ficam no fim dela (por exemplo, “Funil ↓” em Contexto), o botão “Baixar recorte (CSV)” (o mesmo da lista de notícias) e “Como citar”. Motivo: o responsável não encontrou o funil, que fica no fim de uma aba longa.</w:t>
       </w:r>
     </w:p>
     <w:p>
@@ -6679,67 +6682,13 @@
           <w:bCs/>
           <w:b/>
         </w:rPr>
-        <w:t xml:space="preserve">Como é gerada.</w:t>
-      </w:r>
-      <w:r>
-        <w:t xml:space="preserve"> </w:t>
-      </w:r>
-      <w:r>
-        <w:t xml:space="preserve">O português continua sendo o original.</w:t>
-      </w:r>
-      <w:r>
-        <w:t xml:space="preserve"> </w:t>
-      </w:r>
-      <w:r>
-        <w:rPr>
-          <w:rStyle w:val="VerbatimChar"/>
-        </w:rPr>
-        <w:t xml:space="preserve">i18n/ferramenta.js</w:t>
-      </w:r>
-      <w:r>
-        <w:t xml:space="preserve"> </w:t>
-      </w:r>
-      <w:r>
-        <w:t xml:space="preserve">(Node) lê o JavaScript com o analisador do TypeScript e as páginas HTML, encontra cada trecho de texto e o troca pela tradução do catálogo</w:t>
-      </w:r>
-      <w:r>
-        <w:t xml:space="preserve"> </w:t>
-      </w:r>
-      <w:r>
-        <w:rPr>
-          <w:rStyle w:val="VerbatimChar"/>
-        </w:rPr>
-        <w:t xml:space="preserve">i18n/es.json</w:t>
-      </w:r>
-      <w:r>
-        <w:t xml:space="preserve"> </w:t>
-      </w:r>
-      <w:r>
-        <w:t xml:space="preserve">(pares “texto em português” → “texto em espanhol”, cerca de 1.800). Palavras curtas que em outros arquivos são chaves internas (meses abreviados, “forte”, “baixo”…) são traduzidas só no arquivo certo, por</w:t>
-      </w:r>
-      <w:r>
-        <w:t xml:space="preserve"> </w:t>
-      </w:r>
-      <w:r>
-        <w:rPr>
-          <w:rStyle w:val="VerbatimChar"/>
-        </w:rPr>
-        <w:t xml:space="preserve">i18n/es-contexto.json</w:t>
-      </w:r>
-      <w:r>
-        <w:t xml:space="preserve">. Textos que são iguais nas duas línguas ou não devem ser traduzidos (nomes de organizações, seletores CSS, definições do INDEC já em espanhol) ficam em</w:t>
-      </w:r>
-      <w:r>
-        <w:t xml:space="preserve"> </w:t>
-      </w:r>
-      <w:r>
-        <w:rPr>
-          <w:rStyle w:val="VerbatimChar"/>
-        </w:rPr>
-        <w:t xml:space="preserve">i18n/ignorar.json</w:t>
-      </w:r>
-      <w:r>
-        <w:t xml:space="preserve">.</w:t>
+        <w:t xml:space="preserve">Baixar PNG e SVG embaixo de cada gráfico:</w:t>
+      </w:r>
+      <w:r>
+        <w:t xml:space="preserve"> </w:t>
+      </w:r>
+      <w:r>
+        <w:t xml:space="preserve">a imagem leva o título do gráfico, o recorte ativo (filtros, busca e número de notícias) e a linha “Fonte: DATALUTA Argentina 2024 (CC BY 4.0)” com o endereço do site. Os estilos são copiados do navegador para dentro do SVG e a fonte Urbanist vai embutida, para que a imagem fique igual em qualquer computador. Ficam de fora os gráficos pequenos lado a lado (para não quebrar a grade), o mapa principal e as fichas, que já tinham seus próprios botões, e os gráficos feitos em HTML, como as barras da Distribuição.</w:t>
       </w:r>
     </w:p>
     <w:p>
@@ -6751,94 +6700,17 @@
         <w:pStyle w:val="Compact"/>
       </w:pPr>
       <w:r>
-        <w:t xml:space="preserve">Saídas geradas (não editar à mão):</w:t>
-      </w:r>
-      <w:r>
-        <w:t xml:space="preserve"> </w:t>
-      </w:r>
-      <w:r>
-        <w:rPr>
-          <w:rStyle w:val="VerbatimChar"/>
-        </w:rPr>
-        <w:t xml:space="preserve">es/index.html</w:t>
-      </w:r>
-      <w:r>
-        <w:t xml:space="preserve">,</w:t>
-      </w:r>
-      <w:r>
-        <w:t xml:space="preserve"> </w:t>
-      </w:r>
-      <w:r>
-        <w:rPr>
-          <w:rStyle w:val="VerbatimChar"/>
-        </w:rPr>
-        <w:t xml:space="preserve">es/base/index.html</w:t>
-      </w:r>
-      <w:r>
-        <w:t xml:space="preserve">,</w:t>
-      </w:r>
-      <w:r>
-        <w:t xml:space="preserve"> </w:t>
-      </w:r>
-      <w:r>
-        <w:rPr>
-          <w:rStyle w:val="VerbatimChar"/>
-        </w:rPr>
-        <w:t xml:space="preserve">es/sobre/index.html</w:t>
-      </w:r>
-      <w:r>
-        <w:t xml:space="preserve"> </w:t>
-      </w:r>
-      <w:r>
-        <w:t xml:space="preserve">e</w:t>
-      </w:r>
-      <w:r>
-        <w:t xml:space="preserve"> </w:t>
-      </w:r>
-      <w:r>
-        <w:rPr>
-          <w:rStyle w:val="VerbatimChar"/>
-        </w:rPr>
-        <w:t xml:space="preserve">assets/js/app-es/*.js</w:t>
-      </w:r>
-      <w:r>
-        <w:t xml:space="preserve">. Rótulos que vêm dos dados (nomes das variáveis, meses, indicadores, acontecimentos) são traduzidos no navegador, logo depois de carregar os JSON (</w:t>
-      </w:r>
-      <w:r>
-        <w:rPr>
-          <w:rStyle w:val="VerbatimChar"/>
-        </w:rPr>
-        <w:t xml:space="preserve">TR_DADOS</w:t>
-      </w:r>
-      <w:r>
-        <w:t xml:space="preserve"> </w:t>
-      </w:r>
-      <w:r>
-        <w:t xml:space="preserve">em</w:t>
-      </w:r>
-      <w:r>
-        <w:t xml:space="preserve"> </w:t>
-      </w:r>
-      <w:r>
-        <w:rPr>
-          <w:rStyle w:val="VerbatimChar"/>
-        </w:rPr>
-        <w:t xml:space="preserve">assets/js/app-es/carregar.js</w:t>
-      </w:r>
-      <w:r>
-        <w:t xml:space="preserve">). Datas e números usam o formato</w:t>
-      </w:r>
-      <w:r>
-        <w:t xml:space="preserve"> </w:t>
-      </w:r>
-      <w:r>
-        <w:rPr>
-          <w:rStyle w:val="VerbatimChar"/>
-        </w:rPr>
-        <w:t xml:space="preserve">es-AR</w:t>
-      </w:r>
-      <w:r>
-        <w:t xml:space="preserve">.</w:t>
+        <w:rPr>
+          <w:bCs/>
+          <w:b/>
+        </w:rPr>
+        <w:t xml:space="preserve">Baixar tabela (CSV)</w:t>
+      </w:r>
+      <w:r>
+        <w:t xml:space="preserve"> </w:t>
+      </w:r>
+      <w:r>
+        <w:t xml:space="preserve">dentro de “Ver os dados em tabela” de cada nova leitura, com o recorte e a fonte nas últimas linhas.</w:t>
       </w:r>
     </w:p>
     <w:p>
@@ -6850,54 +6722,342 @@
         <w:pStyle w:val="Compact"/>
       </w:pPr>
       <w:r>
-        <w:t xml:space="preserve">O GitHub Actions gera a versão em espanhol a cada publicação.</w:t>
-      </w:r>
-      <w:r>
-        <w:t xml:space="preserve"> </w:t>
-      </w:r>
-      <w:r>
         <w:rPr>
           <w:bCs/>
           <w:b/>
         </w:rPr>
-        <w:t xml:space="preserve">Ao mudar um texto em português</w:t>
-      </w:r>
-      <w:r>
-        <w:t xml:space="preserve">, rode</w:t>
-      </w:r>
-      <w:r>
-        <w:t xml:space="preserve"> </w:t>
-      </w:r>
-      <w:r>
-        <w:rPr>
-          <w:rStyle w:val="VerbatimChar"/>
-        </w:rPr>
-        <w:t xml:space="preserve">node i18n/ferramenta.js gerar</w:t>
-      </w:r>
-      <w:r>
-        <w:t xml:space="preserve">: o que ficar sem tradução aparece em</w:t>
-      </w:r>
-      <w:r>
-        <w:t xml:space="preserve"> </w:t>
-      </w:r>
-      <w:r>
-        <w:rPr>
-          <w:rStyle w:val="VerbatimChar"/>
-        </w:rPr>
-        <w:t xml:space="preserve">i18n/pendentes.json</w:t>
-      </w:r>
-      <w:r>
-        <w:t xml:space="preserve"> </w:t>
-      </w:r>
-      <w:r>
-        <w:t xml:space="preserve">(e no site, em português) até ser acrescentado ao catálogo.</w:t>
+        <w:t xml:space="preserve">Como citar:</w:t>
+      </w:r>
+      <w:r>
+        <w:t xml:space="preserve"> </w:t>
+      </w:r>
+      <w:r>
+        <w:t xml:space="preserve">janela com as referências em ABNT (com data de acesso do dia), APA e BibTeX e botão de copiar; os mesmos formatos na seção “Licença e citação” da página Sobre. No repositório,</w:t>
+      </w:r>
+      <w:r>
+        <w:t xml:space="preserve"> </w:t>
+      </w:r>
+      <w:r>
+        <w:rPr>
+          <w:rStyle w:val="VerbatimChar"/>
+        </w:rPr>
+        <w:t xml:space="preserve">CITATION.cff</w:t>
+      </w:r>
+      <w:r>
+        <w:t xml:space="preserve"> </w:t>
+      </w:r>
+      <w:r>
+        <w:t xml:space="preserve">(botão “Cite this repository” do GitHub) e</w:t>
+      </w:r>
+      <w:r>
+        <w:t xml:space="preserve"> </w:t>
+      </w:r>
+      <w:r>
+        <w:rPr>
+          <w:rStyle w:val="VerbatimChar"/>
+        </w:rPr>
+        <w:t xml:space="preserve">.zenodo.json</w:t>
+      </w:r>
+      <w:r>
+        <w:t xml:space="preserve"> </w:t>
+      </w:r>
+      <w:r>
+        <w:t xml:space="preserve">(metadados para o arquivamento no Zenodo, que gera o DOI).</w:t>
+      </w:r>
+    </w:p>
+    <w:bookmarkEnd w:id="43"/>
+    <w:bookmarkStart w:id="44" w:name="Xe2536c815164416847d5f5b617d6e05abe31b59"/>
+    <w:p>
+      <w:pPr>
+        <w:pStyle w:val="Heading3"/>
+      </w:pPr>
+      <w:r>
+        <w:t xml:space="preserve">7.4 Versão em espanhol</w:t>
       </w:r>
     </w:p>
     <w:p>
       <w:pPr>
         <w:numPr>
           <w:ilvl w:val="0"/>
-          <w:numId w:val="1007"/>
+          <w:numId w:val="1008"/>
+        </w:numPr>
+        <w:pStyle w:val="Compact"/>
+      </w:pPr>
+      <w:r>
+        <w:t xml:space="preserve">Endereços:</w:t>
+      </w:r>
+      <w:r>
+        <w:t xml:space="preserve"> </w:t>
+      </w:r>
+      <w:r>
+        <w:rPr>
+          <w:rStyle w:val="VerbatimChar"/>
+        </w:rPr>
+        <w:t xml:space="preserve">/es/</w:t>
+      </w:r>
+      <w:r>
+        <w:t xml:space="preserve">,</w:t>
+      </w:r>
+      <w:r>
+        <w:t xml:space="preserve"> </w:t>
+      </w:r>
+      <w:r>
+        <w:rPr>
+          <w:rStyle w:val="VerbatimChar"/>
+        </w:rPr>
+        <w:t xml:space="preserve">/es/base/</w:t>
+      </w:r>
+      <w:r>
+        <w:t xml:space="preserve"> </w:t>
+      </w:r>
+      <w:r>
+        <w:t xml:space="preserve">e</w:t>
+      </w:r>
+      <w:r>
+        <w:t xml:space="preserve"> </w:t>
+      </w:r>
+      <w:r>
+        <w:rPr>
+          <w:rStyle w:val="VerbatimChar"/>
+        </w:rPr>
+        <w:t xml:space="preserve">/es/sobre/</w:t>
+      </w:r>
+      <w:r>
+        <w:t xml:space="preserve">; o link “Español”/“Português” no menu troca de idioma (na base, mantendo aba e filtros).</w:t>
+      </w:r>
+    </w:p>
+    <w:p>
+      <w:pPr>
+        <w:numPr>
+          <w:ilvl w:val="0"/>
+          <w:numId w:val="1008"/>
+        </w:numPr>
+        <w:pStyle w:val="Compact"/>
+      </w:pPr>
+      <w:r>
+        <w:rPr>
+          <w:bCs/>
+          <w:b/>
+        </w:rPr>
+        <w:t xml:space="preserve">Como é gerada.</w:t>
+      </w:r>
+      <w:r>
+        <w:t xml:space="preserve"> </w:t>
+      </w:r>
+      <w:r>
+        <w:t xml:space="preserve">O português continua sendo o original.</w:t>
+      </w:r>
+      <w:r>
+        <w:t xml:space="preserve"> </w:t>
+      </w:r>
+      <w:r>
+        <w:rPr>
+          <w:rStyle w:val="VerbatimChar"/>
+        </w:rPr>
+        <w:t xml:space="preserve">i18n/ferramenta.js</w:t>
+      </w:r>
+      <w:r>
+        <w:t xml:space="preserve"> </w:t>
+      </w:r>
+      <w:r>
+        <w:t xml:space="preserve">(Node) lê o JavaScript com o analisador do TypeScript e as páginas HTML, encontra cada trecho de texto e o troca pela tradução do catálogo</w:t>
+      </w:r>
+      <w:r>
+        <w:t xml:space="preserve"> </w:t>
+      </w:r>
+      <w:r>
+        <w:rPr>
+          <w:rStyle w:val="VerbatimChar"/>
+        </w:rPr>
+        <w:t xml:space="preserve">i18n/es.json</w:t>
+      </w:r>
+      <w:r>
+        <w:t xml:space="preserve"> </w:t>
+      </w:r>
+      <w:r>
+        <w:t xml:space="preserve">(pares “texto em português” → “texto em espanhol”, cerca de 1.800). Palavras curtas que em outros arquivos são chaves internas (meses abreviados, “forte”, “baixo”…) são traduzidas só no arquivo certo, por</w:t>
+      </w:r>
+      <w:r>
+        <w:t xml:space="preserve"> </w:t>
+      </w:r>
+      <w:r>
+        <w:rPr>
+          <w:rStyle w:val="VerbatimChar"/>
+        </w:rPr>
+        <w:t xml:space="preserve">i18n/es-contexto.json</w:t>
+      </w:r>
+      <w:r>
+        <w:t xml:space="preserve">. Textos que são iguais nas duas línguas ou não devem ser traduzidos (nomes de organizações, seletores CSS, definições do INDEC já em espanhol) ficam em</w:t>
+      </w:r>
+      <w:r>
+        <w:t xml:space="preserve"> </w:t>
+      </w:r>
+      <w:r>
+        <w:rPr>
+          <w:rStyle w:val="VerbatimChar"/>
+        </w:rPr>
+        <w:t xml:space="preserve">i18n/ignorar.json</w:t>
+      </w:r>
+      <w:r>
+        <w:t xml:space="preserve">.</w:t>
+      </w:r>
+    </w:p>
+    <w:p>
+      <w:pPr>
+        <w:numPr>
+          <w:ilvl w:val="0"/>
+          <w:numId w:val="1008"/>
+        </w:numPr>
+        <w:pStyle w:val="Compact"/>
+      </w:pPr>
+      <w:r>
+        <w:t xml:space="preserve">Saídas geradas (não editar à mão):</w:t>
+      </w:r>
+      <w:r>
+        <w:t xml:space="preserve"> </w:t>
+      </w:r>
+      <w:r>
+        <w:rPr>
+          <w:rStyle w:val="VerbatimChar"/>
+        </w:rPr>
+        <w:t xml:space="preserve">es/index.html</w:t>
+      </w:r>
+      <w:r>
+        <w:t xml:space="preserve">,</w:t>
+      </w:r>
+      <w:r>
+        <w:t xml:space="preserve"> </w:t>
+      </w:r>
+      <w:r>
+        <w:rPr>
+          <w:rStyle w:val="VerbatimChar"/>
+        </w:rPr>
+        <w:t xml:space="preserve">es/base/index.html</w:t>
+      </w:r>
+      <w:r>
+        <w:t xml:space="preserve">,</w:t>
+      </w:r>
+      <w:r>
+        <w:t xml:space="preserve"> </w:t>
+      </w:r>
+      <w:r>
+        <w:rPr>
+          <w:rStyle w:val="VerbatimChar"/>
+        </w:rPr>
+        <w:t xml:space="preserve">es/sobre/index.html</w:t>
+      </w:r>
+      <w:r>
+        <w:t xml:space="preserve"> </w:t>
+      </w:r>
+      <w:r>
+        <w:t xml:space="preserve">e</w:t>
+      </w:r>
+      <w:r>
+        <w:t xml:space="preserve"> </w:t>
+      </w:r>
+      <w:r>
+        <w:rPr>
+          <w:rStyle w:val="VerbatimChar"/>
+        </w:rPr>
+        <w:t xml:space="preserve">assets/js/app-es/*.js</w:t>
+      </w:r>
+      <w:r>
+        <w:t xml:space="preserve">. Rótulos que vêm dos dados (nomes das variáveis, meses, indicadores, acontecimentos) são traduzidos no navegador, logo depois de carregar os JSON (</w:t>
+      </w:r>
+      <w:r>
+        <w:rPr>
+          <w:rStyle w:val="VerbatimChar"/>
+        </w:rPr>
+        <w:t xml:space="preserve">TR_DADOS</w:t>
+      </w:r>
+      <w:r>
+        <w:t xml:space="preserve"> </w:t>
+      </w:r>
+      <w:r>
+        <w:t xml:space="preserve">em</w:t>
+      </w:r>
+      <w:r>
+        <w:t xml:space="preserve"> </w:t>
+      </w:r>
+      <w:r>
+        <w:rPr>
+          <w:rStyle w:val="VerbatimChar"/>
+        </w:rPr>
+        <w:t xml:space="preserve">assets/js/app-es/carregar.js</w:t>
+      </w:r>
+      <w:r>
+        <w:t xml:space="preserve">). Datas e números usam o formato</w:t>
+      </w:r>
+      <w:r>
+        <w:t xml:space="preserve"> </w:t>
+      </w:r>
+      <w:r>
+        <w:rPr>
+          <w:rStyle w:val="VerbatimChar"/>
+        </w:rPr>
+        <w:t xml:space="preserve">es-AR</w:t>
+      </w:r>
+      <w:r>
+        <w:t xml:space="preserve">.</w:t>
+      </w:r>
+    </w:p>
+    <w:p>
+      <w:pPr>
+        <w:numPr>
+          <w:ilvl w:val="0"/>
+          <w:numId w:val="1008"/>
+        </w:numPr>
+        <w:pStyle w:val="Compact"/>
+      </w:pPr>
+      <w:r>
+        <w:t xml:space="preserve">O GitHub Actions gera a versão em espanhol a cada publicação.</w:t>
+      </w:r>
+      <w:r>
+        <w:t xml:space="preserve"> </w:t>
+      </w:r>
+      <w:r>
+        <w:rPr>
+          <w:bCs/>
+          <w:b/>
+        </w:rPr>
+        <w:t xml:space="preserve">Ao mudar um texto em português</w:t>
+      </w:r>
+      <w:r>
+        <w:t xml:space="preserve">, rode</w:t>
+      </w:r>
+      <w:r>
+        <w:t xml:space="preserve"> </w:t>
+      </w:r>
+      <w:r>
+        <w:rPr>
+          <w:rStyle w:val="VerbatimChar"/>
+        </w:rPr>
+        <w:t xml:space="preserve">node i18n/ferramenta.js gerar</w:t>
+      </w:r>
+      <w:r>
+        <w:t xml:space="preserve">: o que ficar sem tradução aparece em</w:t>
+      </w:r>
+      <w:r>
+        <w:t xml:space="preserve"> </w:t>
+      </w:r>
+      <w:r>
+        <w:rPr>
+          <w:rStyle w:val="VerbatimChar"/>
+        </w:rPr>
+        <w:t xml:space="preserve">i18n/pendentes.json</w:t>
+      </w:r>
+      <w:r>
+        <w:t xml:space="preserve"> </w:t>
+      </w:r>
+      <w:r>
+        <w:t xml:space="preserve">(e no site, em português) até ser acrescentado ao catálogo.</w:t>
+      </w:r>
+    </w:p>
+    <w:p>
+      <w:pPr>
+        <w:numPr>
+          <w:ilvl w:val="0"/>
+          <w:numId w:val="1008"/>
         </w:numPr>
         <w:pStyle w:val="Compact"/>
       </w:pPr>
@@ -6912,9 +7072,9 @@
         </w:pict>
       </w:r>
     </w:p>
-    <w:bookmarkEnd w:id="43"/>
     <w:bookmarkEnd w:id="44"/>
-    <w:bookmarkStart w:id="45" w:name="X9a8a5c3f4675aaafcd01bef6e7fb33b3e7de441"/>
+    <w:bookmarkEnd w:id="45"/>
+    <w:bookmarkStart w:id="46" w:name="X9a8a5c3f4675aaafcd01bef6e7fb33b3e7de441"/>
     <w:p>
       <w:pPr>
         <w:pStyle w:val="Heading2"/>
@@ -7365,8 +7525,8 @@
         </w:pict>
       </w:r>
     </w:p>
-    <w:bookmarkEnd w:id="45"/>
-    <w:bookmarkStart w:id="50" w:name="X37a24ddc49ec6a08847d5e7c09b751dfa640a32"/>
+    <w:bookmarkEnd w:id="46"/>
+    <w:bookmarkStart w:id="51" w:name="X37a24ddc49ec6a08847d5e7c09b751dfa640a32"/>
     <w:p>
       <w:pPr>
         <w:pStyle w:val="Heading2"/>
@@ -7383,251 +7543,13 @@
         <w:t xml:space="preserve">Datas no fuso de São Paulo. Os códigos entre colchetes são os commits do repositório.</w:t>
       </w:r>
     </w:p>
-    <w:bookmarkStart w:id="46" w:name="Xb374f4671a78533177f9e41d94caa4dc6b2e1e1"/>
+    <w:bookmarkStart w:id="47" w:name="Xb374f4671a78533177f9e41d94caa4dc6b2e1e1"/>
     <w:p>
       <w:pPr>
         <w:pStyle w:val="Heading3"/>
       </w:pPr>
       <w:r>
         <w:t xml:space="preserve">18/10/2026</w:t>
-      </w:r>
-    </w:p>
-    <w:p>
-      <w:pPr>
-        <w:numPr>
-          <w:ilvl w:val="0"/>
-          <w:numId w:val="1008"/>
-        </w:numPr>
-        <w:pStyle w:val="Compact"/>
-      </w:pPr>
-      <w:r>
-        <w:rPr>
-          <w:bCs/>
-          <w:b/>
-        </w:rPr>
-        <w:t xml:space="preserve">Primeira versão do site</w:t>
-      </w:r>
-      <w:r>
-        <w:t xml:space="preserve"> </w:t>
-      </w:r>
-      <w:r>
-        <w:t xml:space="preserve">e base interativa 2024 publicadas no GitHub Pages [bf1632d, 5c440c7].</w:t>
-      </w:r>
-    </w:p>
-    <w:p>
-      <w:pPr>
-        <w:numPr>
-          <w:ilvl w:val="0"/>
-          <w:numId w:val="1008"/>
-        </w:numPr>
-        <w:pStyle w:val="Compact"/>
-      </w:pPr>
-      <w:r>
-        <w:t xml:space="preserve">Navegação por endereço (</w:t>
-      </w:r>
-      <w:r>
-        <w:rPr>
-          <w:rStyle w:val="VerbatimChar"/>
-        </w:rPr>
-        <w:t xml:space="preserve">#mapa</w:t>
-      </w:r>
-      <w:r>
-        <w:t xml:space="preserve">,</w:t>
-      </w:r>
-      <w:r>
-        <w:t xml:space="preserve"> </w:t>
-      </w:r>
-      <w:r>
-        <w:rPr>
-          <w:rStyle w:val="VerbatimChar"/>
-        </w:rPr>
-        <w:t xml:space="preserve">#tempo</w:t>
-      </w:r>
-      <w:r>
-        <w:t xml:space="preserve">), zoom e arraste nos mapas; README com metodologia e fontes [c1a0ced, 3f2981b].</w:t>
-      </w:r>
-    </w:p>
-    <w:p>
-      <w:pPr>
-        <w:numPr>
-          <w:ilvl w:val="0"/>
-          <w:numId w:val="1008"/>
-        </w:numPr>
-        <w:pStyle w:val="Compact"/>
-      </w:pPr>
-      <w:r>
-        <w:rPr>
-          <w:bCs/>
-          <w:b/>
-        </w:rPr>
-        <w:t xml:space="preserve">Pipeline em Python</w:t>
-      </w:r>
-      <w:r>
-        <w:t xml:space="preserve">, código modular, dados abertos e GeoPackage para QGIS; publicação automática pelo GitHub Actions com verificação de privacidade [a33414f, cc7cd3c].</w:t>
-      </w:r>
-    </w:p>
-    <w:p>
-      <w:pPr>
-        <w:numPr>
-          <w:ilvl w:val="0"/>
-          <w:numId w:val="1008"/>
-        </w:numPr>
-        <w:pStyle w:val="Compact"/>
-      </w:pPr>
-      <w:r>
-        <w:t xml:space="preserve">Identidade argentina, gráficos especializados e primeiros indicadores oficiais (população, EPH, homicídios) [968ee5c].</w:t>
-      </w:r>
-    </w:p>
-    <w:p>
-      <w:pPr>
-        <w:numPr>
-          <w:ilvl w:val="0"/>
-          <w:numId w:val="1008"/>
-        </w:numPr>
-        <w:pStyle w:val="Compact"/>
-      </w:pPr>
-      <w:r>
-        <w:rPr>
-          <w:bCs/>
-          <w:b/>
-        </w:rPr>
-        <w:t xml:space="preserve">28 indicadores do Censo 2022 por departamento</w:t>
-      </w:r>
-      <w:r>
-        <w:t xml:space="preserve"> </w:t>
-      </w:r>
-      <w:r>
-        <w:t xml:space="preserve">(Geoportal do INDEC) e taxas por departamento [9c2705c].</w:t>
-      </w:r>
-    </w:p>
-    <w:p>
-      <w:pPr>
-        <w:numPr>
-          <w:ilvl w:val="0"/>
-          <w:numId w:val="1008"/>
-        </w:numPr>
-        <w:pStyle w:val="Compact"/>
-      </w:pPr>
-      <w:r>
-        <w:t xml:space="preserve">Nova identidade visual com fundo branco e marcha desenhada; tipografia Urbanist [ee5db14, 504893c].</w:t>
-      </w:r>
-    </w:p>
-    <w:p>
-      <w:pPr>
-        <w:numPr>
-          <w:ilvl w:val="0"/>
-          <w:numId w:val="1008"/>
-        </w:numPr>
-        <w:pStyle w:val="Compact"/>
-      </w:pPr>
-      <w:r>
-        <w:t xml:space="preserve">Novas análises: associação (resíduos), Comparar, ACM, mapa bivariado, LISA, série semanal com acontecimentos, comunidades, Imprensa, Fichas e links do recorte [3e910b0].</w:t>
-      </w:r>
-    </w:p>
-    <w:p>
-      <w:pPr>
-        <w:numPr>
-          <w:ilvl w:val="0"/>
-          <w:numId w:val="1008"/>
-        </w:numPr>
-        <w:pStyle w:val="Compact"/>
-      </w:pPr>
-      <w:r>
-        <w:t xml:space="preserve">Guias “Como ler”, exemplos, leituras automáticas, topônimos que mudam com o zoom e ficha em formato de prancha [88a2c6e, c896e9e].</w:t>
-      </w:r>
-    </w:p>
-    <w:p>
-      <w:pPr>
-        <w:numPr>
-          <w:ilvl w:val="0"/>
-          <w:numId w:val="1008"/>
-        </w:numPr>
-        <w:pStyle w:val="Compact"/>
-      </w:pPr>
-      <w:r>
-        <w:t xml:space="preserve">Mapa navegável mundial, destaques por população (Poisson), combinações prontas em todas as abas, glossário [f80c8bd].</w:t>
-      </w:r>
-    </w:p>
-    <w:p>
-      <w:pPr>
-        <w:numPr>
-          <w:ilvl w:val="0"/>
-          <w:numId w:val="1008"/>
-        </w:numPr>
-        <w:pStyle w:val="Compact"/>
-      </w:pPr>
-      <w:r>
-        <w:rPr>
-          <w:bCs/>
-          <w:b/>
-        </w:rPr>
-        <w:t xml:space="preserve">Título DATALUTA</w:t>
-      </w:r>
-      <w:r>
-        <w:t xml:space="preserve">, revisão dos textos e troca do mapa base (CARTO exigia chave; passou a Esri/OSM) [81c0a67].</w:t>
-      </w:r>
-    </w:p>
-    <w:p>
-      <w:pPr>
-        <w:numPr>
-          <w:ilvl w:val="0"/>
-          <w:numId w:val="1008"/>
-        </w:numPr>
-        <w:pStyle w:val="Compact"/>
-      </w:pPr>
-      <w:r>
-        <w:t xml:space="preserve">Título com</w:t>
-      </w:r>
-      <w:r>
-        <w:t xml:space="preserve"> </w:t>
-      </w:r>
-      <w:r>
-        <w:rPr>
-          <w:bCs/>
-          <w:b/>
-        </w:rPr>
-        <w:t xml:space="preserve">Argentina 2024</w:t>
-      </w:r>
-      <w:r>
-        <w:t xml:space="preserve">,</w:t>
-      </w:r>
-      <w:r>
-        <w:t xml:space="preserve"> </w:t>
-      </w:r>
-      <w:r>
-        <w:rPr>
-          <w:bCs/>
-          <w:b/>
-        </w:rPr>
-        <w:t xml:space="preserve">aba Síntese</w:t>
-      </w:r>
-      <w:r>
-        <w:t xml:space="preserve"> </w:t>
-      </w:r>
-      <w:r>
-        <w:t xml:space="preserve">e novas combinações prontas [ec307a2].</w:t>
-      </w:r>
-    </w:p>
-    <w:p>
-      <w:pPr>
-        <w:numPr>
-          <w:ilvl w:val="0"/>
-          <w:numId w:val="1008"/>
-        </w:numPr>
-        <w:pStyle w:val="Compact"/>
-      </w:pPr>
-      <w:r>
-        <w:t xml:space="preserve">Síntese: explicação passo a passo do resíduo ajustado, régua de leitura e combinações raras [2ee97ab].</w:t>
-      </w:r>
-    </w:p>
-    <w:bookmarkEnd w:id="46"/>
-    <w:bookmarkStart w:id="47" w:name="Xfda8f6a74ee01990937dc6b5f77dee589813531"/>
-    <w:p>
-      <w:pPr>
-        <w:pStyle w:val="Heading3"/>
-      </w:pPr>
-      <w:r>
-        <w:t xml:space="preserve">19/10/2026</w:t>
       </w:r>
     </w:p>
     <w:p>
@@ -7643,13 +7565,13 @@
           <w:bCs/>
           <w:b/>
         </w:rPr>
-        <w:t xml:space="preserve">Contexto ligado às lutas:</w:t>
-      </w:r>
-      <w:r>
-        <w:t xml:space="preserve"> </w:t>
-      </w:r>
-      <w:r>
-        <w:t xml:space="preserve">entram RENABAP, ReNaTEP, voto presidencial de 2023 e femicídios; indicadores separados em “ligados às lutas” e “controles” [6f0fe22].</w:t>
+        <w:t xml:space="preserve">Primeira versão do site</w:t>
+      </w:r>
+      <w:r>
+        <w:t xml:space="preserve"> </w:t>
+      </w:r>
+      <w:r>
+        <w:t xml:space="preserve">e base interativa 2024 publicadas no GitHub Pages [bf1632d, 5c440c7].</w:t>
       </w:r>
     </w:p>
     <w:p>
@@ -7661,30 +7583,28 @@
         <w:pStyle w:val="Compact"/>
       </w:pPr>
       <w:r>
-        <w:rPr>
-          <w:bCs/>
-          <w:b/>
-        </w:rPr>
-        <w:t xml:space="preserve">Indicadores sem ligação com as lutas retirados do site</w:t>
-      </w:r>
-      <w:r>
-        <w:t xml:space="preserve">; El Cuy deixado vazio no RENABAP; painel do mapa reorganizado em três blocos; quadro “Como foi calculado este mapa”; cálculo da tendência explicado no Contexto;</w:t>
-      </w:r>
-      <w:r>
-        <w:t xml:space="preserve"> </w:t>
-      </w:r>
-      <w:r>
-        <w:rPr>
-          <w:bCs/>
-          <w:b/>
-        </w:rPr>
-        <w:t xml:space="preserve">leitura em três partes para as 139 combinações prontas</w:t>
-      </w:r>
-      <w:r>
-        <w:t xml:space="preserve"> </w:t>
-      </w:r>
-      <w:r>
-        <w:t xml:space="preserve">[5839d6f].</w:t>
+        <w:t xml:space="preserve">Navegação por endereço (</w:t>
+      </w:r>
+      <w:r>
+        <w:rPr>
+          <w:rStyle w:val="VerbatimChar"/>
+        </w:rPr>
+        <w:t xml:space="preserve">#mapa</w:t>
+      </w:r>
+      <w:r>
+        <w:t xml:space="preserve">,</w:t>
+      </w:r>
+      <w:r>
+        <w:t xml:space="preserve"> </w:t>
+      </w:r>
+      <w:r>
+        <w:rPr>
+          <w:rStyle w:val="VerbatimChar"/>
+        </w:rPr>
+        <w:t xml:space="preserve">#tempo</w:t>
+      </w:r>
+      <w:r>
+        <w:t xml:space="preserve">), zoom e arraste nos mapas; README com metodologia e fontes [c1a0ced, 3f2981b].</w:t>
       </w:r>
     </w:p>
     <w:p>
@@ -7696,19 +7616,14 @@
         <w:pStyle w:val="Compact"/>
       </w:pPr>
       <w:r>
-        <w:t xml:space="preserve">Criado este documento de processo e o roteiro</w:t>
-      </w:r>
-      <w:r>
-        <w:t xml:space="preserve"> </w:t>
-      </w:r>
-      <w:r>
-        <w:rPr>
-          <w:rStyle w:val="VerbatimChar"/>
-        </w:rPr>
-        <w:t xml:space="preserve">pipeline/reconstruir.sh</w:t>
-      </w:r>
-      <w:r>
-        <w:t xml:space="preserve">.</w:t>
+        <w:rPr>
+          <w:bCs/>
+          <w:b/>
+        </w:rPr>
+        <w:t xml:space="preserve">Pipeline em Python</w:t>
+      </w:r>
+      <w:r>
+        <w:t xml:space="preserve">, código modular, dados abertos e GeoPackage para QGIS; publicação automática pelo GitHub Actions com verificação de privacidade [a33414f, cc7cd3c].</w:t>
       </w:r>
     </w:p>
     <w:p>
@@ -7720,53 +7635,7 @@
         <w:pStyle w:val="Compact"/>
       </w:pPr>
       <w:r>
-        <w:rPr>
-          <w:bCs/>
-          <w:b/>
-        </w:rPr>
-        <w:t xml:space="preserve">Licenças definidas:</w:t>
-      </w:r>
-      <w:r>
-        <w:t xml:space="preserve"> </w:t>
-      </w:r>
-      <w:r>
-        <w:t xml:space="preserve">base de dados sob CC BY 4.0 (arquivo</w:t>
-      </w:r>
-      <w:r>
-        <w:t xml:space="preserve"> </w:t>
-      </w:r>
-      <w:r>
-        <w:rPr>
-          <w:rStyle w:val="VerbatimChar"/>
-        </w:rPr>
-        <w:t xml:space="preserve">LICENSE</w:t>
-      </w:r>
-      <w:r>
-        <w:t xml:space="preserve">, que o GitHub reconhece) e código sob MIT (</w:t>
-      </w:r>
-      <w:r>
-        <w:rPr>
-          <w:rStyle w:val="VerbatimChar"/>
-        </w:rPr>
-        <w:t xml:space="preserve">LICENCA-CODIGO</w:t>
-      </w:r>
-      <w:r>
-        <w:t xml:space="preserve">);</w:t>
-      </w:r>
-      <w:r>
-        <w:t xml:space="preserve"> </w:t>
-      </w:r>
-      <w:r>
-        <w:rPr>
-          <w:rStyle w:val="VerbatimChar"/>
-        </w:rPr>
-        <w:t xml:space="preserve">LICENCAS.md</w:t>
-      </w:r>
-      <w:r>
-        <w:t xml:space="preserve"> </w:t>
-      </w:r>
-      <w:r>
-        <w:t xml:space="preserve">explica o que cada uma cobre, lista as condições dos dados de terceiros e traz a forma de citar; rodapés do site e README atualizados. Motivo: sem licença, ninguém tinha permissão formal de reutilizar a base; a CC BY 4.0 é o padrão em dados científicos abertos, garante o crédito e é compatível com o GeoNames e o datos.gob.ar.</w:t>
+        <w:t xml:space="preserve">Identidade argentina, gráficos especializados e primeiros indicadores oficiais (população, EPH, homicídios) [968ee5c].</w:t>
       </w:r>
     </w:p>
     <w:p>
@@ -7782,37 +7651,13 @@
           <w:bCs/>
           <w:b/>
         </w:rPr>
-        <w:t xml:space="preserve">Versão em Word do documento de processo</w:t>
-      </w:r>
-      <w:r>
-        <w:t xml:space="preserve"> </w:t>
-      </w:r>
-      <w:r>
-        <w:t xml:space="preserve">(</w:t>
-      </w:r>
-      <w:r>
-        <w:rPr>
-          <w:rStyle w:val="VerbatimChar"/>
-        </w:rPr>
-        <w:t xml:space="preserve">PROCESSO.docx</w:t>
-      </w:r>
-      <w:r>
-        <w:t xml:space="preserve">), gerada a partir deste arquivo por</w:t>
-      </w:r>
-      <w:r>
-        <w:t xml:space="preserve"> </w:t>
-      </w:r>
-      <w:r>
-        <w:rPr>
-          <w:rStyle w:val="VerbatimChar"/>
-        </w:rPr>
-        <w:t xml:space="preserve">pipeline/gerar_processo_docx.py</w:t>
-      </w:r>
-      <w:r>
-        <w:t xml:space="preserve"> </w:t>
-      </w:r>
-      <w:r>
-        <w:t xml:space="preserve">(pandoc + python-docx), para circular no grupo.</w:t>
+        <w:t xml:space="preserve">28 indicadores do Censo 2022 por departamento</w:t>
+      </w:r>
+      <w:r>
+        <w:t xml:space="preserve"> </w:t>
+      </w:r>
+      <w:r>
+        <w:t xml:space="preserve">(Geoportal do INDEC) e taxas por departamento [9c2705c].</w:t>
       </w:r>
     </w:p>
     <w:p>
@@ -7824,17 +7669,74 @@
         <w:pStyle w:val="Compact"/>
       </w:pPr>
       <w:r>
+        <w:t xml:space="preserve">Nova identidade visual com fundo branco e marcha desenhada; tipografia Urbanist [ee5db14, 504893c].</w:t>
+      </w:r>
+    </w:p>
+    <w:p>
+      <w:pPr>
+        <w:numPr>
+          <w:ilvl w:val="0"/>
+          <w:numId w:val="1009"/>
+        </w:numPr>
+        <w:pStyle w:val="Compact"/>
+      </w:pPr>
+      <w:r>
+        <w:t xml:space="preserve">Novas análises: associação (resíduos), Comparar, ACM, mapa bivariado, LISA, série semanal com acontecimentos, comunidades, Imprensa, Fichas e links do recorte [3e910b0].</w:t>
+      </w:r>
+    </w:p>
+    <w:p>
+      <w:pPr>
+        <w:numPr>
+          <w:ilvl w:val="0"/>
+          <w:numId w:val="1009"/>
+        </w:numPr>
+        <w:pStyle w:val="Compact"/>
+      </w:pPr>
+      <w:r>
+        <w:t xml:space="preserve">Guias “Como ler”, exemplos, leituras automáticas, topônimos que mudam com o zoom e ficha em formato de prancha [88a2c6e, c896e9e].</w:t>
+      </w:r>
+    </w:p>
+    <w:p>
+      <w:pPr>
+        <w:numPr>
+          <w:ilvl w:val="0"/>
+          <w:numId w:val="1009"/>
+        </w:numPr>
+        <w:pStyle w:val="Compact"/>
+      </w:pPr>
+      <w:r>
+        <w:t xml:space="preserve">Mapa navegável mundial, destaques por população (Poisson), combinações prontas em todas as abas, glossário [f80c8bd].</w:t>
+      </w:r>
+    </w:p>
+    <w:p>
+      <w:pPr>
+        <w:numPr>
+          <w:ilvl w:val="0"/>
+          <w:numId w:val="1009"/>
+        </w:numPr>
+        <w:pStyle w:val="Compact"/>
+      </w:pPr>
+      <w:r>
         <w:rPr>
           <w:bCs/>
           <w:b/>
         </w:rPr>
-        <w:t xml:space="preserve">LISA explicado passo a passo</w:t>
-      </w:r>
-      <w:r>
-        <w:t xml:space="preserve"> </w:t>
-      </w:r>
-      <w:r>
-        <w:t xml:space="preserve">no quadro “Como foi calculado este mapa” (abre sozinho na primeira vez), com exemplo numérico de um ponto quente e de um ponto frio, lista dos departamentos, I global e cuidados; dica do mapa mostra z, média dos vizinhos e I local; glossário e guia ampliados. O teste de permutação passou a sortear os vizinhos</w:t>
+        <w:t xml:space="preserve">Título DATALUTA</w:t>
+      </w:r>
+      <w:r>
+        <w:t xml:space="preserve">, revisão dos textos e troca do mapa base (CARTO exigia chave; passou a Esri/OSM) [81c0a67].</w:t>
+      </w:r>
+    </w:p>
+    <w:p>
+      <w:pPr>
+        <w:numPr>
+          <w:ilvl w:val="0"/>
+          <w:numId w:val="1009"/>
+        </w:numPr>
+        <w:pStyle w:val="Compact"/>
+      </w:pPr>
+      <w:r>
+        <w:t xml:space="preserve">Título com</w:t>
       </w:r>
       <w:r>
         <w:t xml:space="preserve"> </w:t>
@@ -7844,23 +7746,48 @@
           <w:bCs/>
           <w:b/>
         </w:rPr>
-        <w:t xml:space="preserve">sem reposição</w:t>
-      </w:r>
-      <w:r>
-        <w:t xml:space="preserve"> </w:t>
-      </w:r>
-      <w:r>
-        <w:t xml:space="preserve">(permutação condicional, como no GeoDa); antes sorteava com reposição. Motivo: pedido de deixar claro como o LISA é calculado.</w:t>
+        <w:t xml:space="preserve">Argentina 2024</w:t>
+      </w:r>
+      <w:r>
+        <w:t xml:space="preserve">,</w:t>
+      </w:r>
+      <w:r>
+        <w:t xml:space="preserve"> </w:t>
+      </w:r>
+      <w:r>
+        <w:rPr>
+          <w:bCs/>
+          <w:b/>
+        </w:rPr>
+        <w:t xml:space="preserve">aba Síntese</w:t>
+      </w:r>
+      <w:r>
+        <w:t xml:space="preserve"> </w:t>
+      </w:r>
+      <w:r>
+        <w:t xml:space="preserve">e novas combinações prontas [ec307a2].</w:t>
+      </w:r>
+    </w:p>
+    <w:p>
+      <w:pPr>
+        <w:numPr>
+          <w:ilvl w:val="0"/>
+          <w:numId w:val="1009"/>
+        </w:numPr>
+        <w:pStyle w:val="Compact"/>
+      </w:pPr>
+      <w:r>
+        <w:t xml:space="preserve">Síntese: explicação passo a passo do resíduo ajustado, régua de leitura e combinações raras [2ee97ab].</w:t>
       </w:r>
     </w:p>
     <w:bookmarkEnd w:id="47"/>
-    <w:bookmarkStart w:id="48" w:name="X0243e2acffdb3298bb3301518b805b778538cf8"/>
+    <w:bookmarkStart w:id="48" w:name="Xfda8f6a74ee01990937dc6b5f77dee589813531"/>
     <w:p>
       <w:pPr>
         <w:pStyle w:val="Heading3"/>
       </w:pPr>
       <w:r>
-        <w:t xml:space="preserve">28/10/2026</w:t>
+        <w:t xml:space="preserve">19/10/2026</w:t>
       </w:r>
     </w:p>
     <w:p>
@@ -7876,23 +7803,224 @@
           <w:bCs/>
           <w:b/>
         </w:rPr>
-        <w:t xml:space="preserve">Fichas:</w:t>
-      </w:r>
-      <w:r>
-        <w:t xml:space="preserve"> </w:t>
-      </w:r>
-      <w:r>
-        <w:t xml:space="preserve">a escolha passou a ser uma lista fechada só com as categorias do tipo de ficha escolhido (por exemplo, só objetivos), com o número de notícias, e um campo para filtrar a lista. Motivo: o campo de texto anterior, com sugestões, deixava o navegador misturar valores digitados antes em outros tipos de ficha (nomes de movimentos, províncias).</w:t>
+        <w:t xml:space="preserve">Contexto ligado às lutas:</w:t>
+      </w:r>
+      <w:r>
+        <w:t xml:space="preserve"> </w:t>
+      </w:r>
+      <w:r>
+        <w:t xml:space="preserve">entram RENABAP, ReNaTEP, voto presidencial de 2023 e femicídios; indicadores separados em “ligados às lutas” e “controles” [6f0fe22].</w:t>
+      </w:r>
+    </w:p>
+    <w:p>
+      <w:pPr>
+        <w:numPr>
+          <w:ilvl w:val="0"/>
+          <w:numId w:val="1010"/>
+        </w:numPr>
+        <w:pStyle w:val="Compact"/>
+      </w:pPr>
+      <w:r>
+        <w:rPr>
+          <w:bCs/>
+          <w:b/>
+        </w:rPr>
+        <w:t xml:space="preserve">Indicadores sem ligação com as lutas retirados do site</w:t>
+      </w:r>
+      <w:r>
+        <w:t xml:space="preserve">; El Cuy deixado vazio no RENABAP; painel do mapa reorganizado em três blocos; quadro “Como foi calculado este mapa”; cálculo da tendência explicado no Contexto;</w:t>
+      </w:r>
+      <w:r>
+        <w:t xml:space="preserve"> </w:t>
+      </w:r>
+      <w:r>
+        <w:rPr>
+          <w:bCs/>
+          <w:b/>
+        </w:rPr>
+        <w:t xml:space="preserve">leitura em três partes para as 139 combinações prontas</w:t>
+      </w:r>
+      <w:r>
+        <w:t xml:space="preserve"> </w:t>
+      </w:r>
+      <w:r>
+        <w:t xml:space="preserve">[5839d6f].</w:t>
+      </w:r>
+    </w:p>
+    <w:p>
+      <w:pPr>
+        <w:numPr>
+          <w:ilvl w:val="0"/>
+          <w:numId w:val="1010"/>
+        </w:numPr>
+        <w:pStyle w:val="Compact"/>
+      </w:pPr>
+      <w:r>
+        <w:t xml:space="preserve">Criado este documento de processo e o roteiro</w:t>
+      </w:r>
+      <w:r>
+        <w:t xml:space="preserve"> </w:t>
+      </w:r>
+      <w:r>
+        <w:rPr>
+          <w:rStyle w:val="VerbatimChar"/>
+        </w:rPr>
+        <w:t xml:space="preserve">pipeline/reconstruir.sh</w:t>
+      </w:r>
+      <w:r>
+        <w:t xml:space="preserve">.</w:t>
+      </w:r>
+    </w:p>
+    <w:p>
+      <w:pPr>
+        <w:numPr>
+          <w:ilvl w:val="0"/>
+          <w:numId w:val="1010"/>
+        </w:numPr>
+        <w:pStyle w:val="Compact"/>
+      </w:pPr>
+      <w:r>
+        <w:rPr>
+          <w:bCs/>
+          <w:b/>
+        </w:rPr>
+        <w:t xml:space="preserve">Licenças definidas:</w:t>
+      </w:r>
+      <w:r>
+        <w:t xml:space="preserve"> </w:t>
+      </w:r>
+      <w:r>
+        <w:t xml:space="preserve">base de dados sob CC BY 4.0 (arquivo</w:t>
+      </w:r>
+      <w:r>
+        <w:t xml:space="preserve"> </w:t>
+      </w:r>
+      <w:r>
+        <w:rPr>
+          <w:rStyle w:val="VerbatimChar"/>
+        </w:rPr>
+        <w:t xml:space="preserve">LICENSE</w:t>
+      </w:r>
+      <w:r>
+        <w:t xml:space="preserve">, que o GitHub reconhece) e código sob MIT (</w:t>
+      </w:r>
+      <w:r>
+        <w:rPr>
+          <w:rStyle w:val="VerbatimChar"/>
+        </w:rPr>
+        <w:t xml:space="preserve">LICENCA-CODIGO</w:t>
+      </w:r>
+      <w:r>
+        <w:t xml:space="preserve">);</w:t>
+      </w:r>
+      <w:r>
+        <w:t xml:space="preserve"> </w:t>
+      </w:r>
+      <w:r>
+        <w:rPr>
+          <w:rStyle w:val="VerbatimChar"/>
+        </w:rPr>
+        <w:t xml:space="preserve">LICENCAS.md</w:t>
+      </w:r>
+      <w:r>
+        <w:t xml:space="preserve"> </w:t>
+      </w:r>
+      <w:r>
+        <w:t xml:space="preserve">explica o que cada uma cobre, lista as condições dos dados de terceiros e traz a forma de citar; rodapés do site e README atualizados. Motivo: sem licença, ninguém tinha permissão formal de reutilizar a base; a CC BY 4.0 é o padrão em dados científicos abertos, garante o crédito e é compatível com o GeoNames e o datos.gob.ar.</w:t>
+      </w:r>
+    </w:p>
+    <w:p>
+      <w:pPr>
+        <w:numPr>
+          <w:ilvl w:val="0"/>
+          <w:numId w:val="1010"/>
+        </w:numPr>
+        <w:pStyle w:val="Compact"/>
+      </w:pPr>
+      <w:r>
+        <w:rPr>
+          <w:bCs/>
+          <w:b/>
+        </w:rPr>
+        <w:t xml:space="preserve">Versão em Word do documento de processo</w:t>
+      </w:r>
+      <w:r>
+        <w:t xml:space="preserve"> </w:t>
+      </w:r>
+      <w:r>
+        <w:t xml:space="preserve">(</w:t>
+      </w:r>
+      <w:r>
+        <w:rPr>
+          <w:rStyle w:val="VerbatimChar"/>
+        </w:rPr>
+        <w:t xml:space="preserve">PROCESSO.docx</w:t>
+      </w:r>
+      <w:r>
+        <w:t xml:space="preserve">), gerada a partir deste arquivo por</w:t>
+      </w:r>
+      <w:r>
+        <w:t xml:space="preserve"> </w:t>
+      </w:r>
+      <w:r>
+        <w:rPr>
+          <w:rStyle w:val="VerbatimChar"/>
+        </w:rPr>
+        <w:t xml:space="preserve">pipeline/gerar_processo_docx.py</w:t>
+      </w:r>
+      <w:r>
+        <w:t xml:space="preserve"> </w:t>
+      </w:r>
+      <w:r>
+        <w:t xml:space="preserve">(pandoc + python-docx), para circular no grupo.</w:t>
+      </w:r>
+    </w:p>
+    <w:p>
+      <w:pPr>
+        <w:numPr>
+          <w:ilvl w:val="0"/>
+          <w:numId w:val="1010"/>
+        </w:numPr>
+        <w:pStyle w:val="Compact"/>
+      </w:pPr>
+      <w:r>
+        <w:rPr>
+          <w:bCs/>
+          <w:b/>
+        </w:rPr>
+        <w:t xml:space="preserve">LISA explicado passo a passo</w:t>
+      </w:r>
+      <w:r>
+        <w:t xml:space="preserve"> </w:t>
+      </w:r>
+      <w:r>
+        <w:t xml:space="preserve">no quadro “Como foi calculado este mapa” (abre sozinho na primeira vez), com exemplo numérico de um ponto quente e de um ponto frio, lista dos departamentos, I global e cuidados; dica do mapa mostra z, média dos vizinhos e I local; glossário e guia ampliados. O teste de permutação passou a sortear os vizinhos</w:t>
+      </w:r>
+      <w:r>
+        <w:t xml:space="preserve"> </w:t>
+      </w:r>
+      <w:r>
+        <w:rPr>
+          <w:bCs/>
+          <w:b/>
+        </w:rPr>
+        <w:t xml:space="preserve">sem reposição</w:t>
+      </w:r>
+      <w:r>
+        <w:t xml:space="preserve"> </w:t>
+      </w:r>
+      <w:r>
+        <w:t xml:space="preserve">(permutação condicional, como no GeoDa); antes sorteava com reposição. Motivo: pedido de deixar claro como o LISA é calculado.</w:t>
       </w:r>
     </w:p>
     <w:bookmarkEnd w:id="48"/>
-    <w:bookmarkStart w:id="49" w:name="X6d16d1d1dfee84c5325917dbbdeb1135ee226ab"/>
+    <w:bookmarkStart w:id="49" w:name="X0243e2acffdb3298bb3301518b805b778538cf8"/>
     <w:p>
       <w:pPr>
         <w:pStyle w:val="Heading3"/>
       </w:pPr>
       <w:r>
-        <w:t xml:space="preserve">30/10/2026</w:t>
+        <w:t xml:space="preserve">28/10/2026</w:t>
       </w:r>
     </w:p>
     <w:p>
@@ -7908,474 +8036,23 @@
           <w:bCs/>
           <w:b/>
         </w:rPr>
-        <w:t xml:space="preserve">Ano e país</w:t>
-      </w:r>
-      <w:r>
-        <w:t xml:space="preserve"> </w:t>
-      </w:r>
-      <w:r>
-        <w:t xml:space="preserve">entram como variáveis (colunas opcionais</w:t>
-      </w:r>
-      <w:r>
-        <w:t xml:space="preserve"> </w:t>
-      </w:r>
-      <w:r>
-        <w:rPr>
-          <w:rStyle w:val="VerbatimChar"/>
-        </w:rPr>
-        <w:t xml:space="preserve">Año</w:t>
-      </w:r>
-      <w:r>
-        <w:t xml:space="preserve"> </w:t>
-      </w:r>
-      <w:r>
-        <w:t xml:space="preserve">e</w:t>
-      </w:r>
-      <w:r>
-        <w:t xml:space="preserve"> </w:t>
-      </w:r>
-      <w:r>
-        <w:rPr>
-          <w:rStyle w:val="VerbatimChar"/>
-        </w:rPr>
-        <w:t xml:space="preserve">País</w:t>
-      </w:r>
-      <w:r>
-        <w:t xml:space="preserve"> </w:t>
-      </w:r>
-      <w:r>
-        <w:t xml:space="preserve">da planilha) e como</w:t>
-      </w:r>
-      <w:r>
-        <w:t xml:space="preserve"> </w:t>
-      </w:r>
-      <w:r>
-        <w:rPr>
-          <w:bCs/>
-          <w:b/>
-        </w:rPr>
-        <w:t xml:space="preserve">seletores no topo da base</w:t>
-      </w:r>
-      <w:r>
-        <w:t xml:space="preserve">. Motivo: preparar a base para juntar os cinco anos da Argentina e os dados do Brasil numa só planilha padronizada.</w:t>
-      </w:r>
-    </w:p>
-    <w:p>
-      <w:pPr>
-        <w:numPr>
-          <w:ilvl w:val="0"/>
-          <w:numId w:val="1011"/>
-        </w:numPr>
-        <w:pStyle w:val="Compact"/>
-      </w:pPr>
-      <w:r>
-        <w:rPr>
-          <w:bCs/>
-          <w:b/>
-        </w:rPr>
-        <w:t xml:space="preserve">Busca mais visível:</w:t>
-      </w:r>
-      <w:r>
-        <w:t xml:space="preserve"> </w:t>
-      </w:r>
-      <w:r>
-        <w:t xml:space="preserve">campo fixo no topo da base que filtra todas as abas, com etiqueta nos filtros e guardado no link. Motivo: a busca ficava escondida no fim da página e só valia para a lista de notícias.</w:t>
-      </w:r>
-    </w:p>
-    <w:p>
-      <w:pPr>
-        <w:numPr>
-          <w:ilvl w:val="0"/>
-          <w:numId w:val="1011"/>
-        </w:numPr>
-        <w:pStyle w:val="Compact"/>
-      </w:pPr>
-      <w:r>
-        <w:rPr>
-          <w:bCs/>
-          <w:b/>
-        </w:rPr>
-        <w:t xml:space="preserve">Página “Sobre e metodologia”</w:t>
-      </w:r>
-      <w:r>
-        <w:t xml:space="preserve"> </w:t>
-      </w:r>
-      <w:r>
-        <w:t xml:space="preserve">(</w:t>
-      </w:r>
-      <w:r>
-        <w:rPr>
-          <w:rStyle w:val="VerbatimChar"/>
-        </w:rPr>
-        <w:t xml:space="preserve">/sobre/</w:t>
-      </w:r>
-      <w:r>
-        <w:t xml:space="preserve">). Motivo: reunir num só lugar como a base foi feita, com fontes, cálculos, limites e citação.</w:t>
-      </w:r>
-    </w:p>
-    <w:p>
-      <w:pPr>
-        <w:numPr>
-          <w:ilvl w:val="0"/>
-          <w:numId w:val="1011"/>
-        </w:numPr>
-        <w:pStyle w:val="Compact"/>
-      </w:pPr>
-      <w:r>
-        <w:rPr>
-          <w:bCs/>
-          <w:b/>
-        </w:rPr>
-        <w:t xml:space="preserve">Versão em espanhol</w:t>
-      </w:r>
-      <w:r>
-        <w:t xml:space="preserve"> </w:t>
-      </w:r>
-      <w:r>
-        <w:t xml:space="preserve">(</w:t>
-      </w:r>
-      <w:r>
-        <w:rPr>
-          <w:rStyle w:val="VerbatimChar"/>
-        </w:rPr>
-        <w:t xml:space="preserve">/es/</w:t>
-      </w:r>
-      <w:r>
-        <w:t xml:space="preserve">), gerada a partir do português por</w:t>
-      </w:r>
-      <w:r>
-        <w:t xml:space="preserve"> </w:t>
-      </w:r>
-      <w:r>
-        <w:rPr>
-          <w:rStyle w:val="VerbatimChar"/>
-        </w:rPr>
-        <w:t xml:space="preserve">i18n/ferramenta.js</w:t>
-      </w:r>
-      <w:r>
-        <w:t xml:space="preserve"> </w:t>
-      </w:r>
-      <w:r>
-        <w:t xml:space="preserve">com o catálogo</w:t>
-      </w:r>
-      <w:r>
-        <w:t xml:space="preserve"> </w:t>
-      </w:r>
-      <w:r>
-        <w:rPr>
-          <w:rStyle w:val="VerbatimChar"/>
-        </w:rPr>
-        <w:t xml:space="preserve">i18n/es.json</w:t>
-      </w:r>
-      <w:r>
-        <w:t xml:space="preserve">; o GitHub Actions passou a gerá-la e a publicar também</w:t>
-      </w:r>
-      <w:r>
-        <w:t xml:space="preserve"> </w:t>
-      </w:r>
-      <w:r>
-        <w:rPr>
-          <w:rStyle w:val="VerbatimChar"/>
-        </w:rPr>
-        <w:t xml:space="preserve">sobre/</w:t>
-      </w:r>
-      <w:r>
-        <w:t xml:space="preserve"> </w:t>
-      </w:r>
-      <w:r>
-        <w:t xml:space="preserve">e</w:t>
-      </w:r>
-      <w:r>
-        <w:t xml:space="preserve"> </w:t>
-      </w:r>
-      <w:r>
-        <w:rPr>
-          <w:rStyle w:val="VerbatimChar"/>
-        </w:rPr>
-        <w:t xml:space="preserve">es/</w:t>
-      </w:r>
-      <w:r>
-        <w:t xml:space="preserve">. Motivo: o público da base é sobretudo argentino e latino-americano (CLACSO). [66fd7e9]</w:t>
-      </w:r>
-    </w:p>
-    <w:p>
-      <w:pPr>
-        <w:numPr>
-          <w:ilvl w:val="0"/>
-          <w:numId w:val="1011"/>
-        </w:numPr>
-        <w:pStyle w:val="Compact"/>
-      </w:pPr>
-      <w:r>
-        <w:t xml:space="preserve">Seção 2, 4, 7 e 8 atualizadas;</w:t>
-      </w:r>
-      <w:r>
-        <w:t xml:space="preserve"> </w:t>
-      </w:r>
-      <w:r>
-        <w:rPr>
-          <w:rStyle w:val="VerbatimChar"/>
-        </w:rPr>
-        <w:t xml:space="preserve">pipeline/reconstruir.sh</w:t>
-      </w:r>
-      <w:r>
-        <w:t xml:space="preserve"> </w:t>
-      </w:r>
-      <w:r>
-        <w:t xml:space="preserve">ganhou o passo da versão em espanhol.</w:t>
-      </w:r>
-    </w:p>
-    <w:p>
-      <w:pPr>
-        <w:numPr>
-          <w:ilvl w:val="0"/>
-          <w:numId w:val="1011"/>
-        </w:numPr>
-        <w:pStyle w:val="Compact"/>
-      </w:pPr>
-      <w:r>
-        <w:rPr>
-          <w:bCs/>
-          <w:b/>
-        </w:rPr>
-        <w:t xml:space="preserve">Mapa animado na abertura</w:t>
-      </w:r>
-      <w:r>
-        <w:t xml:space="preserve"> </w:t>
-      </w:r>
-      <w:r>
-        <w:t xml:space="preserve">da página inicial e da base, no lugar da ilustração da marcha: os pontos das ações vão preenchendo a Argentina ao longo de 2024 e depois o mapa fica parado (ver seção 7, Identidade visual). Motivo: pedido de uma entrada mais dinâmica, que mostre já na abertura onde e quando as ações aconteceram. Também: links do menu passam a quebrar linha em telas estreitas (antes vazavam para a direita no celular).</w:t>
-      </w:r>
-    </w:p>
-    <w:p>
-      <w:pPr>
-        <w:numPr>
-          <w:ilvl w:val="0"/>
-          <w:numId w:val="1011"/>
-        </w:numPr>
-        <w:pStyle w:val="Compact"/>
-      </w:pPr>
-      <w:r>
-        <w:rPr>
-          <w:bCs/>
-          <w:b/>
-        </w:rPr>
-        <w:t xml:space="preserve">Ajustes no mapa da abertura:</w:t>
-      </w:r>
-      <w:r>
-        <w:t xml:space="preserve"> </w:t>
-      </w:r>
-      <w:r>
-        <w:t xml:space="preserve">países vizinhos e oceanos com nomes, como no mapa navegável; cores mais vivas (mar celeste, país em branco quente, vizinhos em bege); divisas das províncias mais fortes; bandeira argentina. Motivo: pedido do responsável (o fundo estava muito apagado e faltava situar a Argentina no continente).</w:t>
-      </w:r>
-    </w:p>
-    <w:p>
-      <w:pPr>
-        <w:numPr>
-          <w:ilvl w:val="0"/>
-          <w:numId w:val="1011"/>
-        </w:numPr>
-        <w:pStyle w:val="Compact"/>
-      </w:pPr>
-      <w:r>
-        <w:rPr>
-          <w:bCs/>
-          <w:b/>
-        </w:rPr>
-        <w:t xml:space="preserve">Mapa no cabeçalho inteiro</w:t>
-      </w:r>
-      <w:r>
-        <w:t xml:space="preserve"> </w:t>
-      </w:r>
-      <w:r>
-        <w:t xml:space="preserve">da página inicial (telas a partir de 1200 px), com grade de meridianos e paralelos no mar, e</w:t>
-      </w:r>
-      <w:r>
-        <w:t xml:space="preserve"> </w:t>
-      </w:r>
-      <w:r>
-        <w:rPr>
-          <w:bCs/>
-          <w:b/>
-        </w:rPr>
-        <w:t xml:space="preserve">sem o gráfico de semanas</w:t>
-      </w:r>
-      <w:r>
-        <w:t xml:space="preserve"> </w:t>
-      </w:r>
-      <w:r>
-        <w:t xml:space="preserve">embaixo do mapa (na página inicial e na base). Contagem de localidades do mapa passou a usar os nomes das localidades (123), e não as coordenadas arredondadas. Motivo: pedido do responsável.</w:t>
-      </w:r>
-    </w:p>
-    <w:p>
-      <w:pPr>
-        <w:numPr>
-          <w:ilvl w:val="0"/>
-          <w:numId w:val="1011"/>
-        </w:numPr>
-        <w:pStyle w:val="Compact"/>
-      </w:pPr>
-      <w:r>
-        <w:rPr>
-          <w:bCs/>
-          <w:b/>
-        </w:rPr>
-        <w:t xml:space="preserve">Mapa cobrindo o cabeçalho inteiro em qualquer tela</w:t>
-      </w:r>
-      <w:r>
-        <w:t xml:space="preserve"> </w:t>
-      </w:r>
-      <w:r>
-        <w:t xml:space="preserve">(a versão anterior só fazia isso a partir de 1200 px e deixava o menu sobre fundo branco): menu dentro do cabeçalho, sobre o mapa, com fundo branco translúcido; enquadramento calculado no navegador a partir do tamanho do cabeçalho e do texto. Motivo: o responsável avaliou que o mapa não ocupava todo o cabeçalho.</w:t>
-      </w:r>
-    </w:p>
-    <w:p>
-      <w:pPr>
-        <w:numPr>
-          <w:ilvl w:val="0"/>
-          <w:numId w:val="1011"/>
-        </w:numPr>
-        <w:pStyle w:val="Compact"/>
-      </w:pPr>
-      <w:r>
-        <w:rPr>
-          <w:bCs/>
-          <w:b/>
-        </w:rPr>
-        <w:t xml:space="preserve">Nome oficial da base</w:t>
-      </w:r>
-      <w:r>
-        <w:t xml:space="preserve"> </w:t>
-      </w:r>
-      <w:r>
-        <w:t xml:space="preserve">passa a ser “Banco de Dados das Lutas por Espaços e Territórios (DATALUTA) - Movimentos Socioespaciais e Socioterritoriais Urbanos Argentinos (2024)” (em espanhol, “Banco de Datos de las Luchas por Espacios y Territorios (DATALUTA) - Movimientos Socioespaciales y Socioterritoriales Urbanos Argentinos (2024)”), na página inicial, na base, na página Sobre, nas citações (README,</w:t>
-      </w:r>
-      <w:r>
-        <w:t xml:space="preserve"> </w:t>
-      </w:r>
-      <w:r>
-        <w:rPr>
-          <w:rStyle w:val="VerbatimChar"/>
-        </w:rPr>
-        <w:t xml:space="preserve">LICENCAS.md</w:t>
-      </w:r>
-      <w:r>
-        <w:t xml:space="preserve">, Sobre), neste documento e no rodapé da versão em Word. Título da página inicial: “Ações no espaço urbano argentino em 2024”. Bandeira do mapa da abertura reposicionada para o Atlântico aberto, a leste da Patagônia. Motivo: pedido do responsável.</w:t>
-      </w:r>
-    </w:p>
-    <w:p>
-      <w:pPr>
-        <w:numPr>
-          <w:ilvl w:val="0"/>
-          <w:numId w:val="1011"/>
-        </w:numPr>
-        <w:pStyle w:val="Compact"/>
-      </w:pPr>
-      <w:r>
-        <w:rPr>
-          <w:bCs/>
-          <w:b/>
-        </w:rPr>
-        <w:t xml:space="preserve">Linha com o nome da base</w:t>
-      </w:r>
-      <w:r>
-        <w:t xml:space="preserve"> </w:t>
-      </w:r>
-      <w:r>
-        <w:t xml:space="preserve">(acima do título, na página inicial e na Sobre) e rótulos da Síntese e das leituras passam do laranja-amarronzado para o azul da paleta (#1d5994 e #2569ad). O laranja segue só nos gráficos e mapas, onde indica “acima do esperado”. Motivo: pedido do responsável, para combinar com a paleta.</w:t>
-      </w:r>
-    </w:p>
-    <w:p>
-      <w:pPr>
-        <w:numPr>
-          <w:ilvl w:val="0"/>
-          <w:numId w:val="1011"/>
-        </w:numPr>
-        <w:pStyle w:val="Compact"/>
-      </w:pPr>
-      <w:r>
-        <w:rPr>
-          <w:bCs/>
-          <w:b/>
-        </w:rPr>
-        <w:t xml:space="preserve">Quatro recursos novos e página de produções</w:t>
-      </w:r>
-      <w:r>
-        <w:t xml:space="preserve">, sem mudar a estrutura da base (seção 7.5): ficha de cada notícia com link próprio e notícias parecidas; correção colaborativa por formulário; data de atualização dos dados; galeria “Perguntas para começar” na página inicial; página “Produções”. Corrigido também o link da página inicial em espanhol, que levava à base em português. Motivo: levantamento de bases interativas de referência (IBGE, Crowd Counting, EJAtlas, Carnegie) e pedido do responsável.</w:t>
-      </w:r>
-    </w:p>
-    <w:p>
-      <w:pPr>
-        <w:numPr>
-          <w:ilvl w:val="0"/>
-          <w:numId w:val="1011"/>
-        </w:numPr>
-        <w:pStyle w:val="Compact"/>
-      </w:pPr>
-      <w:r>
-        <w:rPr>
-          <w:bCs/>
-          <w:b/>
-        </w:rPr>
-        <w:t xml:space="preserve">Ajustes na página inicial:</w:t>
-      </w:r>
-      <w:r>
-        <w:t xml:space="preserve"> </w:t>
-      </w:r>
-      <w:r>
-        <w:t xml:space="preserve">saiu o cartão “A mobilização aparece onde estão os bairros populares?” da galeria; saiu a bandeira do mapa da abertura (atributo</w:t>
-      </w:r>
-      <w:r>
-        <w:t xml:space="preserve"> </w:t>
-      </w:r>
-      <w:r>
-        <w:rPr>
-          <w:rStyle w:val="VerbatimChar"/>
-        </w:rPr>
-        <w:t xml:space="preserve">data-sem-bandeira</w:t>
-      </w:r>
-      <w:r>
-        <w:t xml:space="preserve">; no mapa menor da base ela continua); a marca no canto superior (sol + “Ações Socioespaciais”) passou a ser sol + “Início” em todas as páginas, e o link “Início” repetido no menu saiu; sugestões e correções ficaram mais visíveis (seção “Contribua com a base”, link “Contribuir” no menu e quadro acima da lista de notícias). Motivo: pedido do responsável.</w:t>
-      </w:r>
-    </w:p>
-    <w:p>
-      <w:pPr>
-        <w:numPr>
-          <w:ilvl w:val="0"/>
-          <w:numId w:val="1011"/>
-        </w:numPr>
-        <w:pStyle w:val="Compact"/>
-      </w:pPr>
-      <w:r>
-        <w:rPr>
-          <w:bCs/>
-          <w:b/>
-        </w:rPr>
-        <w:t xml:space="preserve">Novas leituras e história guiada</w:t>
-      </w:r>
-      <w:r>
-        <w:t xml:space="preserve"> </w:t>
-      </w:r>
-      <w:r>
-        <w:t xml:space="preserve">(seções 7.6 e 7.7): funil, mapa de pontos por categoria, cartograma, mapa de calor reordenado, perfil comparado nas fichas, linha do tempo de notícias, margem de erro no Comparar e a página “2024 em ações”. Tudo acrescentado, sem mudar abas, cálculos ou endereços existentes. Motivo: pedido do responsável para melhorar a representação.</w:t>
-      </w:r>
-    </w:p>
-    <w:p>
-      <w:r>
-        <w:pict>
-          <v:rect style="width:0;height:1.5pt" o:hralign="center" o:hrstd="t" o:hr="t"/>
-        </w:pict>
+        <w:t xml:space="preserve">Fichas:</w:t>
+      </w:r>
+      <w:r>
+        <w:t xml:space="preserve"> </w:t>
+      </w:r>
+      <w:r>
+        <w:t xml:space="preserve">a escolha passou a ser uma lista fechada só com as categorias do tipo de ficha escolhido (por exemplo, só objetivos), com o número de notícias, e um campo para filtrar a lista. Motivo: o campo de texto anterior, com sugestões, deixava o navegador misturar valores digitados antes em outros tipos de ficha (nomes de movimentos, províncias).</w:t>
       </w:r>
     </w:p>
     <w:bookmarkEnd w:id="49"/>
-    <w:bookmarkEnd w:id="50"/>
-    <w:bookmarkStart w:id="51" w:name="X3d9f82193e44c2a113d49ff9b97f8db3ae86c66"/>
-    <w:p>
-      <w:pPr>
-        <w:pStyle w:val="Heading2"/>
-      </w:pPr>
-      <w:r>
-        <w:t xml:space="preserve">10. Pendências</w:t>
+    <w:bookmarkStart w:id="50" w:name="X6d16d1d1dfee84c5325917dbbdeb1135ee226ab"/>
+    <w:p>
+      <w:pPr>
+        <w:pStyle w:val="Heading3"/>
+      </w:pPr>
+      <w:r>
+        <w:t xml:space="preserve">30/10/2026</w:t>
       </w:r>
     </w:p>
     <w:p>
@@ -8387,50 +8064,60 @@
         <w:pStyle w:val="Compact"/>
       </w:pPr>
       <w:r>
-        <w:t xml:space="preserve">☐</w:t>
-      </w:r>
-      <w:r>
-        <w:t xml:space="preserve"> </w:t>
-      </w:r>
-      <w:r>
         <w:rPr>
           <w:bCs/>
           <w:b/>
         </w:rPr>
-        <w:t xml:space="preserve">Licenças:</w:t>
-      </w:r>
-      <w:r>
-        <w:t xml:space="preserve"> </w:t>
-      </w:r>
-      <w:r>
-        <w:t xml:space="preserve">o arquivo</w:t>
-      </w:r>
-      <w:r>
-        <w:t xml:space="preserve"> </w:t>
-      </w:r>
-      <w:r>
-        <w:rPr>
-          <w:rStyle w:val="VerbatimChar"/>
-        </w:rPr>
-        <w:t xml:space="preserve">LICENSE</w:t>
-      </w:r>
-      <w:r>
-        <w:t xml:space="preserve"> </w:t>
-      </w:r>
-      <w:r>
-        <w:t xml:space="preserve">foi trocado no GitHub para MIT (commit 6f63b69), mas</w:t>
-      </w:r>
-      <w:r>
-        <w:t xml:space="preserve"> </w:t>
-      </w:r>
-      <w:r>
-        <w:rPr>
-          <w:rStyle w:val="VerbatimChar"/>
-        </w:rPr>
-        <w:t xml:space="preserve">LICENCAS.md</w:t>
-      </w:r>
-      <w:r>
-        <w:t xml:space="preserve">, README, página Sobre e rodapés ainda dizem base de dados sob CC BY 4.0 e código sob MIT. Decidir entre manter CC BY 4.0 para os dados (recomendado) ou adotar MIT para tudo, e alinhar os arquivos. Confirmar também com o grupo/centro de pesquisa.</w:t>
+        <w:t xml:space="preserve">Ano e país</w:t>
+      </w:r>
+      <w:r>
+        <w:t xml:space="preserve"> </w:t>
+      </w:r>
+      <w:r>
+        <w:t xml:space="preserve">entram como variáveis (colunas opcionais</w:t>
+      </w:r>
+      <w:r>
+        <w:t xml:space="preserve"> </w:t>
+      </w:r>
+      <w:r>
+        <w:rPr>
+          <w:rStyle w:val="VerbatimChar"/>
+        </w:rPr>
+        <w:t xml:space="preserve">Año</w:t>
+      </w:r>
+      <w:r>
+        <w:t xml:space="preserve"> </w:t>
+      </w:r>
+      <w:r>
+        <w:t xml:space="preserve">e</w:t>
+      </w:r>
+      <w:r>
+        <w:t xml:space="preserve"> </w:t>
+      </w:r>
+      <w:r>
+        <w:rPr>
+          <w:rStyle w:val="VerbatimChar"/>
+        </w:rPr>
+        <w:t xml:space="preserve">País</w:t>
+      </w:r>
+      <w:r>
+        <w:t xml:space="preserve"> </w:t>
+      </w:r>
+      <w:r>
+        <w:t xml:space="preserve">da planilha) e como</w:t>
+      </w:r>
+      <w:r>
+        <w:t xml:space="preserve"> </w:t>
+      </w:r>
+      <w:r>
+        <w:rPr>
+          <w:bCs/>
+          <w:b/>
+        </w:rPr>
+        <w:t xml:space="preserve">seletores no topo da base</w:t>
+      </w:r>
+      <w:r>
+        <w:t xml:space="preserve">. Motivo: preparar a base para juntar os cinco anos da Argentina e os dados do Brasil numa só planilha padronizada.</w:t>
       </w:r>
     </w:p>
     <w:p>
@@ -8442,22 +8129,17 @@
         <w:pStyle w:val="Compact"/>
       </w:pPr>
       <w:r>
-        <w:t xml:space="preserve">☐ Completar</w:t>
-      </w:r>
-      <w:r>
-        <w:t xml:space="preserve"> </w:t>
-      </w:r>
-      <w:r>
-        <w:rPr>
-          <w:rStyle w:val="VerbatimChar"/>
-        </w:rPr>
-        <w:t xml:space="preserve">dados/producoes.csv</w:t>
-      </w:r>
-      <w:r>
-        <w:t xml:space="preserve"> </w:t>
-      </w:r>
-      <w:r>
-        <w:t xml:space="preserve">com as produções do grupo (a apresentação no GT CLACSO entrou sem link e sem data exata).</w:t>
+        <w:rPr>
+          <w:bCs/>
+          <w:b/>
+        </w:rPr>
+        <w:t xml:space="preserve">Busca mais visível:</w:t>
+      </w:r>
+      <w:r>
+        <w:t xml:space="preserve"> </w:t>
+      </w:r>
+      <w:r>
+        <w:t xml:space="preserve">campo fixo no topo da base que filtra todas as abas, com etiqueta nos filtros e guardado no link. Motivo: a busca ficava escondida no fim da página e só valia para a lista de notícias.</w:t>
       </w:r>
     </w:p>
     <w:p>
@@ -8469,7 +8151,26 @@
         <w:pStyle w:val="Compact"/>
       </w:pPr>
       <w:r>
-        <w:t xml:space="preserve">☐ Criar no GitHub os rótulos “correção” e “produção” e combinar quem revisa as sugestões que chegarem pelos formulários.</w:t>
+        <w:rPr>
+          <w:bCs/>
+          <w:b/>
+        </w:rPr>
+        <w:t xml:space="preserve">Página “Sobre e metodologia”</w:t>
+      </w:r>
+      <w:r>
+        <w:t xml:space="preserve"> </w:t>
+      </w:r>
+      <w:r>
+        <w:t xml:space="preserve">(</w:t>
+      </w:r>
+      <w:r>
+        <w:rPr>
+          <w:rStyle w:val="VerbatimChar"/>
+        </w:rPr>
+        <w:t xml:space="preserve">/sobre/</w:t>
+      </w:r>
+      <w:r>
+        <w:t xml:space="preserve">). Motivo: reunir num só lugar como a base foi feita, com fontes, cálculos, limites e citação.</w:t>
       </w:r>
     </w:p>
     <w:p>
@@ -8481,7 +8182,80 @@
         <w:pStyle w:val="Compact"/>
       </w:pPr>
       <w:r>
-        <w:t xml:space="preserve">☐ Revisão da versão em espanhol por falante nativo (termos como “recorte”, “ficha”, “plancha”).</w:t>
+        <w:rPr>
+          <w:bCs/>
+          <w:b/>
+        </w:rPr>
+        <w:t xml:space="preserve">Versão em espanhol</w:t>
+      </w:r>
+      <w:r>
+        <w:t xml:space="preserve"> </w:t>
+      </w:r>
+      <w:r>
+        <w:t xml:space="preserve">(</w:t>
+      </w:r>
+      <w:r>
+        <w:rPr>
+          <w:rStyle w:val="VerbatimChar"/>
+        </w:rPr>
+        <w:t xml:space="preserve">/es/</w:t>
+      </w:r>
+      <w:r>
+        <w:t xml:space="preserve">), gerada a partir do português por</w:t>
+      </w:r>
+      <w:r>
+        <w:t xml:space="preserve"> </w:t>
+      </w:r>
+      <w:r>
+        <w:rPr>
+          <w:rStyle w:val="VerbatimChar"/>
+        </w:rPr>
+        <w:t xml:space="preserve">i18n/ferramenta.js</w:t>
+      </w:r>
+      <w:r>
+        <w:t xml:space="preserve"> </w:t>
+      </w:r>
+      <w:r>
+        <w:t xml:space="preserve">com o catálogo</w:t>
+      </w:r>
+      <w:r>
+        <w:t xml:space="preserve"> </w:t>
+      </w:r>
+      <w:r>
+        <w:rPr>
+          <w:rStyle w:val="VerbatimChar"/>
+        </w:rPr>
+        <w:t xml:space="preserve">i18n/es.json</w:t>
+      </w:r>
+      <w:r>
+        <w:t xml:space="preserve">; o GitHub Actions passou a gerá-la e a publicar também</w:t>
+      </w:r>
+      <w:r>
+        <w:t xml:space="preserve"> </w:t>
+      </w:r>
+      <w:r>
+        <w:rPr>
+          <w:rStyle w:val="VerbatimChar"/>
+        </w:rPr>
+        <w:t xml:space="preserve">sobre/</w:t>
+      </w:r>
+      <w:r>
+        <w:t xml:space="preserve"> </w:t>
+      </w:r>
+      <w:r>
+        <w:t xml:space="preserve">e</w:t>
+      </w:r>
+      <w:r>
+        <w:t xml:space="preserve"> </w:t>
+      </w:r>
+      <w:r>
+        <w:rPr>
+          <w:rStyle w:val="VerbatimChar"/>
+        </w:rPr>
+        <w:t xml:space="preserve">es/</w:t>
+      </w:r>
+      <w:r>
+        <w:t xml:space="preserve">. Motivo: o público da base é sobretudo argentino e latino-americano (CLACSO). [66fd7e9]</w:t>
       </w:r>
     </w:p>
     <w:p>
@@ -8493,19 +8267,22 @@
         <w:pStyle w:val="Compact"/>
       </w:pPr>
       <w:r>
-        <w:t xml:space="preserve">☐ Depositar a base no Zenodo (ou repositório institucional) para obter um DOI e atualizar a citação em</w:t>
-      </w:r>
-      <w:r>
-        <w:t xml:space="preserve"> </w:t>
-      </w:r>
-      <w:r>
-        <w:rPr>
-          <w:rStyle w:val="VerbatimChar"/>
-        </w:rPr>
-        <w:t xml:space="preserve">LICENCAS.md</w:t>
-      </w:r>
-      <w:r>
-        <w:t xml:space="preserve">.</w:t>
+        <w:t xml:space="preserve">Seção 2, 4, 7 e 8 atualizadas;</w:t>
+      </w:r>
+      <w:r>
+        <w:t xml:space="preserve"> </w:t>
+      </w:r>
+      <w:r>
+        <w:rPr>
+          <w:rStyle w:val="VerbatimChar"/>
+        </w:rPr>
+        <w:t xml:space="preserve">pipeline/reconstruir.sh</w:t>
+      </w:r>
+      <w:r>
+        <w:t xml:space="preserve"> </w:t>
+      </w:r>
+      <w:r>
+        <w:t xml:space="preserve">ganhou o passo da versão em espanhol.</w:t>
       </w:r>
     </w:p>
     <w:p>
@@ -8517,23 +8294,17 @@
         <w:pStyle w:val="Compact"/>
       </w:pPr>
       <w:r>
-        <w:t xml:space="preserve">☐</w:t>
-      </w:r>
-      <w:r>
-        <w:t xml:space="preserve"> </w:t>
-      </w:r>
-      <w:r>
         <w:rPr>
           <w:bCs/>
           <w:b/>
         </w:rPr>
-        <w:t xml:space="preserve">Unificar nomes de organizações duplicados</w:t>
-      </w:r>
-      <w:r>
-        <w:t xml:space="preserve"> </w:t>
-      </w:r>
-      <w:r>
-        <w:t xml:space="preserve">(ex.: grafias diferentes de CTA e CGT). Afeta contagens, fichas e redes.</w:t>
+        <w:t xml:space="preserve">Mapa animado na abertura</w:t>
+      </w:r>
+      <w:r>
+        <w:t xml:space="preserve"> </w:t>
+      </w:r>
+      <w:r>
+        <w:t xml:space="preserve">da página inicial e da base, no lugar da ilustração da marcha: os pontos das ações vão preenchendo a Argentina ao longo de 2024 e depois o mapa fica parado (ver seção 7, Identidade visual). Motivo: pedido de uma entrada mais dinâmica, que mostre já na abertura onde e quando as ações aconteceram. Também: links do menu passam a quebrar linha em telas estreitas (antes vazavam para a direita no celular).</w:t>
       </w:r>
     </w:p>
     <w:p>
@@ -8545,23 +8316,17 @@
         <w:pStyle w:val="Compact"/>
       </w:pPr>
       <w:r>
-        <w:t xml:space="preserve">☐ Resultado do</w:t>
-      </w:r>
-      <w:r>
-        <w:t xml:space="preserve"> </w:t>
-      </w:r>
-      <w:r>
         <w:rPr>
           <w:bCs/>
           <w:b/>
         </w:rPr>
-        <w:t xml:space="preserve">2º turno de 2023</w:t>
-      </w:r>
-      <w:r>
-        <w:t xml:space="preserve"> </w:t>
-      </w:r>
-      <w:r>
-        <w:t xml:space="preserve">por departamento, se a DINE publicar no formato mesa a mesa.</w:t>
+        <w:t xml:space="preserve">Ajustes no mapa da abertura:</w:t>
+      </w:r>
+      <w:r>
+        <w:t xml:space="preserve"> </w:t>
+      </w:r>
+      <w:r>
+        <w:t xml:space="preserve">países vizinhos e oceanos com nomes, como no mapa navegável; cores mais vivas (mar celeste, país em branco quente, vizinhos em bege); divisas das províncias mais fortes; bandeira argentina. Motivo: pedido do responsável (o fundo estava muito apagado e faltava situar a Argentina no continente).</w:t>
       </w:r>
     </w:p>
     <w:p>
@@ -8573,7 +8338,33 @@
         <w:pStyle w:val="Compact"/>
       </w:pPr>
       <w:r>
-        <w:t xml:space="preserve">☐ Outras fontes sugeridas e ainda não coletadas: estudantes de universidades nacionais por província, emprego público por província, titulares do Potenciar Trabajo, projetos de mineração e comunidades indígenas registradas.</w:t>
+        <w:rPr>
+          <w:bCs/>
+          <w:b/>
+        </w:rPr>
+        <w:t xml:space="preserve">Mapa no cabeçalho inteiro</w:t>
+      </w:r>
+      <w:r>
+        <w:t xml:space="preserve"> </w:t>
+      </w:r>
+      <w:r>
+        <w:t xml:space="preserve">da página inicial (telas a partir de 1200 px), com grade de meridianos e paralelos no mar, e</w:t>
+      </w:r>
+      <w:r>
+        <w:t xml:space="preserve"> </w:t>
+      </w:r>
+      <w:r>
+        <w:rPr>
+          <w:bCs/>
+          <w:b/>
+        </w:rPr>
+        <w:t xml:space="preserve">sem o gráfico de semanas</w:t>
+      </w:r>
+      <w:r>
+        <w:t xml:space="preserve"> </w:t>
+      </w:r>
+      <w:r>
+        <w:t xml:space="preserve">embaixo do mapa (na página inicial e na base). Contagem de localidades do mapa passou a usar os nomes das localidades (123), e não as coordenadas arredondadas. Motivo: pedido do responsável.</w:t>
       </w:r>
     </w:p>
     <w:p>
@@ -8585,7 +8376,17 @@
         <w:pStyle w:val="Compact"/>
       </w:pPr>
       <w:r>
-        <w:t xml:space="preserve">☐ Atualizar o ReNaTEP e o RENABAP quando houver versões oficiais mais recentes.</w:t>
+        <w:rPr>
+          <w:bCs/>
+          <w:b/>
+        </w:rPr>
+        <w:t xml:space="preserve">Mapa cobrindo o cabeçalho inteiro em qualquer tela</w:t>
+      </w:r>
+      <w:r>
+        <w:t xml:space="preserve"> </w:t>
+      </w:r>
+      <w:r>
+        <w:t xml:space="preserve">(a versão anterior só fazia isso a partir de 1200 px e deixava o menu sobre fundo branco): menu dentro do cabeçalho, sobre o mapa, com fundo branco translúcido; enquadramento calculado no navegador a partir do tamanho do cabeçalho e do texto. Motivo: o responsável avaliou que o mapa não ocupava todo o cabeçalho.</w:t>
       </w:r>
     </w:p>
     <w:p>
@@ -8597,11 +8398,522 @@
         <w:pStyle w:val="Compact"/>
       </w:pPr>
       <w:r>
+        <w:rPr>
+          <w:bCs/>
+          <w:b/>
+        </w:rPr>
+        <w:t xml:space="preserve">Nome oficial da base</w:t>
+      </w:r>
+      <w:r>
+        <w:t xml:space="preserve"> </w:t>
+      </w:r>
+      <w:r>
+        <w:t xml:space="preserve">passa a ser “Banco de Dados das Lutas por Espaços e Territórios (DATALUTA) - Movimentos Socioespaciais e Socioterritoriais Urbanos Argentinos (2024)” (em espanhol, “Banco de Datos de las Luchas por Espacios y Territorios (DATALUTA) - Movimientos Socioespaciales y Socioterritoriales Urbanos Argentinos (2024)”), na página inicial, na base, na página Sobre, nas citações (README,</w:t>
+      </w:r>
+      <w:r>
+        <w:t xml:space="preserve"> </w:t>
+      </w:r>
+      <w:r>
+        <w:rPr>
+          <w:rStyle w:val="VerbatimChar"/>
+        </w:rPr>
+        <w:t xml:space="preserve">LICENCAS.md</w:t>
+      </w:r>
+      <w:r>
+        <w:t xml:space="preserve">, Sobre), neste documento e no rodapé da versão em Word. Título da página inicial: “Ações no espaço urbano argentino em 2024”. Bandeira do mapa da abertura reposicionada para o Atlântico aberto, a leste da Patagônia. Motivo: pedido do responsável.</w:t>
+      </w:r>
+    </w:p>
+    <w:p>
+      <w:pPr>
+        <w:numPr>
+          <w:ilvl w:val="0"/>
+          <w:numId w:val="1012"/>
+        </w:numPr>
+        <w:pStyle w:val="Compact"/>
+      </w:pPr>
+      <w:r>
+        <w:rPr>
+          <w:bCs/>
+          <w:b/>
+        </w:rPr>
+        <w:t xml:space="preserve">Linha com o nome da base</w:t>
+      </w:r>
+      <w:r>
+        <w:t xml:space="preserve"> </w:t>
+      </w:r>
+      <w:r>
+        <w:t xml:space="preserve">(acima do título, na página inicial e na Sobre) e rótulos da Síntese e das leituras passam do laranja-amarronzado para o azul da paleta (#1d5994 e #2569ad). O laranja segue só nos gráficos e mapas, onde indica “acima do esperado”. Motivo: pedido do responsável, para combinar com a paleta.</w:t>
+      </w:r>
+    </w:p>
+    <w:p>
+      <w:pPr>
+        <w:numPr>
+          <w:ilvl w:val="0"/>
+          <w:numId w:val="1012"/>
+        </w:numPr>
+        <w:pStyle w:val="Compact"/>
+      </w:pPr>
+      <w:r>
+        <w:rPr>
+          <w:bCs/>
+          <w:b/>
+        </w:rPr>
+        <w:t xml:space="preserve">Quatro recursos novos e página de produções</w:t>
+      </w:r>
+      <w:r>
+        <w:t xml:space="preserve">, sem mudar a estrutura da base (seção 7.5): ficha de cada notícia com link próprio e notícias parecidas; correção colaborativa por formulário; data de atualização dos dados; galeria “Perguntas para começar” na página inicial; página “Produções”. Corrigido também o link da página inicial em espanhol, que levava à base em português. Motivo: levantamento de bases interativas de referência (IBGE, Crowd Counting, EJAtlas, Carnegie) e pedido do responsável.</w:t>
+      </w:r>
+    </w:p>
+    <w:p>
+      <w:pPr>
+        <w:numPr>
+          <w:ilvl w:val="0"/>
+          <w:numId w:val="1012"/>
+        </w:numPr>
+        <w:pStyle w:val="Compact"/>
+      </w:pPr>
+      <w:r>
+        <w:rPr>
+          <w:bCs/>
+          <w:b/>
+        </w:rPr>
+        <w:t xml:space="preserve">Ajustes na página inicial:</w:t>
+      </w:r>
+      <w:r>
+        <w:t xml:space="preserve"> </w:t>
+      </w:r>
+      <w:r>
+        <w:t xml:space="preserve">saiu o cartão “A mobilização aparece onde estão os bairros populares?” da galeria; saiu a bandeira do mapa da abertura (atributo</w:t>
+      </w:r>
+      <w:r>
+        <w:t xml:space="preserve"> </w:t>
+      </w:r>
+      <w:r>
+        <w:rPr>
+          <w:rStyle w:val="VerbatimChar"/>
+        </w:rPr>
+        <w:t xml:space="preserve">data-sem-bandeira</w:t>
+      </w:r>
+      <w:r>
+        <w:t xml:space="preserve">; no mapa menor da base ela continua); a marca no canto superior (sol + “Ações Socioespaciais”) passou a ser sol + “Início” em todas as páginas, e o link “Início” repetido no menu saiu; sugestões e correções ficaram mais visíveis (seção “Contribua com a base”, link “Contribuir” no menu e quadro acima da lista de notícias). Motivo: pedido do responsável.</w:t>
+      </w:r>
+    </w:p>
+    <w:p>
+      <w:pPr>
+        <w:numPr>
+          <w:ilvl w:val="0"/>
+          <w:numId w:val="1012"/>
+        </w:numPr>
+        <w:pStyle w:val="Compact"/>
+      </w:pPr>
+      <w:r>
+        <w:rPr>
+          <w:bCs/>
+          <w:b/>
+        </w:rPr>
+        <w:t xml:space="preserve">Novas leituras e história guiada</w:t>
+      </w:r>
+      <w:r>
+        <w:t xml:space="preserve"> </w:t>
+      </w:r>
+      <w:r>
+        <w:t xml:space="preserve">(seções 7.6 e 7.7): funil, mapa de pontos por categoria, cartograma, mapa de calor reordenado, perfil comparado nas fichas, linha do tempo de notícias, margem de erro no Comparar e a página “2024 em ações”. Tudo acrescentado, sem mudar abas, cálculos ou endereços existentes. Motivo: pedido do responsável para melhorar a representação.</w:t>
+      </w:r>
+    </w:p>
+    <w:p>
+      <w:pPr>
+        <w:numPr>
+          <w:ilvl w:val="0"/>
+          <w:numId w:val="1012"/>
+        </w:numPr>
+        <w:pStyle w:val="Compact"/>
+      </w:pPr>
+      <w:r>
+        <w:rPr>
+          <w:bCs/>
+          <w:b/>
+        </w:rPr>
+        <w:t xml:space="preserve">Atalhos, downloads e citação</w:t>
+      </w:r>
+      <w:r>
+        <w:t xml:space="preserve"> </w:t>
+      </w:r>
+      <w:r>
+        <w:t xml:space="preserve">(seção 7.8): faixa no topo de cada aba com atalhos para as novas leituras, CSV do recorte e “Como citar”; botões “Baixar PNG” e “Baixar SVG” embaixo dos gráficos, com título, recorte e fonte gravados na imagem; CSV das tabelas das novas leituras; citação em ABNT, APA e BibTeX;</w:t>
+      </w:r>
+      <w:r>
+        <w:t xml:space="preserve"> </w:t>
+      </w:r>
+      <w:r>
+        <w:rPr>
+          <w:rStyle w:val="VerbatimChar"/>
+        </w:rPr>
+        <w:t xml:space="preserve">CITATION.cff</w:t>
+      </w:r>
+      <w:r>
+        <w:t xml:space="preserve"> </w:t>
+      </w:r>
+      <w:r>
+        <w:t xml:space="preserve">e</w:t>
+      </w:r>
+      <w:r>
+        <w:t xml:space="preserve"> </w:t>
+      </w:r>
+      <w:r>
+        <w:rPr>
+          <w:rStyle w:val="VerbatimChar"/>
+        </w:rPr>
+        <w:t xml:space="preserve">.zenodo.json</w:t>
+      </w:r>
+      <w:r>
+        <w:t xml:space="preserve">. Motivo: facilitar encontrar as novas leituras e reutilizar e citar a base em trabalhos acadêmicos.</w:t>
+      </w:r>
+    </w:p>
+    <w:p>
+      <w:r>
+        <w:pict>
+          <v:rect style="width:0;height:1.5pt" o:hralign="center" o:hrstd="t" o:hr="t"/>
+        </w:pict>
+      </w:r>
+    </w:p>
+    <w:bookmarkEnd w:id="50"/>
+    <w:bookmarkEnd w:id="51"/>
+    <w:bookmarkStart w:id="52" w:name="X3d9f82193e44c2a113d49ff9b97f8db3ae86c66"/>
+    <w:p>
+      <w:pPr>
+        <w:pStyle w:val="Heading2"/>
+      </w:pPr>
+      <w:r>
+        <w:t xml:space="preserve">10. Pendências</w:t>
+      </w:r>
+    </w:p>
+    <w:p>
+      <w:pPr>
+        <w:numPr>
+          <w:ilvl w:val="0"/>
+          <w:numId w:val="1013"/>
+        </w:numPr>
+        <w:pStyle w:val="Compact"/>
+      </w:pPr>
+      <w:r>
+        <w:t xml:space="preserve">☐</w:t>
+      </w:r>
+      <w:r>
+        <w:t xml:space="preserve"> </w:t>
+      </w:r>
+      <w:r>
+        <w:rPr>
+          <w:bCs/>
+          <w:b/>
+        </w:rPr>
+        <w:t xml:space="preserve">Licenças:</w:t>
+      </w:r>
+      <w:r>
+        <w:t xml:space="preserve"> </w:t>
+      </w:r>
+      <w:r>
+        <w:t xml:space="preserve">o arquivo</w:t>
+      </w:r>
+      <w:r>
+        <w:t xml:space="preserve"> </w:t>
+      </w:r>
+      <w:r>
+        <w:rPr>
+          <w:rStyle w:val="VerbatimChar"/>
+        </w:rPr>
+        <w:t xml:space="preserve">LICENSE</w:t>
+      </w:r>
+      <w:r>
+        <w:t xml:space="preserve"> </w:t>
+      </w:r>
+      <w:r>
+        <w:t xml:space="preserve">foi trocado no GitHub para MIT (commit 6f63b69), mas</w:t>
+      </w:r>
+      <w:r>
+        <w:t xml:space="preserve"> </w:t>
+      </w:r>
+      <w:r>
+        <w:rPr>
+          <w:rStyle w:val="VerbatimChar"/>
+        </w:rPr>
+        <w:t xml:space="preserve">LICENCAS.md</w:t>
+      </w:r>
+      <w:r>
+        <w:t xml:space="preserve">, README, página Sobre e rodapés ainda dizem base de dados sob CC BY 4.0 e código sob MIT. Decidir entre manter CC BY 4.0 para os dados (recomendado) ou adotar MIT para tudo, e alinhar os arquivos. Confirmar também com o grupo/centro de pesquisa.</w:t>
+      </w:r>
+    </w:p>
+    <w:p>
+      <w:pPr>
+        <w:numPr>
+          <w:ilvl w:val="0"/>
+          <w:numId w:val="1013"/>
+        </w:numPr>
+        <w:pStyle w:val="Compact"/>
+      </w:pPr>
+      <w:r>
+        <w:t xml:space="preserve">☐ Completar</w:t>
+      </w:r>
+      <w:r>
+        <w:t xml:space="preserve"> </w:t>
+      </w:r>
+      <w:r>
+        <w:rPr>
+          <w:rStyle w:val="VerbatimChar"/>
+        </w:rPr>
+        <w:t xml:space="preserve">dados/producoes.csv</w:t>
+      </w:r>
+      <w:r>
+        <w:t xml:space="preserve"> </w:t>
+      </w:r>
+      <w:r>
+        <w:t xml:space="preserve">com as produções do grupo (a apresentação no GT CLACSO entrou sem link e sem data exata).</w:t>
+      </w:r>
+    </w:p>
+    <w:p>
+      <w:pPr>
+        <w:numPr>
+          <w:ilvl w:val="0"/>
+          <w:numId w:val="1013"/>
+        </w:numPr>
+        <w:pStyle w:val="Compact"/>
+      </w:pPr>
+      <w:r>
+        <w:t xml:space="preserve">☐ Criar no GitHub os rótulos “correção” e “produção” e combinar quem revisa as sugestões que chegarem pelos formulários.</w:t>
+      </w:r>
+    </w:p>
+    <w:p>
+      <w:pPr>
+        <w:numPr>
+          <w:ilvl w:val="0"/>
+          <w:numId w:val="1013"/>
+        </w:numPr>
+        <w:pStyle w:val="Compact"/>
+      </w:pPr>
+      <w:r>
+        <w:t xml:space="preserve">☐ Revisão da versão em espanhol por falante nativo (termos como “recorte”, “ficha”, “plancha”).</w:t>
+      </w:r>
+    </w:p>
+    <w:p>
+      <w:pPr>
+        <w:numPr>
+          <w:ilvl w:val="0"/>
+          <w:numId w:val="1013"/>
+        </w:numPr>
+        <w:pStyle w:val="Compact"/>
+      </w:pPr>
+      <w:r>
+        <w:t xml:space="preserve">☐</w:t>
+      </w:r>
+      <w:r>
+        <w:t xml:space="preserve"> </w:t>
+      </w:r>
+      <w:r>
+        <w:rPr>
+          <w:bCs/>
+          <w:b/>
+        </w:rPr>
+        <w:t xml:space="preserve">DOI no Zenodo:</w:t>
+      </w:r>
+      <w:r>
+        <w:t xml:space="preserve"> </w:t>
+      </w:r>
+      <w:r>
+        <w:t xml:space="preserve">os metadados já estão em</w:t>
+      </w:r>
+      <w:r>
+        <w:t xml:space="preserve"> </w:t>
+      </w:r>
+      <w:r>
+        <w:rPr>
+          <w:rStyle w:val="VerbatimChar"/>
+        </w:rPr>
+        <w:t xml:space="preserve">.zenodo.json</w:t>
+      </w:r>
+      <w:r>
+        <w:t xml:space="preserve">. Falta o responsável entrar em zenodo.org com a conta do GitHub, ativar o repositório</w:t>
+      </w:r>
+      <w:r>
+        <w:t xml:space="preserve"> </w:t>
+      </w:r>
+      <w:r>
+        <w:rPr>
+          <w:rStyle w:val="VerbatimChar"/>
+        </w:rPr>
+        <w:t xml:space="preserve">site-acoes</w:t>
+      </w:r>
+      <w:r>
+        <w:t xml:space="preserve"> </w:t>
+      </w:r>
+      <w:r>
+        <w:t xml:space="preserve">em “GitHub” e criar uma versão (release) no GitHub; o Zenodo gera o DOI, que deve entrar na citação (</w:t>
+      </w:r>
+      <w:r>
+        <w:rPr>
+          <w:rStyle w:val="VerbatimChar"/>
+        </w:rPr>
+        <w:t xml:space="preserve">LICENCAS.md</w:t>
+      </w:r>
+      <w:r>
+        <w:t xml:space="preserve">, Sobre,</w:t>
+      </w:r>
+      <w:r>
+        <w:t xml:space="preserve"> </w:t>
+      </w:r>
+      <w:r>
+        <w:rPr>
+          <w:rStyle w:val="VerbatimChar"/>
+        </w:rPr>
+        <w:t xml:space="preserve">uso.js</w:t>
+      </w:r>
+      <w:r>
+        <w:t xml:space="preserve">,</w:t>
+      </w:r>
+      <w:r>
+        <w:t xml:space="preserve"> </w:t>
+      </w:r>
+      <w:r>
+        <w:rPr>
+          <w:rStyle w:val="VerbatimChar"/>
+        </w:rPr>
+        <w:t xml:space="preserve">CITATION.cff</w:t>
+      </w:r>
+      <w:r>
+        <w:t xml:space="preserve">).</w:t>
+      </w:r>
+    </w:p>
+    <w:p>
+      <w:pPr>
+        <w:numPr>
+          <w:ilvl w:val="0"/>
+          <w:numId w:val="1013"/>
+        </w:numPr>
+        <w:pStyle w:val="Compact"/>
+      </w:pPr>
+      <w:r>
+        <w:t xml:space="preserve">☐ Lista completa de autores da citação (hoje “Souza et al.”), também em</w:t>
+      </w:r>
+      <w:r>
+        <w:t xml:space="preserve"> </w:t>
+      </w:r>
+      <w:r>
+        <w:rPr>
+          <w:rStyle w:val="VerbatimChar"/>
+        </w:rPr>
+        <w:t xml:space="preserve">CITATION.cff</w:t>
+      </w:r>
+      <w:r>
+        <w:t xml:space="preserve"> </w:t>
+      </w:r>
+      <w:r>
+        <w:t xml:space="preserve">e</w:t>
+      </w:r>
+      <w:r>
+        <w:t xml:space="preserve"> </w:t>
+      </w:r>
+      <w:r>
+        <w:rPr>
+          <w:rStyle w:val="VerbatimChar"/>
+        </w:rPr>
+        <w:t xml:space="preserve">.zenodo.json</w:t>
+      </w:r>
+      <w:r>
+        <w:t xml:space="preserve">.</w:t>
+      </w:r>
+    </w:p>
+    <w:p>
+      <w:pPr>
+        <w:numPr>
+          <w:ilvl w:val="0"/>
+          <w:numId w:val="1013"/>
+        </w:numPr>
+        <w:pStyle w:val="Compact"/>
+      </w:pPr>
+      <w:r>
+        <w:t xml:space="preserve">☐</w:t>
+      </w:r>
+      <w:r>
+        <w:t xml:space="preserve"> </w:t>
+      </w:r>
+      <w:r>
+        <w:rPr>
+          <w:bCs/>
+          <w:b/>
+        </w:rPr>
+        <w:t xml:space="preserve">Unificar nomes de organizações duplicados</w:t>
+      </w:r>
+      <w:r>
+        <w:t xml:space="preserve"> </w:t>
+      </w:r>
+      <w:r>
+        <w:t xml:space="preserve">(ex.: grafias diferentes de CTA e CGT). Afeta contagens, fichas e redes.</w:t>
+      </w:r>
+    </w:p>
+    <w:p>
+      <w:pPr>
+        <w:numPr>
+          <w:ilvl w:val="0"/>
+          <w:numId w:val="1013"/>
+        </w:numPr>
+        <w:pStyle w:val="Compact"/>
+      </w:pPr>
+      <w:r>
+        <w:t xml:space="preserve">☐ Resultado do</w:t>
+      </w:r>
+      <w:r>
+        <w:t xml:space="preserve"> </w:t>
+      </w:r>
+      <w:r>
+        <w:rPr>
+          <w:bCs/>
+          <w:b/>
+        </w:rPr>
+        <w:t xml:space="preserve">2º turno de 2023</w:t>
+      </w:r>
+      <w:r>
+        <w:t xml:space="preserve"> </w:t>
+      </w:r>
+      <w:r>
+        <w:t xml:space="preserve">por departamento, se a DINE publicar no formato mesa a mesa.</w:t>
+      </w:r>
+    </w:p>
+    <w:p>
+      <w:pPr>
+        <w:numPr>
+          <w:ilvl w:val="0"/>
+          <w:numId w:val="1013"/>
+        </w:numPr>
+        <w:pStyle w:val="Compact"/>
+      </w:pPr>
+      <w:r>
+        <w:t xml:space="preserve">☐ Outras fontes sugeridas e ainda não coletadas: estudantes de universidades nacionais por província, emprego público por província, titulares do Potenciar Trabajo, projetos de mineração e comunidades indígenas registradas.</w:t>
+      </w:r>
+    </w:p>
+    <w:p>
+      <w:pPr>
+        <w:numPr>
+          <w:ilvl w:val="0"/>
+          <w:numId w:val="1013"/>
+        </w:numPr>
+        <w:pStyle w:val="Compact"/>
+      </w:pPr>
+      <w:r>
+        <w:t xml:space="preserve">☐ Atualizar o ReNaTEP e o RENABAP quando houver versões oficiais mais recentes.</w:t>
+      </w:r>
+    </w:p>
+    <w:p>
+      <w:pPr>
+        <w:numPr>
+          <w:ilvl w:val="0"/>
+          <w:numId w:val="1013"/>
+        </w:numPr>
+        <w:pStyle w:val="Compact"/>
+      </w:pPr>
+      <w:r>
         <w:t xml:space="preserve">☐ Revisar a codificação de casos em que organizações da economia popular aparecem também como “movimientos sindicales”.</w:t>
       </w:r>
     </w:p>
-    <w:bookmarkEnd w:id="51"/>
     <w:bookmarkEnd w:id="52"/>
+    <w:bookmarkEnd w:id="53"/>
     <w:sectPr>
       <w:footerReference w:type="default" r:id="rId9"/>
       <w:pgSz w:h="16838" w:w="11906"/>
@@ -9008,6 +9320,9 @@
     <w:abstractNumId w:val="991"/>
   </w:num>
   <w:num w:numId="1012">
+    <w:abstractNumId w:val="991"/>
+  </w:num>
+  <w:num w:numId="1013">
     <w:abstractNumId w:val="991"/>
   </w:num>
 </w:numbering>

</xml_diff>